<commit_message>
Restore the sections that were cut too far: intrusion walkthrough, face recognition, results with evidence slots, limits and short design reasons
The report grows from 13 to 15 pages. No pin lists, test counts or
code walkthroughs were added back.

Co-Authored-By: Claude Sonnet 5.5 <noreply@anthropic.com>
Claude-Session: https://claude.ai/code/session_01N3vMpjMW2wYwoiVm9vYhWU
</commit_message>
<xml_diff>
--- a/report/HomeGuard_Report.docx
+++ b/report/HomeGuard_Report.docx
@@ -1331,7 +1331,7 @@
     </w:p>
     <w:bookmarkEnd w:id="29"/>
     <w:bookmarkEnd w:id="30"/>
-    <w:bookmarkStart w:id="37" w:name="תכנון-ומימוש"/>
+    <w:bookmarkStart w:id="39" w:name="תכנון-ומימוש"/>
     <w:p>
       <w:pPr>
         <w:pStyle w:val="Heading1"/>
@@ -1363,7 +1363,7 @@
         <w:rPr>
           <w:rtl/>
         </w:rPr>
-        <w:t xml:space="preserve">המערכת בנויה משלושה בקרי ESP32, בקנד ואפליקציה (איור 1). הבקרים מחברים את החיישנים ושולחים הודעות לבקנד ב-WiFi. הבקנד שומר את מצב המערכת (דרוכה, מנוטרלת או אזעקה) ומחליט מתי להפעיל אזעקה. בקר הדלת מקבל גם פקודות מהבקנד, כי בו נמצאים הקודן והזמזמים.</w:t>
+        <w:t xml:space="preserve">המערכת בנויה משלושה בקרי ESP32, בקנד ואפליקציה (איור 1). הבקרים מחברים את החיישנים ושולחים הודעות לבקנד ב-WiFi. הבקנד שומר את מצב המערכת (דרוכה, מנוטרלת או אזעקה) ומחליט מתי להפעיל אזעקה. בקרי החיישנים רק מדווחים, והבקנד הוא שמחליט אם זו אזעקה. כך אפשר לשנות התנהגות (למשל מצב Home) בבקנד בלי לצרוב את הבקרים מחדש. בקר הדלת מקבל גם פקודות מהבקנד, כי בו נמצאים הקודן והזמזמים.</w:t>
       </w:r>
     </w:p>
     <w:p>
@@ -1807,7 +1807,7 @@
         <w:rPr>
           <w:rtl/>
         </w:rPr>
-        <w:t xml:space="preserve">בהפעלה הבקר מודד את המרחק לקיר או למסדרון שמולו, וזה המרחק הרגיל. אחר כך הוא מודד כל כמה אלפיות שנייה. כשהמרחק קצר בהרבה מהרגיל כמה קריאות ברצף, נשלחת לבקנד הודעת חדירה. קריאה בודדת נחשבת רעש ולא מפעילה אזעקה (קוד 1). חיישן הרעידות מגיב מיד לכל מכה.</w:t>
+        <w:t xml:space="preserve">בהפעלה הבקר מודד את המרחק לקיר או למסדרון שמולו, וזה המרחק הרגיל. אחר כך הוא מודד כל כמה אלפיות שנייה. כשהמרחק קצר בהרבה מהרגיל כמה קריאות ברצף, נשלחת לבקנד הודעת חדירה. קריאה בודדת נחשבת רעש ולא מפעילה אזעקה (קוד 1). חיישן הרעידות מגיב מיד לכל מכה: מכה נמשכת אלפיות שנייה בודדות, ולכן הבקר מגיב לה ברגע שהחיישן משדר ולא בודק אותו רק מדי פעם.</w:t>
       </w:r>
     </w:p>
     <w:p>
@@ -1895,7 +1895,7 @@
         <w:rPr>
           <w:rtl/>
         </w:rPr>
-        <w:t xml:space="preserve">בקר הדלת קורא את חיישן הדלת והקודן, מפעיל את הזמזמים ומחליט אם המערכת דרוכה. הקודן נסרק כמו שמתואר בסעיף 3.2 (קוד 2). בנוסף, כל לחיצה נספרת פעם אחת בלבד, גם אם האצבע נשארת על הלחצן.</w:t>
+        <w:t xml:space="preserve">בקר הדלת קורא את חיישן הדלת והקודן, מפעיל את הזמזמים ומחליט אם המערכת דרוכה. הקודן נסרק כמו שמתואר בסעיף 3.2 (קוד 2). בנוסף, כל לחיצה נספרת פעם אחת בלבד, גם אם האצבע נשארת על הלחצן. הדיווח לבקנד נעשה ברקע, כדי שהבקר ימשיך לסרוק את הקודן ולהגיב לפקודות גם כשהרשת איטית.</w:t>
       </w:r>
     </w:p>
     <w:p>
@@ -2874,7 +2874,7 @@
       </w:r>
     </w:p>
     <w:bookmarkEnd w:id="33"/>
-    <w:bookmarkStart w:id="34" w:name="הבקנד-והאפליקציה"/>
+    <w:bookmarkStart w:id="34" w:name="מה-קורה-בזמן-חדירה"/>
     <w:p>
       <w:pPr>
         <w:pStyle w:val="Heading2"/>
@@ -2883,7 +2883,7 @@
         <w:rPr>
           <w:rtl/>
         </w:rPr>
-        <w:t xml:space="preserve">4.4 הבקנד והאפליקציה</w:t>
+        <w:t xml:space="preserve">4.4 מה קורה בזמן חדירה</w:t>
       </w:r>
     </w:p>
     <w:p>
@@ -2894,18 +2894,289 @@
         <w:rPr>
           <w:rtl/>
         </w:rPr>
-        <w:t xml:space="preserve">הבקנד הוא תוכנית Python שרצה על המחשב. הוא שומר את מצב המערכת ויומן אירועים, מקבל דיווחים מהבקרים, מזהה פנים בתמונות מהמצלמה ושולח אימייל. כל בקר מדווח כל כמה שניות שהוא פעיל, ולכן האפליקציה מראה אם בקר כבה.</w:t>
-      </w:r>
-    </w:p>
-    <w:p>
-      <w:pPr>
-        <w:pStyle w:val="BodyText"/>
-      </w:pPr>
-      <w:r>
-        <w:rPr>
-          <w:rtl/>
-        </w:rPr>
-        <w:t xml:space="preserve">האפליקציה (Flutter ‎[12]‎) כוללת מסך ראשי עם מצב המערכת, דריכה ונטרול ומצב הבקרים, יומן אירועים, מצלמה חיה, ניהול פנים והגדרות (שינוי הקוד ונמעני האימייל) (איור 5). הטלפון מתחבר לבקנד לפי כתובת ה-IP של המחשב ברשת הביתית.</w:t>
+        <w:t xml:space="preserve">דוגמה: מישהו עובר מול חיישן המרחק כשהמערכת דרוכה ב-Away.</w:t>
+      </w:r>
+    </w:p>
+    <w:p>
+      <w:pPr>
+        <w:pStyle w:val="Compact"/>
+        <w:numPr>
+          <w:ilvl w:val="0"/>
+          <w:numId w:val="1004"/>
+        </w:numPr>
+      </w:pPr>
+      <w:r>
+        <w:rPr>
+          <w:rtl/>
+        </w:rPr>
+        <w:t xml:space="preserve">חיישן המרחק קורא כמה קריאות ברצף שקצרות בהרבה מהרגיל.</w:t>
+      </w:r>
+    </w:p>
+    <w:p>
+      <w:pPr>
+        <w:pStyle w:val="Compact"/>
+        <w:numPr>
+          <w:ilvl w:val="0"/>
+          <w:numId w:val="1004"/>
+        </w:numPr>
+      </w:pPr>
+      <w:r>
+        <w:rPr>
+          <w:rtl/>
+        </w:rPr>
+        <w:t xml:space="preserve">בקר החיישנים שולח לבקנד הודעת חדירה.</w:t>
+      </w:r>
+    </w:p>
+    <w:p>
+      <w:pPr>
+        <w:pStyle w:val="Compact"/>
+        <w:numPr>
+          <w:ilvl w:val="0"/>
+          <w:numId w:val="1004"/>
+        </w:numPr>
+      </w:pPr>
+      <w:r>
+        <w:rPr>
+          <w:rtl/>
+        </w:rPr>
+        <w:t xml:space="preserve">הבקנד בודק שהמערכת דרוכה ושהחיישן לא מוחרג (ב-Home הוא מוחרג), ועובר למצב אזעקה.</w:t>
+      </w:r>
+    </w:p>
+    <w:p>
+      <w:pPr>
+        <w:pStyle w:val="Compact"/>
+        <w:numPr>
+          <w:ilvl w:val="0"/>
+          <w:numId w:val="1004"/>
+        </w:numPr>
+      </w:pPr>
+      <w:r>
+        <w:rPr>
+          <w:rtl/>
+        </w:rPr>
+        <w:t xml:space="preserve">הבקנד מעדכן את האפליקציה, שולח אימייל עם תמונה מהמצלמה ושולח לבקר הדלת פקודה להפעיל את הסירנה.</w:t>
+      </w:r>
+    </w:p>
+    <w:p>
+      <w:pPr>
+        <w:pStyle w:val="Compact"/>
+        <w:numPr>
+          <w:ilvl w:val="0"/>
+          <w:numId w:val="1004"/>
+        </w:numPr>
+      </w:pPr>
+      <w:r>
+        <w:rPr>
+          <w:rtl/>
+        </w:rPr>
+        <w:t xml:space="preserve">הסירנה נעצרת כשמנטרלים, בקוד בקודן או מהאפליקציה.</w:t>
+      </w:r>
+    </w:p>
+    <w:p>
+      <w:pPr>
+        <w:pStyle w:val="FirstParagraph"/>
+      </w:pPr>
+      <w:r>
+        <w:rPr>
+          <w:rtl/>
+        </w:rPr>
+        <w:t xml:space="preserve">העדכון לאפליקציה נשלח קודם, ושליחת האימייל לא עוצרת אותו, כדי שהאזעקה תופיע מיד גם אם האימייל איטי. אם בקר הדלת מפסיק לענות באמצע ספירת הכניסה (למשל נותק מהחשמל), הבקנד מפעיל אזעקה בעצמו כשהספירה נגמרת.</w:t>
+      </w:r>
+    </w:p>
+    <w:bookmarkEnd w:id="34"/>
+    <w:bookmarkStart w:id="35" w:name="הבקנד-והאפליקציה"/>
+    <w:p>
+      <w:pPr>
+        <w:pStyle w:val="Heading2"/>
+      </w:pPr>
+      <w:r>
+        <w:rPr>
+          <w:rtl/>
+        </w:rPr>
+        <w:t xml:space="preserve">4.5 הבקנד והאפליקציה</w:t>
+      </w:r>
+    </w:p>
+    <w:p>
+      <w:pPr>
+        <w:pStyle w:val="FirstParagraph"/>
+      </w:pPr>
+      <w:r>
+        <w:rPr>
+          <w:rtl/>
+        </w:rPr>
+        <w:t xml:space="preserve">הבקנד הוא תוכנית Python שרצה על המחשב. הוא:</w:t>
+      </w:r>
+    </w:p>
+    <w:p>
+      <w:pPr>
+        <w:pStyle w:val="Compact"/>
+        <w:numPr>
+          <w:ilvl w:val="0"/>
+          <w:numId w:val="1005"/>
+        </w:numPr>
+      </w:pPr>
+      <w:r>
+        <w:rPr>
+          <w:rtl/>
+        </w:rPr>
+        <w:t xml:space="preserve">שומר את מצב המערכת ואת יומן האירועים;</w:t>
+      </w:r>
+    </w:p>
+    <w:p>
+      <w:pPr>
+        <w:pStyle w:val="Compact"/>
+        <w:numPr>
+          <w:ilvl w:val="0"/>
+          <w:numId w:val="1005"/>
+        </w:numPr>
+      </w:pPr>
+      <w:r>
+        <w:rPr>
+          <w:rtl/>
+        </w:rPr>
+        <w:t xml:space="preserve">מקבל דיווחים מהבקרים ומחליט אם יש אזעקה;</w:t>
+      </w:r>
+    </w:p>
+    <w:p>
+      <w:pPr>
+        <w:pStyle w:val="Compact"/>
+        <w:numPr>
+          <w:ilvl w:val="0"/>
+          <w:numId w:val="1005"/>
+        </w:numPr>
+      </w:pPr>
+      <w:r>
+        <w:rPr>
+          <w:rtl/>
+        </w:rPr>
+        <w:t xml:space="preserve">בודק שהבקרים חיים: כל בקר מדווח כל כמה שניות, ואם אין דיווח כ-30 שניות האפליקציה מציגה שהבקר לא מחובר;</w:t>
+      </w:r>
+    </w:p>
+    <w:p>
+      <w:pPr>
+        <w:pStyle w:val="Compact"/>
+        <w:numPr>
+          <w:ilvl w:val="0"/>
+          <w:numId w:val="1005"/>
+        </w:numPr>
+      </w:pPr>
+      <w:r>
+        <w:rPr>
+          <w:rtl/>
+        </w:rPr>
+        <w:t xml:space="preserve">מזהה פנים בתמונות מהמצלמה (סעיף 4.6);</w:t>
+      </w:r>
+    </w:p>
+    <w:p>
+      <w:pPr>
+        <w:pStyle w:val="Compact"/>
+        <w:numPr>
+          <w:ilvl w:val="0"/>
+          <w:numId w:val="1005"/>
+        </w:numPr>
+      </w:pPr>
+      <w:r>
+        <w:rPr>
+          <w:rtl/>
+        </w:rPr>
+        <w:t xml:space="preserve">שולח אימייל באזעקה, ואימייל נוסף לאיש קשר לחירום אם האזעקה לא נוקתה.</w:t>
+      </w:r>
+    </w:p>
+    <w:p>
+      <w:pPr>
+        <w:pStyle w:val="FirstParagraph"/>
+      </w:pPr>
+      <w:r>
+        <w:rPr>
+          <w:rtl/>
+        </w:rPr>
+        <w:t xml:space="preserve">האפליקציה (Flutter ‎[12]‎) כוללת:</w:t>
+      </w:r>
+    </w:p>
+    <w:p>
+      <w:pPr>
+        <w:pStyle w:val="Compact"/>
+        <w:numPr>
+          <w:ilvl w:val="0"/>
+          <w:numId w:val="1006"/>
+        </w:numPr>
+      </w:pPr>
+      <w:r>
+        <w:rPr>
+          <w:rtl/>
+        </w:rPr>
+        <w:t xml:space="preserve">מסך ראשי עם מצב המערכת, דריכה ונטרול (Home או Away) ומצב הבקרים;</w:t>
+      </w:r>
+    </w:p>
+    <w:p>
+      <w:pPr>
+        <w:pStyle w:val="Compact"/>
+        <w:numPr>
+          <w:ilvl w:val="0"/>
+          <w:numId w:val="1006"/>
+        </w:numPr>
+      </w:pPr>
+      <w:r>
+        <w:rPr>
+          <w:rtl/>
+        </w:rPr>
+        <w:t xml:space="preserve">יומן אירועים עם סינון;</w:t>
+      </w:r>
+    </w:p>
+    <w:p>
+      <w:pPr>
+        <w:pStyle w:val="Compact"/>
+        <w:numPr>
+          <w:ilvl w:val="0"/>
+          <w:numId w:val="1006"/>
+        </w:numPr>
+      </w:pPr>
+      <w:r>
+        <w:rPr>
+          <w:rtl/>
+        </w:rPr>
+        <w:t xml:space="preserve">מצלמה חיה;</w:t>
+      </w:r>
+    </w:p>
+    <w:p>
+      <w:pPr>
+        <w:pStyle w:val="Compact"/>
+        <w:numPr>
+          <w:ilvl w:val="0"/>
+          <w:numId w:val="1006"/>
+        </w:numPr>
+      </w:pPr>
+      <w:r>
+        <w:rPr>
+          <w:rtl/>
+        </w:rPr>
+        <w:t xml:space="preserve">ניהול פנים;</w:t>
+      </w:r>
+    </w:p>
+    <w:p>
+      <w:pPr>
+        <w:pStyle w:val="Compact"/>
+        <w:numPr>
+          <w:ilvl w:val="0"/>
+          <w:numId w:val="1006"/>
+        </w:numPr>
+      </w:pPr>
+      <w:r>
+        <w:rPr>
+          <w:rtl/>
+        </w:rPr>
+        <w:t xml:space="preserve">הגדרות: שינוי הקוד, נמעני האימייל ושעות הדריכה האוטומטית.</w:t>
+      </w:r>
+    </w:p>
+    <w:p>
+      <w:pPr>
+        <w:pStyle w:val="FirstParagraph"/>
+      </w:pPr>
+      <w:r>
+        <w:rPr>
+          <w:rtl/>
+        </w:rPr>
+        <w:t xml:space="preserve">הטלפון מתחבר לבקנד לפי כתובת ה-IP של המחשב ברשת הביתית (איור 5). הבקנד מגיש גם גרסת web של האפליקציה, שנפתחת בדפדפן באותה כתובת.</w:t>
       </w:r>
     </w:p>
     <w:p>
@@ -2946,8 +3217,8 @@
         <w:t xml:space="preserve">איור 5: האפליקציה</w:t>
       </w:r>
     </w:p>
-    <w:bookmarkEnd w:id="34"/>
-    <w:bookmarkStart w:id="35" w:name="אבטחה"/>
+    <w:bookmarkEnd w:id="35"/>
+    <w:bookmarkStart w:id="36" w:name="זיהוי-פנים-1"/>
     <w:p>
       <w:pPr>
         <w:pStyle w:val="Heading2"/>
@@ -2956,7 +3227,7 @@
         <w:rPr>
           <w:rtl/>
         </w:rPr>
-        <w:t xml:space="preserve">4.5 אבטחה</w:t>
+        <w:t xml:space="preserve">4.6 זיהוי פנים</w:t>
       </w:r>
     </w:p>
     <w:p>
@@ -2967,6 +3238,41 @@
         <w:rPr>
           <w:rtl/>
         </w:rPr>
+        <w:t xml:space="preserve">פנים נרשמות מהאפליקציה: מסך הפנים מצלם תמונה מהמצלמה ושומר אותה עם שם. ה-ESP32-CAM שולח תמונה לבקנד כמה פעמים בשנייה. הבקנד מוצא פנים בתמונה, ממיר אותן לווקטור ומשווה לווקטורים של הפנים השמורות. אם הדמיון גבוה מסף, הפנים מזוהות והאירוע נרשם ביומן, פעם בדקה לכל היותר לאותו אדם, כדי שהיומן לא יתמלא.</w:t>
+      </w:r>
+    </w:p>
+    <w:p>
+      <w:pPr>
+        <w:pStyle w:val="BodyText"/>
+      </w:pPr>
+      <w:r>
+        <w:rPr>
+          <w:rtl/>
+        </w:rPr>
+        <w:t xml:space="preserve">אם נטרול בפנים מופעל והמערכת דרוכה, פנים מזוהות מנטרלות אותה, והנטרול נרשם ביומן עם השם. האפשרות כבויה כברירת מחדל ונועדה לנוחות ולא לאבטחה.</w:t>
+      </w:r>
+    </w:p>
+    <w:bookmarkEnd w:id="36"/>
+    <w:bookmarkStart w:id="37" w:name="אבטחה"/>
+    <w:p>
+      <w:pPr>
+        <w:pStyle w:val="Heading2"/>
+      </w:pPr>
+      <w:r>
+        <w:rPr>
+          <w:rtl/>
+        </w:rPr>
+        <w:t xml:space="preserve">4.7 אבטחה</w:t>
+      </w:r>
+    </w:p>
+    <w:p>
+      <w:pPr>
+        <w:pStyle w:val="FirstParagraph"/>
+      </w:pPr>
+      <w:r>
+        <w:rPr>
+          <w:rtl/>
+        </w:rPr>
         <w:t xml:space="preserve">הכניסה לאפליקציה דורשת סיסמה, והיא אותו קוד כמו בקודן. אחרי 3 ניסיונות שגויים ההתחברות ננעלת ל-30 שניות. הבקרים מזדהים מול הבקנד במפתח משותף. התקשורת אינה מוצפנת: הכול עובר ב-HTTP רגיל ברשת ה-WiFi הביתית.</w:t>
       </w:r>
     </w:p>
@@ -2981,8 +3287,8 @@
         <w:t xml:space="preserve">כדי להתחבר מהטלפון מספיק להיות באותה רשת ולדעת את כתובת ה-IP של המחשב. המערכת לא נחשפה לאינטרנט. מי שנמצא באותה רשת יכול לנסות לנחש את הקוד או להאזין לתעבורה, ולכן המערכת מתאימה לשימוש ביתי ולא להגנה אמיתית.</w:t>
       </w:r>
     </w:p>
-    <w:bookmarkEnd w:id="35"/>
-    <w:bookmarkStart w:id="36" w:name="כלים-ותוכנות"/>
+    <w:bookmarkEnd w:id="37"/>
+    <w:bookmarkStart w:id="38" w:name="כלים-ותוכנות"/>
     <w:p>
       <w:pPr>
         <w:pStyle w:val="Heading2"/>
@@ -2991,7 +3297,7 @@
         <w:rPr>
           <w:rtl/>
         </w:rPr>
-        <w:t xml:space="preserve">4.6 כלים ותוכנות</w:t>
+        <w:t xml:space="preserve">4.8 כלים ותוכנות</w:t>
       </w:r>
     </w:p>
     <w:p>
@@ -3336,9 +3642,9 @@
         </w:tc>
       </w:tr>
     </w:tbl>
-    <w:bookmarkEnd w:id="36"/>
-    <w:bookmarkEnd w:id="37"/>
-    <w:bookmarkStart w:id="40" w:name="בדיקות-ותוצאות"/>
+    <w:bookmarkEnd w:id="38"/>
+    <w:bookmarkEnd w:id="39"/>
+    <w:bookmarkStart w:id="44" w:name="בדיקות-ותוצאות"/>
     <w:p>
       <w:pPr>
         <w:pStyle w:val="Heading1"/>
@@ -3350,7 +3656,7 @@
         <w:t xml:space="preserve">5. בדיקות ותוצאות</w:t>
       </w:r>
     </w:p>
-    <w:bookmarkStart w:id="38" w:name="איך-נבדקה-המערכת"/>
+    <w:bookmarkStart w:id="40" w:name="איך-נבדקה-המערכת"/>
     <w:p>
       <w:pPr>
         <w:pStyle w:val="Heading2"/>
@@ -3373,8 +3679,8 @@
         <w:t xml:space="preserve">לבקנד יש בדיקות אוטומטיות (pytest ‎[13]‎) שבודקות את הלוגיקה: מצבי האזעקה, ההתחברות והנעילה, וההתראות. שאר המערכת נבדקה ידנית על החומרה.</w:t>
       </w:r>
     </w:p>
-    <w:bookmarkEnd w:id="38"/>
-    <w:bookmarkStart w:id="39" w:name="תרחישי-הבדיקה"/>
+    <w:bookmarkEnd w:id="40"/>
+    <w:bookmarkStart w:id="41" w:name="תרחישי-הבדיקה"/>
     <w:p>
       <w:pPr>
         <w:pStyle w:val="Heading2"/>
@@ -4083,9 +4389,200 @@
         <w:t xml:space="preserve">הבעיות שהתגלו בבדיקות מפורטות בסעיף 6.2.</w:t>
       </w:r>
     </w:p>
-    <w:bookmarkEnd w:id="39"/>
-    <w:bookmarkEnd w:id="40"/>
-    <w:bookmarkStart w:id="45" w:name="סיכום-ומסקנות"/>
+    <w:bookmarkEnd w:id="41"/>
+    <w:bookmarkStart w:id="42" w:name="תוצאות"/>
+    <w:p>
+      <w:pPr>
+        <w:pStyle w:val="Heading2"/>
+      </w:pPr>
+      <w:r>
+        <w:rPr>
+          <w:rtl/>
+        </w:rPr>
+        <w:t xml:space="preserve">5.3 תוצאות</w:t>
+      </w:r>
+    </w:p>
+    <w:p>
+      <w:pPr>
+        <w:pStyle w:val="FirstParagraph"/>
+      </w:pPr>
+      <w:r>
+        <w:rPr>
+          <w:rtl/>
+        </w:rPr>
+        <w:t xml:space="preserve">בכל תרחיש האירועים נרשמו ביומן האפליקציה לפי הסדר, עם שעה: דריכה, פתיחת דלת, אזעקה ונטרול (איור 7). בבקר החיישנים אפשר לראות ב-Serial Monitor איך קריאת המרחק יורדת מתחת למרחק הרגיל כשמישהו עובר, ורק אחרי כמה קריאות ברצף נשלחת הודעת חדירה (איור 6).</w:t>
+      </w:r>
+    </w:p>
+    <w:p>
+      <w:pPr>
+        <w:pStyle w:val="BodyText"/>
+        <w:keepNext/>
+        <w:pBdr>
+          <w:top w:val="dashed" w:sz="8" w:space="4" w:color="B58900"/>
+          <w:left w:val="dashed" w:sz="8" w:space="4" w:color="B58900"/>
+          <w:bottom w:val="dashed" w:sz="8" w:space="4" w:color="B58900"/>
+          <w:right w:val="dashed" w:sz="8" w:space="4" w:color="B58900"/>
+        </w:pBdr>
+        <w:spacing w:before="200" w:after="200"/>
+        <w:jc w:val="center"/>
+      </w:pPr>
+      <w:r>
+        <w:rPr>
+          <w:b/>
+          <w:bCs/>
+          <w:highlight w:val="yellow"/>
+          <w:rtl/>
+        </w:rPr>
+        <w:t xml:space="preserve">[הכנס תמונה כאן: פלט ה-Serial Monitor של בקר החיישנים: קריאות המרחק לפני חציית החיישן, בזמן החציה והודעת החדירה שנשלחה]</w:t>
+      </w:r>
+    </w:p>
+    <w:p>
+      <w:pPr>
+        <w:pStyle w:val="ImageCaption"/>
+        <w:keepNext w:val="0"/>
+        <w:jc w:val="center"/>
+      </w:pPr>
+      <w:r>
+        <w:rPr>
+          <w:b/>
+          <w:bCs/>
+          <w:rtl/>
+        </w:rPr>
+        <w:t xml:space="preserve">איור 6: קריאות חיישן המרחק בזמן חדירה</w:t>
+      </w:r>
+    </w:p>
+    <w:p>
+      <w:pPr>
+        <w:pStyle w:val="BodyText"/>
+        <w:keepNext/>
+        <w:pBdr>
+          <w:top w:val="dashed" w:sz="8" w:space="4" w:color="B58900"/>
+          <w:left w:val="dashed" w:sz="8" w:space="4" w:color="B58900"/>
+          <w:bottom w:val="dashed" w:sz="8" w:space="4" w:color="B58900"/>
+          <w:right w:val="dashed" w:sz="8" w:space="4" w:color="B58900"/>
+        </w:pBdr>
+        <w:spacing w:before="200" w:after="200"/>
+        <w:jc w:val="center"/>
+      </w:pPr>
+      <w:r>
+        <w:rPr>
+          <w:b/>
+          <w:bCs/>
+          <w:highlight w:val="yellow"/>
+          <w:rtl/>
+        </w:rPr>
+        <w:t xml:space="preserve">[הכנס תמונה כאן: צילום מסך של יומן האירועים באפליקציה אחרי תרחיש: דריכה, פתיחת דלת, אזעקה ונטרול]</w:t>
+      </w:r>
+    </w:p>
+    <w:p>
+      <w:pPr>
+        <w:pStyle w:val="ImageCaption"/>
+        <w:keepNext w:val="0"/>
+        <w:jc w:val="center"/>
+      </w:pPr>
+      <w:r>
+        <w:rPr>
+          <w:b/>
+          <w:bCs/>
+          <w:rtl/>
+        </w:rPr>
+        <w:t xml:space="preserve">איור 7: יומן האירועים אחרי תרחיש בדיקה</w:t>
+      </w:r>
+    </w:p>
+    <w:bookmarkEnd w:id="42"/>
+    <w:bookmarkStart w:id="43" w:name="ניתוח-ומגבלות"/>
+    <w:p>
+      <w:pPr>
+        <w:pStyle w:val="Heading2"/>
+      </w:pPr>
+      <w:r>
+        <w:rPr>
+          <w:rtl/>
+        </w:rPr>
+        <w:t xml:space="preserve">5.4 ניתוח ומגבלות</w:t>
+      </w:r>
+    </w:p>
+    <w:p>
+      <w:pPr>
+        <w:pStyle w:val="Compact"/>
+        <w:numPr>
+          <w:ilvl w:val="0"/>
+          <w:numId w:val="1007"/>
+        </w:numPr>
+      </w:pPr>
+      <w:r>
+        <w:rPr>
+          <w:b/>
+          <w:bCs/>
+          <w:rtl/>
+        </w:rPr>
+        <w:t xml:space="preserve">המרחק הרגיל נמדד בכל הפעלה.</w:t>
+      </w:r>
+      <w:r>
+        <w:t xml:space="preserve"> </w:t>
+      </w:r>
+      <w:r>
+        <w:rPr>
+          <w:rtl/>
+        </w:rPr>
+        <w:t xml:space="preserve">לכן אין צורך לכוונן את חיישן המרחק ידנית כשמזיזים אותו. החיסרון: אם מישהו עומד מול החיישן בזמן ההפעלה, המרחק הרגיל נמדד לא נכון. הבקר פוסל מרחק רגיל שקצר מדי ומדווח תקלה, והיא מופיעה באפליקציה.</w:t>
+      </w:r>
+    </w:p>
+    <w:p>
+      <w:pPr>
+        <w:pStyle w:val="Compact"/>
+        <w:numPr>
+          <w:ilvl w:val="0"/>
+          <w:numId w:val="1007"/>
+        </w:numPr>
+      </w:pPr>
+      <w:r>
+        <w:rPr>
+          <w:b/>
+          <w:bCs/>
+          <w:rtl/>
+        </w:rPr>
+        <w:t xml:space="preserve">בקרי החיישנים תלויים בבקנד.</w:t>
+      </w:r>
+      <w:r>
+        <w:t xml:space="preserve"> </w:t>
+      </w:r>
+      <w:r>
+        <w:rPr>
+          <w:rtl/>
+        </w:rPr>
+        <w:t xml:space="preserve">בלי המחשב אין התראה מחיישן המרחק ומחיישן הרעידות. בקר הדלת מפעיל סירנה גם בלי הבקנד כשהדלת נפתחת ולא מנטרלים בזמן.</w:t>
+      </w:r>
+    </w:p>
+    <w:p>
+      <w:pPr>
+        <w:pStyle w:val="Compact"/>
+        <w:numPr>
+          <w:ilvl w:val="0"/>
+          <w:numId w:val="1007"/>
+        </w:numPr>
+      </w:pPr>
+      <w:r>
+        <w:rPr>
+          <w:b/>
+          <w:bCs/>
+          <w:rtl/>
+        </w:rPr>
+        <w:t xml:space="preserve">הבקנד לא זוכר אם המערכת דרוכה.</w:t>
+      </w:r>
+      <w:r>
+        <w:t xml:space="preserve"> </w:t>
+      </w:r>
+      <w:r>
+        <w:rPr>
+          <w:rtl/>
+        </w:rPr>
+        <w:t xml:space="preserve">אחרי הפעלה מחדש הוא מתחיל במצב מנוטרל ומתעדכן כשבקר הדלת מדווח. כך האפליקציה לא מציגה מצב ישן שאף אחד לא אימת.</w:t>
+      </w:r>
+    </w:p>
+    <w:bookmarkEnd w:id="43"/>
+    <w:bookmarkEnd w:id="44"/>
+    <w:bookmarkStart w:id="49" w:name="סיכום-ומסקנות"/>
     <w:p>
       <w:pPr>
         <w:pStyle w:val="Heading1"/>
@@ -4097,7 +4594,7 @@
         <w:t xml:space="preserve">6. סיכום ומסקנות</w:t>
       </w:r>
     </w:p>
-    <w:bookmarkStart w:id="41" w:name="עמידה-במטרות"/>
+    <w:bookmarkStart w:id="45" w:name="עמידה-במטרות"/>
     <w:p>
       <w:pPr>
         <w:pStyle w:val="Heading2"/>
@@ -4664,8 +5161,8 @@
         </w:tc>
       </w:tr>
     </w:tbl>
-    <w:bookmarkEnd w:id="41"/>
-    <w:bookmarkStart w:id="42" w:name="אתגרים-ופתרונות"/>
+    <w:bookmarkEnd w:id="45"/>
+    <w:bookmarkStart w:id="46" w:name="אתגרים-ופתרונות"/>
     <w:p>
       <w:pPr>
         <w:pStyle w:val="Heading2"/>
@@ -5130,8 +5627,8 @@
         </w:tc>
       </w:tr>
     </w:tbl>
-    <w:bookmarkEnd w:id="42"/>
-    <w:bookmarkStart w:id="43" w:name="מסקנות"/>
+    <w:bookmarkEnd w:id="46"/>
+    <w:bookmarkStart w:id="47" w:name="מסקנות"/>
     <w:p>
       <w:pPr>
         <w:pStyle w:val="Heading2"/>
@@ -5148,7 +5645,7 @@
         <w:pStyle w:val="Compact"/>
         <w:numPr>
           <w:ilvl w:val="0"/>
-          <w:numId w:val="1004"/>
+          <w:numId w:val="1008"/>
         </w:numPr>
       </w:pPr>
       <w:r>
@@ -5163,7 +5660,7 @@
         <w:pStyle w:val="Compact"/>
         <w:numPr>
           <w:ilvl w:val="0"/>
-          <w:numId w:val="1004"/>
+          <w:numId w:val="1008"/>
         </w:numPr>
       </w:pPr>
       <w:r>
@@ -5178,7 +5675,7 @@
         <w:pStyle w:val="Compact"/>
         <w:numPr>
           <w:ilvl w:val="0"/>
-          <w:numId w:val="1004"/>
+          <w:numId w:val="1008"/>
         </w:numPr>
       </w:pPr>
       <w:r>
@@ -5188,8 +5685,8 @@
         <w:t xml:space="preserve">צלילים קצרים וברורים לכל פעולה בקודן עושים את השימוש בו הרבה יותר נוח.</w:t>
       </w:r>
     </w:p>
-    <w:bookmarkEnd w:id="43"/>
-    <w:bookmarkStart w:id="44" w:name="המשך"/>
+    <w:bookmarkEnd w:id="47"/>
+    <w:bookmarkStart w:id="48" w:name="המשך"/>
     <w:p>
       <w:pPr>
         <w:pStyle w:val="Heading2"/>
@@ -5206,7 +5703,7 @@
         <w:pStyle w:val="Compact"/>
         <w:numPr>
           <w:ilvl w:val="0"/>
-          <w:numId w:val="1005"/>
+          <w:numId w:val="1009"/>
         </w:numPr>
       </w:pPr>
       <w:r>
@@ -5221,7 +5718,7 @@
         <w:pStyle w:val="Compact"/>
         <w:numPr>
           <w:ilvl w:val="0"/>
-          <w:numId w:val="1005"/>
+          <w:numId w:val="1009"/>
         </w:numPr>
       </w:pPr>
       <w:r>
@@ -5236,7 +5733,7 @@
         <w:pStyle w:val="Compact"/>
         <w:numPr>
           <w:ilvl w:val="0"/>
-          <w:numId w:val="1005"/>
+          <w:numId w:val="1009"/>
         </w:numPr>
       </w:pPr>
       <w:r>
@@ -5251,7 +5748,7 @@
         <w:pStyle w:val="Compact"/>
         <w:numPr>
           <w:ilvl w:val="0"/>
-          <w:numId w:val="1005"/>
+          <w:numId w:val="1009"/>
         </w:numPr>
       </w:pPr>
       <w:r>
@@ -5266,7 +5763,7 @@
         <w:pStyle w:val="Compact"/>
         <w:numPr>
           <w:ilvl w:val="0"/>
-          <w:numId w:val="1005"/>
+          <w:numId w:val="1009"/>
         </w:numPr>
       </w:pPr>
       <w:r>
@@ -5281,7 +5778,7 @@
         <w:pStyle w:val="Compact"/>
         <w:numPr>
           <w:ilvl w:val="0"/>
-          <w:numId w:val="1005"/>
+          <w:numId w:val="1009"/>
         </w:numPr>
       </w:pPr>
       <w:r>
@@ -5291,9 +5788,9 @@
         <w:t xml:space="preserve">שיפור הדיוק של זיהוי הפנים.</w:t>
       </w:r>
     </w:p>
-    <w:bookmarkEnd w:id="44"/>
-    <w:bookmarkEnd w:id="45"/>
-    <w:bookmarkStart w:id="46" w:name="רשימת-מקורות"/>
+    <w:bookmarkEnd w:id="48"/>
+    <w:bookmarkEnd w:id="49"/>
+    <w:bookmarkStart w:id="50" w:name="רשימת-מקורות"/>
     <w:p>
       <w:pPr>
         <w:pStyle w:val="Heading1"/>
@@ -5488,8 +5985,8 @@
         <w:t xml:space="preserve">[13] pytest-dev, "pytest Documentation." [Online]. Available: https://docs.pytest.org/. Accessed: Oct. 17, 2026.</w:t>
       </w:r>
     </w:p>
-    <w:bookmarkEnd w:id="46"/>
-    <w:bookmarkStart w:id="48" w:name="נספחים"/>
+    <w:bookmarkEnd w:id="50"/>
+    <w:bookmarkStart w:id="52" w:name="נספחים"/>
     <w:p>
       <w:pPr>
         <w:pStyle w:val="Heading1"/>
@@ -5502,7 +5999,7 @@
         <w:t xml:space="preserve">8. נספחים</w:t>
       </w:r>
     </w:p>
-    <w:bookmarkStart w:id="47" w:name="נספח-א-רשימת-חומרים-bom"/>
+    <w:bookmarkStart w:id="51" w:name="נספח-א-רשימת-חומרים-bom"/>
     <w:p>
       <w:pPr>
         <w:pStyle w:val="Heading2"/>
@@ -6522,8 +7019,8 @@
         <w:t xml:space="preserve">הקוד המלא והקבצים הנלווים מצורפים בקובץ ה-ZIP של הגשת הפרויקט.</w:t>
       </w:r>
     </w:p>
-    <w:bookmarkEnd w:id="47"/>
-    <w:bookmarkEnd w:id="48"/>
+    <w:bookmarkEnd w:id="51"/>
+    <w:bookmarkEnd w:id="52"/>
     <w:sectPr>
       <w:footerReference w:type="default" r:id="rId14"/>
       <w:footerReference w:type="first" r:id="rId15"/>
@@ -6869,9 +7366,48 @@
     </w:lvlOverride>
   </w:num>
   <w:num w:numId="1004">
+    <w:abstractNumId w:val="99411"/>
+    <w:lvlOverride w:ilvl="0">
+      <w:startOverride w:val="1"/>
+    </w:lvlOverride>
+    <w:lvlOverride w:ilvl="1">
+      <w:startOverride w:val="1"/>
+    </w:lvlOverride>
+    <w:lvlOverride w:ilvl="2">
+      <w:startOverride w:val="1"/>
+    </w:lvlOverride>
+    <w:lvlOverride w:ilvl="3">
+      <w:startOverride w:val="1"/>
+    </w:lvlOverride>
+    <w:lvlOverride w:ilvl="4">
+      <w:startOverride w:val="1"/>
+    </w:lvlOverride>
+    <w:lvlOverride w:ilvl="5">
+      <w:startOverride w:val="1"/>
+    </w:lvlOverride>
+    <w:lvlOverride w:ilvl="6">
+      <w:startOverride w:val="1"/>
+    </w:lvlOverride>
+    <w:lvlOverride w:ilvl="7">
+      <w:startOverride w:val="1"/>
+    </w:lvlOverride>
+    <w:lvlOverride w:ilvl="8">
+      <w:startOverride w:val="1"/>
+    </w:lvlOverride>
+  </w:num>
+  <w:num w:numId="1005">
     <w:abstractNumId w:val="991"/>
   </w:num>
-  <w:num w:numId="1005">
+  <w:num w:numId="1006">
+    <w:abstractNumId w:val="991"/>
+  </w:num>
+  <w:num w:numId="1007">
+    <w:abstractNumId w:val="991"/>
+  </w:num>
+  <w:num w:numId="1008">
+    <w:abstractNumId w:val="991"/>
+  </w:num>
+  <w:num w:numId="1009">
     <w:abstractNumId w:val="991"/>
   </w:num>
 </w:numbering>

</xml_diff>

<commit_message>
Fix report errors found in a code audit: screen count, summary contradiction, camera liveness, entry-delay watchdog timing, keypad disarm rules
Co-Authored-By: Claude Sonnet 5.5 <noreply@anthropic.com>
Claude-Session: https://claude.ai/code/session_01N3vMpjMW2wYwoiVm9vYhWU
</commit_message>
<xml_diff>
--- a/report/HomeGuard_Report.docx
+++ b/report/HomeGuard_Report.docx
@@ -674,7 +674,7 @@
         <w:rPr>
           <w:rtl/>
         </w:rPr>
-        <w:t xml:space="preserve">בפרויקט נבנתה מערכת אזעקה לבית. שלושה בקרי ESP32 מחוברים ב-WiFi לשרת (בקנד) שכתוב ב-Python ורץ על מחשב: בקר אחד עם חיישן מרחק וחיישן רעידות, בקר שני בדלת עם חיישן דלת, קודן וזמזמים, ובקר שלישי עם מצלמה. הבקנד מחליט מתי יש אזעקה, מזהה פנים של דיירים ושולח אימייל עם תמונה מהמצלמה. אפליקציה בטלפון מאפשרת לדרוך ולנטרל, לראות את המצלמה ולעבור על יומן אירועים. אפשר לדרוך ולנטרל גם מהקודן שליד הדלת. כל דרישות הפרויקט מומשו, חוץ מחיוג אוטומטי לגורם חירום.</w:t>
+        <w:t xml:space="preserve">בפרויקט נבנתה מערכת אזעקה לבית. שלושה בקרי ESP32 מחוברים ב-WiFi לשרת (בקנד) שכתוב ב-Python ורץ על מחשב: בקר אחד עם חיישן מרחק וחיישן רעידות, בקר שני בדלת עם חיישן דלת, קודן וזמזמים, ובקר שלישי עם מצלמה. הבקנד מחליט מתי יש אזעקה, מזהה פנים של דיירים ושולח אימייל עם תמונה מהמצלמה. אפליקציה בטלפון מאפשרת לדרוך ולנטרל, לראות את המצלמה ולעבור על יומן אירועים. אפשר לדרוך ולנטרל גם מהקודן שליד הדלת. דרישות החובה של הפרויקט מומשו. שני דברים שהוצעו לא מומשו: חיוג אוטומטי לגורם חירום, ונעילת הקודן אחרי כמה קודים שגויים.</w:t>
       </w:r>
     </w:p>
     <w:bookmarkEnd w:id="20"/>
@@ -1278,7 +1278,7 @@
         <w:rPr>
           <w:rtl/>
         </w:rPr>
-        <w:t xml:space="preserve">הבקר עובר על ארבע השורות שוב ושוב, כמה פעמים בשנייה.</w:t>
+        <w:t xml:space="preserve">הבקר עובר על ארבע השורות שוב ושוב, הרבה פעמים בשנייה.</w:t>
       </w:r>
     </w:p>
     <w:bookmarkEnd w:id="27"/>
@@ -1909,7 +1909,7 @@
         <w:rPr>
           <w:rtl/>
         </w:rPr>
-        <w:t xml:space="preserve">כל בקר שולח לבקנד "דיווח חיים" כל 10 שניות, וכך הבקנד יודע שהבקר מחובר. לכל בקשה לבקנד מוגדרת מגבלת זמן של שנייה אחת, כדי שבקשה שנתקעה לא תעצור את המדידה.</w:t>
+        <w:t xml:space="preserve">בקר החיישנים ובקר הדלת שולחים לבקנד "דיווח חיים" כל 10 שניות, וכך הבקנד יודע שהם מחוברים. בקר המצלמה לא שולח דיווח כזה: התמונות שהוא שולח משמשות כדיווח חיים. לכל בקשה לבקנד מוגדרת מגבלת זמן של שנייה אחת, כדי שבקשה שנתקעה לא תעצור את המדידה.</w:t>
       </w:r>
     </w:p>
     <w:p>
@@ -2776,7 +2776,7 @@
         <w:rPr>
           <w:rtl/>
         </w:rPr>
-        <w:t xml:space="preserve">לפני שהדלת נסגרה מבטלת את הדריכה. הסדר הזה, לחיצה, פתיחה וסגירה, מבטיח שמי שדורך אכן יצא מהבית לפני שהמערכת נדרכת.</w:t>
+        <w:t xml:space="preserve">לפני שהדלת נסגרה מבטלת את הדריכה. הסדר הזה, לחיצה, פתיחה וסגירה, נועד לוודא שמי שדורך אכן יצא מהבית לפני שהמערכת נדרכת.</w:t>
       </w:r>
     </w:p>
     <w:p>
@@ -2945,7 +2945,7 @@
         <w:rPr>
           <w:rtl/>
         </w:rPr>
-        <w:t xml:space="preserve">מנטרלים עם קוד נכון בקודן, מהאפליקציה או בזיהוי פנים. זיהוי פנים כבוי כברירת מחדל, וצריך להפעיל אותו באפליקציה. הוא נועד לנוחות ולא לאבטחה.</w:t>
+        <w:t xml:space="preserve">מנטרלים עם קוד נכון בקודן, מהאפליקציה או בזיהוי פנים. בקודן הקוד פועל רק אחרי שהדלת נפתחה (בספירת הכניסה) או כשהאזעקה כבר פועלת. הקשת קוד כשהמערכת דרוכה והדלת סגורה לא עושה דבר. זיהוי פנים כבוי כברירת מחדל, וצריך להפעיל אותו באפליקציה. הוא נועד לנוחות ולא לאבטחה.</w:t>
       </w:r>
     </w:p>
     <w:p>
@@ -3137,7 +3137,7 @@
         <w:rPr>
           <w:rtl/>
         </w:rPr>
-        <w:t xml:space="preserve">העדכון לאפליקציה נשלח קודם, ושליחת האימייל לא עוצרת אותו, כדי שהאזעקה תופיע מיד גם אם האימייל איטי. אם בקר הדלת מפסיק לענות באמצע ספירת הכניסה (למשל נותק מהחשמל), הבקנד מפעיל אזעקה בעצמו כשהספירה נגמרת.</w:t>
+        <w:t xml:space="preserve">העדכון לאפליקציה נשלח קודם, ושליחת האימייל לא עוצרת אותו, כדי שהאזעקה תופיע מיד גם אם האימייל איטי. אם בקר הדלת מפסיק לענות באמצע ספירת הכניסה (למשל נותק מהחשמל), הבקנד מפעיל אזעקה בעצמו, 5 שניות אחרי שהספירה אמורה להסתיים.</w:t>
       </w:r>
     </w:p>
     <w:bookmarkEnd w:id="35"/>
@@ -3206,7 +3206,7 @@
         <w:rPr>
           <w:rtl/>
         </w:rPr>
-        <w:t xml:space="preserve">בודק שהבקרים חיים: כל בקר מדווח כל כמה שניות, ואם אין דיווח כ-30 שניות האפליקציה מציגה שהבקר לא מחובר;</w:t>
+        <w:t xml:space="preserve">בודק שהבקרים חיים: בקר החיישנים ובקר הדלת מדווחים כל כמה שניות, ובקר המצלמה נבדק לפי התמונות שהוא שולח. אם אין דבר כ-30 שניות, האפליקציה מציגה שהבקר לא מחובר;</w:t>
       </w:r>
     </w:p>
     <w:p>
@@ -3297,7 +3297,7 @@
         <w:rPr>
           <w:rtl/>
         </w:rPr>
-        <w:t xml:space="preserve">האפליקציה נכתבה ב-Flutter ‎[12]‎ ורצה על טלפון Android. העיצוב כהה, בסגנון לוח בקרה, ומצב המערכת מובחן בצבע: אדום כשהמערכת דרוכה או באזעקה, וירוק כשהיא מנוטרלת. ספירת הכניסה מוצגת בצבע אזהרה נפרד. האפליקציה כוללת חמישה מסכים (איור 5).</w:t>
+        <w:t xml:space="preserve">האפליקציה נכתבה ב-Flutter ‎[12]‎ ורצה על טלפון Android. העיצוב כהה, בסגנון לוח בקרה, ומצב המערכת מובחן בצבע: אדום כשהמערכת דרוכה או באזעקה, וירוק כשהיא מנוטרלת. ספירת הכניסה מוצגת בצבע אזהרה נפרד. האפליקציה כוללת שישה מסכים (איור 5).</w:t>
       </w:r>
     </w:p>
     <w:p>
@@ -3772,9 +3772,9 @@
         </w:tblCellMar>
       </w:tblPr>
       <w:tblGrid>
-        <w:gridCol w:w="4175"/>
-        <w:gridCol w:w="2528"/>
-        <w:gridCol w:w="2369"/>
+        <w:gridCol w:w="4151"/>
+        <w:gridCol w:w="2541"/>
+        <w:gridCol w:w="2380"/>
       </w:tblGrid>
       <w:tr>
         <w:trPr>
@@ -3784,7 +3784,7 @@
         </w:trPr>
         <w:tc>
           <w:tcPr>
-            <w:tcW w:w="4175" w:type="dxa"/>
+            <w:tcW w:w="4151" w:type="dxa"/>
             <w:tcBorders>
               <w:top w:val="single" w:sz="4" w:space="0" w:color="999999"/>
               <w:left w:val="single" w:sz="4" w:space="0" w:color="999999"/>
@@ -3811,7 +3811,7 @@
         </w:tc>
         <w:tc>
           <w:tcPr>
-            <w:tcW w:w="2528" w:type="dxa"/>
+            <w:tcW w:w="2541" w:type="dxa"/>
             <w:tcBorders>
               <w:top w:val="single" w:sz="4" w:space="0" w:color="999999"/>
               <w:left w:val="single" w:sz="4" w:space="0" w:color="999999"/>
@@ -3838,7 +3838,7 @@
         </w:tc>
         <w:tc>
           <w:tcPr>
-            <w:tcW w:w="2369" w:type="dxa"/>
+            <w:tcW w:w="2380" w:type="dxa"/>
             <w:tcBorders>
               <w:top w:val="single" w:sz="4" w:space="0" w:color="999999"/>
               <w:left w:val="single" w:sz="4" w:space="0" w:color="999999"/>
@@ -3870,7 +3870,7 @@
         </w:trPr>
         <w:tc>
           <w:tcPr>
-            <w:tcW w:w="4175" w:type="dxa"/>
+            <w:tcW w:w="4151" w:type="dxa"/>
             <w:tcBorders>
               <w:top w:val="single" w:sz="4" w:space="0" w:color="999999"/>
               <w:left w:val="single" w:sz="4" w:space="0" w:color="999999"/>
@@ -3893,7 +3893,7 @@
         </w:tc>
         <w:tc>
           <w:tcPr>
-            <w:tcW w:w="2528" w:type="dxa"/>
+            <w:tcW w:w="2541" w:type="dxa"/>
             <w:tcBorders>
               <w:top w:val="single" w:sz="4" w:space="0" w:color="999999"/>
               <w:left w:val="single" w:sz="4" w:space="0" w:color="999999"/>
@@ -3916,7 +3916,7 @@
         </w:tc>
         <w:tc>
           <w:tcPr>
-            <w:tcW w:w="2369" w:type="dxa"/>
+            <w:tcW w:w="2380" w:type="dxa"/>
             <w:tcBorders>
               <w:top w:val="single" w:sz="4" w:space="0" w:color="999999"/>
               <w:left w:val="single" w:sz="4" w:space="0" w:color="999999"/>
@@ -3944,7 +3944,7 @@
         </w:trPr>
         <w:tc>
           <w:tcPr>
-            <w:tcW w:w="4175" w:type="dxa"/>
+            <w:tcW w:w="4151" w:type="dxa"/>
             <w:tcBorders>
               <w:top w:val="single" w:sz="4" w:space="0" w:color="999999"/>
               <w:left w:val="single" w:sz="4" w:space="0" w:color="999999"/>
@@ -3967,7 +3967,7 @@
         </w:tc>
         <w:tc>
           <w:tcPr>
-            <w:tcW w:w="2528" w:type="dxa"/>
+            <w:tcW w:w="2541" w:type="dxa"/>
             <w:tcBorders>
               <w:top w:val="single" w:sz="4" w:space="0" w:color="999999"/>
               <w:left w:val="single" w:sz="4" w:space="0" w:color="999999"/>
@@ -3990,7 +3990,7 @@
         </w:tc>
         <w:tc>
           <w:tcPr>
-            <w:tcW w:w="2369" w:type="dxa"/>
+            <w:tcW w:w="2380" w:type="dxa"/>
             <w:tcBorders>
               <w:top w:val="single" w:sz="4" w:space="0" w:color="999999"/>
               <w:left w:val="single" w:sz="4" w:space="0" w:color="999999"/>
@@ -4018,7 +4018,7 @@
         </w:trPr>
         <w:tc>
           <w:tcPr>
-            <w:tcW w:w="4175" w:type="dxa"/>
+            <w:tcW w:w="4151" w:type="dxa"/>
             <w:tcBorders>
               <w:top w:val="single" w:sz="4" w:space="0" w:color="999999"/>
               <w:left w:val="single" w:sz="4" w:space="0" w:color="999999"/>
@@ -4041,7 +4041,7 @@
         </w:tc>
         <w:tc>
           <w:tcPr>
-            <w:tcW w:w="2528" w:type="dxa"/>
+            <w:tcW w:w="2541" w:type="dxa"/>
             <w:tcBorders>
               <w:top w:val="single" w:sz="4" w:space="0" w:color="999999"/>
               <w:left w:val="single" w:sz="4" w:space="0" w:color="999999"/>
@@ -4064,7 +4064,7 @@
         </w:tc>
         <w:tc>
           <w:tcPr>
-            <w:tcW w:w="2369" w:type="dxa"/>
+            <w:tcW w:w="2380" w:type="dxa"/>
             <w:tcBorders>
               <w:top w:val="single" w:sz="4" w:space="0" w:color="999999"/>
               <w:left w:val="single" w:sz="4" w:space="0" w:color="999999"/>
@@ -4092,7 +4092,7 @@
         </w:trPr>
         <w:tc>
           <w:tcPr>
-            <w:tcW w:w="4175" w:type="dxa"/>
+            <w:tcW w:w="4151" w:type="dxa"/>
             <w:tcBorders>
               <w:top w:val="single" w:sz="4" w:space="0" w:color="999999"/>
               <w:left w:val="single" w:sz="4" w:space="0" w:color="999999"/>
@@ -4115,7 +4115,7 @@
         </w:tc>
         <w:tc>
           <w:tcPr>
-            <w:tcW w:w="2528" w:type="dxa"/>
+            <w:tcW w:w="2541" w:type="dxa"/>
             <w:tcBorders>
               <w:top w:val="single" w:sz="4" w:space="0" w:color="999999"/>
               <w:left w:val="single" w:sz="4" w:space="0" w:color="999999"/>
@@ -4138,7 +4138,7 @@
         </w:tc>
         <w:tc>
           <w:tcPr>
-            <w:tcW w:w="2369" w:type="dxa"/>
+            <w:tcW w:w="2380" w:type="dxa"/>
             <w:tcBorders>
               <w:top w:val="single" w:sz="4" w:space="0" w:color="999999"/>
               <w:left w:val="single" w:sz="4" w:space="0" w:color="999999"/>
@@ -4166,7 +4166,7 @@
         </w:trPr>
         <w:tc>
           <w:tcPr>
-            <w:tcW w:w="4175" w:type="dxa"/>
+            <w:tcW w:w="4151" w:type="dxa"/>
             <w:tcBorders>
               <w:top w:val="single" w:sz="4" w:space="0" w:color="999999"/>
               <w:left w:val="single" w:sz="4" w:space="0" w:color="999999"/>
@@ -4189,7 +4189,7 @@
         </w:tc>
         <w:tc>
           <w:tcPr>
-            <w:tcW w:w="2528" w:type="dxa"/>
+            <w:tcW w:w="2541" w:type="dxa"/>
             <w:tcBorders>
               <w:top w:val="single" w:sz="4" w:space="0" w:color="999999"/>
               <w:left w:val="single" w:sz="4" w:space="0" w:color="999999"/>
@@ -4212,7 +4212,7 @@
         </w:tc>
         <w:tc>
           <w:tcPr>
-            <w:tcW w:w="2369" w:type="dxa"/>
+            <w:tcW w:w="2380" w:type="dxa"/>
             <w:tcBorders>
               <w:top w:val="single" w:sz="4" w:space="0" w:color="999999"/>
               <w:left w:val="single" w:sz="4" w:space="0" w:color="999999"/>
@@ -4240,7 +4240,7 @@
         </w:trPr>
         <w:tc>
           <w:tcPr>
-            <w:tcW w:w="4175" w:type="dxa"/>
+            <w:tcW w:w="4151" w:type="dxa"/>
             <w:tcBorders>
               <w:top w:val="single" w:sz="4" w:space="0" w:color="999999"/>
               <w:left w:val="single" w:sz="4" w:space="0" w:color="999999"/>
@@ -4263,7 +4263,7 @@
         </w:tc>
         <w:tc>
           <w:tcPr>
-            <w:tcW w:w="2528" w:type="dxa"/>
+            <w:tcW w:w="2541" w:type="dxa"/>
             <w:tcBorders>
               <w:top w:val="single" w:sz="4" w:space="0" w:color="999999"/>
               <w:left w:val="single" w:sz="4" w:space="0" w:color="999999"/>
@@ -4286,7 +4286,7 @@
         </w:tc>
         <w:tc>
           <w:tcPr>
-            <w:tcW w:w="2369" w:type="dxa"/>
+            <w:tcW w:w="2380" w:type="dxa"/>
             <w:tcBorders>
               <w:top w:val="single" w:sz="4" w:space="0" w:color="999999"/>
               <w:left w:val="single" w:sz="4" w:space="0" w:color="999999"/>
@@ -4314,7 +4314,7 @@
         </w:trPr>
         <w:tc>
           <w:tcPr>
-            <w:tcW w:w="4175" w:type="dxa"/>
+            <w:tcW w:w="4151" w:type="dxa"/>
             <w:tcBorders>
               <w:top w:val="single" w:sz="4" w:space="0" w:color="999999"/>
               <w:left w:val="single" w:sz="4" w:space="0" w:color="999999"/>
@@ -4337,7 +4337,7 @@
         </w:tc>
         <w:tc>
           <w:tcPr>
-            <w:tcW w:w="2528" w:type="dxa"/>
+            <w:tcW w:w="2541" w:type="dxa"/>
             <w:tcBorders>
               <w:top w:val="single" w:sz="4" w:space="0" w:color="999999"/>
               <w:left w:val="single" w:sz="4" w:space="0" w:color="999999"/>
@@ -4357,7 +4357,7 @@
         </w:tc>
         <w:tc>
           <w:tcPr>
-            <w:tcW w:w="2369" w:type="dxa"/>
+            <w:tcW w:w="2380" w:type="dxa"/>
             <w:tcBorders>
               <w:top w:val="single" w:sz="4" w:space="0" w:color="999999"/>
               <w:left w:val="single" w:sz="4" w:space="0" w:color="999999"/>
@@ -4385,7 +4385,7 @@
         </w:trPr>
         <w:tc>
           <w:tcPr>
-            <w:tcW w:w="4175" w:type="dxa"/>
+            <w:tcW w:w="4151" w:type="dxa"/>
             <w:tcBorders>
               <w:top w:val="single" w:sz="4" w:space="0" w:color="999999"/>
               <w:left w:val="single" w:sz="4" w:space="0" w:color="999999"/>
@@ -4408,7 +4408,7 @@
         </w:tc>
         <w:tc>
           <w:tcPr>
-            <w:tcW w:w="2528" w:type="dxa"/>
+            <w:tcW w:w="2541" w:type="dxa"/>
             <w:tcBorders>
               <w:top w:val="single" w:sz="4" w:space="0" w:color="999999"/>
               <w:left w:val="single" w:sz="4" w:space="0" w:color="999999"/>
@@ -4431,7 +4431,7 @@
         </w:tc>
         <w:tc>
           <w:tcPr>
-            <w:tcW w:w="2369" w:type="dxa"/>
+            <w:tcW w:w="2380" w:type="dxa"/>
             <w:tcBorders>
               <w:top w:val="single" w:sz="4" w:space="0" w:color="999999"/>
               <w:left w:val="single" w:sz="4" w:space="0" w:color="999999"/>
@@ -4459,30 +4459,30 @@
         </w:trPr>
         <w:tc>
           <w:tcPr>
-            <w:tcW w:w="4175" w:type="dxa"/>
-            <w:tcBorders>
-              <w:top w:val="single" w:sz="4" w:space="0" w:color="999999"/>
-              <w:left w:val="single" w:sz="4" w:space="0" w:color="999999"/>
-              <w:bottom w:val="single" w:sz="4" w:space="0" w:color="999999"/>
-              <w:right w:val="single" w:sz="4" w:space="0" w:color="999999"/>
-            </w:tcBorders>
-            <w:vAlign w:val="center"/>
-          </w:tcPr>
-          <w:p>
-            <w:pPr>
-              <w:pStyle w:val="Compact"/>
-            </w:pPr>
-            <w:r>
-              <w:rPr>
-                <w:rtl/>
-              </w:rPr>
-              <w:t xml:space="preserve">דיווח חיים של כל בקר</w:t>
-            </w:r>
-          </w:p>
-        </w:tc>
-        <w:tc>
-          <w:tcPr>
-            <w:tcW w:w="2528" w:type="dxa"/>
+            <w:tcW w:w="4151" w:type="dxa"/>
+            <w:tcBorders>
+              <w:top w:val="single" w:sz="4" w:space="0" w:color="999999"/>
+              <w:left w:val="single" w:sz="4" w:space="0" w:color="999999"/>
+              <w:bottom w:val="single" w:sz="4" w:space="0" w:color="999999"/>
+              <w:right w:val="single" w:sz="4" w:space="0" w:color="999999"/>
+            </w:tcBorders>
+            <w:vAlign w:val="center"/>
+          </w:tcPr>
+          <w:p>
+            <w:pPr>
+              <w:pStyle w:val="Compact"/>
+            </w:pPr>
+            <w:r>
+              <w:rPr>
+                <w:rtl/>
+              </w:rPr>
+              <w:t xml:space="preserve">דיווח חיים</w:t>
+            </w:r>
+          </w:p>
+        </w:tc>
+        <w:tc>
+          <w:tcPr>
+            <w:tcW w:w="2541" w:type="dxa"/>
             <w:tcBorders>
               <w:top w:val="single" w:sz="4" w:space="0" w:color="999999"/>
               <w:left w:val="single" w:sz="4" w:space="0" w:color="999999"/>
@@ -4505,24 +4505,24 @@
         </w:tc>
         <w:tc>
           <w:tcPr>
-            <w:tcW w:w="2369" w:type="dxa"/>
-            <w:tcBorders>
-              <w:top w:val="single" w:sz="4" w:space="0" w:color="999999"/>
-              <w:left w:val="single" w:sz="4" w:space="0" w:color="999999"/>
-              <w:bottom w:val="single" w:sz="4" w:space="0" w:color="999999"/>
-              <w:right w:val="single" w:sz="4" w:space="0" w:color="999999"/>
-            </w:tcBorders>
-            <w:vAlign w:val="center"/>
-          </w:tcPr>
-          <w:p>
-            <w:pPr>
-              <w:pStyle w:val="Compact"/>
-            </w:pPr>
-            <w:r>
-              <w:rPr>
-                <w:rtl/>
-              </w:rPr>
-              <w:t xml:space="preserve">כל הבקרים</w:t>
+            <w:tcW w:w="2380" w:type="dxa"/>
+            <w:tcBorders>
+              <w:top w:val="single" w:sz="4" w:space="0" w:color="999999"/>
+              <w:left w:val="single" w:sz="4" w:space="0" w:color="999999"/>
+              <w:bottom w:val="single" w:sz="4" w:space="0" w:color="999999"/>
+              <w:right w:val="single" w:sz="4" w:space="0" w:color="999999"/>
+            </w:tcBorders>
+            <w:vAlign w:val="center"/>
+          </w:tcPr>
+          <w:p>
+            <w:pPr>
+              <w:pStyle w:val="Compact"/>
+            </w:pPr>
+            <w:r>
+              <w:rPr>
+                <w:rtl/>
+              </w:rPr>
+              <w:t xml:space="preserve">בקר החיישנים ובקר הדלת</w:t>
             </w:r>
           </w:p>
         </w:tc>
@@ -4533,7 +4533,7 @@
         </w:trPr>
         <w:tc>
           <w:tcPr>
-            <w:tcW w:w="4175" w:type="dxa"/>
+            <w:tcW w:w="4151" w:type="dxa"/>
             <w:tcBorders>
               <w:top w:val="single" w:sz="4" w:space="0" w:color="999999"/>
               <w:left w:val="single" w:sz="4" w:space="0" w:color="999999"/>
@@ -4556,7 +4556,7 @@
         </w:tc>
         <w:tc>
           <w:tcPr>
-            <w:tcW w:w="2528" w:type="dxa"/>
+            <w:tcW w:w="2541" w:type="dxa"/>
             <w:tcBorders>
               <w:top w:val="single" w:sz="4" w:space="0" w:color="999999"/>
               <w:left w:val="single" w:sz="4" w:space="0" w:color="999999"/>
@@ -4579,7 +4579,7 @@
         </w:tc>
         <w:tc>
           <w:tcPr>
-            <w:tcW w:w="2369" w:type="dxa"/>
+            <w:tcW w:w="2380" w:type="dxa"/>
             <w:tcBorders>
               <w:top w:val="single" w:sz="4" w:space="0" w:color="999999"/>
               <w:left w:val="single" w:sz="4" w:space="0" w:color="999999"/>
@@ -4607,7 +4607,7 @@
         </w:trPr>
         <w:tc>
           <w:tcPr>
-            <w:tcW w:w="4175" w:type="dxa"/>
+            <w:tcW w:w="4151" w:type="dxa"/>
             <w:tcBorders>
               <w:top w:val="single" w:sz="4" w:space="0" w:color="999999"/>
               <w:left w:val="single" w:sz="4" w:space="0" w:color="999999"/>
@@ -4630,7 +4630,7 @@
         </w:tc>
         <w:tc>
           <w:tcPr>
-            <w:tcW w:w="2528" w:type="dxa"/>
+            <w:tcW w:w="2541" w:type="dxa"/>
             <w:tcBorders>
               <w:top w:val="single" w:sz="4" w:space="0" w:color="999999"/>
               <w:left w:val="single" w:sz="4" w:space="0" w:color="999999"/>
@@ -4653,7 +4653,7 @@
         </w:tc>
         <w:tc>
           <w:tcPr>
-            <w:tcW w:w="2369" w:type="dxa"/>
+            <w:tcW w:w="2380" w:type="dxa"/>
             <w:tcBorders>
               <w:top w:val="single" w:sz="4" w:space="0" w:color="999999"/>
               <w:left w:val="single" w:sz="4" w:space="0" w:color="999999"/>
@@ -4681,7 +4681,7 @@
         </w:trPr>
         <w:tc>
           <w:tcPr>
-            <w:tcW w:w="4175" w:type="dxa"/>
+            <w:tcW w:w="4151" w:type="dxa"/>
             <w:tcBorders>
               <w:top w:val="single" w:sz="4" w:space="0" w:color="999999"/>
               <w:left w:val="single" w:sz="4" w:space="0" w:color="999999"/>
@@ -4704,7 +4704,7 @@
         </w:tc>
         <w:tc>
           <w:tcPr>
-            <w:tcW w:w="2528" w:type="dxa"/>
+            <w:tcW w:w="2541" w:type="dxa"/>
             <w:tcBorders>
               <w:top w:val="single" w:sz="4" w:space="0" w:color="999999"/>
               <w:left w:val="single" w:sz="4" w:space="0" w:color="999999"/>
@@ -4727,7 +4727,7 @@
         </w:tc>
         <w:tc>
           <w:tcPr>
-            <w:tcW w:w="2369" w:type="dxa"/>
+            <w:tcW w:w="2380" w:type="dxa"/>
             <w:tcBorders>
               <w:top w:val="single" w:sz="4" w:space="0" w:color="999999"/>
               <w:left w:val="single" w:sz="4" w:space="0" w:color="999999"/>
@@ -4755,7 +4755,7 @@
         </w:trPr>
         <w:tc>
           <w:tcPr>
-            <w:tcW w:w="4175" w:type="dxa"/>
+            <w:tcW w:w="4151" w:type="dxa"/>
             <w:tcBorders>
               <w:top w:val="single" w:sz="4" w:space="0" w:color="999999"/>
               <w:left w:val="single" w:sz="4" w:space="0" w:color="999999"/>
@@ -4778,7 +4778,7 @@
         </w:tc>
         <w:tc>
           <w:tcPr>
-            <w:tcW w:w="2528" w:type="dxa"/>
+            <w:tcW w:w="2541" w:type="dxa"/>
             <w:tcBorders>
               <w:top w:val="single" w:sz="4" w:space="0" w:color="999999"/>
               <w:left w:val="single" w:sz="4" w:space="0" w:color="999999"/>
@@ -4801,7 +4801,7 @@
         </w:tc>
         <w:tc>
           <w:tcPr>
-            <w:tcW w:w="2369" w:type="dxa"/>
+            <w:tcW w:w="2380" w:type="dxa"/>
             <w:tcBorders>
               <w:top w:val="single" w:sz="4" w:space="0" w:color="999999"/>
               <w:left w:val="single" w:sz="4" w:space="0" w:color="999999"/>
@@ -4829,7 +4829,7 @@
         </w:trPr>
         <w:tc>
           <w:tcPr>
-            <w:tcW w:w="4175" w:type="dxa"/>
+            <w:tcW w:w="4151" w:type="dxa"/>
             <w:tcBorders>
               <w:top w:val="single" w:sz="4" w:space="0" w:color="999999"/>
               <w:left w:val="single" w:sz="4" w:space="0" w:color="999999"/>
@@ -4852,7 +4852,7 @@
         </w:tc>
         <w:tc>
           <w:tcPr>
-            <w:tcW w:w="2528" w:type="dxa"/>
+            <w:tcW w:w="2541" w:type="dxa"/>
             <w:tcBorders>
               <w:top w:val="single" w:sz="4" w:space="0" w:color="999999"/>
               <w:left w:val="single" w:sz="4" w:space="0" w:color="999999"/>
@@ -4875,7 +4875,7 @@
         </w:tc>
         <w:tc>
           <w:tcPr>
-            <w:tcW w:w="2369" w:type="dxa"/>
+            <w:tcW w:w="2380" w:type="dxa"/>
             <w:tcBorders>
               <w:top w:val="single" w:sz="4" w:space="0" w:color="999999"/>
               <w:left w:val="single" w:sz="4" w:space="0" w:color="999999"/>
@@ -4903,7 +4903,7 @@
         </w:trPr>
         <w:tc>
           <w:tcPr>
-            <w:tcW w:w="4175" w:type="dxa"/>
+            <w:tcW w:w="4151" w:type="dxa"/>
             <w:tcBorders>
               <w:top w:val="single" w:sz="4" w:space="0" w:color="999999"/>
               <w:left w:val="single" w:sz="4" w:space="0" w:color="999999"/>
@@ -4926,7 +4926,7 @@
         </w:tc>
         <w:tc>
           <w:tcPr>
-            <w:tcW w:w="2528" w:type="dxa"/>
+            <w:tcW w:w="2541" w:type="dxa"/>
             <w:tcBorders>
               <w:top w:val="single" w:sz="4" w:space="0" w:color="999999"/>
               <w:left w:val="single" w:sz="4" w:space="0" w:color="999999"/>
@@ -4949,7 +4949,7 @@
         </w:tc>
         <w:tc>
           <w:tcPr>
-            <w:tcW w:w="2369" w:type="dxa"/>
+            <w:tcW w:w="2380" w:type="dxa"/>
             <w:tcBorders>
               <w:top w:val="single" w:sz="4" w:space="0" w:color="999999"/>
               <w:left w:val="single" w:sz="4" w:space="0" w:color="999999"/>
@@ -4977,7 +4977,7 @@
         </w:trPr>
         <w:tc>
           <w:tcPr>
-            <w:tcW w:w="4175" w:type="dxa"/>
+            <w:tcW w:w="4151" w:type="dxa"/>
             <w:tcBorders>
               <w:top w:val="single" w:sz="4" w:space="0" w:color="999999"/>
               <w:left w:val="single" w:sz="4" w:space="0" w:color="999999"/>
@@ -5000,7 +5000,7 @@
         </w:tc>
         <w:tc>
           <w:tcPr>
-            <w:tcW w:w="2528" w:type="dxa"/>
+            <w:tcW w:w="2541" w:type="dxa"/>
             <w:tcBorders>
               <w:top w:val="single" w:sz="4" w:space="0" w:color="999999"/>
               <w:left w:val="single" w:sz="4" w:space="0" w:color="999999"/>
@@ -5023,7 +5023,7 @@
         </w:tc>
         <w:tc>
           <w:tcPr>
-            <w:tcW w:w="2369" w:type="dxa"/>
+            <w:tcW w:w="2380" w:type="dxa"/>
             <w:tcBorders>
               <w:top w:val="single" w:sz="4" w:space="0" w:color="999999"/>
               <w:left w:val="single" w:sz="4" w:space="0" w:color="999999"/>
@@ -9299,9 +9299,9 @@
         </w:tblCellMar>
       </w:tblPr>
       <w:tblGrid>
-        <w:gridCol w:w="1926"/>
-        <w:gridCol w:w="3951"/>
-        <w:gridCol w:w="3195"/>
+        <w:gridCol w:w="1848"/>
+        <w:gridCol w:w="4067"/>
+        <w:gridCol w:w="3157"/>
       </w:tblGrid>
       <w:tr>
         <w:trPr>
@@ -9311,7 +9311,7 @@
         </w:trPr>
         <w:tc>
           <w:tcPr>
-            <w:tcW w:w="1926" w:type="dxa"/>
+            <w:tcW w:w="1848" w:type="dxa"/>
             <w:tcBorders>
               <w:top w:val="single" w:sz="4" w:space="0" w:color="999999"/>
               <w:left w:val="single" w:sz="4" w:space="0" w:color="999999"/>
@@ -9338,7 +9338,7 @@
         </w:tc>
         <w:tc>
           <w:tcPr>
-            <w:tcW w:w="3951" w:type="dxa"/>
+            <w:tcW w:w="4067" w:type="dxa"/>
             <w:tcBorders>
               <w:top w:val="single" w:sz="4" w:space="0" w:color="999999"/>
               <w:left w:val="single" w:sz="4" w:space="0" w:color="999999"/>
@@ -9365,7 +9365,7 @@
         </w:tc>
         <w:tc>
           <w:tcPr>
-            <w:tcW w:w="3195" w:type="dxa"/>
+            <w:tcW w:w="3157" w:type="dxa"/>
             <w:tcBorders>
               <w:top w:val="single" w:sz="4" w:space="0" w:color="999999"/>
               <w:left w:val="single" w:sz="4" w:space="0" w:color="999999"/>
@@ -9397,7 +9397,7 @@
         </w:trPr>
         <w:tc>
           <w:tcPr>
-            <w:tcW w:w="1926" w:type="dxa"/>
+            <w:tcW w:w="1848" w:type="dxa"/>
             <w:tcBorders>
               <w:top w:val="single" w:sz="4" w:space="0" w:color="999999"/>
               <w:left w:val="single" w:sz="4" w:space="0" w:color="999999"/>
@@ -9420,7 +9420,7 @@
         </w:tc>
         <w:tc>
           <w:tcPr>
-            <w:tcW w:w="3951" w:type="dxa"/>
+            <w:tcW w:w="4067" w:type="dxa"/>
             <w:tcBorders>
               <w:top w:val="single" w:sz="4" w:space="0" w:color="999999"/>
               <w:left w:val="single" w:sz="4" w:space="0" w:color="999999"/>
@@ -9461,7 +9461,7 @@
         </w:tc>
         <w:tc>
           <w:tcPr>
-            <w:tcW w:w="3195" w:type="dxa"/>
+            <w:tcW w:w="3157" w:type="dxa"/>
             <w:tcBorders>
               <w:top w:val="single" w:sz="4" w:space="0" w:color="999999"/>
               <w:left w:val="single" w:sz="4" w:space="0" w:color="999999"/>
@@ -9489,7 +9489,7 @@
         </w:trPr>
         <w:tc>
           <w:tcPr>
-            <w:tcW w:w="1926" w:type="dxa"/>
+            <w:tcW w:w="1848" w:type="dxa"/>
             <w:tcBorders>
               <w:top w:val="single" w:sz="4" w:space="0" w:color="999999"/>
               <w:left w:val="single" w:sz="4" w:space="0" w:color="999999"/>
@@ -9512,7 +9512,7 @@
         </w:tc>
         <w:tc>
           <w:tcPr>
-            <w:tcW w:w="3951" w:type="dxa"/>
+            <w:tcW w:w="4067" w:type="dxa"/>
             <w:tcBorders>
               <w:top w:val="single" w:sz="4" w:space="0" w:color="999999"/>
               <w:left w:val="single" w:sz="4" w:space="0" w:color="999999"/>
@@ -9553,7 +9553,7 @@
         </w:tc>
         <w:tc>
           <w:tcPr>
-            <w:tcW w:w="3195" w:type="dxa"/>
+            <w:tcW w:w="3157" w:type="dxa"/>
             <w:tcBorders>
               <w:top w:val="single" w:sz="4" w:space="0" w:color="999999"/>
               <w:left w:val="single" w:sz="4" w:space="0" w:color="999999"/>
@@ -9578,30 +9578,30 @@
         </w:trPr>
         <w:tc>
           <w:tcPr>
-            <w:tcW w:w="1926" w:type="dxa"/>
-            <w:tcBorders>
-              <w:top w:val="single" w:sz="4" w:space="0" w:color="999999"/>
-              <w:left w:val="single" w:sz="4" w:space="0" w:color="999999"/>
-              <w:bottom w:val="single" w:sz="4" w:space="0" w:color="999999"/>
-              <w:right w:val="single" w:sz="4" w:space="0" w:color="999999"/>
-            </w:tcBorders>
-            <w:vAlign w:val="center"/>
-          </w:tcPr>
-          <w:p>
-            <w:pPr>
-              <w:pStyle w:val="Compact"/>
-            </w:pPr>
-            <w:r>
-              <w:rPr>
-                <w:rtl/>
-              </w:rPr>
-              <w:t xml:space="preserve">נטרול</w:t>
-            </w:r>
-          </w:p>
-        </w:tc>
-        <w:tc>
-          <w:tcPr>
-            <w:tcW w:w="3951" w:type="dxa"/>
+            <w:tcW w:w="1848" w:type="dxa"/>
+            <w:tcBorders>
+              <w:top w:val="single" w:sz="4" w:space="0" w:color="999999"/>
+              <w:left w:val="single" w:sz="4" w:space="0" w:color="999999"/>
+              <w:bottom w:val="single" w:sz="4" w:space="0" w:color="999999"/>
+              <w:right w:val="single" w:sz="4" w:space="0" w:color="999999"/>
+            </w:tcBorders>
+            <w:vAlign w:val="center"/>
+          </w:tcPr>
+          <w:p>
+            <w:pPr>
+              <w:pStyle w:val="Compact"/>
+            </w:pPr>
+            <w:r>
+              <w:rPr>
+                <w:rtl/>
+              </w:rPr>
+              <w:t xml:space="preserve">נטרול כשהאזעקה פועלת</w:t>
+            </w:r>
+          </w:p>
+        </w:tc>
+        <w:tc>
+          <w:tcPr>
+            <w:tcW w:w="4067" w:type="dxa"/>
             <w:tcBorders>
               <w:top w:val="single" w:sz="4" w:space="0" w:color="999999"/>
               <w:left w:val="single" w:sz="4" w:space="0" w:color="999999"/>
@@ -9630,7 +9630,7 @@
         </w:tc>
         <w:tc>
           <w:tcPr>
-            <w:tcW w:w="3195" w:type="dxa"/>
+            <w:tcW w:w="3157" w:type="dxa"/>
             <w:tcBorders>
               <w:top w:val="single" w:sz="4" w:space="0" w:color="999999"/>
               <w:left w:val="single" w:sz="4" w:space="0" w:color="999999"/>
@@ -9655,7 +9655,7 @@
         </w:trPr>
         <w:tc>
           <w:tcPr>
-            <w:tcW w:w="1926" w:type="dxa"/>
+            <w:tcW w:w="1848" w:type="dxa"/>
             <w:tcBorders>
               <w:top w:val="single" w:sz="4" w:space="0" w:color="999999"/>
               <w:left w:val="single" w:sz="4" w:space="0" w:color="999999"/>
@@ -9678,7 +9678,7 @@
         </w:tc>
         <w:tc>
           <w:tcPr>
-            <w:tcW w:w="3951" w:type="dxa"/>
+            <w:tcW w:w="4067" w:type="dxa"/>
             <w:tcBorders>
               <w:top w:val="single" w:sz="4" w:space="0" w:color="999999"/>
               <w:left w:val="single" w:sz="4" w:space="0" w:color="999999"/>
@@ -9716,21 +9716,24 @@
         </w:tc>
         <w:tc>
           <w:tcPr>
-            <w:tcW w:w="3195" w:type="dxa"/>
-            <w:tcBorders>
-              <w:top w:val="single" w:sz="4" w:space="0" w:color="999999"/>
-              <w:left w:val="single" w:sz="4" w:space="0" w:color="999999"/>
-              <w:bottom w:val="single" w:sz="4" w:space="0" w:color="999999"/>
-              <w:right w:val="single" w:sz="4" w:space="0" w:color="999999"/>
-            </w:tcBorders>
-            <w:vAlign w:val="center"/>
-          </w:tcPr>
-          <w:p>
-            <w:pPr>
-              <w:pStyle w:val="Compact"/>
-            </w:pPr>
-            <w:r>
-              <w:t xml:space="preserve">DISARM</w:t>
+            <w:tcW w:w="3157" w:type="dxa"/>
+            <w:tcBorders>
+              <w:top w:val="single" w:sz="4" w:space="0" w:color="999999"/>
+              <w:left w:val="single" w:sz="4" w:space="0" w:color="999999"/>
+              <w:bottom w:val="single" w:sz="4" w:space="0" w:color="999999"/>
+              <w:right w:val="single" w:sz="4" w:space="0" w:color="999999"/>
+            </w:tcBorders>
+            <w:vAlign w:val="center"/>
+          </w:tcPr>
+          <w:p>
+            <w:pPr>
+              <w:pStyle w:val="Compact"/>
+            </w:pPr>
+            <w:r>
+              <w:rPr>
+                <w:rtl/>
+              </w:rPr>
+              <w:t xml:space="preserve">DISARM, גם בזמן הספירה</w:t>
             </w:r>
           </w:p>
         </w:tc>
@@ -9741,30 +9744,30 @@
         </w:trPr>
         <w:tc>
           <w:tcPr>
-            <w:tcW w:w="1926" w:type="dxa"/>
-            <w:tcBorders>
-              <w:top w:val="single" w:sz="4" w:space="0" w:color="999999"/>
-              <w:left w:val="single" w:sz="4" w:space="0" w:color="999999"/>
-              <w:bottom w:val="single" w:sz="4" w:space="0" w:color="999999"/>
-              <w:right w:val="single" w:sz="4" w:space="0" w:color="999999"/>
-            </w:tcBorders>
-            <w:vAlign w:val="center"/>
-          </w:tcPr>
-          <w:p>
-            <w:pPr>
-              <w:pStyle w:val="Compact"/>
-            </w:pPr>
-            <w:r>
-              <w:rPr>
-                <w:rtl/>
-              </w:rPr>
-              <w:t xml:space="preserve">שינוי הקוד</w:t>
-            </w:r>
-          </w:p>
-        </w:tc>
-        <w:tc>
-          <w:tcPr>
-            <w:tcW w:w="3951" w:type="dxa"/>
+            <w:tcW w:w="1848" w:type="dxa"/>
+            <w:tcBorders>
+              <w:top w:val="single" w:sz="4" w:space="0" w:color="999999"/>
+              <w:left w:val="single" w:sz="4" w:space="0" w:color="999999"/>
+              <w:bottom w:val="single" w:sz="4" w:space="0" w:color="999999"/>
+              <w:right w:val="single" w:sz="4" w:space="0" w:color="999999"/>
+            </w:tcBorders>
+            <w:vAlign w:val="center"/>
+          </w:tcPr>
+          <w:p>
+            <w:pPr>
+              <w:pStyle w:val="Compact"/>
+            </w:pPr>
+            <w:r>
+              <w:rPr>
+                <w:rtl/>
+              </w:rPr>
+              <w:t xml:space="preserve">הוספת פנים</w:t>
+            </w:r>
+          </w:p>
+        </w:tc>
+        <w:tc>
+          <w:tcPr>
+            <w:tcW w:w="4067" w:type="dxa"/>
             <w:tcBorders>
               <w:top w:val="single" w:sz="4" w:space="0" w:color="999999"/>
               <w:left w:val="single" w:sz="4" w:space="0" w:color="999999"/>
@@ -9784,24 +9787,24 @@
         </w:tc>
         <w:tc>
           <w:tcPr>
-            <w:tcW w:w="3195" w:type="dxa"/>
-            <w:tcBorders>
-              <w:top w:val="single" w:sz="4" w:space="0" w:color="999999"/>
-              <w:left w:val="single" w:sz="4" w:space="0" w:color="999999"/>
-              <w:bottom w:val="single" w:sz="4" w:space="0" w:color="999999"/>
-              <w:right w:val="single" w:sz="4" w:space="0" w:color="999999"/>
-            </w:tcBorders>
-            <w:vAlign w:val="center"/>
-          </w:tcPr>
-          <w:p>
-            <w:pPr>
-              <w:pStyle w:val="Compact"/>
-            </w:pPr>
-            <w:r>
-              <w:rPr>
-                <w:rtl/>
-              </w:rPr>
-              <w:t xml:space="preserve">הגדרות, שינוי סיסמה וקוד</w:t>
+            <w:tcW w:w="3157" w:type="dxa"/>
+            <w:tcBorders>
+              <w:top w:val="single" w:sz="4" w:space="0" w:color="999999"/>
+              <w:left w:val="single" w:sz="4" w:space="0" w:color="999999"/>
+              <w:bottom w:val="single" w:sz="4" w:space="0" w:color="999999"/>
+              <w:right w:val="single" w:sz="4" w:space="0" w:color="999999"/>
+            </w:tcBorders>
+            <w:vAlign w:val="center"/>
+          </w:tcPr>
+          <w:p>
+            <w:pPr>
+              <w:pStyle w:val="Compact"/>
+            </w:pPr>
+            <w:r>
+              <w:rPr>
+                <w:rtl/>
+              </w:rPr>
+              <w:t xml:space="preserve">מסך הפנים, הוספה עם שם</w:t>
             </w:r>
           </w:p>
         </w:tc>
@@ -9812,30 +9815,30 @@
         </w:trPr>
         <w:tc>
           <w:tcPr>
-            <w:tcW w:w="1926" w:type="dxa"/>
-            <w:tcBorders>
-              <w:top w:val="single" w:sz="4" w:space="0" w:color="999999"/>
-              <w:left w:val="single" w:sz="4" w:space="0" w:color="999999"/>
-              <w:bottom w:val="single" w:sz="4" w:space="0" w:color="999999"/>
-              <w:right w:val="single" w:sz="4" w:space="0" w:color="999999"/>
-            </w:tcBorders>
-            <w:vAlign w:val="center"/>
-          </w:tcPr>
-          <w:p>
-            <w:pPr>
-              <w:pStyle w:val="Compact"/>
-            </w:pPr>
-            <w:r>
-              <w:rPr>
-                <w:rtl/>
-              </w:rPr>
-              <w:t xml:space="preserve">הוספת פנים</w:t>
-            </w:r>
-          </w:p>
-        </w:tc>
-        <w:tc>
-          <w:tcPr>
-            <w:tcW w:w="3951" w:type="dxa"/>
+            <w:tcW w:w="1848" w:type="dxa"/>
+            <w:tcBorders>
+              <w:top w:val="single" w:sz="4" w:space="0" w:color="999999"/>
+              <w:left w:val="single" w:sz="4" w:space="0" w:color="999999"/>
+              <w:bottom w:val="single" w:sz="4" w:space="0" w:color="999999"/>
+              <w:right w:val="single" w:sz="4" w:space="0" w:color="999999"/>
+            </w:tcBorders>
+            <w:vAlign w:val="center"/>
+          </w:tcPr>
+          <w:p>
+            <w:pPr>
+              <w:pStyle w:val="Compact"/>
+            </w:pPr>
+            <w:r>
+              <w:rPr>
+                <w:rtl/>
+              </w:rPr>
+              <w:t xml:space="preserve">דריכה אוטומטית בלילה</w:t>
+            </w:r>
+          </w:p>
+        </w:tc>
+        <w:tc>
+          <w:tcPr>
+            <w:tcW w:w="4067" w:type="dxa"/>
             <w:tcBorders>
               <w:top w:val="single" w:sz="4" w:space="0" w:color="999999"/>
               <w:left w:val="single" w:sz="4" w:space="0" w:color="999999"/>
@@ -9855,149 +9858,7 @@
         </w:tc>
         <w:tc>
           <w:tcPr>
-            <w:tcW w:w="3195" w:type="dxa"/>
-            <w:tcBorders>
-              <w:top w:val="single" w:sz="4" w:space="0" w:color="999999"/>
-              <w:left w:val="single" w:sz="4" w:space="0" w:color="999999"/>
-              <w:bottom w:val="single" w:sz="4" w:space="0" w:color="999999"/>
-              <w:right w:val="single" w:sz="4" w:space="0" w:color="999999"/>
-            </w:tcBorders>
-            <w:vAlign w:val="center"/>
-          </w:tcPr>
-          <w:p>
-            <w:pPr>
-              <w:pStyle w:val="Compact"/>
-            </w:pPr>
-            <w:r>
-              <w:rPr>
-                <w:rtl/>
-              </w:rPr>
-              <w:t xml:space="preserve">מסך הפנים, הוספה עם שם</w:t>
-            </w:r>
-          </w:p>
-        </w:tc>
-      </w:tr>
-      <w:tr>
-        <w:trPr>
-          <w:cantSplit/>
-        </w:trPr>
-        <w:tc>
-          <w:tcPr>
-            <w:tcW w:w="1926" w:type="dxa"/>
-            <w:tcBorders>
-              <w:top w:val="single" w:sz="4" w:space="0" w:color="999999"/>
-              <w:left w:val="single" w:sz="4" w:space="0" w:color="999999"/>
-              <w:bottom w:val="single" w:sz="4" w:space="0" w:color="999999"/>
-              <w:right w:val="single" w:sz="4" w:space="0" w:color="999999"/>
-            </w:tcBorders>
-            <w:vAlign w:val="center"/>
-          </w:tcPr>
-          <w:p>
-            <w:pPr>
-              <w:pStyle w:val="Compact"/>
-            </w:pPr>
-            <w:r>
-              <w:rPr>
-                <w:rtl/>
-              </w:rPr>
-              <w:t xml:space="preserve">שינוי נמעני האימייל</w:t>
-            </w:r>
-          </w:p>
-        </w:tc>
-        <w:tc>
-          <w:tcPr>
-            <w:tcW w:w="3951" w:type="dxa"/>
-            <w:tcBorders>
-              <w:top w:val="single" w:sz="4" w:space="0" w:color="999999"/>
-              <w:left w:val="single" w:sz="4" w:space="0" w:color="999999"/>
-              <w:bottom w:val="single" w:sz="4" w:space="0" w:color="999999"/>
-              <w:right w:val="single" w:sz="4" w:space="0" w:color="999999"/>
-            </w:tcBorders>
-            <w:vAlign w:val="center"/>
-          </w:tcPr>
-          <w:p>
-            <w:pPr>
-              <w:pStyle w:val="Compact"/>
-            </w:pPr>
-            <w:r>
-              <w:t xml:space="preserve">—</w:t>
-            </w:r>
-          </w:p>
-        </w:tc>
-        <w:tc>
-          <w:tcPr>
-            <w:tcW w:w="3195" w:type="dxa"/>
-            <w:tcBorders>
-              <w:top w:val="single" w:sz="4" w:space="0" w:color="999999"/>
-              <w:left w:val="single" w:sz="4" w:space="0" w:color="999999"/>
-              <w:bottom w:val="single" w:sz="4" w:space="0" w:color="999999"/>
-              <w:right w:val="single" w:sz="4" w:space="0" w:color="999999"/>
-            </w:tcBorders>
-            <w:vAlign w:val="center"/>
-          </w:tcPr>
-          <w:p>
-            <w:pPr>
-              <w:pStyle w:val="Compact"/>
-            </w:pPr>
-            <w:r>
-              <w:rPr>
-                <w:rtl/>
-              </w:rPr>
-              <w:t xml:space="preserve">הגדרות, התראות</w:t>
-            </w:r>
-          </w:p>
-        </w:tc>
-      </w:tr>
-      <w:tr>
-        <w:trPr>
-          <w:cantSplit/>
-        </w:trPr>
-        <w:tc>
-          <w:tcPr>
-            <w:tcW w:w="1926" w:type="dxa"/>
-            <w:tcBorders>
-              <w:top w:val="single" w:sz="4" w:space="0" w:color="999999"/>
-              <w:left w:val="single" w:sz="4" w:space="0" w:color="999999"/>
-              <w:bottom w:val="single" w:sz="4" w:space="0" w:color="999999"/>
-              <w:right w:val="single" w:sz="4" w:space="0" w:color="999999"/>
-            </w:tcBorders>
-            <w:vAlign w:val="center"/>
-          </w:tcPr>
-          <w:p>
-            <w:pPr>
-              <w:pStyle w:val="Compact"/>
-            </w:pPr>
-            <w:r>
-              <w:rPr>
-                <w:rtl/>
-              </w:rPr>
-              <w:t xml:space="preserve">דריכה אוטומטית בלילה</w:t>
-            </w:r>
-          </w:p>
-        </w:tc>
-        <w:tc>
-          <w:tcPr>
-            <w:tcW w:w="3951" w:type="dxa"/>
-            <w:tcBorders>
-              <w:top w:val="single" w:sz="4" w:space="0" w:color="999999"/>
-              <w:left w:val="single" w:sz="4" w:space="0" w:color="999999"/>
-              <w:bottom w:val="single" w:sz="4" w:space="0" w:color="999999"/>
-              <w:right w:val="single" w:sz="4" w:space="0" w:color="999999"/>
-            </w:tcBorders>
-            <w:vAlign w:val="center"/>
-          </w:tcPr>
-          <w:p>
-            <w:pPr>
-              <w:pStyle w:val="Compact"/>
-            </w:pPr>
-            <w:r>
-              <w:t xml:space="preserve">—</w:t>
-            </w:r>
-          </w:p>
-        </w:tc>
-        <w:tc>
-          <w:tcPr>
-            <w:tcW w:w="3195" w:type="dxa"/>
+            <w:tcW w:w="3157" w:type="dxa"/>
             <w:tcBorders>
               <w:top w:val="single" w:sz="4" w:space="0" w:color="999999"/>
               <w:left w:val="single" w:sz="4" w:space="0" w:color="999999"/>

</xml_diff>

<commit_message>
Align the report with the department rules: unit symbols, passive voice, hierarchical appendix numbering, findings in the abstract
Co-Authored-By: Claude Sonnet 5.5 <noreply@anthropic.com>
Claude-Session: https://claude.ai/code/session_01N3vMpjMW2wYwoiVm9vYhWU
</commit_message>
<xml_diff>
--- a/report/HomeGuard_Report.docx
+++ b/report/HomeGuard_Report.docx
@@ -689,6 +689,17 @@
         <w:t xml:space="preserve">בפרויקט נבנתה מערכת אזעקה לבית. שלושה בקרי ESP32 מחוברים ב-WiFi לשרת (בקנד) שכתוב ב-Python ורץ על מחשב: בקר אחד עם חיישן מרחק וחיישן רעידות, בקר שני בדלת עם חיישן דלת, קודן וזמזמים, ובקר שלישי עם מצלמה. הבקנד מחליט מתי יש אזעקה, מזהה פנים של דיירים ושולח אימייל עם תמונה מהמצלמה. אפליקציה בטלפון מאפשרת לדרוך ולנטרל, לראות את המצלמה ולעבור על יומן אירועים. אפשר לדרוך ולנטרל גם מהקודן שליד הדלת. דרישות החובה של הפרויקט מומשו. שני דברים שהוצעו לא מומשו: חיוג אוטומטי לגורם חירום, ונעילת הקודן אחרי כמה קודים שגויים.</w:t>
       </w:r>
     </w:p>
+    <w:p>
+      <w:pPr>
+        <w:pStyle w:val="BodyText"/>
+      </w:pPr>
+      <w:r>
+        <w:rPr>
+          <w:rtl/>
+        </w:rPr>
+        <w:t xml:space="preserve">המערכת נבדקה על החומרה בתרחישי דריכה, כניסה, חדירה ונטרול, ונבחנו הצלילים, המסך באפליקציה ויומן האירועים. המסקנה העיקרית היא שהפרדה בין בקרים פשוטים, שרק מדווחים, לבין בקנד שמחליט מאפשרת לשנות את התנהגות המערכת בלי לצרוב את הבקרים מחדש. רוב הבעיות התגלו רק על החומרה, ולא בבדיקות האוטומטיות.</w:t>
+      </w:r>
+    </w:p>
     <w:bookmarkEnd w:id="20"/>
     <w:bookmarkStart w:id="25" w:name="מבוא"/>
     <w:p>
@@ -866,7 +877,7 @@
         <w:rPr>
           <w:rtl/>
         </w:rPr>
-        <w:t xml:space="preserve">במקום מצלמת USB שמחוברת למחשב משתמשים ב-ESP32-CAM.</w:t>
+        <w:t xml:space="preserve">במקום מצלמת USB שמחוברת למחשב נעשה שימוש ב-ESP32-CAM.</w:t>
       </w:r>
     </w:p>
     <w:p>
@@ -1374,7 +1385,7 @@
         <w:rPr>
           <w:rtl/>
         </w:rPr>
-        <w:t xml:space="preserve">חיישנים מחזירים לפעמים קריאות שגויות. חיישן מרחק עלול לקלוט הד מקרי, ולחצן מכני "קופץ" כמה פעמים לפני שהוא מתייצב. אם כל קריאה כזו הייתה מפעילה פעולה, המערכת הייתה מפעילה אזעקות שווא. לכן משתמשים בשלושה כללים פשוטים:</w:t>
+        <w:t xml:space="preserve">חיישנים מחזירים לפעמים קריאות שגויות. חיישן מרחק עלול לקלוט הד מקרי, ולחצן מכני "קופץ" כמה פעמים לפני שהוא מתייצב. אם כל קריאה כזו הייתה מפעילה פעולה, המערכת הייתה מפעילה אזעקות שווא. לכן נעשה שימוש בשלושה כללים פשוטים:</w:t>
       </w:r>
     </w:p>
     <w:p>
@@ -1390,7 +1401,7 @@
         <w:rPr>
           <w:rtl/>
         </w:rPr>
-        <w:t xml:space="preserve">דורשים כמה קריאות חריגות ברצף לפני שמדווחים על חדירה.</w:t>
+        <w:t xml:space="preserve">נדרשות כמה קריאות חריגות ברצף לפני דיווח על חדירה.</w:t>
       </w:r>
     </w:p>
     <w:p>
@@ -1406,7 +1417,7 @@
         <w:rPr>
           <w:rtl/>
         </w:rPr>
-        <w:t xml:space="preserve">מתעלמים מלחיצות חוזרות על אותו לחצן בפרק זמן קצר (debounce).</w:t>
+        <w:t xml:space="preserve">לחיצות חוזרות על אותו לחצן בפרק זמן קצר אינן נספרות (debounce).</w:t>
       </w:r>
     </w:p>
     <w:p>
@@ -1422,7 +1433,7 @@
         <w:rPr>
           <w:rtl/>
         </w:rPr>
-        <w:t xml:space="preserve">אחרי דיווח מחכים כמה שניות לפני הדיווח הבא, כדי שאירוע אחד לא יציף את הבקנד.</w:t>
+        <w:t xml:space="preserve">אחרי דיווח מתקיימת המתנה של כמה שניות לפני הדיווח הבא, כדי שאירוע אחד לא יציף את הבקנד.</w:t>
       </w:r>
     </w:p>
     <w:p>
@@ -1923,7 +1934,7 @@
         <w:rPr>
           <w:rtl/>
         </w:rPr>
-        <w:t xml:space="preserve">בהפעלה הבקר מודד את המרחק לקיר או למסדרון שמולו, ממוצע של 10 קריאות, וזה המרחק הרגיל. המרחק נשמר בזיכרון הקבוע של הבקר, כדי שיהיה לבקר ממה להמשיך אם המדידה בהפעלה הבאה תיכשל. אחר כך הבקר מודד כ-15 פעמים בשנייה. כשהמרחק קצר מהרגיל ביותר מ-10 ס"מ בחמש קריאות ברצף, כלומר כשליש שנייה, נשלחת לבקנד הודעת חדירה. קריאה בודדת נחשבת רעש ולא מפעילה אזעקה (קוד 1). אחרי דיווח הבקר ממשיך למדוד אבל מחכה 5 שניות לפני הדיווח הבא.</w:t>
+        <w:t xml:space="preserve">בהפעלה הבקר מודד את המרחק לקיר או למסדרון שמולו, ממוצע של 10 קריאות, וזה המרחק הרגיל. המרחק נשמר בזיכרון הקבוע של הבקר, כדי שיהיה לבקר ממה להמשיך אם המדידה בהפעלה הבאה תיכשל. אחר כך הבקר מודד בתדר של כ-15‎ Hz. כשהמרחק קצר מהרגיל ביותר מ-10‎ cm בחמש קריאות ברצף, כלומר כ-0.33‎ s, נשלחת לבקנד הודעת חדירה. קריאה בודדת נחשבת רעש ולא מפעילה אזעקה (קוד 1). אחרי דיווח הבקר ממשיך למדוד אבל מחכה 5‎ s לפני הדיווח הבא.</w:t>
       </w:r>
     </w:p>
     <w:p>
@@ -1934,7 +1945,7 @@
         <w:rPr>
           <w:rtl/>
         </w:rPr>
-        <w:t xml:space="preserve">חיישן הרעידות מגיב מיד לכל מכה: מכה נמשכת אלפיות שנייה בודדות, ולכן הבקר מגיב לה ברגע שהחיישן משדר ולא בודק אותו רק מדי פעם. גם כאן יש הפסקה של 5 שניות בין שני דיווחים.</w:t>
+        <w:t xml:space="preserve">חיישן הרעידות מגיב מיד לכל מכה: מכה נמשכת אלפיות שנייה בודדות, ולכן הבקר מגיב לה ברגע שהחיישן משדר ולא בודק אותו רק מדי פעם. גם כאן יש הפסקה של 5‎ s בין שני דיווחים.</w:t>
       </w:r>
     </w:p>
     <w:p>
@@ -1945,7 +1956,7 @@
         <w:rPr>
           <w:rtl/>
         </w:rPr>
-        <w:t xml:space="preserve">בקר החיישנים ובקר הדלת שולחים לבקנד "דיווח חיים" כל 10 שניות, וכך הבקנד יודע שהם מחוברים. בקר המצלמה לא שולח דיווח כזה: התמונות שהוא שולח משמשות כדיווח חיים. לכל בקשה לבקנד מוגדרת מגבלת זמן של שנייה אחת, כדי שבקשה שנתקעה לא תעצור את המדידה.</w:t>
+        <w:t xml:space="preserve">בקר החיישנים ובקר הדלת שולחים לבקנד "דיווח חיים" כל 10‎ s, וכך הבקנד יודע שהם מחוברים. בקר המצלמה לא שולח דיווח כזה: התמונות שהוא שולח משמשות כדיווח חיים. לכל בקשה לבקנד מוגדרת מגבלת זמן של 1‎ s, כדי שבקשה שנתקעה לא תעצור את המדידה.</w:t>
       </w:r>
     </w:p>
     <w:p>
@@ -2033,7 +2044,7 @@
         <w:rPr>
           <w:rtl/>
         </w:rPr>
-        <w:t xml:space="preserve">בקר הדלת קורא את חיישן הדלת והקודן, מפעיל את הזמזמים ומחליט אם המערכת דרוכה. הקודן נסרק כמו שמתואר בסעיף 3.2 (קוד 2). בנוסף, כל לחיצה נספרת פעם אחת בלבד: צריך להרים את האצבע לפני שאותו לחצן נספר שוב, ובין שתי לחיצות עוברים לפחות 200 אלפיות שנייה. בלי זה לחיצה אחת נקראת עשרות פעמים, כי הסריקה רצה הרבה יותר מהר מהאצבע. הקוד מורכב מ-4 עד 8 ספרות. מקלידים אותו ומאשרים עם</w:t>
+        <w:t xml:space="preserve">בקר הדלת קורא את חיישן הדלת והקודן, מפעיל את הזמזמים ומחליט אם המערכת דרוכה. הקודן נסרק כמו שמתואר בסעיף 3.2 (קוד 2). בנוסף, כל לחיצה נספרת פעם אחת בלבד: צריך להרים את האצבע לפני שאותו לחצן נספר שוב, ובין שתי לחיצות עוברים לפחות 200‎ ms. בלי זה לחיצה אחת נקראת עשרות פעמים, כי הסריקה רצה הרבה יותר מהר מהאצבע. הקוד מורכב מ-4 עד 8 ספרות. מקלידים אותו ומאשרים עם</w:t>
       </w:r>
       <w:r>
         <w:t xml:space="preserve"> </w:t>
@@ -2193,8 +2204,8 @@
         </w:tblCellMar>
       </w:tblPr>
       <w:tblGrid>
-        <w:gridCol w:w="3126"/>
-        <w:gridCol w:w="5874"/>
+        <w:gridCol w:w="3135"/>
+        <w:gridCol w:w="5865"/>
       </w:tblGrid>
       <w:tr>
         <w:trPr>
@@ -2204,7 +2215,7 @@
         </w:trPr>
         <w:tc>
           <w:tcPr>
-            <w:tcW w:w="3126" w:type="dxa"/>
+            <w:tcW w:w="3135" w:type="dxa"/>
             <w:tcBorders>
               <w:top w:val="single" w:sz="4" w:space="0" w:color="999999"/>
               <w:left w:val="single" w:sz="4" w:space="0" w:color="999999"/>
@@ -2232,7 +2243,7 @@
         </w:tc>
         <w:tc>
           <w:tcPr>
-            <w:tcW w:w="5874" w:type="dxa"/>
+            <w:tcW w:w="5865" w:type="dxa"/>
             <w:tcBorders>
               <w:top w:val="single" w:sz="4" w:space="0" w:color="999999"/>
               <w:left w:val="single" w:sz="4" w:space="0" w:color="999999"/>
@@ -2265,7 +2276,7 @@
         </w:trPr>
         <w:tc>
           <w:tcPr>
-            <w:tcW w:w="3126" w:type="dxa"/>
+            <w:tcW w:w="3135" w:type="dxa"/>
             <w:tcBorders>
               <w:top w:val="single" w:sz="4" w:space="0" w:color="999999"/>
               <w:left w:val="single" w:sz="4" w:space="0" w:color="999999"/>
@@ -2289,7 +2300,7 @@
         </w:tc>
         <w:tc>
           <w:tcPr>
-            <w:tcW w:w="5874" w:type="dxa"/>
+            <w:tcW w:w="5865" w:type="dxa"/>
             <w:tcBorders>
               <w:top w:val="single" w:sz="4" w:space="0" w:color="999999"/>
               <w:left w:val="single" w:sz="4" w:space="0" w:color="999999"/>
@@ -2318,7 +2329,7 @@
         </w:trPr>
         <w:tc>
           <w:tcPr>
-            <w:tcW w:w="3126" w:type="dxa"/>
+            <w:tcW w:w="3135" w:type="dxa"/>
             <w:tcBorders>
               <w:top w:val="single" w:sz="4" w:space="0" w:color="999999"/>
               <w:left w:val="single" w:sz="4" w:space="0" w:color="999999"/>
@@ -2342,7 +2353,7 @@
         </w:tc>
         <w:tc>
           <w:tcPr>
-            <w:tcW w:w="5874" w:type="dxa"/>
+            <w:tcW w:w="5865" w:type="dxa"/>
             <w:tcBorders>
               <w:top w:val="single" w:sz="4" w:space="0" w:color="999999"/>
               <w:left w:val="single" w:sz="4" w:space="0" w:color="999999"/>
@@ -2371,7 +2382,7 @@
         </w:trPr>
         <w:tc>
           <w:tcPr>
-            <w:tcW w:w="3126" w:type="dxa"/>
+            <w:tcW w:w="3135" w:type="dxa"/>
             <w:tcBorders>
               <w:top w:val="single" w:sz="4" w:space="0" w:color="999999"/>
               <w:left w:val="single" w:sz="4" w:space="0" w:color="999999"/>
@@ -2395,7 +2406,7 @@
         </w:tc>
         <w:tc>
           <w:tcPr>
-            <w:tcW w:w="5874" w:type="dxa"/>
+            <w:tcW w:w="5865" w:type="dxa"/>
             <w:tcBorders>
               <w:top w:val="single" w:sz="4" w:space="0" w:color="999999"/>
               <w:left w:val="single" w:sz="4" w:space="0" w:color="999999"/>
@@ -2424,7 +2435,7 @@
         </w:trPr>
         <w:tc>
           <w:tcPr>
-            <w:tcW w:w="3126" w:type="dxa"/>
+            <w:tcW w:w="3135" w:type="dxa"/>
             <w:tcBorders>
               <w:top w:val="single" w:sz="4" w:space="0" w:color="999999"/>
               <w:left w:val="single" w:sz="4" w:space="0" w:color="999999"/>
@@ -2448,7 +2459,7 @@
         </w:tc>
         <w:tc>
           <w:tcPr>
-            <w:tcW w:w="5874" w:type="dxa"/>
+            <w:tcW w:w="5865" w:type="dxa"/>
             <w:tcBorders>
               <w:top w:val="single" w:sz="4" w:space="0" w:color="999999"/>
               <w:left w:val="single" w:sz="4" w:space="0" w:color="999999"/>
@@ -2477,7 +2488,7 @@
         </w:trPr>
         <w:tc>
           <w:tcPr>
-            <w:tcW w:w="3126" w:type="dxa"/>
+            <w:tcW w:w="3135" w:type="dxa"/>
             <w:tcBorders>
               <w:top w:val="single" w:sz="4" w:space="0" w:color="999999"/>
               <w:left w:val="single" w:sz="4" w:space="0" w:color="999999"/>
@@ -2501,7 +2512,7 @@
         </w:tc>
         <w:tc>
           <w:tcPr>
-            <w:tcW w:w="5874" w:type="dxa"/>
+            <w:tcW w:w="5865" w:type="dxa"/>
             <w:tcBorders>
               <w:top w:val="single" w:sz="4" w:space="0" w:color="999999"/>
               <w:left w:val="single" w:sz="4" w:space="0" w:color="999999"/>
@@ -2530,7 +2541,7 @@
         </w:trPr>
         <w:tc>
           <w:tcPr>
-            <w:tcW w:w="3126" w:type="dxa"/>
+            <w:tcW w:w="3135" w:type="dxa"/>
             <w:tcBorders>
               <w:top w:val="single" w:sz="4" w:space="0" w:color="999999"/>
               <w:left w:val="single" w:sz="4" w:space="0" w:color="999999"/>
@@ -2554,25 +2565,25 @@
         </w:tc>
         <w:tc>
           <w:tcPr>
-            <w:tcW w:w="5874" w:type="dxa"/>
-            <w:tcBorders>
-              <w:top w:val="single" w:sz="4" w:space="0" w:color="999999"/>
-              <w:left w:val="single" w:sz="4" w:space="0" w:color="999999"/>
-              <w:bottom w:val="single" w:sz="4" w:space="0" w:color="999999"/>
-              <w:right w:val="single" w:sz="4" w:space="0" w:color="999999"/>
-            </w:tcBorders>
-            <w:vAlign w:val="center"/>
-          </w:tcPr>
-          <w:p>
-            <w:pPr>
-              <w:pStyle w:val="Compact"/>
-              <w:keepNext/>
-            </w:pPr>
-            <w:r>
-              <w:rPr>
-                <w:rtl/>
-              </w:rPr>
-              <w:t xml:space="preserve">ספירת הכניסה, אחרי שהדלת נפתחה במערכת דרוכה. הצפצופים מתחילים אחרי 2 שניות ונעצרים בזמן הקלדה</w:t>
+            <w:tcW w:w="5865" w:type="dxa"/>
+            <w:tcBorders>
+              <w:top w:val="single" w:sz="4" w:space="0" w:color="999999"/>
+              <w:left w:val="single" w:sz="4" w:space="0" w:color="999999"/>
+              <w:bottom w:val="single" w:sz="4" w:space="0" w:color="999999"/>
+              <w:right w:val="single" w:sz="4" w:space="0" w:color="999999"/>
+            </w:tcBorders>
+            <w:vAlign w:val="center"/>
+          </w:tcPr>
+          <w:p>
+            <w:pPr>
+              <w:pStyle w:val="Compact"/>
+              <w:keepNext/>
+            </w:pPr>
+            <w:r>
+              <w:rPr>
+                <w:rtl/>
+              </w:rPr>
+              <w:t xml:space="preserve">ספירת הכניסה, אחרי שהדלת נפתחה במערכת דרוכה. הצפצופים מתחילים אחרי 2‎ s ונעצרים בזמן הקלדה</w:t>
             </w:r>
           </w:p>
         </w:tc>
@@ -2583,7 +2594,7 @@
         </w:trPr>
         <w:tc>
           <w:tcPr>
-            <w:tcW w:w="3126" w:type="dxa"/>
+            <w:tcW w:w="3135" w:type="dxa"/>
             <w:tcBorders>
               <w:top w:val="single" w:sz="4" w:space="0" w:color="999999"/>
               <w:left w:val="single" w:sz="4" w:space="0" w:color="999999"/>
@@ -2606,7 +2617,7 @@
         </w:tc>
         <w:tc>
           <w:tcPr>
-            <w:tcW w:w="5874" w:type="dxa"/>
+            <w:tcW w:w="5865" w:type="dxa"/>
             <w:tcBorders>
               <w:top w:val="single" w:sz="4" w:space="0" w:color="999999"/>
               <w:left w:val="single" w:sz="4" w:space="0" w:color="999999"/>
@@ -2904,7 +2915,7 @@
         <w:rPr>
           <w:rtl/>
         </w:rPr>
-        <w:t xml:space="preserve">כשהדלת נפתחת במערכת דרוכה מתחילה ספירה של 30 שניות, והאפליקציה מציגה אותה. בזמן הזה מקישים את הקוד ו-</w:t>
+        <w:t xml:space="preserve">כשהדלת נפתחת במערכת דרוכה מתחילה ספירה של 30‎ s, והאפליקציה מציגה אותה. בזמן הזה מקישים את הקוד ו-</w:t>
       </w:r>
       <w:r>
         <w:rPr>
@@ -3204,7 +3215,7 @@
         <w:rPr>
           <w:rtl/>
         </w:rPr>
-        <w:t xml:space="preserve">העדכון לאפליקציה נשלח קודם, ושליחת האימייל לא עוצרת אותו, כדי שהאזעקה תופיע מיד גם אם האימייל איטי. אם בקר הדלת מפסיק לענות באמצע ספירת הכניסה (למשל נותק מהחשמל), הבקנד מפעיל אזעקה בעצמו, 5 שניות אחרי שהספירה אמורה להסתיים.</w:t>
+        <w:t xml:space="preserve">העדכון לאפליקציה נשלח קודם, ושליחת האימייל לא עוצרת אותו, כדי שהאזעקה תופיע מיד גם אם האימייל איטי. אם בקר הדלת מפסיק לענות באמצע ספירת הכניסה (למשל נותק מהחשמל), הבקנד מפעיל אזעקה בעצמו, 5‎ s אחרי שהספירה אמורה להסתיים.</w:t>
       </w:r>
     </w:p>
     <w:bookmarkEnd w:id="35"/>
@@ -3276,7 +3287,7 @@
         <w:rPr>
           <w:rtl/>
         </w:rPr>
-        <w:t xml:space="preserve">בודק שהבקרים חיים: בקר החיישנים ובקר הדלת מדווחים כל כמה שניות, ובקר המצלמה נבדק לפי התמונות שהוא שולח. אם אין דבר כ-30 שניות, האפליקציה מציגה שהבקר לא מחובר;</w:t>
+        <w:t xml:space="preserve">בודק שהבקרים חיים: בקר החיישנים ובקר הדלת מדווחים כל כמה שניות, ובקר המצלמה נבדק לפי התמונות שהוא שולח. אם אין דבר כ-30‎ s, האפליקציה מציגה שהבקר לא מחובר;</w:t>
       </w:r>
     </w:p>
     <w:p>
@@ -3397,7 +3408,7 @@
         <w:rPr>
           <w:rtl/>
         </w:rPr>
-        <w:t xml:space="preserve">מקלידים סיסמה. אחרי 3 ניסיונות שגויים הכפתור ננעל ל-30 שניות, והמסך מראה כמה זמן נשאר.</w:t>
+        <w:t xml:space="preserve">מוקלדת סיסמה. אחרי 3 ניסיונות שגויים הכפתור ננעל ל-30‎ s, והמסך מראה כמה זמן נשאר.</w:t>
       </w:r>
     </w:p>
     <w:p>
@@ -3616,7 +3627,7 @@
         <w:rPr>
           <w:rtl/>
         </w:rPr>
-        <w:t xml:space="preserve">פנים נרשמות מהאפליקציה: מסך הפנים מצלם תמונה מהמצלמה ושומר אותה עם שם. ה-ESP32-CAM שולח תמונה לבקנד כמה פעמים בשנייה. הבקנד מוצא פנים בתמונה, ממיר אותן לווקטור ומשווה לווקטורים של הפנים השמורות. אם הדמיון גבוה מסף, הפנים מזוהות והאירוע נרשם ביומן, פעם בדקה לכל היותר לאותו אדם, כדי שהיומן לא יתמלא.</w:t>
+        <w:t xml:space="preserve">פנים נרשמות מהאפליקציה: מסך הפנים מצלם תמונה מהמצלמה ושומר אותה עם שם. ה-ESP32-CAM שולח תמונה לבקנד כמה פעמים בשנייה. הבקנד מוצא פנים בתמונה, ממיר אותן לווקטור ומשווה לווקטורים של הפנים השמורות. אם הדמיון גבוה מסף, הפנים מזוהות והאירוע נרשם ביומן, פעם ב-60‎ s לכל היותר לאותו אדם, כדי שהיומן לא יתמלא.</w:t>
       </w:r>
     </w:p>
     <w:p>
@@ -3684,7 +3695,7 @@
         <w:rPr>
           <w:rtl/>
         </w:rPr>
-        <w:t xml:space="preserve">אם האזעקה לא נוקתה תוך זמן שמוגדר באפליקציה (60 שניות כברירת מחדל), נשלח אימייל נוסף לאנשי הקשר לחירום. נטרול האזעקה מבטל את ההסלמה. הרשימה של אנשי הקשר נפרדת מרשימת הנמענים הרגילה. בהצעת הפרויקט תוכנן חיוג אוטומטי לגורם חירום, אבל חיוג דורש ספק טלפוניה, ולכן במקומו נשלחת התראה דחופה שאומרת למי להתקשר.</w:t>
+        <w:t xml:space="preserve">אם האזעקה לא נוקתה תוך זמן שמוגדר באפליקציה (60‎ s כברירת מחדל), נשלח אימייל נוסף לאנשי הקשר לחירום. נטרול האזעקה מבטל את ההסלמה. הרשימה של אנשי הקשר נפרדת מרשימת הנמענים הרגילה. בהצעת הפרויקט תוכנן חיוג אוטומטי לגורם חירום, אבל חיוג דורש ספק טלפוניה, ולכן במקומו נשלחת התראה דחופה שאומרת למי להתקשר.</w:t>
       </w:r>
     </w:p>
     <w:p>
@@ -3784,7 +3795,7 @@
         <w:rPr>
           <w:rtl/>
         </w:rPr>
-        <w:t xml:space="preserve">הכניסה לאפליקציה דורשת סיסמה, והיא אותו קוד כמו בקודן. אחרי 3 ניסיונות שגויים ההתחברות ננעלת ל-30 שניות. הבקרים מזדהים מול הבקנד במפתח משותף. התקשורת אינה מוצפנת: הכול עובר ב-HTTP רגיל ברשת ה-WiFi הביתית.</w:t>
+        <w:t xml:space="preserve">הכניסה לאפליקציה דורשת סיסמה, והיא אותו קוד כמו בקודן. אחרי 3 ניסיונות שגויים ההתחברות ננעלת ל-30‎ s. הבקרים מזדהים מול הבקנד במפתח משותף. התקשורת אינה מוצפנת: הכול עובר ב-HTTP רגיל ברשת ה-WiFi הביתית.</w:t>
       </w:r>
     </w:p>
     <w:p>
@@ -3854,9 +3865,9 @@
         </w:tblCellMar>
       </w:tblPr>
       <w:tblGrid>
-        <w:gridCol w:w="4119"/>
-        <w:gridCol w:w="2520"/>
-        <w:gridCol w:w="2361"/>
+        <w:gridCol w:w="4193"/>
+        <w:gridCol w:w="2403"/>
+        <w:gridCol w:w="2404"/>
       </w:tblGrid>
       <w:tr>
         <w:trPr>
@@ -3866,7 +3877,7 @@
         </w:trPr>
         <w:tc>
           <w:tcPr>
-            <w:tcW w:w="4119" w:type="dxa"/>
+            <w:tcW w:w="4193" w:type="dxa"/>
             <w:tcBorders>
               <w:top w:val="single" w:sz="4" w:space="0" w:color="999999"/>
               <w:left w:val="single" w:sz="4" w:space="0" w:color="999999"/>
@@ -3893,7 +3904,7 @@
         </w:tc>
         <w:tc>
           <w:tcPr>
-            <w:tcW w:w="2520" w:type="dxa"/>
+            <w:tcW w:w="2403" w:type="dxa"/>
             <w:tcBorders>
               <w:top w:val="single" w:sz="4" w:space="0" w:color="999999"/>
               <w:left w:val="single" w:sz="4" w:space="0" w:color="999999"/>
@@ -3920,7 +3931,7 @@
         </w:tc>
         <w:tc>
           <w:tcPr>
-            <w:tcW w:w="2361" w:type="dxa"/>
+            <w:tcW w:w="2404" w:type="dxa"/>
             <w:tcBorders>
               <w:top w:val="single" w:sz="4" w:space="0" w:color="999999"/>
               <w:left w:val="single" w:sz="4" w:space="0" w:color="999999"/>
@@ -3952,7 +3963,7 @@
         </w:trPr>
         <w:tc>
           <w:tcPr>
-            <w:tcW w:w="4119" w:type="dxa"/>
+            <w:tcW w:w="4193" w:type="dxa"/>
             <w:tcBorders>
               <w:top w:val="single" w:sz="4" w:space="0" w:color="999999"/>
               <w:left w:val="single" w:sz="4" w:space="0" w:color="999999"/>
@@ -3975,30 +3986,27 @@
         </w:tc>
         <w:tc>
           <w:tcPr>
-            <w:tcW w:w="2520" w:type="dxa"/>
-            <w:tcBorders>
-              <w:top w:val="single" w:sz="4" w:space="0" w:color="999999"/>
-              <w:left w:val="single" w:sz="4" w:space="0" w:color="999999"/>
-              <w:bottom w:val="single" w:sz="4" w:space="0" w:color="999999"/>
-              <w:right w:val="single" w:sz="4" w:space="0" w:color="999999"/>
-            </w:tcBorders>
-            <w:vAlign w:val="center"/>
-          </w:tcPr>
-          <w:p>
-            <w:pPr>
-              <w:pStyle w:val="Compact"/>
-            </w:pPr>
-            <w:r>
-              <w:rPr>
-                <w:rtl/>
-              </w:rPr>
-              <w:t xml:space="preserve">30 שניות</w:t>
-            </w:r>
-          </w:p>
-        </w:tc>
-        <w:tc>
-          <w:tcPr>
-            <w:tcW w:w="2361" w:type="dxa"/>
+            <w:tcW w:w="2403" w:type="dxa"/>
+            <w:tcBorders>
+              <w:top w:val="single" w:sz="4" w:space="0" w:color="999999"/>
+              <w:left w:val="single" w:sz="4" w:space="0" w:color="999999"/>
+              <w:bottom w:val="single" w:sz="4" w:space="0" w:color="999999"/>
+              <w:right w:val="single" w:sz="4" w:space="0" w:color="999999"/>
+            </w:tcBorders>
+            <w:vAlign w:val="center"/>
+          </w:tcPr>
+          <w:p>
+            <w:pPr>
+              <w:pStyle w:val="Compact"/>
+            </w:pPr>
+            <w:r>
+              <w:t xml:space="preserve">30‎ s</w:t>
+            </w:r>
+          </w:p>
+        </w:tc>
+        <w:tc>
+          <w:tcPr>
+            <w:tcW w:w="2404" w:type="dxa"/>
             <w:tcBorders>
               <w:top w:val="single" w:sz="4" w:space="0" w:color="999999"/>
               <w:left w:val="single" w:sz="4" w:space="0" w:color="999999"/>
@@ -4026,7 +4034,7 @@
         </w:trPr>
         <w:tc>
           <w:tcPr>
-            <w:tcW w:w="4119" w:type="dxa"/>
+            <w:tcW w:w="4193" w:type="dxa"/>
             <w:tcBorders>
               <w:top w:val="single" w:sz="4" w:space="0" w:color="999999"/>
               <w:left w:val="single" w:sz="4" w:space="0" w:color="999999"/>
@@ -4049,30 +4057,27 @@
         </w:tc>
         <w:tc>
           <w:tcPr>
-            <w:tcW w:w="2520" w:type="dxa"/>
-            <w:tcBorders>
-              <w:top w:val="single" w:sz="4" w:space="0" w:color="999999"/>
-              <w:left w:val="single" w:sz="4" w:space="0" w:color="999999"/>
-              <w:bottom w:val="single" w:sz="4" w:space="0" w:color="999999"/>
-              <w:right w:val="single" w:sz="4" w:space="0" w:color="999999"/>
-            </w:tcBorders>
-            <w:vAlign w:val="center"/>
-          </w:tcPr>
-          <w:p>
-            <w:pPr>
-              <w:pStyle w:val="Compact"/>
-            </w:pPr>
-            <w:r>
-              <w:rPr>
-                <w:rtl/>
-              </w:rPr>
-              <w:t xml:space="preserve">2 שניות</w:t>
-            </w:r>
-          </w:p>
-        </w:tc>
-        <w:tc>
-          <w:tcPr>
-            <w:tcW w:w="2361" w:type="dxa"/>
+            <w:tcW w:w="2403" w:type="dxa"/>
+            <w:tcBorders>
+              <w:top w:val="single" w:sz="4" w:space="0" w:color="999999"/>
+              <w:left w:val="single" w:sz="4" w:space="0" w:color="999999"/>
+              <w:bottom w:val="single" w:sz="4" w:space="0" w:color="999999"/>
+              <w:right w:val="single" w:sz="4" w:space="0" w:color="999999"/>
+            </w:tcBorders>
+            <w:vAlign w:val="center"/>
+          </w:tcPr>
+          <w:p>
+            <w:pPr>
+              <w:pStyle w:val="Compact"/>
+            </w:pPr>
+            <w:r>
+              <w:t xml:space="preserve">2‎ s</w:t>
+            </w:r>
+          </w:p>
+        </w:tc>
+        <w:tc>
+          <w:tcPr>
+            <w:tcW w:w="2404" w:type="dxa"/>
             <w:tcBorders>
               <w:top w:val="single" w:sz="4" w:space="0" w:color="999999"/>
               <w:left w:val="single" w:sz="4" w:space="0" w:color="999999"/>
@@ -4100,7 +4105,7 @@
         </w:trPr>
         <w:tc>
           <w:tcPr>
-            <w:tcW w:w="4119" w:type="dxa"/>
+            <w:tcW w:w="4193" w:type="dxa"/>
             <w:tcBorders>
               <w:top w:val="single" w:sz="4" w:space="0" w:color="999999"/>
               <w:left w:val="single" w:sz="4" w:space="0" w:color="999999"/>
@@ -4123,30 +4128,27 @@
         </w:tc>
         <w:tc>
           <w:tcPr>
-            <w:tcW w:w="2520" w:type="dxa"/>
-            <w:tcBorders>
-              <w:top w:val="single" w:sz="4" w:space="0" w:color="999999"/>
-              <w:left w:val="single" w:sz="4" w:space="0" w:color="999999"/>
-              <w:bottom w:val="single" w:sz="4" w:space="0" w:color="999999"/>
-              <w:right w:val="single" w:sz="4" w:space="0" w:color="999999"/>
-            </w:tcBorders>
-            <w:vAlign w:val="center"/>
-          </w:tcPr>
-          <w:p>
-            <w:pPr>
-              <w:pStyle w:val="Compact"/>
-            </w:pPr>
-            <w:r>
-              <w:rPr>
-                <w:rtl/>
-              </w:rPr>
-              <w:t xml:space="preserve">200 אלפיות שנייה</w:t>
-            </w:r>
-          </w:p>
-        </w:tc>
-        <w:tc>
-          <w:tcPr>
-            <w:tcW w:w="2361" w:type="dxa"/>
+            <w:tcW w:w="2403" w:type="dxa"/>
+            <w:tcBorders>
+              <w:top w:val="single" w:sz="4" w:space="0" w:color="999999"/>
+              <w:left w:val="single" w:sz="4" w:space="0" w:color="999999"/>
+              <w:bottom w:val="single" w:sz="4" w:space="0" w:color="999999"/>
+              <w:right w:val="single" w:sz="4" w:space="0" w:color="999999"/>
+            </w:tcBorders>
+            <w:vAlign w:val="center"/>
+          </w:tcPr>
+          <w:p>
+            <w:pPr>
+              <w:pStyle w:val="Compact"/>
+            </w:pPr>
+            <w:r>
+              <w:t xml:space="preserve">200‎ ms</w:t>
+            </w:r>
+          </w:p>
+        </w:tc>
+        <w:tc>
+          <w:tcPr>
+            <w:tcW w:w="2404" w:type="dxa"/>
             <w:tcBorders>
               <w:top w:val="single" w:sz="4" w:space="0" w:color="999999"/>
               <w:left w:val="single" w:sz="4" w:space="0" w:color="999999"/>
@@ -4174,7 +4176,7 @@
         </w:trPr>
         <w:tc>
           <w:tcPr>
-            <w:tcW w:w="4119" w:type="dxa"/>
+            <w:tcW w:w="4193" w:type="dxa"/>
             <w:tcBorders>
               <w:top w:val="single" w:sz="4" w:space="0" w:color="999999"/>
               <w:left w:val="single" w:sz="4" w:space="0" w:color="999999"/>
@@ -4197,7 +4199,7 @@
         </w:tc>
         <w:tc>
           <w:tcPr>
-            <w:tcW w:w="2520" w:type="dxa"/>
+            <w:tcW w:w="2403" w:type="dxa"/>
             <w:tcBorders>
               <w:top w:val="single" w:sz="4" w:space="0" w:color="999999"/>
               <w:left w:val="single" w:sz="4" w:space="0" w:color="999999"/>
@@ -4220,7 +4222,7 @@
         </w:tc>
         <w:tc>
           <w:tcPr>
-            <w:tcW w:w="2361" w:type="dxa"/>
+            <w:tcW w:w="2404" w:type="dxa"/>
             <w:tcBorders>
               <w:top w:val="single" w:sz="4" w:space="0" w:color="999999"/>
               <w:left w:val="single" w:sz="4" w:space="0" w:color="999999"/>
@@ -4248,7 +4250,7 @@
         </w:trPr>
         <w:tc>
           <w:tcPr>
-            <w:tcW w:w="4119" w:type="dxa"/>
+            <w:tcW w:w="4193" w:type="dxa"/>
             <w:tcBorders>
               <w:top w:val="single" w:sz="4" w:space="0" w:color="999999"/>
               <w:left w:val="single" w:sz="4" w:space="0" w:color="999999"/>
@@ -4271,30 +4273,30 @@
         </w:tc>
         <w:tc>
           <w:tcPr>
-            <w:tcW w:w="2520" w:type="dxa"/>
-            <w:tcBorders>
-              <w:top w:val="single" w:sz="4" w:space="0" w:color="999999"/>
-              <w:left w:val="single" w:sz="4" w:space="0" w:color="999999"/>
-              <w:bottom w:val="single" w:sz="4" w:space="0" w:color="999999"/>
-              <w:right w:val="single" w:sz="4" w:space="0" w:color="999999"/>
-            </w:tcBorders>
-            <w:vAlign w:val="center"/>
-          </w:tcPr>
-          <w:p>
-            <w:pPr>
-              <w:pStyle w:val="Compact"/>
-            </w:pPr>
-            <w:r>
-              <w:rPr>
-                <w:rtl/>
-              </w:rPr>
-              <w:t xml:space="preserve">כ-15 בשנייה</w:t>
-            </w:r>
-          </w:p>
-        </w:tc>
-        <w:tc>
-          <w:tcPr>
-            <w:tcW w:w="2361" w:type="dxa"/>
+            <w:tcW w:w="2403" w:type="dxa"/>
+            <w:tcBorders>
+              <w:top w:val="single" w:sz="4" w:space="0" w:color="999999"/>
+              <w:left w:val="single" w:sz="4" w:space="0" w:color="999999"/>
+              <w:bottom w:val="single" w:sz="4" w:space="0" w:color="999999"/>
+              <w:right w:val="single" w:sz="4" w:space="0" w:color="999999"/>
+            </w:tcBorders>
+            <w:vAlign w:val="center"/>
+          </w:tcPr>
+          <w:p>
+            <w:pPr>
+              <w:pStyle w:val="Compact"/>
+            </w:pPr>
+            <w:r>
+              <w:rPr>
+                <w:rtl/>
+              </w:rPr>
+              <w:t xml:space="preserve">כ-15‎ Hz</w:t>
+            </w:r>
+          </w:p>
+        </w:tc>
+        <w:tc>
+          <w:tcPr>
+            <w:tcW w:w="2404" w:type="dxa"/>
             <w:tcBorders>
               <w:top w:val="single" w:sz="4" w:space="0" w:color="999999"/>
               <w:left w:val="single" w:sz="4" w:space="0" w:color="999999"/>
@@ -4322,7 +4324,7 @@
         </w:trPr>
         <w:tc>
           <w:tcPr>
-            <w:tcW w:w="4119" w:type="dxa"/>
+            <w:tcW w:w="4193" w:type="dxa"/>
             <w:tcBorders>
               <w:top w:val="single" w:sz="4" w:space="0" w:color="999999"/>
               <w:left w:val="single" w:sz="4" w:space="0" w:color="999999"/>
@@ -4345,30 +4347,30 @@
         </w:tc>
         <w:tc>
           <w:tcPr>
-            <w:tcW w:w="2520" w:type="dxa"/>
-            <w:tcBorders>
-              <w:top w:val="single" w:sz="4" w:space="0" w:color="999999"/>
-              <w:left w:val="single" w:sz="4" w:space="0" w:color="999999"/>
-              <w:bottom w:val="single" w:sz="4" w:space="0" w:color="999999"/>
-              <w:right w:val="single" w:sz="4" w:space="0" w:color="999999"/>
-            </w:tcBorders>
-            <w:vAlign w:val="center"/>
-          </w:tcPr>
-          <w:p>
-            <w:pPr>
-              <w:pStyle w:val="Compact"/>
-            </w:pPr>
-            <w:r>
-              <w:rPr>
-                <w:rtl/>
-              </w:rPr>
-              <w:t xml:space="preserve">יותר מ-10 ס"מ</w:t>
-            </w:r>
-          </w:p>
-        </w:tc>
-        <w:tc>
-          <w:tcPr>
-            <w:tcW w:w="2361" w:type="dxa"/>
+            <w:tcW w:w="2403" w:type="dxa"/>
+            <w:tcBorders>
+              <w:top w:val="single" w:sz="4" w:space="0" w:color="999999"/>
+              <w:left w:val="single" w:sz="4" w:space="0" w:color="999999"/>
+              <w:bottom w:val="single" w:sz="4" w:space="0" w:color="999999"/>
+              <w:right w:val="single" w:sz="4" w:space="0" w:color="999999"/>
+            </w:tcBorders>
+            <w:vAlign w:val="center"/>
+          </w:tcPr>
+          <w:p>
+            <w:pPr>
+              <w:pStyle w:val="Compact"/>
+            </w:pPr>
+            <w:r>
+              <w:rPr>
+                <w:rtl/>
+              </w:rPr>
+              <w:t xml:space="preserve">יותר מ-10‎ cm</w:t>
+            </w:r>
+          </w:p>
+        </w:tc>
+        <w:tc>
+          <w:tcPr>
+            <w:tcW w:w="2404" w:type="dxa"/>
             <w:tcBorders>
               <w:top w:val="single" w:sz="4" w:space="0" w:color="999999"/>
               <w:left w:val="single" w:sz="4" w:space="0" w:color="999999"/>
@@ -4396,7 +4398,7 @@
         </w:trPr>
         <w:tc>
           <w:tcPr>
-            <w:tcW w:w="4119" w:type="dxa"/>
+            <w:tcW w:w="4193" w:type="dxa"/>
             <w:tcBorders>
               <w:top w:val="single" w:sz="4" w:space="0" w:color="999999"/>
               <w:left w:val="single" w:sz="4" w:space="0" w:color="999999"/>
@@ -4419,7 +4421,7 @@
         </w:tc>
         <w:tc>
           <w:tcPr>
-            <w:tcW w:w="2520" w:type="dxa"/>
+            <w:tcW w:w="2403" w:type="dxa"/>
             <w:tcBorders>
               <w:top w:val="single" w:sz="4" w:space="0" w:color="999999"/>
               <w:left w:val="single" w:sz="4" w:space="0" w:color="999999"/>
@@ -4439,7 +4441,7 @@
         </w:tc>
         <w:tc>
           <w:tcPr>
-            <w:tcW w:w="2361" w:type="dxa"/>
+            <w:tcW w:w="2404" w:type="dxa"/>
             <w:tcBorders>
               <w:top w:val="single" w:sz="4" w:space="0" w:color="999999"/>
               <w:left w:val="single" w:sz="4" w:space="0" w:color="999999"/>
@@ -4467,7 +4469,7 @@
         </w:trPr>
         <w:tc>
           <w:tcPr>
-            <w:tcW w:w="4119" w:type="dxa"/>
+            <w:tcW w:w="4193" w:type="dxa"/>
             <w:tcBorders>
               <w:top w:val="single" w:sz="4" w:space="0" w:color="999999"/>
               <w:left w:val="single" w:sz="4" w:space="0" w:color="999999"/>
@@ -4490,30 +4492,27 @@
         </w:tc>
         <w:tc>
           <w:tcPr>
-            <w:tcW w:w="2520" w:type="dxa"/>
-            <w:tcBorders>
-              <w:top w:val="single" w:sz="4" w:space="0" w:color="999999"/>
-              <w:left w:val="single" w:sz="4" w:space="0" w:color="999999"/>
-              <w:bottom w:val="single" w:sz="4" w:space="0" w:color="999999"/>
-              <w:right w:val="single" w:sz="4" w:space="0" w:color="999999"/>
-            </w:tcBorders>
-            <w:vAlign w:val="center"/>
-          </w:tcPr>
-          <w:p>
-            <w:pPr>
-              <w:pStyle w:val="Compact"/>
-            </w:pPr>
-            <w:r>
-              <w:rPr>
-                <w:rtl/>
-              </w:rPr>
-              <w:t xml:space="preserve">5 שניות</w:t>
-            </w:r>
-          </w:p>
-        </w:tc>
-        <w:tc>
-          <w:tcPr>
-            <w:tcW w:w="2361" w:type="dxa"/>
+            <w:tcW w:w="2403" w:type="dxa"/>
+            <w:tcBorders>
+              <w:top w:val="single" w:sz="4" w:space="0" w:color="999999"/>
+              <w:left w:val="single" w:sz="4" w:space="0" w:color="999999"/>
+              <w:bottom w:val="single" w:sz="4" w:space="0" w:color="999999"/>
+              <w:right w:val="single" w:sz="4" w:space="0" w:color="999999"/>
+            </w:tcBorders>
+            <w:vAlign w:val="center"/>
+          </w:tcPr>
+          <w:p>
+            <w:pPr>
+              <w:pStyle w:val="Compact"/>
+            </w:pPr>
+            <w:r>
+              <w:t xml:space="preserve">5‎ s</w:t>
+            </w:r>
+          </w:p>
+        </w:tc>
+        <w:tc>
+          <w:tcPr>
+            <w:tcW w:w="2404" w:type="dxa"/>
             <w:tcBorders>
               <w:top w:val="single" w:sz="4" w:space="0" w:color="999999"/>
               <w:left w:val="single" w:sz="4" w:space="0" w:color="999999"/>
@@ -4541,7 +4540,7 @@
         </w:trPr>
         <w:tc>
           <w:tcPr>
-            <w:tcW w:w="4119" w:type="dxa"/>
+            <w:tcW w:w="4193" w:type="dxa"/>
             <w:tcBorders>
               <w:top w:val="single" w:sz="4" w:space="0" w:color="999999"/>
               <w:left w:val="single" w:sz="4" w:space="0" w:color="999999"/>
@@ -4564,30 +4563,30 @@
         </w:tc>
         <w:tc>
           <w:tcPr>
-            <w:tcW w:w="2520" w:type="dxa"/>
-            <w:tcBorders>
-              <w:top w:val="single" w:sz="4" w:space="0" w:color="999999"/>
-              <w:left w:val="single" w:sz="4" w:space="0" w:color="999999"/>
-              <w:bottom w:val="single" w:sz="4" w:space="0" w:color="999999"/>
-              <w:right w:val="single" w:sz="4" w:space="0" w:color="999999"/>
-            </w:tcBorders>
-            <w:vAlign w:val="center"/>
-          </w:tcPr>
-          <w:p>
-            <w:pPr>
-              <w:pStyle w:val="Compact"/>
-            </w:pPr>
-            <w:r>
-              <w:rPr>
-                <w:rtl/>
-              </w:rPr>
-              <w:t xml:space="preserve">כל 10 שניות</w:t>
-            </w:r>
-          </w:p>
-        </w:tc>
-        <w:tc>
-          <w:tcPr>
-            <w:tcW w:w="2361" w:type="dxa"/>
+            <w:tcW w:w="2403" w:type="dxa"/>
+            <w:tcBorders>
+              <w:top w:val="single" w:sz="4" w:space="0" w:color="999999"/>
+              <w:left w:val="single" w:sz="4" w:space="0" w:color="999999"/>
+              <w:bottom w:val="single" w:sz="4" w:space="0" w:color="999999"/>
+              <w:right w:val="single" w:sz="4" w:space="0" w:color="999999"/>
+            </w:tcBorders>
+            <w:vAlign w:val="center"/>
+          </w:tcPr>
+          <w:p>
+            <w:pPr>
+              <w:pStyle w:val="Compact"/>
+            </w:pPr>
+            <w:r>
+              <w:rPr>
+                <w:rtl/>
+              </w:rPr>
+              <w:t xml:space="preserve">כל 10‎ s</w:t>
+            </w:r>
+          </w:p>
+        </w:tc>
+        <w:tc>
+          <w:tcPr>
+            <w:tcW w:w="2404" w:type="dxa"/>
             <w:tcBorders>
               <w:top w:val="single" w:sz="4" w:space="0" w:color="999999"/>
               <w:left w:val="single" w:sz="4" w:space="0" w:color="999999"/>
@@ -4615,7 +4614,7 @@
         </w:trPr>
         <w:tc>
           <w:tcPr>
-            <w:tcW w:w="4119" w:type="dxa"/>
+            <w:tcW w:w="4193" w:type="dxa"/>
             <w:tcBorders>
               <w:top w:val="single" w:sz="4" w:space="0" w:color="999999"/>
               <w:left w:val="single" w:sz="4" w:space="0" w:color="999999"/>
@@ -4638,30 +4637,27 @@
         </w:tc>
         <w:tc>
           <w:tcPr>
-            <w:tcW w:w="2520" w:type="dxa"/>
-            <w:tcBorders>
-              <w:top w:val="single" w:sz="4" w:space="0" w:color="999999"/>
-              <w:left w:val="single" w:sz="4" w:space="0" w:color="999999"/>
-              <w:bottom w:val="single" w:sz="4" w:space="0" w:color="999999"/>
-              <w:right w:val="single" w:sz="4" w:space="0" w:color="999999"/>
-            </w:tcBorders>
-            <w:vAlign w:val="center"/>
-          </w:tcPr>
-          <w:p>
-            <w:pPr>
-              <w:pStyle w:val="Compact"/>
-            </w:pPr>
-            <w:r>
-              <w:rPr>
-                <w:rtl/>
-              </w:rPr>
-              <w:t xml:space="preserve">30 שניות</w:t>
-            </w:r>
-          </w:p>
-        </w:tc>
-        <w:tc>
-          <w:tcPr>
-            <w:tcW w:w="2361" w:type="dxa"/>
+            <w:tcW w:w="2403" w:type="dxa"/>
+            <w:tcBorders>
+              <w:top w:val="single" w:sz="4" w:space="0" w:color="999999"/>
+              <w:left w:val="single" w:sz="4" w:space="0" w:color="999999"/>
+              <w:bottom w:val="single" w:sz="4" w:space="0" w:color="999999"/>
+              <w:right w:val="single" w:sz="4" w:space="0" w:color="999999"/>
+            </w:tcBorders>
+            <w:vAlign w:val="center"/>
+          </w:tcPr>
+          <w:p>
+            <w:pPr>
+              <w:pStyle w:val="Compact"/>
+            </w:pPr>
+            <w:r>
+              <w:t xml:space="preserve">30‎ s</w:t>
+            </w:r>
+          </w:p>
+        </w:tc>
+        <w:tc>
+          <w:tcPr>
+            <w:tcW w:w="2404" w:type="dxa"/>
             <w:tcBorders>
               <w:top w:val="single" w:sz="4" w:space="0" w:color="999999"/>
               <w:left w:val="single" w:sz="4" w:space="0" w:color="999999"/>
@@ -4689,7 +4685,7 @@
         </w:trPr>
         <w:tc>
           <w:tcPr>
-            <w:tcW w:w="4119" w:type="dxa"/>
+            <w:tcW w:w="4193" w:type="dxa"/>
             <w:tcBorders>
               <w:top w:val="single" w:sz="4" w:space="0" w:color="999999"/>
               <w:left w:val="single" w:sz="4" w:space="0" w:color="999999"/>
@@ -4712,30 +4708,30 @@
         </w:tc>
         <w:tc>
           <w:tcPr>
-            <w:tcW w:w="2520" w:type="dxa"/>
-            <w:tcBorders>
-              <w:top w:val="single" w:sz="4" w:space="0" w:color="999999"/>
-              <w:left w:val="single" w:sz="4" w:space="0" w:color="999999"/>
-              <w:bottom w:val="single" w:sz="4" w:space="0" w:color="999999"/>
-              <w:right w:val="single" w:sz="4" w:space="0" w:color="999999"/>
-            </w:tcBorders>
-            <w:vAlign w:val="center"/>
-          </w:tcPr>
-          <w:p>
-            <w:pPr>
-              <w:pStyle w:val="Compact"/>
-            </w:pPr>
-            <w:r>
-              <w:rPr>
-                <w:rtl/>
-              </w:rPr>
-              <w:t xml:space="preserve">כ-300 אלפיות שנייה</w:t>
-            </w:r>
-          </w:p>
-        </w:tc>
-        <w:tc>
-          <w:tcPr>
-            <w:tcW w:w="2361" w:type="dxa"/>
+            <w:tcW w:w="2403" w:type="dxa"/>
+            <w:tcBorders>
+              <w:top w:val="single" w:sz="4" w:space="0" w:color="999999"/>
+              <w:left w:val="single" w:sz="4" w:space="0" w:color="999999"/>
+              <w:bottom w:val="single" w:sz="4" w:space="0" w:color="999999"/>
+              <w:right w:val="single" w:sz="4" w:space="0" w:color="999999"/>
+            </w:tcBorders>
+            <w:vAlign w:val="center"/>
+          </w:tcPr>
+          <w:p>
+            <w:pPr>
+              <w:pStyle w:val="Compact"/>
+            </w:pPr>
+            <w:r>
+              <w:rPr>
+                <w:rtl/>
+              </w:rPr>
+              <w:t xml:space="preserve">כ-300‎ ms</w:t>
+            </w:r>
+          </w:p>
+        </w:tc>
+        <w:tc>
+          <w:tcPr>
+            <w:tcW w:w="2404" w:type="dxa"/>
             <w:tcBorders>
               <w:top w:val="single" w:sz="4" w:space="0" w:color="999999"/>
               <w:left w:val="single" w:sz="4" w:space="0" w:color="999999"/>
@@ -4763,7 +4759,7 @@
         </w:trPr>
         <w:tc>
           <w:tcPr>
-            <w:tcW w:w="4119" w:type="dxa"/>
+            <w:tcW w:w="4193" w:type="dxa"/>
             <w:tcBorders>
               <w:top w:val="single" w:sz="4" w:space="0" w:color="999999"/>
               <w:left w:val="single" w:sz="4" w:space="0" w:color="999999"/>
@@ -4786,30 +4782,30 @@
         </w:tc>
         <w:tc>
           <w:tcPr>
-            <w:tcW w:w="2520" w:type="dxa"/>
-            <w:tcBorders>
-              <w:top w:val="single" w:sz="4" w:space="0" w:color="999999"/>
-              <w:left w:val="single" w:sz="4" w:space="0" w:color="999999"/>
-              <w:bottom w:val="single" w:sz="4" w:space="0" w:color="999999"/>
-              <w:right w:val="single" w:sz="4" w:space="0" w:color="999999"/>
-            </w:tcBorders>
-            <w:vAlign w:val="center"/>
-          </w:tcPr>
-          <w:p>
-            <w:pPr>
-              <w:pStyle w:val="Compact"/>
-            </w:pPr>
-            <w:r>
-              <w:rPr>
-                <w:rtl/>
-              </w:rPr>
-              <w:t xml:space="preserve">פעם בדקה לכל היותר</w:t>
-            </w:r>
-          </w:p>
-        </w:tc>
-        <w:tc>
-          <w:tcPr>
-            <w:tcW w:w="2361" w:type="dxa"/>
+            <w:tcW w:w="2403" w:type="dxa"/>
+            <w:tcBorders>
+              <w:top w:val="single" w:sz="4" w:space="0" w:color="999999"/>
+              <w:left w:val="single" w:sz="4" w:space="0" w:color="999999"/>
+              <w:bottom w:val="single" w:sz="4" w:space="0" w:color="999999"/>
+              <w:right w:val="single" w:sz="4" w:space="0" w:color="999999"/>
+            </w:tcBorders>
+            <w:vAlign w:val="center"/>
+          </w:tcPr>
+          <w:p>
+            <w:pPr>
+              <w:pStyle w:val="Compact"/>
+            </w:pPr>
+            <w:r>
+              <w:rPr>
+                <w:rtl/>
+              </w:rPr>
+              <w:t xml:space="preserve">פעם ב-60‎ s לכל היותר</w:t>
+            </w:r>
+          </w:p>
+        </w:tc>
+        <w:tc>
+          <w:tcPr>
+            <w:tcW w:w="2404" w:type="dxa"/>
             <w:tcBorders>
               <w:top w:val="single" w:sz="4" w:space="0" w:color="999999"/>
               <w:left w:val="single" w:sz="4" w:space="0" w:color="999999"/>
@@ -4837,7 +4833,7 @@
         </w:trPr>
         <w:tc>
           <w:tcPr>
-            <w:tcW w:w="4119" w:type="dxa"/>
+            <w:tcW w:w="4193" w:type="dxa"/>
             <w:tcBorders>
               <w:top w:val="single" w:sz="4" w:space="0" w:color="999999"/>
               <w:left w:val="single" w:sz="4" w:space="0" w:color="999999"/>
@@ -4860,30 +4856,27 @@
         </w:tc>
         <w:tc>
           <w:tcPr>
-            <w:tcW w:w="2520" w:type="dxa"/>
-            <w:tcBorders>
-              <w:top w:val="single" w:sz="4" w:space="0" w:color="999999"/>
-              <w:left w:val="single" w:sz="4" w:space="0" w:color="999999"/>
-              <w:bottom w:val="single" w:sz="4" w:space="0" w:color="999999"/>
-              <w:right w:val="single" w:sz="4" w:space="0" w:color="999999"/>
-            </w:tcBorders>
-            <w:vAlign w:val="center"/>
-          </w:tcPr>
-          <w:p>
-            <w:pPr>
-              <w:pStyle w:val="Compact"/>
-            </w:pPr>
-            <w:r>
-              <w:rPr>
-                <w:rtl/>
-              </w:rPr>
-              <w:t xml:space="preserve">30 שניות</w:t>
-            </w:r>
-          </w:p>
-        </w:tc>
-        <w:tc>
-          <w:tcPr>
-            <w:tcW w:w="2361" w:type="dxa"/>
+            <w:tcW w:w="2403" w:type="dxa"/>
+            <w:tcBorders>
+              <w:top w:val="single" w:sz="4" w:space="0" w:color="999999"/>
+              <w:left w:val="single" w:sz="4" w:space="0" w:color="999999"/>
+              <w:bottom w:val="single" w:sz="4" w:space="0" w:color="999999"/>
+              <w:right w:val="single" w:sz="4" w:space="0" w:color="999999"/>
+            </w:tcBorders>
+            <w:vAlign w:val="center"/>
+          </w:tcPr>
+          <w:p>
+            <w:pPr>
+              <w:pStyle w:val="Compact"/>
+            </w:pPr>
+            <w:r>
+              <w:t xml:space="preserve">30‎ s</w:t>
+            </w:r>
+          </w:p>
+        </w:tc>
+        <w:tc>
+          <w:tcPr>
+            <w:tcW w:w="2404" w:type="dxa"/>
             <w:tcBorders>
               <w:top w:val="single" w:sz="4" w:space="0" w:color="999999"/>
               <w:left w:val="single" w:sz="4" w:space="0" w:color="999999"/>
@@ -4911,7 +4904,7 @@
         </w:trPr>
         <w:tc>
           <w:tcPr>
-            <w:tcW w:w="4119" w:type="dxa"/>
+            <w:tcW w:w="4193" w:type="dxa"/>
             <w:tcBorders>
               <w:top w:val="single" w:sz="4" w:space="0" w:color="999999"/>
               <w:left w:val="single" w:sz="4" w:space="0" w:color="999999"/>
@@ -4934,30 +4927,27 @@
         </w:tc>
         <w:tc>
           <w:tcPr>
-            <w:tcW w:w="2520" w:type="dxa"/>
-            <w:tcBorders>
-              <w:top w:val="single" w:sz="4" w:space="0" w:color="999999"/>
-              <w:left w:val="single" w:sz="4" w:space="0" w:color="999999"/>
-              <w:bottom w:val="single" w:sz="4" w:space="0" w:color="999999"/>
-              <w:right w:val="single" w:sz="4" w:space="0" w:color="999999"/>
-            </w:tcBorders>
-            <w:vAlign w:val="center"/>
-          </w:tcPr>
-          <w:p>
-            <w:pPr>
-              <w:pStyle w:val="Compact"/>
-            </w:pPr>
-            <w:r>
-              <w:rPr>
-                <w:rtl/>
-              </w:rPr>
-              <w:t xml:space="preserve">12 שעות</w:t>
-            </w:r>
-          </w:p>
-        </w:tc>
-        <w:tc>
-          <w:tcPr>
-            <w:tcW w:w="2361" w:type="dxa"/>
+            <w:tcW w:w="2403" w:type="dxa"/>
+            <w:tcBorders>
+              <w:top w:val="single" w:sz="4" w:space="0" w:color="999999"/>
+              <w:left w:val="single" w:sz="4" w:space="0" w:color="999999"/>
+              <w:bottom w:val="single" w:sz="4" w:space="0" w:color="999999"/>
+              <w:right w:val="single" w:sz="4" w:space="0" w:color="999999"/>
+            </w:tcBorders>
+            <w:vAlign w:val="center"/>
+          </w:tcPr>
+          <w:p>
+            <w:pPr>
+              <w:pStyle w:val="Compact"/>
+            </w:pPr>
+            <w:r>
+              <w:t xml:space="preserve">12‎ h</w:t>
+            </w:r>
+          </w:p>
+        </w:tc>
+        <w:tc>
+          <w:tcPr>
+            <w:tcW w:w="2404" w:type="dxa"/>
             <w:tcBorders>
               <w:top w:val="single" w:sz="4" w:space="0" w:color="999999"/>
               <w:left w:val="single" w:sz="4" w:space="0" w:color="999999"/>
@@ -4985,7 +4975,7 @@
         </w:trPr>
         <w:tc>
           <w:tcPr>
-            <w:tcW w:w="4119" w:type="dxa"/>
+            <w:tcW w:w="4193" w:type="dxa"/>
             <w:tcBorders>
               <w:top w:val="single" w:sz="4" w:space="0" w:color="999999"/>
               <w:left w:val="single" w:sz="4" w:space="0" w:color="999999"/>
@@ -5008,30 +4998,27 @@
         </w:tc>
         <w:tc>
           <w:tcPr>
-            <w:tcW w:w="2520" w:type="dxa"/>
-            <w:tcBorders>
-              <w:top w:val="single" w:sz="4" w:space="0" w:color="999999"/>
-              <w:left w:val="single" w:sz="4" w:space="0" w:color="999999"/>
-              <w:bottom w:val="single" w:sz="4" w:space="0" w:color="999999"/>
-              <w:right w:val="single" w:sz="4" w:space="0" w:color="999999"/>
-            </w:tcBorders>
-            <w:vAlign w:val="center"/>
-          </w:tcPr>
-          <w:p>
-            <w:pPr>
-              <w:pStyle w:val="Compact"/>
-            </w:pPr>
-            <w:r>
-              <w:rPr>
-                <w:rtl/>
-              </w:rPr>
-              <w:t xml:space="preserve">60 שניות</w:t>
-            </w:r>
-          </w:p>
-        </w:tc>
-        <w:tc>
-          <w:tcPr>
-            <w:tcW w:w="2361" w:type="dxa"/>
+            <w:tcW w:w="2403" w:type="dxa"/>
+            <w:tcBorders>
+              <w:top w:val="single" w:sz="4" w:space="0" w:color="999999"/>
+              <w:left w:val="single" w:sz="4" w:space="0" w:color="999999"/>
+              <w:bottom w:val="single" w:sz="4" w:space="0" w:color="999999"/>
+              <w:right w:val="single" w:sz="4" w:space="0" w:color="999999"/>
+            </w:tcBorders>
+            <w:vAlign w:val="center"/>
+          </w:tcPr>
+          <w:p>
+            <w:pPr>
+              <w:pStyle w:val="Compact"/>
+            </w:pPr>
+            <w:r>
+              <w:t xml:space="preserve">60‎ s</w:t>
+            </w:r>
+          </w:p>
+        </w:tc>
+        <w:tc>
+          <w:tcPr>
+            <w:tcW w:w="2404" w:type="dxa"/>
             <w:tcBorders>
               <w:top w:val="single" w:sz="4" w:space="0" w:color="999999"/>
               <w:left w:val="single" w:sz="4" w:space="0" w:color="999999"/>
@@ -5059,7 +5046,7 @@
         </w:trPr>
         <w:tc>
           <w:tcPr>
-            <w:tcW w:w="4119" w:type="dxa"/>
+            <w:tcW w:w="4193" w:type="dxa"/>
             <w:tcBorders>
               <w:top w:val="single" w:sz="4" w:space="0" w:color="999999"/>
               <w:left w:val="single" w:sz="4" w:space="0" w:color="999999"/>
@@ -5082,7 +5069,7 @@
         </w:tc>
         <w:tc>
           <w:tcPr>
-            <w:tcW w:w="2520" w:type="dxa"/>
+            <w:tcW w:w="2403" w:type="dxa"/>
             <w:tcBorders>
               <w:top w:val="single" w:sz="4" w:space="0" w:color="999999"/>
               <w:left w:val="single" w:sz="4" w:space="0" w:color="999999"/>
@@ -5105,7 +5092,7 @@
         </w:tc>
         <w:tc>
           <w:tcPr>
-            <w:tcW w:w="2361" w:type="dxa"/>
+            <w:tcW w:w="2404" w:type="dxa"/>
             <w:tcBorders>
               <w:top w:val="single" w:sz="4" w:space="0" w:color="999999"/>
               <w:left w:val="single" w:sz="4" w:space="0" w:color="999999"/>
@@ -5689,7 +5676,7 @@
         <w:rPr>
           <w:rtl/>
         </w:rPr>
-        <w:t xml:space="preserve">שאר המערכת נבדקה על הבקרים עצמם. כל תרחיש מתבצע פיזית: פותחים את הדלת, עוברים מול חיישן המרחק, מקישים קוד. בכל פעם בודקים שלוש תוצאות: הצליל שבקר הדלת משמיע, המסך באפליקציה והרשומה ביומן האירועים. את ההדפסות של הבקרים אפשר לראות ב-Serial Monitor בזמן הבדיקה.</w:t>
+        <w:t xml:space="preserve">שאר המערכת נבדקה על הבקרים עצמם. כל תרחיש מתבצע פיזית: נפתחת הדלת, נעשית חציה מול חיישן המרחק, מוקש קוד. בכל פעם נבדקות שלוש תוצאות: הצליל שבקר הדלת משמיע, המסך באפליקציה והרשומה ביומן האירועים. את ההדפסות של הבקרים אפשר לראות ב-Serial Monitor בזמן הבדיקה.</w:t>
       </w:r>
     </w:p>
     <w:bookmarkEnd w:id="44"/>
@@ -5748,8 +5735,8 @@
         </w:tblCellMar>
       </w:tblPr>
       <w:tblGrid>
-        <w:gridCol w:w="3893"/>
-        <w:gridCol w:w="5107"/>
+        <w:gridCol w:w="3897"/>
+        <w:gridCol w:w="5103"/>
       </w:tblGrid>
       <w:tr>
         <w:trPr>
@@ -5759,7 +5746,7 @@
         </w:trPr>
         <w:tc>
           <w:tcPr>
-            <w:tcW w:w="3893" w:type="dxa"/>
+            <w:tcW w:w="3897" w:type="dxa"/>
             <w:tcBorders>
               <w:top w:val="single" w:sz="4" w:space="0" w:color="999999"/>
               <w:left w:val="single" w:sz="4" w:space="0" w:color="999999"/>
@@ -5786,7 +5773,7 @@
         </w:tc>
         <w:tc>
           <w:tcPr>
-            <w:tcW w:w="5107" w:type="dxa"/>
+            <w:tcW w:w="5103" w:type="dxa"/>
             <w:tcBorders>
               <w:top w:val="single" w:sz="4" w:space="0" w:color="999999"/>
               <w:left w:val="single" w:sz="4" w:space="0" w:color="999999"/>
@@ -5818,7 +5805,7 @@
         </w:trPr>
         <w:tc>
           <w:tcPr>
-            <w:tcW w:w="3893" w:type="dxa"/>
+            <w:tcW w:w="3897" w:type="dxa"/>
             <w:tcBorders>
               <w:top w:val="single" w:sz="4" w:space="0" w:color="999999"/>
               <w:left w:val="single" w:sz="4" w:space="0" w:color="999999"/>
@@ -5856,7 +5843,7 @@
         </w:tc>
         <w:tc>
           <w:tcPr>
-            <w:tcW w:w="5107" w:type="dxa"/>
+            <w:tcW w:w="5103" w:type="dxa"/>
             <w:tcBorders>
               <w:top w:val="single" w:sz="4" w:space="0" w:color="999999"/>
               <w:left w:val="single" w:sz="4" w:space="0" w:color="999999"/>
@@ -5884,7 +5871,7 @@
         </w:trPr>
         <w:tc>
           <w:tcPr>
-            <w:tcW w:w="3893" w:type="dxa"/>
+            <w:tcW w:w="3897" w:type="dxa"/>
             <w:tcBorders>
               <w:top w:val="single" w:sz="4" w:space="0" w:color="999999"/>
               <w:left w:val="single" w:sz="4" w:space="0" w:color="999999"/>
@@ -5907,24 +5894,24 @@
         </w:tc>
         <w:tc>
           <w:tcPr>
-            <w:tcW w:w="5107" w:type="dxa"/>
-            <w:tcBorders>
-              <w:top w:val="single" w:sz="4" w:space="0" w:color="999999"/>
-              <w:left w:val="single" w:sz="4" w:space="0" w:color="999999"/>
-              <w:bottom w:val="single" w:sz="4" w:space="0" w:color="999999"/>
-              <w:right w:val="single" w:sz="4" w:space="0" w:color="999999"/>
-            </w:tcBorders>
-            <w:vAlign w:val="center"/>
-          </w:tcPr>
-          <w:p>
-            <w:pPr>
-              <w:pStyle w:val="Compact"/>
-            </w:pPr>
-            <w:r>
-              <w:rPr>
-                <w:rtl/>
-              </w:rPr>
-              <w:t xml:space="preserve">ספירה של 30 שניות, ואז נטרול וצליל נטרול</w:t>
+            <w:tcW w:w="5103" w:type="dxa"/>
+            <w:tcBorders>
+              <w:top w:val="single" w:sz="4" w:space="0" w:color="999999"/>
+              <w:left w:val="single" w:sz="4" w:space="0" w:color="999999"/>
+              <w:bottom w:val="single" w:sz="4" w:space="0" w:color="999999"/>
+              <w:right w:val="single" w:sz="4" w:space="0" w:color="999999"/>
+            </w:tcBorders>
+            <w:vAlign w:val="center"/>
+          </w:tcPr>
+          <w:p>
+            <w:pPr>
+              <w:pStyle w:val="Compact"/>
+            </w:pPr>
+            <w:r>
+              <w:rPr>
+                <w:rtl/>
+              </w:rPr>
+              <w:t xml:space="preserve">ספירה של 30‎ s, ואז נטרול וצליל נטרול</w:t>
             </w:r>
           </w:p>
         </w:tc>
@@ -5935,7 +5922,7 @@
         </w:trPr>
         <w:tc>
           <w:tcPr>
-            <w:tcW w:w="3893" w:type="dxa"/>
+            <w:tcW w:w="3897" w:type="dxa"/>
             <w:tcBorders>
               <w:top w:val="single" w:sz="4" w:space="0" w:color="999999"/>
               <w:left w:val="single" w:sz="4" w:space="0" w:color="999999"/>
@@ -5958,7 +5945,7 @@
         </w:tc>
         <w:tc>
           <w:tcPr>
-            <w:tcW w:w="5107" w:type="dxa"/>
+            <w:tcW w:w="5103" w:type="dxa"/>
             <w:tcBorders>
               <w:top w:val="single" w:sz="4" w:space="0" w:color="999999"/>
               <w:left w:val="single" w:sz="4" w:space="0" w:color="999999"/>
@@ -5986,30 +5973,30 @@
         </w:trPr>
         <w:tc>
           <w:tcPr>
-            <w:tcW w:w="3893" w:type="dxa"/>
-            <w:tcBorders>
-              <w:top w:val="single" w:sz="4" w:space="0" w:color="999999"/>
-              <w:left w:val="single" w:sz="4" w:space="0" w:color="999999"/>
-              <w:bottom w:val="single" w:sz="4" w:space="0" w:color="999999"/>
-              <w:right w:val="single" w:sz="4" w:space="0" w:color="999999"/>
-            </w:tcBorders>
-            <w:vAlign w:val="center"/>
-          </w:tcPr>
-          <w:p>
-            <w:pPr>
-              <w:pStyle w:val="Compact"/>
-            </w:pPr>
-            <w:r>
-              <w:rPr>
-                <w:rtl/>
-              </w:rPr>
-              <w:t xml:space="preserve">פתיחת הדלת וחוסר נטרול במשך 30 שניות</w:t>
-            </w:r>
-          </w:p>
-        </w:tc>
-        <w:tc>
-          <w:tcPr>
-            <w:tcW w:w="5107" w:type="dxa"/>
+            <w:tcW w:w="3897" w:type="dxa"/>
+            <w:tcBorders>
+              <w:top w:val="single" w:sz="4" w:space="0" w:color="999999"/>
+              <w:left w:val="single" w:sz="4" w:space="0" w:color="999999"/>
+              <w:bottom w:val="single" w:sz="4" w:space="0" w:color="999999"/>
+              <w:right w:val="single" w:sz="4" w:space="0" w:color="999999"/>
+            </w:tcBorders>
+            <w:vAlign w:val="center"/>
+          </w:tcPr>
+          <w:p>
+            <w:pPr>
+              <w:pStyle w:val="Compact"/>
+            </w:pPr>
+            <w:r>
+              <w:rPr>
+                <w:rtl/>
+              </w:rPr>
+              <w:t xml:space="preserve">פתיחת הדלת וחוסר נטרול במשך 30‎ s</w:t>
+            </w:r>
+          </w:p>
+        </w:tc>
+        <w:tc>
+          <w:tcPr>
+            <w:tcW w:w="5103" w:type="dxa"/>
             <w:tcBorders>
               <w:top w:val="single" w:sz="4" w:space="0" w:color="999999"/>
               <w:left w:val="single" w:sz="4" w:space="0" w:color="999999"/>
@@ -6037,7 +6024,7 @@
         </w:trPr>
         <w:tc>
           <w:tcPr>
-            <w:tcW w:w="3893" w:type="dxa"/>
+            <w:tcW w:w="3897" w:type="dxa"/>
             <w:tcBorders>
               <w:top w:val="single" w:sz="4" w:space="0" w:color="999999"/>
               <w:left w:val="single" w:sz="4" w:space="0" w:color="999999"/>
@@ -6060,7 +6047,7 @@
         </w:tc>
         <w:tc>
           <w:tcPr>
-            <w:tcW w:w="5107" w:type="dxa"/>
+            <w:tcW w:w="5103" w:type="dxa"/>
             <w:tcBorders>
               <w:top w:val="single" w:sz="4" w:space="0" w:color="999999"/>
               <w:left w:val="single" w:sz="4" w:space="0" w:color="999999"/>
@@ -6088,7 +6075,7 @@
         </w:trPr>
         <w:tc>
           <w:tcPr>
-            <w:tcW w:w="3893" w:type="dxa"/>
+            <w:tcW w:w="3897" w:type="dxa"/>
             <w:tcBorders>
               <w:top w:val="single" w:sz="4" w:space="0" w:color="999999"/>
               <w:left w:val="single" w:sz="4" w:space="0" w:color="999999"/>
@@ -6111,7 +6098,7 @@
         </w:tc>
         <w:tc>
           <w:tcPr>
-            <w:tcW w:w="5107" w:type="dxa"/>
+            <w:tcW w:w="5103" w:type="dxa"/>
             <w:tcBorders>
               <w:top w:val="single" w:sz="4" w:space="0" w:color="999999"/>
               <w:left w:val="single" w:sz="4" w:space="0" w:color="999999"/>
@@ -6139,7 +6126,7 @@
         </w:trPr>
         <w:tc>
           <w:tcPr>
-            <w:tcW w:w="3893" w:type="dxa"/>
+            <w:tcW w:w="3897" w:type="dxa"/>
             <w:tcBorders>
               <w:top w:val="single" w:sz="4" w:space="0" w:color="999999"/>
               <w:left w:val="single" w:sz="4" w:space="0" w:color="999999"/>
@@ -6162,7 +6149,7 @@
         </w:tc>
         <w:tc>
           <w:tcPr>
-            <w:tcW w:w="5107" w:type="dxa"/>
+            <w:tcW w:w="5103" w:type="dxa"/>
             <w:tcBorders>
               <w:top w:val="single" w:sz="4" w:space="0" w:color="999999"/>
               <w:left w:val="single" w:sz="4" w:space="0" w:color="999999"/>
@@ -6190,7 +6177,7 @@
         </w:trPr>
         <w:tc>
           <w:tcPr>
-            <w:tcW w:w="3893" w:type="dxa"/>
+            <w:tcW w:w="3897" w:type="dxa"/>
             <w:tcBorders>
               <w:top w:val="single" w:sz="4" w:space="0" w:color="999999"/>
               <w:left w:val="single" w:sz="4" w:space="0" w:color="999999"/>
@@ -6213,7 +6200,7 @@
         </w:tc>
         <w:tc>
           <w:tcPr>
-            <w:tcW w:w="5107" w:type="dxa"/>
+            <w:tcW w:w="5103" w:type="dxa"/>
             <w:tcBorders>
               <w:top w:val="single" w:sz="4" w:space="0" w:color="999999"/>
               <w:left w:val="single" w:sz="4" w:space="0" w:color="999999"/>
@@ -6241,7 +6228,7 @@
         </w:trPr>
         <w:tc>
           <w:tcPr>
-            <w:tcW w:w="3893" w:type="dxa"/>
+            <w:tcW w:w="3897" w:type="dxa"/>
             <w:tcBorders>
               <w:top w:val="single" w:sz="4" w:space="0" w:color="999999"/>
               <w:left w:val="single" w:sz="4" w:space="0" w:color="999999"/>
@@ -6264,7 +6251,7 @@
         </w:tc>
         <w:tc>
           <w:tcPr>
-            <w:tcW w:w="5107" w:type="dxa"/>
+            <w:tcW w:w="5103" w:type="dxa"/>
             <w:tcBorders>
               <w:top w:val="single" w:sz="4" w:space="0" w:color="999999"/>
               <w:left w:val="single" w:sz="4" w:space="0" w:color="999999"/>
@@ -6292,7 +6279,7 @@
         </w:trPr>
         <w:tc>
           <w:tcPr>
-            <w:tcW w:w="3893" w:type="dxa"/>
+            <w:tcW w:w="3897" w:type="dxa"/>
             <w:tcBorders>
               <w:top w:val="single" w:sz="4" w:space="0" w:color="999999"/>
               <w:left w:val="single" w:sz="4" w:space="0" w:color="999999"/>
@@ -6315,7 +6302,7 @@
         </w:tc>
         <w:tc>
           <w:tcPr>
-            <w:tcW w:w="5107" w:type="dxa"/>
+            <w:tcW w:w="5103" w:type="dxa"/>
             <w:tcBorders>
               <w:top w:val="single" w:sz="4" w:space="0" w:color="999999"/>
               <w:left w:val="single" w:sz="4" w:space="0" w:color="999999"/>
@@ -6343,7 +6330,7 @@
         </w:trPr>
         <w:tc>
           <w:tcPr>
-            <w:tcW w:w="3893" w:type="dxa"/>
+            <w:tcW w:w="3897" w:type="dxa"/>
             <w:tcBorders>
               <w:top w:val="single" w:sz="4" w:space="0" w:color="999999"/>
               <w:left w:val="single" w:sz="4" w:space="0" w:color="999999"/>
@@ -6366,7 +6353,7 @@
         </w:tc>
         <w:tc>
           <w:tcPr>
-            <w:tcW w:w="5107" w:type="dxa"/>
+            <w:tcW w:w="5103" w:type="dxa"/>
             <w:tcBorders>
               <w:top w:val="single" w:sz="4" w:space="0" w:color="999999"/>
               <w:left w:val="single" w:sz="4" w:space="0" w:color="999999"/>
@@ -6394,7 +6381,7 @@
         </w:trPr>
         <w:tc>
           <w:tcPr>
-            <w:tcW w:w="3893" w:type="dxa"/>
+            <w:tcW w:w="3897" w:type="dxa"/>
             <w:tcBorders>
               <w:top w:val="single" w:sz="4" w:space="0" w:color="999999"/>
               <w:left w:val="single" w:sz="4" w:space="0" w:color="999999"/>
@@ -6417,24 +6404,24 @@
         </w:tc>
         <w:tc>
           <w:tcPr>
-            <w:tcW w:w="5107" w:type="dxa"/>
-            <w:tcBorders>
-              <w:top w:val="single" w:sz="4" w:space="0" w:color="999999"/>
-              <w:left w:val="single" w:sz="4" w:space="0" w:color="999999"/>
-              <w:bottom w:val="single" w:sz="4" w:space="0" w:color="999999"/>
-              <w:right w:val="single" w:sz="4" w:space="0" w:color="999999"/>
-            </w:tcBorders>
-            <w:vAlign w:val="center"/>
-          </w:tcPr>
-          <w:p>
-            <w:pPr>
-              <w:pStyle w:val="Compact"/>
-            </w:pPr>
-            <w:r>
-              <w:rPr>
-                <w:rtl/>
-              </w:rPr>
-              <w:t xml:space="preserve">הכפתור ננעל ל-30 שניות</w:t>
+            <w:tcW w:w="5103" w:type="dxa"/>
+            <w:tcBorders>
+              <w:top w:val="single" w:sz="4" w:space="0" w:color="999999"/>
+              <w:left w:val="single" w:sz="4" w:space="0" w:color="999999"/>
+              <w:bottom w:val="single" w:sz="4" w:space="0" w:color="999999"/>
+              <w:right w:val="single" w:sz="4" w:space="0" w:color="999999"/>
+            </w:tcBorders>
+            <w:vAlign w:val="center"/>
+          </w:tcPr>
+          <w:p>
+            <w:pPr>
+              <w:pStyle w:val="Compact"/>
+            </w:pPr>
+            <w:r>
+              <w:rPr>
+                <w:rtl/>
+              </w:rPr>
+              <w:t xml:space="preserve">הכפתור ננעל ל-30‎ s</w:t>
             </w:r>
           </w:p>
         </w:tc>
@@ -6445,7 +6432,7 @@
         </w:trPr>
         <w:tc>
           <w:tcPr>
-            <w:tcW w:w="3893" w:type="dxa"/>
+            <w:tcW w:w="3897" w:type="dxa"/>
             <w:tcBorders>
               <w:top w:val="single" w:sz="4" w:space="0" w:color="999999"/>
               <w:left w:val="single" w:sz="4" w:space="0" w:color="999999"/>
@@ -6468,7 +6455,7 @@
         </w:tc>
         <w:tc>
           <w:tcPr>
-            <w:tcW w:w="5107" w:type="dxa"/>
+            <w:tcW w:w="5103" w:type="dxa"/>
             <w:tcBorders>
               <w:top w:val="single" w:sz="4" w:space="0" w:color="999999"/>
               <w:left w:val="single" w:sz="4" w:space="0" w:color="999999"/>
@@ -6496,7 +6483,7 @@
         </w:trPr>
         <w:tc>
           <w:tcPr>
-            <w:tcW w:w="3893" w:type="dxa"/>
+            <w:tcW w:w="3897" w:type="dxa"/>
             <w:tcBorders>
               <w:top w:val="single" w:sz="4" w:space="0" w:color="999999"/>
               <w:left w:val="single" w:sz="4" w:space="0" w:color="999999"/>
@@ -6519,7 +6506,7 @@
         </w:tc>
         <w:tc>
           <w:tcPr>
-            <w:tcW w:w="5107" w:type="dxa"/>
+            <w:tcW w:w="5103" w:type="dxa"/>
             <w:tcBorders>
               <w:top w:val="single" w:sz="4" w:space="0" w:color="999999"/>
               <w:left w:val="single" w:sz="4" w:space="0" w:color="999999"/>
@@ -6547,7 +6534,7 @@
         </w:trPr>
         <w:tc>
           <w:tcPr>
-            <w:tcW w:w="3893" w:type="dxa"/>
+            <w:tcW w:w="3897" w:type="dxa"/>
             <w:tcBorders>
               <w:top w:val="single" w:sz="4" w:space="0" w:color="999999"/>
               <w:left w:val="single" w:sz="4" w:space="0" w:color="999999"/>
@@ -6570,7 +6557,7 @@
         </w:tc>
         <w:tc>
           <w:tcPr>
-            <w:tcW w:w="5107" w:type="dxa"/>
+            <w:tcW w:w="5103" w:type="dxa"/>
             <w:tcBorders>
               <w:top w:val="single" w:sz="4" w:space="0" w:color="999999"/>
               <w:left w:val="single" w:sz="4" w:space="0" w:color="999999"/>
@@ -6755,7 +6742,7 @@
         <w:rPr>
           <w:rtl/>
         </w:rPr>
-        <w:t xml:space="preserve">לכן אין צורך לכוונן את חיישן המרחק ידנית כשמזיזים אותו. החיסרון: אם מישהו עומד מול החיישן בזמן ההפעלה, המרחק הרגיל נמדד לא נכון, והחיישן כמעט לא יזהה אחרי זה את המסדרון הריק. כדי להקטין את הסיכון הבקר פוסל מרחק רגיל שקצר מ-1 מטר או ארוך מ-4 מטר, וחוזר למרחק האחרון ששמר. הוא גם מציין תקלה בדיווח החיים אם המרחק הרגיל זז ביותר מ-40 ס"מ מההפעלה הקודמת, או אם החיישן לא מחזיר הד במשך 30 שניות. כרגע הבקנד לא מציג את התקלה הזאת באפליקציה, והיא נראית רק ביומן הבקשות של הבקנד. זה שיפור שנשאר להמשך.</w:t>
+        <w:t xml:space="preserve">לכן אין צורך לכוונן את חיישן המרחק ידנית כשמזיזים אותו. החיסרון: אם מישהו עומד מול החיישן בזמן ההפעלה, המרחק הרגיל נמדד לא נכון, והחיישן כמעט לא יזהה אחרי זה את המסדרון הריק. כדי להקטין את הסיכון הבקר פוסל מרחק רגיל שקצר מ-1‎ m או ארוך מ-4‎ m, וחוזר למרחק האחרון ששמר. הוא גם מציין תקלה בדיווח החיים אם המרחק הרגיל זז ביותר מ-40‎ cm מההפעלה הקודמת, או אם החיישן לא מחזיר הד במשך 30‎ s. כרגע הבקנד לא מציג את התקלה הזאת באפליקציה, והיא נראית רק ביומן הבקשות של הבקנד. זה שיפור שנשאר להמשך.</w:t>
       </w:r>
     </w:p>
     <w:p>
@@ -8074,7 +8061,7 @@
         <w:rPr>
           <w:rtl/>
         </w:rPr>
-        <w:t xml:space="preserve">כשמחברים כמה רכיבים מתחומים שונים, החלק הקשה הוא לא הרכיבים עצמם אלא החיבור ביניהם: זמנים, סדר פעולות ומצבים שהמערכת צריכה להסכים עליהם.</w:t>
+        <w:t xml:space="preserve">בחיבור של כמה רכיבים מתחומים שונים, החלק הקשה הוא לא הרכיבים עצמם אלא החיבור ביניהם: זמנים, סדר פעולות ומצבים שהמערכת צריכה להסכים עליהם.</w:t>
       </w:r>
     </w:p>
     <w:bookmarkEnd w:id="51"/>
@@ -8428,7 +8415,7 @@
         <w:t xml:space="preserve">8. נספחים</w:t>
       </w:r>
     </w:p>
-    <w:bookmarkStart w:id="55" w:name="נספח-א-רשימת-חומרים-bom"/>
+    <w:bookmarkStart w:id="55" w:name="רשימת-חומרים-bom"/>
     <w:p>
       <w:pPr>
         <w:pStyle w:val="Heading2"/>
@@ -8437,7 +8424,7 @@
         <w:rPr>
           <w:rtl/>
         </w:rPr>
-        <w:t xml:space="preserve">נספח א' — רשימת חומרים (BOM)</w:t>
+        <w:t xml:space="preserve">8.1 רשימת חומרים (BOM)</w:t>
       </w:r>
     </w:p>
     <w:p>
@@ -9486,7 +9473,7 @@
       </w:tr>
     </w:tbl>
     <w:bookmarkEnd w:id="55"/>
-    <w:bookmarkStart w:id="56" w:name="נספח-ב-הוראות-הפעלה-קצרות"/>
+    <w:bookmarkStart w:id="56" w:name="הוראות-הפעלה-קצרות"/>
     <w:p>
       <w:pPr>
         <w:pStyle w:val="Heading2"/>
@@ -9495,7 +9482,7 @@
         <w:rPr>
           <w:rtl/>
         </w:rPr>
-        <w:t xml:space="preserve">נספח ב' — הוראות הפעלה קצרות</w:t>
+        <w:t xml:space="preserve">8.2 הוראות הפעלה קצרות</w:t>
       </w:r>
     </w:p>
     <w:p>
@@ -9541,9 +9528,9 @@
         </w:tblCellMar>
       </w:tblPr>
       <w:tblGrid>
-        <w:gridCol w:w="1834"/>
-        <w:gridCol w:w="4035"/>
-        <w:gridCol w:w="3131"/>
+        <w:gridCol w:w="1839"/>
+        <w:gridCol w:w="4021"/>
+        <w:gridCol w:w="3140"/>
       </w:tblGrid>
       <w:tr>
         <w:trPr>
@@ -9553,7 +9540,7 @@
         </w:trPr>
         <w:tc>
           <w:tcPr>
-            <w:tcW w:w="1834" w:type="dxa"/>
+            <w:tcW w:w="1839" w:type="dxa"/>
             <w:tcBorders>
               <w:top w:val="single" w:sz="4" w:space="0" w:color="999999"/>
               <w:left w:val="single" w:sz="4" w:space="0" w:color="999999"/>
@@ -9581,7 +9568,7 @@
         </w:tc>
         <w:tc>
           <w:tcPr>
-            <w:tcW w:w="4035" w:type="dxa"/>
+            <w:tcW w:w="4021" w:type="dxa"/>
             <w:tcBorders>
               <w:top w:val="single" w:sz="4" w:space="0" w:color="999999"/>
               <w:left w:val="single" w:sz="4" w:space="0" w:color="999999"/>
@@ -9609,7 +9596,7 @@
         </w:tc>
         <w:tc>
           <w:tcPr>
-            <w:tcW w:w="3131" w:type="dxa"/>
+            <w:tcW w:w="3140" w:type="dxa"/>
             <w:tcBorders>
               <w:top w:val="single" w:sz="4" w:space="0" w:color="999999"/>
               <w:left w:val="single" w:sz="4" w:space="0" w:color="999999"/>
@@ -9642,7 +9629,7 @@
         </w:trPr>
         <w:tc>
           <w:tcPr>
-            <w:tcW w:w="1834" w:type="dxa"/>
+            <w:tcW w:w="1839" w:type="dxa"/>
             <w:tcBorders>
               <w:top w:val="single" w:sz="4" w:space="0" w:color="999999"/>
               <w:left w:val="single" w:sz="4" w:space="0" w:color="999999"/>
@@ -9666,7 +9653,7 @@
         </w:tc>
         <w:tc>
           <w:tcPr>
-            <w:tcW w:w="4035" w:type="dxa"/>
+            <w:tcW w:w="4021" w:type="dxa"/>
             <w:tcBorders>
               <w:top w:val="single" w:sz="4" w:space="0" w:color="999999"/>
               <w:left w:val="single" w:sz="4" w:space="0" w:color="999999"/>
@@ -9708,7 +9695,7 @@
         </w:tc>
         <w:tc>
           <w:tcPr>
-            <w:tcW w:w="3131" w:type="dxa"/>
+            <w:tcW w:w="3140" w:type="dxa"/>
             <w:tcBorders>
               <w:top w:val="single" w:sz="4" w:space="0" w:color="999999"/>
               <w:left w:val="single" w:sz="4" w:space="0" w:color="999999"/>
@@ -9737,7 +9724,7 @@
         </w:trPr>
         <w:tc>
           <w:tcPr>
-            <w:tcW w:w="1834" w:type="dxa"/>
+            <w:tcW w:w="1839" w:type="dxa"/>
             <w:tcBorders>
               <w:top w:val="single" w:sz="4" w:space="0" w:color="999999"/>
               <w:left w:val="single" w:sz="4" w:space="0" w:color="999999"/>
@@ -9761,7 +9748,7 @@
         </w:tc>
         <w:tc>
           <w:tcPr>
-            <w:tcW w:w="4035" w:type="dxa"/>
+            <w:tcW w:w="4021" w:type="dxa"/>
             <w:tcBorders>
               <w:top w:val="single" w:sz="4" w:space="0" w:color="999999"/>
               <w:left w:val="single" w:sz="4" w:space="0" w:color="999999"/>
@@ -9803,7 +9790,7 @@
         </w:tc>
         <w:tc>
           <w:tcPr>
-            <w:tcW w:w="3131" w:type="dxa"/>
+            <w:tcW w:w="3140" w:type="dxa"/>
             <w:tcBorders>
               <w:top w:val="single" w:sz="4" w:space="0" w:color="999999"/>
               <w:left w:val="single" w:sz="4" w:space="0" w:color="999999"/>
@@ -9829,7 +9816,7 @@
         </w:trPr>
         <w:tc>
           <w:tcPr>
-            <w:tcW w:w="1834" w:type="dxa"/>
+            <w:tcW w:w="1839" w:type="dxa"/>
             <w:tcBorders>
               <w:top w:val="single" w:sz="4" w:space="0" w:color="999999"/>
               <w:left w:val="single" w:sz="4" w:space="0" w:color="999999"/>
@@ -9853,7 +9840,7 @@
         </w:tc>
         <w:tc>
           <w:tcPr>
-            <w:tcW w:w="4035" w:type="dxa"/>
+            <w:tcW w:w="4021" w:type="dxa"/>
             <w:tcBorders>
               <w:top w:val="single" w:sz="4" w:space="0" w:color="999999"/>
               <w:left w:val="single" w:sz="4" w:space="0" w:color="999999"/>
@@ -9883,7 +9870,7 @@
         </w:tc>
         <w:tc>
           <w:tcPr>
-            <w:tcW w:w="3131" w:type="dxa"/>
+            <w:tcW w:w="3140" w:type="dxa"/>
             <w:tcBorders>
               <w:top w:val="single" w:sz="4" w:space="0" w:color="999999"/>
               <w:left w:val="single" w:sz="4" w:space="0" w:color="999999"/>
@@ -9909,7 +9896,7 @@
         </w:trPr>
         <w:tc>
           <w:tcPr>
-            <w:tcW w:w="1834" w:type="dxa"/>
+            <w:tcW w:w="1839" w:type="dxa"/>
             <w:tcBorders>
               <w:top w:val="single" w:sz="4" w:space="0" w:color="999999"/>
               <w:left w:val="single" w:sz="4" w:space="0" w:color="999999"/>
@@ -9933,7 +9920,7 @@
         </w:tc>
         <w:tc>
           <w:tcPr>
-            <w:tcW w:w="4035" w:type="dxa"/>
+            <w:tcW w:w="4021" w:type="dxa"/>
             <w:tcBorders>
               <w:top w:val="single" w:sz="4" w:space="0" w:color="999999"/>
               <w:left w:val="single" w:sz="4" w:space="0" w:color="999999"/>
@@ -9966,13 +9953,13 @@
               <w:rPr>
                 <w:rtl/>
               </w:rPr>
-              <w:t xml:space="preserve">תוך 30 שניות</w:t>
-            </w:r>
-          </w:p>
-        </w:tc>
-        <w:tc>
-          <w:tcPr>
-            <w:tcW w:w="3131" w:type="dxa"/>
+              <w:t xml:space="preserve">תוך 30‎ s</w:t>
+            </w:r>
+          </w:p>
+        </w:tc>
+        <w:tc>
+          <w:tcPr>
+            <w:tcW w:w="3140" w:type="dxa"/>
             <w:tcBorders>
               <w:top w:val="single" w:sz="4" w:space="0" w:color="999999"/>
               <w:left w:val="single" w:sz="4" w:space="0" w:color="999999"/>
@@ -10001,7 +9988,7 @@
         </w:trPr>
         <w:tc>
           <w:tcPr>
-            <w:tcW w:w="1834" w:type="dxa"/>
+            <w:tcW w:w="1839" w:type="dxa"/>
             <w:tcBorders>
               <w:top w:val="single" w:sz="4" w:space="0" w:color="999999"/>
               <w:left w:val="single" w:sz="4" w:space="0" w:color="999999"/>
@@ -10025,7 +10012,7 @@
         </w:tc>
         <w:tc>
           <w:tcPr>
-            <w:tcW w:w="4035" w:type="dxa"/>
+            <w:tcW w:w="4021" w:type="dxa"/>
             <w:tcBorders>
               <w:top w:val="single" w:sz="4" w:space="0" w:color="999999"/>
               <w:left w:val="single" w:sz="4" w:space="0" w:color="999999"/>
@@ -10046,7 +10033,7 @@
         </w:tc>
         <w:tc>
           <w:tcPr>
-            <w:tcW w:w="3131" w:type="dxa"/>
+            <w:tcW w:w="3140" w:type="dxa"/>
             <w:tcBorders>
               <w:top w:val="single" w:sz="4" w:space="0" w:color="999999"/>
               <w:left w:val="single" w:sz="4" w:space="0" w:color="999999"/>
@@ -10075,7 +10062,7 @@
         </w:trPr>
         <w:tc>
           <w:tcPr>
-            <w:tcW w:w="1834" w:type="dxa"/>
+            <w:tcW w:w="1839" w:type="dxa"/>
             <w:tcBorders>
               <w:top w:val="single" w:sz="4" w:space="0" w:color="999999"/>
               <w:left w:val="single" w:sz="4" w:space="0" w:color="999999"/>
@@ -10098,7 +10085,7 @@
         </w:tc>
         <w:tc>
           <w:tcPr>
-            <w:tcW w:w="4035" w:type="dxa"/>
+            <w:tcW w:w="4021" w:type="dxa"/>
             <w:tcBorders>
               <w:top w:val="single" w:sz="4" w:space="0" w:color="999999"/>
               <w:left w:val="single" w:sz="4" w:space="0" w:color="999999"/>
@@ -10118,7 +10105,7 @@
         </w:tc>
         <w:tc>
           <w:tcPr>
-            <w:tcW w:w="3131" w:type="dxa"/>
+            <w:tcW w:w="3140" w:type="dxa"/>
             <w:tcBorders>
               <w:top w:val="single" w:sz="4" w:space="0" w:color="999999"/>
               <w:left w:val="single" w:sz="4" w:space="0" w:color="999999"/>

</xml_diff>

<commit_message>
Adapt the report to the code: Home mode bypasses only the vibration sensor, 3 s arming from the app, deviations from the proposal, lockout wording
Co-Authored-By: Claude Sonnet 5.5 <noreply@anthropic.com>
Claude-Session: https://claude.ai/code/session_01N3vMpjMW2wYwoiVm9vYhWU
</commit_message>
<xml_diff>
--- a/report/HomeGuard_Report.docx
+++ b/report/HomeGuard_Report.docx
@@ -686,7 +686,7 @@
         <w:rPr>
           <w:rtl/>
         </w:rPr>
-        <w:t xml:space="preserve">בפרויקט נבנתה מערכת אזעקה לבית. שלושה בקרי ESP32 מחוברים ב-WiFi לשרת (בקנד) שכתוב ב-Python ורץ על מחשב: בקר אחד עם חיישן מרחק וחיישן רעידות, בקר שני בדלת עם חיישן דלת, קודן וזמזמים, ובקר שלישי עם מצלמה. הבקנד מחליט מתי יש אזעקה, מזהה פנים של דיירים ושולח אימייל עם תמונה מהמצלמה. אפליקציה בטלפון מאפשרת לדרוך ולנטרל, לראות את המצלמה ולעבור על יומן אירועים. אפשר לדרוך ולנטרל גם מהקודן שליד הדלת. דרישות החובה של הפרויקט מומשו. שני דברים שהוצעו לא מומשו: חיוג אוטומטי לגורם חירום, ונעילת הקודן אחרי כמה קודים שגויים.</w:t>
+        <w:t xml:space="preserve">בפרויקט נבנתה מערכת אזעקה לבית. שלושה בקרי ESP32 מחוברים ב-WiFi לשרת (בקנד) שכתוב ב-Python ורץ על מחשב: בקר אחד עם חיישן מרחק וחיישן רעידות, בקר שני בדלת עם חיישן דלת, קודן וזמזמים, ובקר שלישי עם מצלמה. הבקנד מחליט מתי יש אזעקה, מזהה פנים של דיירים ושולח אימייל עם תמונה מהמצלמה. אפליקציה בטלפון מאפשרת לדרוך ולנטרל, לראות את המצלמה ולעבור על יומן אירועים. אפשר לדרוך ולנטרל גם מהקודן שליד הדלת. דרישות החובה של הפרויקט מומשו. שלושה דברים שהוצעו לא מומשו כפי שהוצעו: חיוג אוטומטי לגורם חירום, אזעקה אוטומטית אחרי כמה קודים שגויים בקודן, והפעלת אזעקה בזיהוי פנים לא מאושרות (במקומה, פנים מאושרות מנטרלות את המערכת).</w:t>
       </w:r>
     </w:p>
     <w:p>
@@ -926,6 +926,70 @@
           <w:rtl/>
         </w:rPr>
         <w:t xml:space="preserve">ההתראות נשלחות באימייל.</w:t>
+      </w:r>
+    </w:p>
+    <w:p>
+      <w:pPr>
+        <w:pStyle w:val="BodyText"/>
+        <w:numPr>
+          <w:ilvl w:val="0"/>
+          <w:numId w:val="1002"/>
+        </w:numPr>
+        <w:spacing w:after="60"/>
+      </w:pPr>
+      <w:r>
+        <w:rPr>
+          <w:rtl/>
+        </w:rPr>
+        <w:t xml:space="preserve">קודן 3×4 במקום 4×4.</w:t>
+      </w:r>
+    </w:p>
+    <w:p>
+      <w:pPr>
+        <w:pStyle w:val="BodyText"/>
+        <w:numPr>
+          <w:ilvl w:val="0"/>
+          <w:numId w:val="1002"/>
+        </w:numPr>
+        <w:spacing w:after="60"/>
+      </w:pPr>
+      <w:r>
+        <w:rPr>
+          <w:rtl/>
+        </w:rPr>
+        <w:t xml:space="preserve">חיישן הרעידות מחובר כאות דיגיטלי עם פסיקה ולא כאות אנלוגי. לכן במקום אלגוריתם לסינון אות אנלוגי נעשה סינון של קריאות חוזרות והפסקה בין דיווחים (סעיף 3.5).</w:t>
+      </w:r>
+    </w:p>
+    <w:p>
+      <w:pPr>
+        <w:pStyle w:val="BodyText"/>
+        <w:numPr>
+          <w:ilvl w:val="0"/>
+          <w:numId w:val="1002"/>
+        </w:numPr>
+        <w:spacing w:after="60"/>
+      </w:pPr>
+      <w:r>
+        <w:rPr>
+          <w:rtl/>
+        </w:rPr>
+        <w:t xml:space="preserve">זיהוי פנים משמש לנטרול המערכת, באופט-אין, ולא להפעלת אזעקה בזיהוי פנים לא מאושרות.</w:t>
+      </w:r>
+    </w:p>
+    <w:p>
+      <w:pPr>
+        <w:pStyle w:val="BodyText"/>
+        <w:numPr>
+          <w:ilvl w:val="0"/>
+          <w:numId w:val="1002"/>
+        </w:numPr>
+        <w:spacing w:after="60"/>
+      </w:pPr>
+      <w:r>
+        <w:rPr>
+          <w:rtl/>
+        </w:rPr>
+        <w:t xml:space="preserve">אזעקה אוטומטית אחרי 3 קודים שגויים בקודן לא מומשה (טבלה 6).</w:t>
       </w:r>
     </w:p>
     <w:bookmarkEnd w:id="23"/>
@@ -1945,7 +2009,7 @@
         <w:rPr>
           <w:rtl/>
         </w:rPr>
-        <w:t xml:space="preserve">חיישן הרעידות מגיב מיד לכל מכה: מכה נמשכת אלפיות שנייה בודדות, ולכן הבקר מגיב לה ברגע שהחיישן משדר ולא בודק אותו רק מדי פעם. גם כאן יש הפסקה של 5‎ s בין שני דיווחים.</w:t>
+        <w:t xml:space="preserve">חיישן הרעידות מחובר לפסיקה (Interrupt). מכה נמשכת אלפיות שנייה בודדות, ובדיקה מדי פעם הייתה יכולה לפספס אותה. עם פסיקה הבקר מסמן את המכה ברגע שהחיישן משדר, והלולאה הראשית מדווחת עליה. גם כאן יש הפסקה של 5‎ s בין שני דיווחים.</w:t>
       </w:r>
     </w:p>
     <w:p>
@@ -2871,7 +2935,7 @@
         <w:rPr>
           <w:rtl/>
         </w:rPr>
-        <w:t xml:space="preserve">האפליקציה שולחת פקודה לבקר הדלת. אם הדלת פתוחה, הדריכה נדחית והאפליקציה מציגה הודעה.</w:t>
+        <w:t xml:space="preserve">האפליקציה שולחת פקודה לבקר הדלת, והמערכת נדרכת אחרי ספירה קצרה של 3‎ s שבמהלכה האפליקציה מציגה "Arming". אם הדלת פתוחה, הדריכה נדחית והאפליקציה מציגה הודעה.</w:t>
       </w:r>
     </w:p>
     <w:p>
@@ -2893,7 +2957,7 @@
         <w:rPr>
           <w:rtl/>
         </w:rPr>
-        <w:t xml:space="preserve">ב-Away כל החיישנים פעילים. ב-Home המערכת מתעלמת מחיישן המרחק ומחיישן הרעידות, כדי שאפשר יהיה להיות בבית כשהמערכת דרוכה. חיישן הדלת ממשיך לעבוד.</w:t>
+        <w:t xml:space="preserve">ב-Away כל החיישנים פעילים. ב-Home המערכת מתעלמת מחיישן הרעידות, כדי שאפשר יהיה לנוע בבית כשהמערכת דרוכה. חיישן המרחק וחיישן הדלת ממשיכים לעבוד, ולכן מי שעובר מול חיישן המרחק או פותח את הדלת מפעיל תגובה גם ב-Home.</w:t>
       </w:r>
     </w:p>
     <w:p>
@@ -3172,7 +3236,7 @@
         <w:rPr>
           <w:rtl/>
         </w:rPr>
-        <w:t xml:space="preserve">הבקנד בודק שהמערכת דרוכה ושהחיישן לא מוחרג (ב-Home הוא מוחרג), ועובר למצב אזעקה.</w:t>
+        <w:t xml:space="preserve">הבקנד בודק שהמערכת דרוכה ושהחיישן לא מוחרג (ב-Home מוחרג רק חיישן הרעידות), ועובר למצב אזעקה.</w:t>
       </w:r>
     </w:p>
     <w:p>
@@ -5735,8 +5799,8 @@
         </w:tblCellMar>
       </w:tblPr>
       <w:tblGrid>
-        <w:gridCol w:w="3897"/>
-        <w:gridCol w:w="5103"/>
+        <w:gridCol w:w="4036"/>
+        <w:gridCol w:w="4964"/>
       </w:tblGrid>
       <w:tr>
         <w:trPr>
@@ -5746,7 +5810,7 @@
         </w:trPr>
         <w:tc>
           <w:tcPr>
-            <w:tcW w:w="3897" w:type="dxa"/>
+            <w:tcW w:w="4036" w:type="dxa"/>
             <w:tcBorders>
               <w:top w:val="single" w:sz="4" w:space="0" w:color="999999"/>
               <w:left w:val="single" w:sz="4" w:space="0" w:color="999999"/>
@@ -5773,7 +5837,7 @@
         </w:tc>
         <w:tc>
           <w:tcPr>
-            <w:tcW w:w="5103" w:type="dxa"/>
+            <w:tcW w:w="4964" w:type="dxa"/>
             <w:tcBorders>
               <w:top w:val="single" w:sz="4" w:space="0" w:color="999999"/>
               <w:left w:val="single" w:sz="4" w:space="0" w:color="999999"/>
@@ -5805,7 +5869,7 @@
         </w:trPr>
         <w:tc>
           <w:tcPr>
-            <w:tcW w:w="3897" w:type="dxa"/>
+            <w:tcW w:w="4036" w:type="dxa"/>
             <w:tcBorders>
               <w:top w:val="single" w:sz="4" w:space="0" w:color="999999"/>
               <w:left w:val="single" w:sz="4" w:space="0" w:color="999999"/>
@@ -5843,7 +5907,7 @@
         </w:tc>
         <w:tc>
           <w:tcPr>
-            <w:tcW w:w="5103" w:type="dxa"/>
+            <w:tcW w:w="4964" w:type="dxa"/>
             <w:tcBorders>
               <w:top w:val="single" w:sz="4" w:space="0" w:color="999999"/>
               <w:left w:val="single" w:sz="4" w:space="0" w:color="999999"/>
@@ -5871,7 +5935,7 @@
         </w:trPr>
         <w:tc>
           <w:tcPr>
-            <w:tcW w:w="3897" w:type="dxa"/>
+            <w:tcW w:w="4036" w:type="dxa"/>
             <w:tcBorders>
               <w:top w:val="single" w:sz="4" w:space="0" w:color="999999"/>
               <w:left w:val="single" w:sz="4" w:space="0" w:color="999999"/>
@@ -5894,7 +5958,7 @@
         </w:tc>
         <w:tc>
           <w:tcPr>
-            <w:tcW w:w="5103" w:type="dxa"/>
+            <w:tcW w:w="4964" w:type="dxa"/>
             <w:tcBorders>
               <w:top w:val="single" w:sz="4" w:space="0" w:color="999999"/>
               <w:left w:val="single" w:sz="4" w:space="0" w:color="999999"/>
@@ -5922,7 +5986,7 @@
         </w:trPr>
         <w:tc>
           <w:tcPr>
-            <w:tcW w:w="3897" w:type="dxa"/>
+            <w:tcW w:w="4036" w:type="dxa"/>
             <w:tcBorders>
               <w:top w:val="single" w:sz="4" w:space="0" w:color="999999"/>
               <w:left w:val="single" w:sz="4" w:space="0" w:color="999999"/>
@@ -5945,7 +6009,7 @@
         </w:tc>
         <w:tc>
           <w:tcPr>
-            <w:tcW w:w="5103" w:type="dxa"/>
+            <w:tcW w:w="4964" w:type="dxa"/>
             <w:tcBorders>
               <w:top w:val="single" w:sz="4" w:space="0" w:color="999999"/>
               <w:left w:val="single" w:sz="4" w:space="0" w:color="999999"/>
@@ -5973,7 +6037,7 @@
         </w:trPr>
         <w:tc>
           <w:tcPr>
-            <w:tcW w:w="3897" w:type="dxa"/>
+            <w:tcW w:w="4036" w:type="dxa"/>
             <w:tcBorders>
               <w:top w:val="single" w:sz="4" w:space="0" w:color="999999"/>
               <w:left w:val="single" w:sz="4" w:space="0" w:color="999999"/>
@@ -5996,7 +6060,7 @@
         </w:tc>
         <w:tc>
           <w:tcPr>
-            <w:tcW w:w="5103" w:type="dxa"/>
+            <w:tcW w:w="4964" w:type="dxa"/>
             <w:tcBorders>
               <w:top w:val="single" w:sz="4" w:space="0" w:color="999999"/>
               <w:left w:val="single" w:sz="4" w:space="0" w:color="999999"/>
@@ -6024,7 +6088,7 @@
         </w:trPr>
         <w:tc>
           <w:tcPr>
-            <w:tcW w:w="3897" w:type="dxa"/>
+            <w:tcW w:w="4036" w:type="dxa"/>
             <w:tcBorders>
               <w:top w:val="single" w:sz="4" w:space="0" w:color="999999"/>
               <w:left w:val="single" w:sz="4" w:space="0" w:color="999999"/>
@@ -6047,7 +6111,7 @@
         </w:tc>
         <w:tc>
           <w:tcPr>
-            <w:tcW w:w="5103" w:type="dxa"/>
+            <w:tcW w:w="4964" w:type="dxa"/>
             <w:tcBorders>
               <w:top w:val="single" w:sz="4" w:space="0" w:color="999999"/>
               <w:left w:val="single" w:sz="4" w:space="0" w:color="999999"/>
@@ -6075,7 +6139,7 @@
         </w:trPr>
         <w:tc>
           <w:tcPr>
-            <w:tcW w:w="3897" w:type="dxa"/>
+            <w:tcW w:w="4036" w:type="dxa"/>
             <w:tcBorders>
               <w:top w:val="single" w:sz="4" w:space="0" w:color="999999"/>
               <w:left w:val="single" w:sz="4" w:space="0" w:color="999999"/>
@@ -6098,7 +6162,7 @@
         </w:tc>
         <w:tc>
           <w:tcPr>
-            <w:tcW w:w="5103" w:type="dxa"/>
+            <w:tcW w:w="4964" w:type="dxa"/>
             <w:tcBorders>
               <w:top w:val="single" w:sz="4" w:space="0" w:color="999999"/>
               <w:left w:val="single" w:sz="4" w:space="0" w:color="999999"/>
@@ -6126,47 +6190,47 @@
         </w:trPr>
         <w:tc>
           <w:tcPr>
-            <w:tcW w:w="3897" w:type="dxa"/>
-            <w:tcBorders>
-              <w:top w:val="single" w:sz="4" w:space="0" w:color="999999"/>
-              <w:left w:val="single" w:sz="4" w:space="0" w:color="999999"/>
-              <w:bottom w:val="single" w:sz="4" w:space="0" w:color="999999"/>
-              <w:right w:val="single" w:sz="4" w:space="0" w:color="999999"/>
-            </w:tcBorders>
-            <w:vAlign w:val="center"/>
-          </w:tcPr>
-          <w:p>
-            <w:pPr>
-              <w:pStyle w:val="Compact"/>
-            </w:pPr>
-            <w:r>
-              <w:rPr>
-                <w:rtl/>
-              </w:rPr>
-              <w:t xml:space="preserve">אותו דבר במצב Home</w:t>
-            </w:r>
-          </w:p>
-        </w:tc>
-        <w:tc>
-          <w:tcPr>
-            <w:tcW w:w="5103" w:type="dxa"/>
-            <w:tcBorders>
-              <w:top w:val="single" w:sz="4" w:space="0" w:color="999999"/>
-              <w:left w:val="single" w:sz="4" w:space="0" w:color="999999"/>
-              <w:bottom w:val="single" w:sz="4" w:space="0" w:color="999999"/>
-              <w:right w:val="single" w:sz="4" w:space="0" w:color="999999"/>
-            </w:tcBorders>
-            <w:vAlign w:val="center"/>
-          </w:tcPr>
-          <w:p>
-            <w:pPr>
-              <w:pStyle w:val="Compact"/>
-            </w:pPr>
-            <w:r>
-              <w:rPr>
-                <w:rtl/>
-              </w:rPr>
-              <w:t xml:space="preserve">אין אזעקה. פתיחת הדלת מתחילה ספירת כניסה</w:t>
+            <w:tcW w:w="4036" w:type="dxa"/>
+            <w:tcBorders>
+              <w:top w:val="single" w:sz="4" w:space="0" w:color="999999"/>
+              <w:left w:val="single" w:sz="4" w:space="0" w:color="999999"/>
+              <w:bottom w:val="single" w:sz="4" w:space="0" w:color="999999"/>
+              <w:right w:val="single" w:sz="4" w:space="0" w:color="999999"/>
+            </w:tcBorders>
+            <w:vAlign w:val="center"/>
+          </w:tcPr>
+          <w:p>
+            <w:pPr>
+              <w:pStyle w:val="Compact"/>
+            </w:pPr>
+            <w:r>
+              <w:rPr>
+                <w:rtl/>
+              </w:rPr>
+              <w:t xml:space="preserve">דפיקה על חיישן הרעידות במצב Home</w:t>
+            </w:r>
+          </w:p>
+        </w:tc>
+        <w:tc>
+          <w:tcPr>
+            <w:tcW w:w="4964" w:type="dxa"/>
+            <w:tcBorders>
+              <w:top w:val="single" w:sz="4" w:space="0" w:color="999999"/>
+              <w:left w:val="single" w:sz="4" w:space="0" w:color="999999"/>
+              <w:bottom w:val="single" w:sz="4" w:space="0" w:color="999999"/>
+              <w:right w:val="single" w:sz="4" w:space="0" w:color="999999"/>
+            </w:tcBorders>
+            <w:vAlign w:val="center"/>
+          </w:tcPr>
+          <w:p>
+            <w:pPr>
+              <w:pStyle w:val="Compact"/>
+            </w:pPr>
+            <w:r>
+              <w:rPr>
+                <w:rtl/>
+              </w:rPr>
+              <w:t xml:space="preserve">אין אזעקה</w:t>
             </w:r>
           </w:p>
         </w:tc>
@@ -6177,47 +6241,47 @@
         </w:trPr>
         <w:tc>
           <w:tcPr>
-            <w:tcW w:w="3897" w:type="dxa"/>
-            <w:tcBorders>
-              <w:top w:val="single" w:sz="4" w:space="0" w:color="999999"/>
-              <w:left w:val="single" w:sz="4" w:space="0" w:color="999999"/>
-              <w:bottom w:val="single" w:sz="4" w:space="0" w:color="999999"/>
-              <w:right w:val="single" w:sz="4" w:space="0" w:color="999999"/>
-            </w:tcBorders>
-            <w:vAlign w:val="center"/>
-          </w:tcPr>
-          <w:p>
-            <w:pPr>
-              <w:pStyle w:val="Compact"/>
-            </w:pPr>
-            <w:r>
-              <w:rPr>
-                <w:rtl/>
-              </w:rPr>
-              <w:t xml:space="preserve">דריכה כשהדלת פתוחה, מהקודן ומהאפליקציה</w:t>
-            </w:r>
-          </w:p>
-        </w:tc>
-        <w:tc>
-          <w:tcPr>
-            <w:tcW w:w="5103" w:type="dxa"/>
-            <w:tcBorders>
-              <w:top w:val="single" w:sz="4" w:space="0" w:color="999999"/>
-              <w:left w:val="single" w:sz="4" w:space="0" w:color="999999"/>
-              <w:bottom w:val="single" w:sz="4" w:space="0" w:color="999999"/>
-              <w:right w:val="single" w:sz="4" w:space="0" w:color="999999"/>
-            </w:tcBorders>
-            <w:vAlign w:val="center"/>
-          </w:tcPr>
-          <w:p>
-            <w:pPr>
-              <w:pStyle w:val="Compact"/>
-            </w:pPr>
-            <w:r>
-              <w:rPr>
-                <w:rtl/>
-              </w:rPr>
-              <w:t xml:space="preserve">סירוב: צליל סירוב והודעה באפליקציה</w:t>
+            <w:tcW w:w="4036" w:type="dxa"/>
+            <w:tcBorders>
+              <w:top w:val="single" w:sz="4" w:space="0" w:color="999999"/>
+              <w:left w:val="single" w:sz="4" w:space="0" w:color="999999"/>
+              <w:bottom w:val="single" w:sz="4" w:space="0" w:color="999999"/>
+              <w:right w:val="single" w:sz="4" w:space="0" w:color="999999"/>
+            </w:tcBorders>
+            <w:vAlign w:val="center"/>
+          </w:tcPr>
+          <w:p>
+            <w:pPr>
+              <w:pStyle w:val="Compact"/>
+            </w:pPr>
+            <w:r>
+              <w:rPr>
+                <w:rtl/>
+              </w:rPr>
+              <w:t xml:space="preserve">מעבר מול חיישן המרחק במצב Home</w:t>
+            </w:r>
+          </w:p>
+        </w:tc>
+        <w:tc>
+          <w:tcPr>
+            <w:tcW w:w="4964" w:type="dxa"/>
+            <w:tcBorders>
+              <w:top w:val="single" w:sz="4" w:space="0" w:color="999999"/>
+              <w:left w:val="single" w:sz="4" w:space="0" w:color="999999"/>
+              <w:bottom w:val="single" w:sz="4" w:space="0" w:color="999999"/>
+              <w:right w:val="single" w:sz="4" w:space="0" w:color="999999"/>
+            </w:tcBorders>
+            <w:vAlign w:val="center"/>
+          </w:tcPr>
+          <w:p>
+            <w:pPr>
+              <w:pStyle w:val="Compact"/>
+            </w:pPr>
+            <w:r>
+              <w:rPr>
+                <w:rtl/>
+              </w:rPr>
+              <w:t xml:space="preserve">אזעקה</w:t>
             </w:r>
           </w:p>
         </w:tc>
@@ -6228,47 +6292,47 @@
         </w:trPr>
         <w:tc>
           <w:tcPr>
-            <w:tcW w:w="3897" w:type="dxa"/>
-            <w:tcBorders>
-              <w:top w:val="single" w:sz="4" w:space="0" w:color="999999"/>
-              <w:left w:val="single" w:sz="4" w:space="0" w:color="999999"/>
-              <w:bottom w:val="single" w:sz="4" w:space="0" w:color="999999"/>
-              <w:right w:val="single" w:sz="4" w:space="0" w:color="999999"/>
-            </w:tcBorders>
-            <w:vAlign w:val="center"/>
-          </w:tcPr>
-          <w:p>
-            <w:pPr>
-              <w:pStyle w:val="Compact"/>
-            </w:pPr>
-            <w:r>
-              <w:rPr>
-                <w:rtl/>
-              </w:rPr>
-              <w:t xml:space="preserve">דריכה ונטרול מהאפליקציה</w:t>
-            </w:r>
-          </w:p>
-        </w:tc>
-        <w:tc>
-          <w:tcPr>
-            <w:tcW w:w="5103" w:type="dxa"/>
-            <w:tcBorders>
-              <w:top w:val="single" w:sz="4" w:space="0" w:color="999999"/>
-              <w:left w:val="single" w:sz="4" w:space="0" w:color="999999"/>
-              <w:bottom w:val="single" w:sz="4" w:space="0" w:color="999999"/>
-              <w:right w:val="single" w:sz="4" w:space="0" w:color="999999"/>
-            </w:tcBorders>
-            <w:vAlign w:val="center"/>
-          </w:tcPr>
-          <w:p>
-            <w:pPr>
-              <w:pStyle w:val="Compact"/>
-            </w:pPr>
-            <w:r>
-              <w:rPr>
-                <w:rtl/>
-              </w:rPr>
-              <w:t xml:space="preserve">הפקודה מגיעה לבקר הדלת, והצלילים מושמעים</w:t>
+            <w:tcW w:w="4036" w:type="dxa"/>
+            <w:tcBorders>
+              <w:top w:val="single" w:sz="4" w:space="0" w:color="999999"/>
+              <w:left w:val="single" w:sz="4" w:space="0" w:color="999999"/>
+              <w:bottom w:val="single" w:sz="4" w:space="0" w:color="999999"/>
+              <w:right w:val="single" w:sz="4" w:space="0" w:color="999999"/>
+            </w:tcBorders>
+            <w:vAlign w:val="center"/>
+          </w:tcPr>
+          <w:p>
+            <w:pPr>
+              <w:pStyle w:val="Compact"/>
+            </w:pPr>
+            <w:r>
+              <w:rPr>
+                <w:rtl/>
+              </w:rPr>
+              <w:t xml:space="preserve">פתיחת הדלת במצב Home</w:t>
+            </w:r>
+          </w:p>
+        </w:tc>
+        <w:tc>
+          <w:tcPr>
+            <w:tcW w:w="4964" w:type="dxa"/>
+            <w:tcBorders>
+              <w:top w:val="single" w:sz="4" w:space="0" w:color="999999"/>
+              <w:left w:val="single" w:sz="4" w:space="0" w:color="999999"/>
+              <w:bottom w:val="single" w:sz="4" w:space="0" w:color="999999"/>
+              <w:right w:val="single" w:sz="4" w:space="0" w:color="999999"/>
+            </w:tcBorders>
+            <w:vAlign w:val="center"/>
+          </w:tcPr>
+          <w:p>
+            <w:pPr>
+              <w:pStyle w:val="Compact"/>
+            </w:pPr>
+            <w:r>
+              <w:rPr>
+                <w:rtl/>
+              </w:rPr>
+              <w:t xml:space="preserve">ספירת כניסה, כמו ב-Away</w:t>
             </w:r>
           </w:p>
         </w:tc>
@@ -6279,47 +6343,47 @@
         </w:trPr>
         <w:tc>
           <w:tcPr>
-            <w:tcW w:w="3897" w:type="dxa"/>
-            <w:tcBorders>
-              <w:top w:val="single" w:sz="4" w:space="0" w:color="999999"/>
-              <w:left w:val="single" w:sz="4" w:space="0" w:color="999999"/>
-              <w:bottom w:val="single" w:sz="4" w:space="0" w:color="999999"/>
-              <w:right w:val="single" w:sz="4" w:space="0" w:color="999999"/>
-            </w:tcBorders>
-            <w:vAlign w:val="center"/>
-          </w:tcPr>
-          <w:p>
-            <w:pPr>
-              <w:pStyle w:val="Compact"/>
-            </w:pPr>
-            <w:r>
-              <w:rPr>
-                <w:rtl/>
-              </w:rPr>
-              <w:t xml:space="preserve">מצלמה חיה וזיהוי פנים</w:t>
-            </w:r>
-          </w:p>
-        </w:tc>
-        <w:tc>
-          <w:tcPr>
-            <w:tcW w:w="5103" w:type="dxa"/>
-            <w:tcBorders>
-              <w:top w:val="single" w:sz="4" w:space="0" w:color="999999"/>
-              <w:left w:val="single" w:sz="4" w:space="0" w:color="999999"/>
-              <w:bottom w:val="single" w:sz="4" w:space="0" w:color="999999"/>
-              <w:right w:val="single" w:sz="4" w:space="0" w:color="999999"/>
-            </w:tcBorders>
-            <w:vAlign w:val="center"/>
-          </w:tcPr>
-          <w:p>
-            <w:pPr>
-              <w:pStyle w:val="Compact"/>
-            </w:pPr>
-            <w:r>
-              <w:rPr>
-                <w:rtl/>
-              </w:rPr>
-              <w:t xml:space="preserve">וידאו באפליקציה, ופנים ששמורות במערכת מזוהות</w:t>
+            <w:tcW w:w="4036" w:type="dxa"/>
+            <w:tcBorders>
+              <w:top w:val="single" w:sz="4" w:space="0" w:color="999999"/>
+              <w:left w:val="single" w:sz="4" w:space="0" w:color="999999"/>
+              <w:bottom w:val="single" w:sz="4" w:space="0" w:color="999999"/>
+              <w:right w:val="single" w:sz="4" w:space="0" w:color="999999"/>
+            </w:tcBorders>
+            <w:vAlign w:val="center"/>
+          </w:tcPr>
+          <w:p>
+            <w:pPr>
+              <w:pStyle w:val="Compact"/>
+            </w:pPr>
+            <w:r>
+              <w:rPr>
+                <w:rtl/>
+              </w:rPr>
+              <w:t xml:space="preserve">דריכה כשהדלת פתוחה, מהקודן ומהאפליקציה</w:t>
+            </w:r>
+          </w:p>
+        </w:tc>
+        <w:tc>
+          <w:tcPr>
+            <w:tcW w:w="4964" w:type="dxa"/>
+            <w:tcBorders>
+              <w:top w:val="single" w:sz="4" w:space="0" w:color="999999"/>
+              <w:left w:val="single" w:sz="4" w:space="0" w:color="999999"/>
+              <w:bottom w:val="single" w:sz="4" w:space="0" w:color="999999"/>
+              <w:right w:val="single" w:sz="4" w:space="0" w:color="999999"/>
+            </w:tcBorders>
+            <w:vAlign w:val="center"/>
+          </w:tcPr>
+          <w:p>
+            <w:pPr>
+              <w:pStyle w:val="Compact"/>
+            </w:pPr>
+            <w:r>
+              <w:rPr>
+                <w:rtl/>
+              </w:rPr>
+              <w:t xml:space="preserve">סירוב: צליל סירוב והודעה באפליקציה</w:t>
             </w:r>
           </w:p>
         </w:tc>
@@ -6330,47 +6394,47 @@
         </w:trPr>
         <w:tc>
           <w:tcPr>
-            <w:tcW w:w="3897" w:type="dxa"/>
-            <w:tcBorders>
-              <w:top w:val="single" w:sz="4" w:space="0" w:color="999999"/>
-              <w:left w:val="single" w:sz="4" w:space="0" w:color="999999"/>
-              <w:bottom w:val="single" w:sz="4" w:space="0" w:color="999999"/>
-              <w:right w:val="single" w:sz="4" w:space="0" w:color="999999"/>
-            </w:tcBorders>
-            <w:vAlign w:val="center"/>
-          </w:tcPr>
-          <w:p>
-            <w:pPr>
-              <w:pStyle w:val="Compact"/>
-            </w:pPr>
-            <w:r>
-              <w:rPr>
-                <w:rtl/>
-              </w:rPr>
-              <w:t xml:space="preserve">ניתוק בקר מהחשמל</w:t>
-            </w:r>
-          </w:p>
-        </w:tc>
-        <w:tc>
-          <w:tcPr>
-            <w:tcW w:w="5103" w:type="dxa"/>
-            <w:tcBorders>
-              <w:top w:val="single" w:sz="4" w:space="0" w:color="999999"/>
-              <w:left w:val="single" w:sz="4" w:space="0" w:color="999999"/>
-              <w:bottom w:val="single" w:sz="4" w:space="0" w:color="999999"/>
-              <w:right w:val="single" w:sz="4" w:space="0" w:color="999999"/>
-            </w:tcBorders>
-            <w:vAlign w:val="center"/>
-          </w:tcPr>
-          <w:p>
-            <w:pPr>
-              <w:pStyle w:val="Compact"/>
-            </w:pPr>
-            <w:r>
-              <w:rPr>
-                <w:rtl/>
-              </w:rPr>
-              <w:t xml:space="preserve">האפליקציה מציגה שהבקר לא מחובר</w:t>
+            <w:tcW w:w="4036" w:type="dxa"/>
+            <w:tcBorders>
+              <w:top w:val="single" w:sz="4" w:space="0" w:color="999999"/>
+              <w:left w:val="single" w:sz="4" w:space="0" w:color="999999"/>
+              <w:bottom w:val="single" w:sz="4" w:space="0" w:color="999999"/>
+              <w:right w:val="single" w:sz="4" w:space="0" w:color="999999"/>
+            </w:tcBorders>
+            <w:vAlign w:val="center"/>
+          </w:tcPr>
+          <w:p>
+            <w:pPr>
+              <w:pStyle w:val="Compact"/>
+            </w:pPr>
+            <w:r>
+              <w:rPr>
+                <w:rtl/>
+              </w:rPr>
+              <w:t xml:space="preserve">דריכה ונטרול מהאפליקציה</w:t>
+            </w:r>
+          </w:p>
+        </w:tc>
+        <w:tc>
+          <w:tcPr>
+            <w:tcW w:w="4964" w:type="dxa"/>
+            <w:tcBorders>
+              <w:top w:val="single" w:sz="4" w:space="0" w:color="999999"/>
+              <w:left w:val="single" w:sz="4" w:space="0" w:color="999999"/>
+              <w:bottom w:val="single" w:sz="4" w:space="0" w:color="999999"/>
+              <w:right w:val="single" w:sz="4" w:space="0" w:color="999999"/>
+            </w:tcBorders>
+            <w:vAlign w:val="center"/>
+          </w:tcPr>
+          <w:p>
+            <w:pPr>
+              <w:pStyle w:val="Compact"/>
+            </w:pPr>
+            <w:r>
+              <w:rPr>
+                <w:rtl/>
+              </w:rPr>
+              <w:t xml:space="preserve">הפקודה מגיעה לבקר הדלת, והצלילים מושמעים</w:t>
             </w:r>
           </w:p>
         </w:tc>
@@ -6381,47 +6445,47 @@
         </w:trPr>
         <w:tc>
           <w:tcPr>
-            <w:tcW w:w="3897" w:type="dxa"/>
-            <w:tcBorders>
-              <w:top w:val="single" w:sz="4" w:space="0" w:color="999999"/>
-              <w:left w:val="single" w:sz="4" w:space="0" w:color="999999"/>
-              <w:bottom w:val="single" w:sz="4" w:space="0" w:color="999999"/>
-              <w:right w:val="single" w:sz="4" w:space="0" w:color="999999"/>
-            </w:tcBorders>
-            <w:vAlign w:val="center"/>
-          </w:tcPr>
-          <w:p>
-            <w:pPr>
-              <w:pStyle w:val="Compact"/>
-            </w:pPr>
-            <w:r>
-              <w:rPr>
-                <w:rtl/>
-              </w:rPr>
-              <w:t xml:space="preserve">שלוש סיסמאות שגויות בהתחברות לאפליקציה</w:t>
-            </w:r>
-          </w:p>
-        </w:tc>
-        <w:tc>
-          <w:tcPr>
-            <w:tcW w:w="5103" w:type="dxa"/>
-            <w:tcBorders>
-              <w:top w:val="single" w:sz="4" w:space="0" w:color="999999"/>
-              <w:left w:val="single" w:sz="4" w:space="0" w:color="999999"/>
-              <w:bottom w:val="single" w:sz="4" w:space="0" w:color="999999"/>
-              <w:right w:val="single" w:sz="4" w:space="0" w:color="999999"/>
-            </w:tcBorders>
-            <w:vAlign w:val="center"/>
-          </w:tcPr>
-          <w:p>
-            <w:pPr>
-              <w:pStyle w:val="Compact"/>
-            </w:pPr>
-            <w:r>
-              <w:rPr>
-                <w:rtl/>
-              </w:rPr>
-              <w:t xml:space="preserve">הכפתור ננעל ל-30‎ s</w:t>
+            <w:tcW w:w="4036" w:type="dxa"/>
+            <w:tcBorders>
+              <w:top w:val="single" w:sz="4" w:space="0" w:color="999999"/>
+              <w:left w:val="single" w:sz="4" w:space="0" w:color="999999"/>
+              <w:bottom w:val="single" w:sz="4" w:space="0" w:color="999999"/>
+              <w:right w:val="single" w:sz="4" w:space="0" w:color="999999"/>
+            </w:tcBorders>
+            <w:vAlign w:val="center"/>
+          </w:tcPr>
+          <w:p>
+            <w:pPr>
+              <w:pStyle w:val="Compact"/>
+            </w:pPr>
+            <w:r>
+              <w:rPr>
+                <w:rtl/>
+              </w:rPr>
+              <w:t xml:space="preserve">מצלמה חיה וזיהוי פנים</w:t>
+            </w:r>
+          </w:p>
+        </w:tc>
+        <w:tc>
+          <w:tcPr>
+            <w:tcW w:w="4964" w:type="dxa"/>
+            <w:tcBorders>
+              <w:top w:val="single" w:sz="4" w:space="0" w:color="999999"/>
+              <w:left w:val="single" w:sz="4" w:space="0" w:color="999999"/>
+              <w:bottom w:val="single" w:sz="4" w:space="0" w:color="999999"/>
+              <w:right w:val="single" w:sz="4" w:space="0" w:color="999999"/>
+            </w:tcBorders>
+            <w:vAlign w:val="center"/>
+          </w:tcPr>
+          <w:p>
+            <w:pPr>
+              <w:pStyle w:val="Compact"/>
+            </w:pPr>
+            <w:r>
+              <w:rPr>
+                <w:rtl/>
+              </w:rPr>
+              <w:t xml:space="preserve">וידאו באפליקציה, ופנים ששמורות במערכת מזוהות</w:t>
             </w:r>
           </w:p>
         </w:tc>
@@ -6432,47 +6496,47 @@
         </w:trPr>
         <w:tc>
           <w:tcPr>
-            <w:tcW w:w="3897" w:type="dxa"/>
-            <w:tcBorders>
-              <w:top w:val="single" w:sz="4" w:space="0" w:color="999999"/>
-              <w:left w:val="single" w:sz="4" w:space="0" w:color="999999"/>
-              <w:bottom w:val="single" w:sz="4" w:space="0" w:color="999999"/>
-              <w:right w:val="single" w:sz="4" w:space="0" w:color="999999"/>
-            </w:tcBorders>
-            <w:vAlign w:val="center"/>
-          </w:tcPr>
-          <w:p>
-            <w:pPr>
-              <w:pStyle w:val="Compact"/>
-            </w:pPr>
-            <w:r>
-              <w:rPr>
-                <w:rtl/>
-              </w:rPr>
-              <w:t xml:space="preserve">שינוי הקוד מהאפליקציה</w:t>
-            </w:r>
-          </w:p>
-        </w:tc>
-        <w:tc>
-          <w:tcPr>
-            <w:tcW w:w="5103" w:type="dxa"/>
-            <w:tcBorders>
-              <w:top w:val="single" w:sz="4" w:space="0" w:color="999999"/>
-              <w:left w:val="single" w:sz="4" w:space="0" w:color="999999"/>
-              <w:bottom w:val="single" w:sz="4" w:space="0" w:color="999999"/>
-              <w:right w:val="single" w:sz="4" w:space="0" w:color="999999"/>
-            </w:tcBorders>
-            <w:vAlign w:val="center"/>
-          </w:tcPr>
-          <w:p>
-            <w:pPr>
-              <w:pStyle w:val="Compact"/>
-            </w:pPr>
-            <w:r>
-              <w:rPr>
-                <w:rtl/>
-              </w:rPr>
-              <w:t xml:space="preserve">הקוד החדש עובד בקודן והישן לא</w:t>
+            <w:tcW w:w="4036" w:type="dxa"/>
+            <w:tcBorders>
+              <w:top w:val="single" w:sz="4" w:space="0" w:color="999999"/>
+              <w:left w:val="single" w:sz="4" w:space="0" w:color="999999"/>
+              <w:bottom w:val="single" w:sz="4" w:space="0" w:color="999999"/>
+              <w:right w:val="single" w:sz="4" w:space="0" w:color="999999"/>
+            </w:tcBorders>
+            <w:vAlign w:val="center"/>
+          </w:tcPr>
+          <w:p>
+            <w:pPr>
+              <w:pStyle w:val="Compact"/>
+            </w:pPr>
+            <w:r>
+              <w:rPr>
+                <w:rtl/>
+              </w:rPr>
+              <w:t xml:space="preserve">ניתוק בקר מהחשמל</w:t>
+            </w:r>
+          </w:p>
+        </w:tc>
+        <w:tc>
+          <w:tcPr>
+            <w:tcW w:w="4964" w:type="dxa"/>
+            <w:tcBorders>
+              <w:top w:val="single" w:sz="4" w:space="0" w:color="999999"/>
+              <w:left w:val="single" w:sz="4" w:space="0" w:color="999999"/>
+              <w:bottom w:val="single" w:sz="4" w:space="0" w:color="999999"/>
+              <w:right w:val="single" w:sz="4" w:space="0" w:color="999999"/>
+            </w:tcBorders>
+            <w:vAlign w:val="center"/>
+          </w:tcPr>
+          <w:p>
+            <w:pPr>
+              <w:pStyle w:val="Compact"/>
+            </w:pPr>
+            <w:r>
+              <w:rPr>
+                <w:rtl/>
+              </w:rPr>
+              <w:t xml:space="preserve">האפליקציה מציגה שהבקר לא מחובר</w:t>
             </w:r>
           </w:p>
         </w:tc>
@@ -6483,47 +6547,47 @@
         </w:trPr>
         <w:tc>
           <w:tcPr>
-            <w:tcW w:w="3897" w:type="dxa"/>
-            <w:tcBorders>
-              <w:top w:val="single" w:sz="4" w:space="0" w:color="999999"/>
-              <w:left w:val="single" w:sz="4" w:space="0" w:color="999999"/>
-              <w:bottom w:val="single" w:sz="4" w:space="0" w:color="999999"/>
-              <w:right w:val="single" w:sz="4" w:space="0" w:color="999999"/>
-            </w:tcBorders>
-            <w:vAlign w:val="center"/>
-          </w:tcPr>
-          <w:p>
-            <w:pPr>
-              <w:pStyle w:val="Compact"/>
-            </w:pPr>
-            <w:r>
-              <w:rPr>
-                <w:rtl/>
-              </w:rPr>
-              <w:t xml:space="preserve">מצב לילה בשעה שהוגדרה</w:t>
-            </w:r>
-          </w:p>
-        </w:tc>
-        <w:tc>
-          <w:tcPr>
-            <w:tcW w:w="5103" w:type="dxa"/>
-            <w:tcBorders>
-              <w:top w:val="single" w:sz="4" w:space="0" w:color="999999"/>
-              <w:left w:val="single" w:sz="4" w:space="0" w:color="999999"/>
-              <w:bottom w:val="single" w:sz="4" w:space="0" w:color="999999"/>
-              <w:right w:val="single" w:sz="4" w:space="0" w:color="999999"/>
-            </w:tcBorders>
-            <w:vAlign w:val="center"/>
-          </w:tcPr>
-          <w:p>
-            <w:pPr>
-              <w:pStyle w:val="Compact"/>
-            </w:pPr>
-            <w:r>
-              <w:rPr>
-                <w:rtl/>
-              </w:rPr>
-              <w:t xml:space="preserve">המערכת נדרכת במצב Home ונרשם ביומן</w:t>
+            <w:tcW w:w="4036" w:type="dxa"/>
+            <w:tcBorders>
+              <w:top w:val="single" w:sz="4" w:space="0" w:color="999999"/>
+              <w:left w:val="single" w:sz="4" w:space="0" w:color="999999"/>
+              <w:bottom w:val="single" w:sz="4" w:space="0" w:color="999999"/>
+              <w:right w:val="single" w:sz="4" w:space="0" w:color="999999"/>
+            </w:tcBorders>
+            <w:vAlign w:val="center"/>
+          </w:tcPr>
+          <w:p>
+            <w:pPr>
+              <w:pStyle w:val="Compact"/>
+            </w:pPr>
+            <w:r>
+              <w:rPr>
+                <w:rtl/>
+              </w:rPr>
+              <w:t xml:space="preserve">שלוש סיסמאות שגויות בהתחברות לאפליקציה</w:t>
+            </w:r>
+          </w:p>
+        </w:tc>
+        <w:tc>
+          <w:tcPr>
+            <w:tcW w:w="4964" w:type="dxa"/>
+            <w:tcBorders>
+              <w:top w:val="single" w:sz="4" w:space="0" w:color="999999"/>
+              <w:left w:val="single" w:sz="4" w:space="0" w:color="999999"/>
+              <w:bottom w:val="single" w:sz="4" w:space="0" w:color="999999"/>
+              <w:right w:val="single" w:sz="4" w:space="0" w:color="999999"/>
+            </w:tcBorders>
+            <w:vAlign w:val="center"/>
+          </w:tcPr>
+          <w:p>
+            <w:pPr>
+              <w:pStyle w:val="Compact"/>
+            </w:pPr>
+            <w:r>
+              <w:rPr>
+                <w:rtl/>
+              </w:rPr>
+              <w:t xml:space="preserve">הכפתור ננעל ל-30‎ s</w:t>
             </w:r>
           </w:p>
         </w:tc>
@@ -6534,7 +6598,109 @@
         </w:trPr>
         <w:tc>
           <w:tcPr>
-            <w:tcW w:w="3897" w:type="dxa"/>
+            <w:tcW w:w="4036" w:type="dxa"/>
+            <w:tcBorders>
+              <w:top w:val="single" w:sz="4" w:space="0" w:color="999999"/>
+              <w:left w:val="single" w:sz="4" w:space="0" w:color="999999"/>
+              <w:bottom w:val="single" w:sz="4" w:space="0" w:color="999999"/>
+              <w:right w:val="single" w:sz="4" w:space="0" w:color="999999"/>
+            </w:tcBorders>
+            <w:vAlign w:val="center"/>
+          </w:tcPr>
+          <w:p>
+            <w:pPr>
+              <w:pStyle w:val="Compact"/>
+            </w:pPr>
+            <w:r>
+              <w:rPr>
+                <w:rtl/>
+              </w:rPr>
+              <w:t xml:space="preserve">שינוי הקוד מהאפליקציה</w:t>
+            </w:r>
+          </w:p>
+        </w:tc>
+        <w:tc>
+          <w:tcPr>
+            <w:tcW w:w="4964" w:type="dxa"/>
+            <w:tcBorders>
+              <w:top w:val="single" w:sz="4" w:space="0" w:color="999999"/>
+              <w:left w:val="single" w:sz="4" w:space="0" w:color="999999"/>
+              <w:bottom w:val="single" w:sz="4" w:space="0" w:color="999999"/>
+              <w:right w:val="single" w:sz="4" w:space="0" w:color="999999"/>
+            </w:tcBorders>
+            <w:vAlign w:val="center"/>
+          </w:tcPr>
+          <w:p>
+            <w:pPr>
+              <w:pStyle w:val="Compact"/>
+            </w:pPr>
+            <w:r>
+              <w:rPr>
+                <w:rtl/>
+              </w:rPr>
+              <w:t xml:space="preserve">הקוד החדש עובד בקודן והישן לא</w:t>
+            </w:r>
+          </w:p>
+        </w:tc>
+      </w:tr>
+      <w:tr>
+        <w:trPr>
+          <w:cantSplit/>
+        </w:trPr>
+        <w:tc>
+          <w:tcPr>
+            <w:tcW w:w="4036" w:type="dxa"/>
+            <w:tcBorders>
+              <w:top w:val="single" w:sz="4" w:space="0" w:color="999999"/>
+              <w:left w:val="single" w:sz="4" w:space="0" w:color="999999"/>
+              <w:bottom w:val="single" w:sz="4" w:space="0" w:color="999999"/>
+              <w:right w:val="single" w:sz="4" w:space="0" w:color="999999"/>
+            </w:tcBorders>
+            <w:vAlign w:val="center"/>
+          </w:tcPr>
+          <w:p>
+            <w:pPr>
+              <w:pStyle w:val="Compact"/>
+            </w:pPr>
+            <w:r>
+              <w:rPr>
+                <w:rtl/>
+              </w:rPr>
+              <w:t xml:space="preserve">מצב לילה בשעה שהוגדרה</w:t>
+            </w:r>
+          </w:p>
+        </w:tc>
+        <w:tc>
+          <w:tcPr>
+            <w:tcW w:w="4964" w:type="dxa"/>
+            <w:tcBorders>
+              <w:top w:val="single" w:sz="4" w:space="0" w:color="999999"/>
+              <w:left w:val="single" w:sz="4" w:space="0" w:color="999999"/>
+              <w:bottom w:val="single" w:sz="4" w:space="0" w:color="999999"/>
+              <w:right w:val="single" w:sz="4" w:space="0" w:color="999999"/>
+            </w:tcBorders>
+            <w:vAlign w:val="center"/>
+          </w:tcPr>
+          <w:p>
+            <w:pPr>
+              <w:pStyle w:val="Compact"/>
+            </w:pPr>
+            <w:r>
+              <w:rPr>
+                <w:rtl/>
+              </w:rPr>
+              <w:t xml:space="preserve">המערכת נדרכת במצב Home ונרשם ביומן</w:t>
+            </w:r>
+          </w:p>
+        </w:tc>
+      </w:tr>
+      <w:tr>
+        <w:trPr>
+          <w:cantSplit/>
+        </w:trPr>
+        <w:tc>
+          <w:tcPr>
+            <w:tcW w:w="4036" w:type="dxa"/>
             <w:tcBorders>
               <w:top w:val="single" w:sz="4" w:space="0" w:color="999999"/>
               <w:left w:val="single" w:sz="4" w:space="0" w:color="999999"/>
@@ -6557,7 +6723,7 @@
         </w:tc>
         <w:tc>
           <w:tcPr>
-            <w:tcW w:w="5103" w:type="dxa"/>
+            <w:tcW w:w="4964" w:type="dxa"/>
             <w:tcBorders>
               <w:top w:val="single" w:sz="4" w:space="0" w:color="999999"/>
               <w:left w:val="single" w:sz="4" w:space="0" w:color="999999"/>
@@ -6949,8 +7115,8 @@
         </w:tblCellMar>
       </w:tblPr>
       <w:tblGrid>
-        <w:gridCol w:w="5722"/>
-        <w:gridCol w:w="3278"/>
+        <w:gridCol w:w="4675"/>
+        <w:gridCol w:w="4325"/>
       </w:tblGrid>
       <w:tr>
         <w:trPr>
@@ -6960,7 +7126,7 @@
         </w:trPr>
         <w:tc>
           <w:tcPr>
-            <w:tcW w:w="5722" w:type="dxa"/>
+            <w:tcW w:w="4675" w:type="dxa"/>
             <w:tcBorders>
               <w:top w:val="single" w:sz="4" w:space="0" w:color="999999"/>
               <w:left w:val="single" w:sz="4" w:space="0" w:color="999999"/>
@@ -6973,7 +7139,6 @@
           <w:p>
             <w:pPr>
               <w:pStyle w:val="Compact"/>
-              <w:keepNext/>
               <w:jc w:val="center"/>
             </w:pPr>
             <w:r>
@@ -6988,7 +7153,7 @@
         </w:tc>
         <w:tc>
           <w:tcPr>
-            <w:tcW w:w="3278" w:type="dxa"/>
+            <w:tcW w:w="4325" w:type="dxa"/>
             <w:tcBorders>
               <w:top w:val="single" w:sz="4" w:space="0" w:color="999999"/>
               <w:left w:val="single" w:sz="4" w:space="0" w:color="999999"/>
@@ -7001,7 +7166,6 @@
           <w:p>
             <w:pPr>
               <w:pStyle w:val="Compact"/>
-              <w:keepNext/>
               <w:jc w:val="center"/>
             </w:pPr>
             <w:r>
@@ -7021,19 +7185,18 @@
         </w:trPr>
         <w:tc>
           <w:tcPr>
-            <w:tcW w:w="5722" w:type="dxa"/>
-            <w:tcBorders>
-              <w:top w:val="single" w:sz="4" w:space="0" w:color="999999"/>
-              <w:left w:val="single" w:sz="4" w:space="0" w:color="999999"/>
-              <w:bottom w:val="single" w:sz="4" w:space="0" w:color="999999"/>
-              <w:right w:val="single" w:sz="4" w:space="0" w:color="999999"/>
-            </w:tcBorders>
-            <w:vAlign w:val="center"/>
-          </w:tcPr>
-          <w:p>
-            <w:pPr>
-              <w:pStyle w:val="Compact"/>
-              <w:keepNext/>
+            <w:tcW w:w="4675" w:type="dxa"/>
+            <w:tcBorders>
+              <w:top w:val="single" w:sz="4" w:space="0" w:color="999999"/>
+              <w:left w:val="single" w:sz="4" w:space="0" w:color="999999"/>
+              <w:bottom w:val="single" w:sz="4" w:space="0" w:color="999999"/>
+              <w:right w:val="single" w:sz="4" w:space="0" w:color="999999"/>
+            </w:tcBorders>
+            <w:vAlign w:val="center"/>
+          </w:tcPr>
+          <w:p>
+            <w:pPr>
+              <w:pStyle w:val="Compact"/>
             </w:pPr>
             <w:r>
               <w:rPr>
@@ -7045,19 +7208,18 @@
         </w:tc>
         <w:tc>
           <w:tcPr>
-            <w:tcW w:w="3278" w:type="dxa"/>
-            <w:tcBorders>
-              <w:top w:val="single" w:sz="4" w:space="0" w:color="999999"/>
-              <w:left w:val="single" w:sz="4" w:space="0" w:color="999999"/>
-              <w:bottom w:val="single" w:sz="4" w:space="0" w:color="999999"/>
-              <w:right w:val="single" w:sz="4" w:space="0" w:color="999999"/>
-            </w:tcBorders>
-            <w:vAlign w:val="center"/>
-          </w:tcPr>
-          <w:p>
-            <w:pPr>
-              <w:pStyle w:val="Compact"/>
-              <w:keepNext/>
+            <w:tcW w:w="4325" w:type="dxa"/>
+            <w:tcBorders>
+              <w:top w:val="single" w:sz="4" w:space="0" w:color="999999"/>
+              <w:left w:val="single" w:sz="4" w:space="0" w:color="999999"/>
+              <w:bottom w:val="single" w:sz="4" w:space="0" w:color="999999"/>
+              <w:right w:val="single" w:sz="4" w:space="0" w:color="999999"/>
+            </w:tcBorders>
+            <w:vAlign w:val="center"/>
+          </w:tcPr>
+          <w:p>
+            <w:pPr>
+              <w:pStyle w:val="Compact"/>
             </w:pPr>
             <w:r>
               <w:rPr>
@@ -7074,19 +7236,18 @@
         </w:trPr>
         <w:tc>
           <w:tcPr>
-            <w:tcW w:w="5722" w:type="dxa"/>
-            <w:tcBorders>
-              <w:top w:val="single" w:sz="4" w:space="0" w:color="999999"/>
-              <w:left w:val="single" w:sz="4" w:space="0" w:color="999999"/>
-              <w:bottom w:val="single" w:sz="4" w:space="0" w:color="999999"/>
-              <w:right w:val="single" w:sz="4" w:space="0" w:color="999999"/>
-            </w:tcBorders>
-            <w:vAlign w:val="center"/>
-          </w:tcPr>
-          <w:p>
-            <w:pPr>
-              <w:pStyle w:val="Compact"/>
-              <w:keepNext/>
+            <w:tcW w:w="4675" w:type="dxa"/>
+            <w:tcBorders>
+              <w:top w:val="single" w:sz="4" w:space="0" w:color="999999"/>
+              <w:left w:val="single" w:sz="4" w:space="0" w:color="999999"/>
+              <w:bottom w:val="single" w:sz="4" w:space="0" w:color="999999"/>
+              <w:right w:val="single" w:sz="4" w:space="0" w:color="999999"/>
+            </w:tcBorders>
+            <w:vAlign w:val="center"/>
+          </w:tcPr>
+          <w:p>
+            <w:pPr>
+              <w:pStyle w:val="Compact"/>
             </w:pPr>
             <w:r>
               <w:rPr>
@@ -7098,19 +7259,18 @@
         </w:tc>
         <w:tc>
           <w:tcPr>
-            <w:tcW w:w="3278" w:type="dxa"/>
-            <w:tcBorders>
-              <w:top w:val="single" w:sz="4" w:space="0" w:color="999999"/>
-              <w:left w:val="single" w:sz="4" w:space="0" w:color="999999"/>
-              <w:bottom w:val="single" w:sz="4" w:space="0" w:color="999999"/>
-              <w:right w:val="single" w:sz="4" w:space="0" w:color="999999"/>
-            </w:tcBorders>
-            <w:vAlign w:val="center"/>
-          </w:tcPr>
-          <w:p>
-            <w:pPr>
-              <w:pStyle w:val="Compact"/>
-              <w:keepNext/>
+            <w:tcW w:w="4325" w:type="dxa"/>
+            <w:tcBorders>
+              <w:top w:val="single" w:sz="4" w:space="0" w:color="999999"/>
+              <w:left w:val="single" w:sz="4" w:space="0" w:color="999999"/>
+              <w:bottom w:val="single" w:sz="4" w:space="0" w:color="999999"/>
+              <w:right w:val="single" w:sz="4" w:space="0" w:color="999999"/>
+            </w:tcBorders>
+            <w:vAlign w:val="center"/>
+          </w:tcPr>
+          <w:p>
+            <w:pPr>
+              <w:pStyle w:val="Compact"/>
             </w:pPr>
             <w:r>
               <w:rPr>
@@ -7127,19 +7287,18 @@
         </w:trPr>
         <w:tc>
           <w:tcPr>
-            <w:tcW w:w="5722" w:type="dxa"/>
-            <w:tcBorders>
-              <w:top w:val="single" w:sz="4" w:space="0" w:color="999999"/>
-              <w:left w:val="single" w:sz="4" w:space="0" w:color="999999"/>
-              <w:bottom w:val="single" w:sz="4" w:space="0" w:color="999999"/>
-              <w:right w:val="single" w:sz="4" w:space="0" w:color="999999"/>
-            </w:tcBorders>
-            <w:vAlign w:val="center"/>
-          </w:tcPr>
-          <w:p>
-            <w:pPr>
-              <w:pStyle w:val="Compact"/>
-              <w:keepNext/>
+            <w:tcW w:w="4675" w:type="dxa"/>
+            <w:tcBorders>
+              <w:top w:val="single" w:sz="4" w:space="0" w:color="999999"/>
+              <w:left w:val="single" w:sz="4" w:space="0" w:color="999999"/>
+              <w:bottom w:val="single" w:sz="4" w:space="0" w:color="999999"/>
+              <w:right w:val="single" w:sz="4" w:space="0" w:color="999999"/>
+            </w:tcBorders>
+            <w:vAlign w:val="center"/>
+          </w:tcPr>
+          <w:p>
+            <w:pPr>
+              <w:pStyle w:val="Compact"/>
             </w:pPr>
             <w:r>
               <w:rPr>
@@ -7151,19 +7310,18 @@
         </w:tc>
         <w:tc>
           <w:tcPr>
-            <w:tcW w:w="3278" w:type="dxa"/>
-            <w:tcBorders>
-              <w:top w:val="single" w:sz="4" w:space="0" w:color="999999"/>
-              <w:left w:val="single" w:sz="4" w:space="0" w:color="999999"/>
-              <w:bottom w:val="single" w:sz="4" w:space="0" w:color="999999"/>
-              <w:right w:val="single" w:sz="4" w:space="0" w:color="999999"/>
-            </w:tcBorders>
-            <w:vAlign w:val="center"/>
-          </w:tcPr>
-          <w:p>
-            <w:pPr>
-              <w:pStyle w:val="Compact"/>
-              <w:keepNext/>
+            <w:tcW w:w="4325" w:type="dxa"/>
+            <w:tcBorders>
+              <w:top w:val="single" w:sz="4" w:space="0" w:color="999999"/>
+              <w:left w:val="single" w:sz="4" w:space="0" w:color="999999"/>
+              <w:bottom w:val="single" w:sz="4" w:space="0" w:color="999999"/>
+              <w:right w:val="single" w:sz="4" w:space="0" w:color="999999"/>
+            </w:tcBorders>
+            <w:vAlign w:val="center"/>
+          </w:tcPr>
+          <w:p>
+            <w:pPr>
+              <w:pStyle w:val="Compact"/>
             </w:pPr>
             <w:r>
               <w:rPr>
@@ -7180,43 +7338,41 @@
         </w:trPr>
         <w:tc>
           <w:tcPr>
-            <w:tcW w:w="5722" w:type="dxa"/>
-            <w:tcBorders>
-              <w:top w:val="single" w:sz="4" w:space="0" w:color="999999"/>
-              <w:left w:val="single" w:sz="4" w:space="0" w:color="999999"/>
-              <w:bottom w:val="single" w:sz="4" w:space="0" w:color="999999"/>
-              <w:right w:val="single" w:sz="4" w:space="0" w:color="999999"/>
-            </w:tcBorders>
-            <w:vAlign w:val="center"/>
-          </w:tcPr>
-          <w:p>
-            <w:pPr>
-              <w:pStyle w:val="Compact"/>
-              <w:keepNext/>
-            </w:pPr>
-            <w:r>
-              <w:rPr>
-                <w:rtl/>
-              </w:rPr>
-              <w:t xml:space="preserve">זיהוי פנים</w:t>
-            </w:r>
-          </w:p>
-        </w:tc>
-        <w:tc>
-          <w:tcPr>
-            <w:tcW w:w="3278" w:type="dxa"/>
-            <w:tcBorders>
-              <w:top w:val="single" w:sz="4" w:space="0" w:color="999999"/>
-              <w:left w:val="single" w:sz="4" w:space="0" w:color="999999"/>
-              <w:bottom w:val="single" w:sz="4" w:space="0" w:color="999999"/>
-              <w:right w:val="single" w:sz="4" w:space="0" w:color="999999"/>
-            </w:tcBorders>
-            <w:vAlign w:val="center"/>
-          </w:tcPr>
-          <w:p>
-            <w:pPr>
-              <w:pStyle w:val="Compact"/>
-              <w:keepNext/>
+            <w:tcW w:w="4675" w:type="dxa"/>
+            <w:tcBorders>
+              <w:top w:val="single" w:sz="4" w:space="0" w:color="999999"/>
+              <w:left w:val="single" w:sz="4" w:space="0" w:color="999999"/>
+              <w:bottom w:val="single" w:sz="4" w:space="0" w:color="999999"/>
+              <w:right w:val="single" w:sz="4" w:space="0" w:color="999999"/>
+            </w:tcBorders>
+            <w:vAlign w:val="center"/>
+          </w:tcPr>
+          <w:p>
+            <w:pPr>
+              <w:pStyle w:val="Compact"/>
+            </w:pPr>
+            <w:r>
+              <w:rPr>
+                <w:rtl/>
+              </w:rPr>
+              <w:t xml:space="preserve">שמירת פנים מאושרות וזיהוי שלהן במצלמה</w:t>
+            </w:r>
+          </w:p>
+        </w:tc>
+        <w:tc>
+          <w:tcPr>
+            <w:tcW w:w="4325" w:type="dxa"/>
+            <w:tcBorders>
+              <w:top w:val="single" w:sz="4" w:space="0" w:color="999999"/>
+              <w:left w:val="single" w:sz="4" w:space="0" w:color="999999"/>
+              <w:bottom w:val="single" w:sz="4" w:space="0" w:color="999999"/>
+              <w:right w:val="single" w:sz="4" w:space="0" w:color="999999"/>
+            </w:tcBorders>
+            <w:vAlign w:val="center"/>
+          </w:tcPr>
+          <w:p>
+            <w:pPr>
+              <w:pStyle w:val="Compact"/>
             </w:pPr>
             <w:r>
               <w:rPr>
@@ -7233,49 +7389,47 @@
         </w:trPr>
         <w:tc>
           <w:tcPr>
-            <w:tcW w:w="5722" w:type="dxa"/>
-            <w:tcBorders>
-              <w:top w:val="single" w:sz="4" w:space="0" w:color="999999"/>
-              <w:left w:val="single" w:sz="4" w:space="0" w:color="999999"/>
-              <w:bottom w:val="single" w:sz="4" w:space="0" w:color="999999"/>
-              <w:right w:val="single" w:sz="4" w:space="0" w:color="999999"/>
-            </w:tcBorders>
-            <w:vAlign w:val="center"/>
-          </w:tcPr>
-          <w:p>
-            <w:pPr>
-              <w:pStyle w:val="Compact"/>
-              <w:keepNext/>
-            </w:pPr>
-            <w:r>
-              <w:rPr>
-                <w:rtl/>
-              </w:rPr>
-              <w:t xml:space="preserve">יומן אירועים בזמן אמת בטלפון</w:t>
-            </w:r>
-          </w:p>
-        </w:tc>
-        <w:tc>
-          <w:tcPr>
-            <w:tcW w:w="3278" w:type="dxa"/>
-            <w:tcBorders>
-              <w:top w:val="single" w:sz="4" w:space="0" w:color="999999"/>
-              <w:left w:val="single" w:sz="4" w:space="0" w:color="999999"/>
-              <w:bottom w:val="single" w:sz="4" w:space="0" w:color="999999"/>
-              <w:right w:val="single" w:sz="4" w:space="0" w:color="999999"/>
-            </w:tcBorders>
-            <w:vAlign w:val="center"/>
-          </w:tcPr>
-          <w:p>
-            <w:pPr>
-              <w:pStyle w:val="Compact"/>
-              <w:keepNext/>
-            </w:pPr>
-            <w:r>
-              <w:rPr>
-                <w:rtl/>
-              </w:rPr>
-              <w:t xml:space="preserve">הושלם</w:t>
+            <w:tcW w:w="4675" w:type="dxa"/>
+            <w:tcBorders>
+              <w:top w:val="single" w:sz="4" w:space="0" w:color="999999"/>
+              <w:left w:val="single" w:sz="4" w:space="0" w:color="999999"/>
+              <w:bottom w:val="single" w:sz="4" w:space="0" w:color="999999"/>
+              <w:right w:val="single" w:sz="4" w:space="0" w:color="999999"/>
+            </w:tcBorders>
+            <w:vAlign w:val="center"/>
+          </w:tcPr>
+          <w:p>
+            <w:pPr>
+              <w:pStyle w:val="Compact"/>
+            </w:pPr>
+            <w:r>
+              <w:rPr>
+                <w:rtl/>
+              </w:rPr>
+              <w:t xml:space="preserve">הפעלת אזעקה בזיהוי פנים לא מאושרות</w:t>
+            </w:r>
+          </w:p>
+        </w:tc>
+        <w:tc>
+          <w:tcPr>
+            <w:tcW w:w="4325" w:type="dxa"/>
+            <w:tcBorders>
+              <w:top w:val="single" w:sz="4" w:space="0" w:color="999999"/>
+              <w:left w:val="single" w:sz="4" w:space="0" w:color="999999"/>
+              <w:bottom w:val="single" w:sz="4" w:space="0" w:color="999999"/>
+              <w:right w:val="single" w:sz="4" w:space="0" w:color="999999"/>
+            </w:tcBorders>
+            <w:vAlign w:val="center"/>
+          </w:tcPr>
+          <w:p>
+            <w:pPr>
+              <w:pStyle w:val="Compact"/>
+            </w:pPr>
+            <w:r>
+              <w:rPr>
+                <w:rtl/>
+              </w:rPr>
+              <w:t xml:space="preserve">לא הושלם. במקומה פנים מאושרות מנטרלות את המערכת, באופט-אין</w:t>
             </w:r>
           </w:p>
         </w:tc>
@@ -7286,43 +7440,41 @@
         </w:trPr>
         <w:tc>
           <w:tcPr>
-            <w:tcW w:w="5722" w:type="dxa"/>
-            <w:tcBorders>
-              <w:top w:val="single" w:sz="4" w:space="0" w:color="999999"/>
-              <w:left w:val="single" w:sz="4" w:space="0" w:color="999999"/>
-              <w:bottom w:val="single" w:sz="4" w:space="0" w:color="999999"/>
-              <w:right w:val="single" w:sz="4" w:space="0" w:color="999999"/>
-            </w:tcBorders>
-            <w:vAlign w:val="center"/>
-          </w:tcPr>
-          <w:p>
-            <w:pPr>
-              <w:pStyle w:val="Compact"/>
-              <w:keepNext/>
-            </w:pPr>
-            <w:r>
-              <w:rPr>
-                <w:rtl/>
-              </w:rPr>
-              <w:t xml:space="preserve">שינוי הקוד מהאפליקציה</w:t>
-            </w:r>
-          </w:p>
-        </w:tc>
-        <w:tc>
-          <w:tcPr>
-            <w:tcW w:w="3278" w:type="dxa"/>
-            <w:tcBorders>
-              <w:top w:val="single" w:sz="4" w:space="0" w:color="999999"/>
-              <w:left w:val="single" w:sz="4" w:space="0" w:color="999999"/>
-              <w:bottom w:val="single" w:sz="4" w:space="0" w:color="999999"/>
-              <w:right w:val="single" w:sz="4" w:space="0" w:color="999999"/>
-            </w:tcBorders>
-            <w:vAlign w:val="center"/>
-          </w:tcPr>
-          <w:p>
-            <w:pPr>
-              <w:pStyle w:val="Compact"/>
-              <w:keepNext/>
+            <w:tcW w:w="4675" w:type="dxa"/>
+            <w:tcBorders>
+              <w:top w:val="single" w:sz="4" w:space="0" w:color="999999"/>
+              <w:left w:val="single" w:sz="4" w:space="0" w:color="999999"/>
+              <w:bottom w:val="single" w:sz="4" w:space="0" w:color="999999"/>
+              <w:right w:val="single" w:sz="4" w:space="0" w:color="999999"/>
+            </w:tcBorders>
+            <w:vAlign w:val="center"/>
+          </w:tcPr>
+          <w:p>
+            <w:pPr>
+              <w:pStyle w:val="Compact"/>
+            </w:pPr>
+            <w:r>
+              <w:rPr>
+                <w:rtl/>
+              </w:rPr>
+              <w:t xml:space="preserve">יומן אירועים בזמן אמת בטלפון</w:t>
+            </w:r>
+          </w:p>
+        </w:tc>
+        <w:tc>
+          <w:tcPr>
+            <w:tcW w:w="4325" w:type="dxa"/>
+            <w:tcBorders>
+              <w:top w:val="single" w:sz="4" w:space="0" w:color="999999"/>
+              <w:left w:val="single" w:sz="4" w:space="0" w:color="999999"/>
+              <w:bottom w:val="single" w:sz="4" w:space="0" w:color="999999"/>
+              <w:right w:val="single" w:sz="4" w:space="0" w:color="999999"/>
+            </w:tcBorders>
+            <w:vAlign w:val="center"/>
+          </w:tcPr>
+          <w:p>
+            <w:pPr>
+              <w:pStyle w:val="Compact"/>
             </w:pPr>
             <w:r>
               <w:rPr>
@@ -7339,43 +7491,41 @@
         </w:trPr>
         <w:tc>
           <w:tcPr>
-            <w:tcW w:w="5722" w:type="dxa"/>
-            <w:tcBorders>
-              <w:top w:val="single" w:sz="4" w:space="0" w:color="999999"/>
-              <w:left w:val="single" w:sz="4" w:space="0" w:color="999999"/>
-              <w:bottom w:val="single" w:sz="4" w:space="0" w:color="999999"/>
-              <w:right w:val="single" w:sz="4" w:space="0" w:color="999999"/>
-            </w:tcBorders>
-            <w:vAlign w:val="center"/>
-          </w:tcPr>
-          <w:p>
-            <w:pPr>
-              <w:pStyle w:val="Compact"/>
-              <w:keepNext/>
-            </w:pPr>
-            <w:r>
-              <w:rPr>
-                <w:rtl/>
-              </w:rPr>
-              <w:t xml:space="preserve">אימייל עם תמונה, וידאו חי ודריכה אוטומטית בשעות הלילה (מעבר להצעה)</w:t>
-            </w:r>
-          </w:p>
-        </w:tc>
-        <w:tc>
-          <w:tcPr>
-            <w:tcW w:w="3278" w:type="dxa"/>
-            <w:tcBorders>
-              <w:top w:val="single" w:sz="4" w:space="0" w:color="999999"/>
-              <w:left w:val="single" w:sz="4" w:space="0" w:color="999999"/>
-              <w:bottom w:val="single" w:sz="4" w:space="0" w:color="999999"/>
-              <w:right w:val="single" w:sz="4" w:space="0" w:color="999999"/>
-            </w:tcBorders>
-            <w:vAlign w:val="center"/>
-          </w:tcPr>
-          <w:p>
-            <w:pPr>
-              <w:pStyle w:val="Compact"/>
-              <w:keepNext/>
+            <w:tcW w:w="4675" w:type="dxa"/>
+            <w:tcBorders>
+              <w:top w:val="single" w:sz="4" w:space="0" w:color="999999"/>
+              <w:left w:val="single" w:sz="4" w:space="0" w:color="999999"/>
+              <w:bottom w:val="single" w:sz="4" w:space="0" w:color="999999"/>
+              <w:right w:val="single" w:sz="4" w:space="0" w:color="999999"/>
+            </w:tcBorders>
+            <w:vAlign w:val="center"/>
+          </w:tcPr>
+          <w:p>
+            <w:pPr>
+              <w:pStyle w:val="Compact"/>
+            </w:pPr>
+            <w:r>
+              <w:rPr>
+                <w:rtl/>
+              </w:rPr>
+              <w:t xml:space="preserve">שינוי הקוד מהאפליקציה</w:t>
+            </w:r>
+          </w:p>
+        </w:tc>
+        <w:tc>
+          <w:tcPr>
+            <w:tcW w:w="4325" w:type="dxa"/>
+            <w:tcBorders>
+              <w:top w:val="single" w:sz="4" w:space="0" w:color="999999"/>
+              <w:left w:val="single" w:sz="4" w:space="0" w:color="999999"/>
+              <w:bottom w:val="single" w:sz="4" w:space="0" w:color="999999"/>
+              <w:right w:val="single" w:sz="4" w:space="0" w:color="999999"/>
+            </w:tcBorders>
+            <w:vAlign w:val="center"/>
+          </w:tcPr>
+          <w:p>
+            <w:pPr>
+              <w:pStyle w:val="Compact"/>
             </w:pPr>
             <w:r>
               <w:rPr>
@@ -7392,49 +7542,47 @@
         </w:trPr>
         <w:tc>
           <w:tcPr>
-            <w:tcW w:w="5722" w:type="dxa"/>
-            <w:tcBorders>
-              <w:top w:val="single" w:sz="4" w:space="0" w:color="999999"/>
-              <w:left w:val="single" w:sz="4" w:space="0" w:color="999999"/>
-              <w:bottom w:val="single" w:sz="4" w:space="0" w:color="999999"/>
-              <w:right w:val="single" w:sz="4" w:space="0" w:color="999999"/>
-            </w:tcBorders>
-            <w:vAlign w:val="center"/>
-          </w:tcPr>
-          <w:p>
-            <w:pPr>
-              <w:pStyle w:val="Compact"/>
-              <w:keepNext/>
-            </w:pPr>
-            <w:r>
-              <w:rPr>
-                <w:rtl/>
-              </w:rPr>
-              <w:t xml:space="preserve">נעילת הקודן אחרי 3 קודים שגויים</w:t>
-            </w:r>
-          </w:p>
-        </w:tc>
-        <w:tc>
-          <w:tcPr>
-            <w:tcW w:w="3278" w:type="dxa"/>
-            <w:tcBorders>
-              <w:top w:val="single" w:sz="4" w:space="0" w:color="999999"/>
-              <w:left w:val="single" w:sz="4" w:space="0" w:color="999999"/>
-              <w:bottom w:val="single" w:sz="4" w:space="0" w:color="999999"/>
-              <w:right w:val="single" w:sz="4" w:space="0" w:color="999999"/>
-            </w:tcBorders>
-            <w:vAlign w:val="center"/>
-          </w:tcPr>
-          <w:p>
-            <w:pPr>
-              <w:pStyle w:val="Compact"/>
-              <w:keepNext/>
-            </w:pPr>
-            <w:r>
-              <w:rPr>
-                <w:rtl/>
-              </w:rPr>
-              <w:t xml:space="preserve">לא הושלם. נעילה קיימת רק בהתחברות לאפליקציה</w:t>
+            <w:tcW w:w="4675" w:type="dxa"/>
+            <w:tcBorders>
+              <w:top w:val="single" w:sz="4" w:space="0" w:color="999999"/>
+              <w:left w:val="single" w:sz="4" w:space="0" w:color="999999"/>
+              <w:bottom w:val="single" w:sz="4" w:space="0" w:color="999999"/>
+              <w:right w:val="single" w:sz="4" w:space="0" w:color="999999"/>
+            </w:tcBorders>
+            <w:vAlign w:val="center"/>
+          </w:tcPr>
+          <w:p>
+            <w:pPr>
+              <w:pStyle w:val="Compact"/>
+            </w:pPr>
+            <w:r>
+              <w:rPr>
+                <w:rtl/>
+              </w:rPr>
+              <w:t xml:space="preserve">אימייל עם תמונה, וידאו חי ודריכה אוטומטית בשעות הלילה (מעבר להצעה)</w:t>
+            </w:r>
+          </w:p>
+        </w:tc>
+        <w:tc>
+          <w:tcPr>
+            <w:tcW w:w="4325" w:type="dxa"/>
+            <w:tcBorders>
+              <w:top w:val="single" w:sz="4" w:space="0" w:color="999999"/>
+              <w:left w:val="single" w:sz="4" w:space="0" w:color="999999"/>
+              <w:bottom w:val="single" w:sz="4" w:space="0" w:color="999999"/>
+              <w:right w:val="single" w:sz="4" w:space="0" w:color="999999"/>
+            </w:tcBorders>
+            <w:vAlign w:val="center"/>
+          </w:tcPr>
+          <w:p>
+            <w:pPr>
+              <w:pStyle w:val="Compact"/>
+            </w:pPr>
+            <w:r>
+              <w:rPr>
+                <w:rtl/>
+              </w:rPr>
+              <w:t xml:space="preserve">הושלם</w:t>
             </w:r>
           </w:p>
         </w:tc>
@@ -7445,7 +7593,58 @@
         </w:trPr>
         <w:tc>
           <w:tcPr>
-            <w:tcW w:w="5722" w:type="dxa"/>
+            <w:tcW w:w="4675" w:type="dxa"/>
+            <w:tcBorders>
+              <w:top w:val="single" w:sz="4" w:space="0" w:color="999999"/>
+              <w:left w:val="single" w:sz="4" w:space="0" w:color="999999"/>
+              <w:bottom w:val="single" w:sz="4" w:space="0" w:color="999999"/>
+              <w:right w:val="single" w:sz="4" w:space="0" w:color="999999"/>
+            </w:tcBorders>
+            <w:vAlign w:val="center"/>
+          </w:tcPr>
+          <w:p>
+            <w:pPr>
+              <w:pStyle w:val="Compact"/>
+            </w:pPr>
+            <w:r>
+              <w:rPr>
+                <w:rtl/>
+              </w:rPr>
+              <w:t xml:space="preserve">אזעקה אוטומטית אחרי 3 קודים שגויים בקודן</w:t>
+            </w:r>
+          </w:p>
+        </w:tc>
+        <w:tc>
+          <w:tcPr>
+            <w:tcW w:w="4325" w:type="dxa"/>
+            <w:tcBorders>
+              <w:top w:val="single" w:sz="4" w:space="0" w:color="999999"/>
+              <w:left w:val="single" w:sz="4" w:space="0" w:color="999999"/>
+              <w:bottom w:val="single" w:sz="4" w:space="0" w:color="999999"/>
+              <w:right w:val="single" w:sz="4" w:space="0" w:color="999999"/>
+            </w:tcBorders>
+            <w:vAlign w:val="center"/>
+          </w:tcPr>
+          <w:p>
+            <w:pPr>
+              <w:pStyle w:val="Compact"/>
+            </w:pPr>
+            <w:r>
+              <w:rPr>
+                <w:rtl/>
+              </w:rPr>
+              <w:t xml:space="preserve">לא הושלם. קוד שגוי משמיע זמזום ארוך בלבד. נעילה של 30‎ s אחרי 3 סיסמאות שגויות קיימת רק בהתחברות לאפליקציה</w:t>
+            </w:r>
+          </w:p>
+        </w:tc>
+      </w:tr>
+      <w:tr>
+        <w:trPr>
+          <w:cantSplit/>
+        </w:trPr>
+        <w:tc>
+          <w:tcPr>
+            <w:tcW w:w="4675" w:type="dxa"/>
             <w:tcBorders>
               <w:top w:val="single" w:sz="4" w:space="0" w:color="999999"/>
               <w:left w:val="single" w:sz="4" w:space="0" w:color="999999"/>
@@ -7468,7 +7667,7 @@
         </w:tc>
         <w:tc>
           <w:tcPr>
-            <w:tcW w:w="3278" w:type="dxa"/>
+            <w:tcW w:w="4325" w:type="dxa"/>
             <w:tcBorders>
               <w:top w:val="single" w:sz="4" w:space="0" w:color="999999"/>
               <w:left w:val="single" w:sz="4" w:space="0" w:color="999999"/>
@@ -8106,7 +8305,7 @@
         <w:rPr>
           <w:rtl/>
         </w:rPr>
-        <w:t xml:space="preserve">נעילת הקודן אחרי כמה קודים שגויים.</w:t>
+        <w:t xml:space="preserve">הפעלת אזעקה אחרי 3 קודים שגויים בקודן.</w:t>
       </w:r>
     </w:p>
     <w:p>

</xml_diff>

<commit_message>
Home mode now ignores both sensor-board sensors (distance and vibration); drop ntfy and the four-board wording from the README; report follows the code
The backend bypasses the distance and vibration sensors in Home mode, the door
sensor stays active. Tests and the real-server simulation cover the new rule.

Co-Authored-By: Claude Sonnet 5.5 <noreply@anthropic.com>
Claude-Session: https://claude.ai/code/session_01N3vMpjMW2wYwoiVm9vYhWU
</commit_message>
<xml_diff>
--- a/report/HomeGuard_Report.docx
+++ b/report/HomeGuard_Report.docx
@@ -2957,7 +2957,7 @@
         <w:rPr>
           <w:rtl/>
         </w:rPr>
-        <w:t xml:space="preserve">ב-Away כל החיישנים פעילים. ב-Home המערכת מתעלמת מחיישן הרעידות, כדי שאפשר יהיה לנוע בבית כשהמערכת דרוכה. חיישן המרחק וחיישן הדלת ממשיכים לעבוד, ולכן מי שעובר מול חיישן המרחק או פותח את הדלת מפעיל תגובה גם ב-Home.</w:t>
+        <w:t xml:space="preserve">ב-Away כל החיישנים פעילים. ב-Home המערכת מתעלמת מחיישן המרחק ומחיישן הרעידות, כדי שאפשר יהיה לנוע בבית כשהמערכת דרוכה. חיישן הדלת ממשיך לעבוד.</w:t>
       </w:r>
     </w:p>
     <w:p>
@@ -3236,7 +3236,7 @@
         <w:rPr>
           <w:rtl/>
         </w:rPr>
-        <w:t xml:space="preserve">הבקנד בודק שהמערכת דרוכה ושהחיישן לא מוחרג (ב-Home מוחרג רק חיישן הרעידות), ועובר למצב אזעקה.</w:t>
+        <w:t xml:space="preserve">הבקנד בודק שהמערכת דרוכה ושהחיישן לא מוחרג (ב-Home מוחרגים חיישן המרחק וחיישן הרעידות), ועובר למצב אזעקה.</w:t>
       </w:r>
     </w:p>
     <w:p>
@@ -3499,7 +3499,7 @@
         <w:rPr>
           <w:rtl/>
         </w:rPr>
-        <w:t xml:space="preserve">חיווי גדול של מצב המערכת, ספירה לאחור בזמן כניסה, מצב כל חיישן ומצב החיבור של הבקרים. כשהמערכת מנוטרלת יש שני כפתורי דריכה: ARM HOME (היקף בלבד, אפשר לנוע בתוך הבית) ו-ARM AWAY (כל החיישנים). כשהמערכת דרוכה או באזעקה הכפתור הוא DISARM. מתחת מוצגות הפעולות האחרונות.</w:t>
+        <w:t xml:space="preserve">חיווי גדול של מצב המערכת, ספירה לאחור בזמן כניסה, מצב כל חיישן ומצב החיבור של הבקרים. כשהמערכת מנוטרלת יש שני כפתורי דריכה: ARM HOME (חיישן הדלת בלבד, אפשר לנוע בתוך הבית) ו-ARM AWAY (כל החיישנים). כשהמערכת דרוכה או באזעקה הכפתור הוא DISARM. מתחת מוצגות הפעולות האחרונות.</w:t>
       </w:r>
     </w:p>
     <w:p>
@@ -5799,8 +5799,8 @@
         </w:tblCellMar>
       </w:tblPr>
       <w:tblGrid>
-        <w:gridCol w:w="4036"/>
-        <w:gridCol w:w="4964"/>
+        <w:gridCol w:w="4029"/>
+        <w:gridCol w:w="4971"/>
       </w:tblGrid>
       <w:tr>
         <w:trPr>
@@ -5810,7 +5810,7 @@
         </w:trPr>
         <w:tc>
           <w:tcPr>
-            <w:tcW w:w="4036" w:type="dxa"/>
+            <w:tcW w:w="4029" w:type="dxa"/>
             <w:tcBorders>
               <w:top w:val="single" w:sz="4" w:space="0" w:color="999999"/>
               <w:left w:val="single" w:sz="4" w:space="0" w:color="999999"/>
@@ -5837,7 +5837,7 @@
         </w:tc>
         <w:tc>
           <w:tcPr>
-            <w:tcW w:w="4964" w:type="dxa"/>
+            <w:tcW w:w="4971" w:type="dxa"/>
             <w:tcBorders>
               <w:top w:val="single" w:sz="4" w:space="0" w:color="999999"/>
               <w:left w:val="single" w:sz="4" w:space="0" w:color="999999"/>
@@ -5869,7 +5869,7 @@
         </w:trPr>
         <w:tc>
           <w:tcPr>
-            <w:tcW w:w="4036" w:type="dxa"/>
+            <w:tcW w:w="4029" w:type="dxa"/>
             <w:tcBorders>
               <w:top w:val="single" w:sz="4" w:space="0" w:color="999999"/>
               <w:left w:val="single" w:sz="4" w:space="0" w:color="999999"/>
@@ -5907,7 +5907,7 @@
         </w:tc>
         <w:tc>
           <w:tcPr>
-            <w:tcW w:w="4964" w:type="dxa"/>
+            <w:tcW w:w="4971" w:type="dxa"/>
             <w:tcBorders>
               <w:top w:val="single" w:sz="4" w:space="0" w:color="999999"/>
               <w:left w:val="single" w:sz="4" w:space="0" w:color="999999"/>
@@ -5935,7 +5935,7 @@
         </w:trPr>
         <w:tc>
           <w:tcPr>
-            <w:tcW w:w="4036" w:type="dxa"/>
+            <w:tcW w:w="4029" w:type="dxa"/>
             <w:tcBorders>
               <w:top w:val="single" w:sz="4" w:space="0" w:color="999999"/>
               <w:left w:val="single" w:sz="4" w:space="0" w:color="999999"/>
@@ -5958,7 +5958,7 @@
         </w:tc>
         <w:tc>
           <w:tcPr>
-            <w:tcW w:w="4964" w:type="dxa"/>
+            <w:tcW w:w="4971" w:type="dxa"/>
             <w:tcBorders>
               <w:top w:val="single" w:sz="4" w:space="0" w:color="999999"/>
               <w:left w:val="single" w:sz="4" w:space="0" w:color="999999"/>
@@ -5986,7 +5986,7 @@
         </w:trPr>
         <w:tc>
           <w:tcPr>
-            <w:tcW w:w="4036" w:type="dxa"/>
+            <w:tcW w:w="4029" w:type="dxa"/>
             <w:tcBorders>
               <w:top w:val="single" w:sz="4" w:space="0" w:color="999999"/>
               <w:left w:val="single" w:sz="4" w:space="0" w:color="999999"/>
@@ -6009,7 +6009,7 @@
         </w:tc>
         <w:tc>
           <w:tcPr>
-            <w:tcW w:w="4964" w:type="dxa"/>
+            <w:tcW w:w="4971" w:type="dxa"/>
             <w:tcBorders>
               <w:top w:val="single" w:sz="4" w:space="0" w:color="999999"/>
               <w:left w:val="single" w:sz="4" w:space="0" w:color="999999"/>
@@ -6037,7 +6037,7 @@
         </w:trPr>
         <w:tc>
           <w:tcPr>
-            <w:tcW w:w="4036" w:type="dxa"/>
+            <w:tcW w:w="4029" w:type="dxa"/>
             <w:tcBorders>
               <w:top w:val="single" w:sz="4" w:space="0" w:color="999999"/>
               <w:left w:val="single" w:sz="4" w:space="0" w:color="999999"/>
@@ -6060,7 +6060,7 @@
         </w:tc>
         <w:tc>
           <w:tcPr>
-            <w:tcW w:w="4964" w:type="dxa"/>
+            <w:tcW w:w="4971" w:type="dxa"/>
             <w:tcBorders>
               <w:top w:val="single" w:sz="4" w:space="0" w:color="999999"/>
               <w:left w:val="single" w:sz="4" w:space="0" w:color="999999"/>
@@ -6088,7 +6088,7 @@
         </w:trPr>
         <w:tc>
           <w:tcPr>
-            <w:tcW w:w="4036" w:type="dxa"/>
+            <w:tcW w:w="4029" w:type="dxa"/>
             <w:tcBorders>
               <w:top w:val="single" w:sz="4" w:space="0" w:color="999999"/>
               <w:left w:val="single" w:sz="4" w:space="0" w:color="999999"/>
@@ -6111,7 +6111,7 @@
         </w:tc>
         <w:tc>
           <w:tcPr>
-            <w:tcW w:w="4964" w:type="dxa"/>
+            <w:tcW w:w="4971" w:type="dxa"/>
             <w:tcBorders>
               <w:top w:val="single" w:sz="4" w:space="0" w:color="999999"/>
               <w:left w:val="single" w:sz="4" w:space="0" w:color="999999"/>
@@ -6139,7 +6139,7 @@
         </w:trPr>
         <w:tc>
           <w:tcPr>
-            <w:tcW w:w="4036" w:type="dxa"/>
+            <w:tcW w:w="4029" w:type="dxa"/>
             <w:tcBorders>
               <w:top w:val="single" w:sz="4" w:space="0" w:color="999999"/>
               <w:left w:val="single" w:sz="4" w:space="0" w:color="999999"/>
@@ -6162,7 +6162,7 @@
         </w:tc>
         <w:tc>
           <w:tcPr>
-            <w:tcW w:w="4964" w:type="dxa"/>
+            <w:tcW w:w="4971" w:type="dxa"/>
             <w:tcBorders>
               <w:top w:val="single" w:sz="4" w:space="0" w:color="999999"/>
               <w:left w:val="single" w:sz="4" w:space="0" w:color="999999"/>
@@ -6190,7 +6190,7 @@
         </w:trPr>
         <w:tc>
           <w:tcPr>
-            <w:tcW w:w="4036" w:type="dxa"/>
+            <w:tcW w:w="4029" w:type="dxa"/>
             <w:tcBorders>
               <w:top w:val="single" w:sz="4" w:space="0" w:color="999999"/>
               <w:left w:val="single" w:sz="4" w:space="0" w:color="999999"/>
@@ -6213,7 +6213,7 @@
         </w:tc>
         <w:tc>
           <w:tcPr>
-            <w:tcW w:w="4964" w:type="dxa"/>
+            <w:tcW w:w="4971" w:type="dxa"/>
             <w:tcBorders>
               <w:top w:val="single" w:sz="4" w:space="0" w:color="999999"/>
               <w:left w:val="single" w:sz="4" w:space="0" w:color="999999"/>
@@ -6241,7 +6241,7 @@
         </w:trPr>
         <w:tc>
           <w:tcPr>
-            <w:tcW w:w="4036" w:type="dxa"/>
+            <w:tcW w:w="4029" w:type="dxa"/>
             <w:tcBorders>
               <w:top w:val="single" w:sz="4" w:space="0" w:color="999999"/>
               <w:left w:val="single" w:sz="4" w:space="0" w:color="999999"/>
@@ -6264,24 +6264,24 @@
         </w:tc>
         <w:tc>
           <w:tcPr>
-            <w:tcW w:w="4964" w:type="dxa"/>
-            <w:tcBorders>
-              <w:top w:val="single" w:sz="4" w:space="0" w:color="999999"/>
-              <w:left w:val="single" w:sz="4" w:space="0" w:color="999999"/>
-              <w:bottom w:val="single" w:sz="4" w:space="0" w:color="999999"/>
-              <w:right w:val="single" w:sz="4" w:space="0" w:color="999999"/>
-            </w:tcBorders>
-            <w:vAlign w:val="center"/>
-          </w:tcPr>
-          <w:p>
-            <w:pPr>
-              <w:pStyle w:val="Compact"/>
-            </w:pPr>
-            <w:r>
-              <w:rPr>
-                <w:rtl/>
-              </w:rPr>
-              <w:t xml:space="preserve">אזעקה</w:t>
+            <w:tcW w:w="4971" w:type="dxa"/>
+            <w:tcBorders>
+              <w:top w:val="single" w:sz="4" w:space="0" w:color="999999"/>
+              <w:left w:val="single" w:sz="4" w:space="0" w:color="999999"/>
+              <w:bottom w:val="single" w:sz="4" w:space="0" w:color="999999"/>
+              <w:right w:val="single" w:sz="4" w:space="0" w:color="999999"/>
+            </w:tcBorders>
+            <w:vAlign w:val="center"/>
+          </w:tcPr>
+          <w:p>
+            <w:pPr>
+              <w:pStyle w:val="Compact"/>
+            </w:pPr>
+            <w:r>
+              <w:rPr>
+                <w:rtl/>
+              </w:rPr>
+              <w:t xml:space="preserve">אין אזעקה</w:t>
             </w:r>
           </w:p>
         </w:tc>
@@ -6292,7 +6292,7 @@
         </w:trPr>
         <w:tc>
           <w:tcPr>
-            <w:tcW w:w="4036" w:type="dxa"/>
+            <w:tcW w:w="4029" w:type="dxa"/>
             <w:tcBorders>
               <w:top w:val="single" w:sz="4" w:space="0" w:color="999999"/>
               <w:left w:val="single" w:sz="4" w:space="0" w:color="999999"/>
@@ -6315,7 +6315,7 @@
         </w:tc>
         <w:tc>
           <w:tcPr>
-            <w:tcW w:w="4964" w:type="dxa"/>
+            <w:tcW w:w="4971" w:type="dxa"/>
             <w:tcBorders>
               <w:top w:val="single" w:sz="4" w:space="0" w:color="999999"/>
               <w:left w:val="single" w:sz="4" w:space="0" w:color="999999"/>
@@ -6343,7 +6343,7 @@
         </w:trPr>
         <w:tc>
           <w:tcPr>
-            <w:tcW w:w="4036" w:type="dxa"/>
+            <w:tcW w:w="4029" w:type="dxa"/>
             <w:tcBorders>
               <w:top w:val="single" w:sz="4" w:space="0" w:color="999999"/>
               <w:left w:val="single" w:sz="4" w:space="0" w:color="999999"/>
@@ -6366,7 +6366,7 @@
         </w:tc>
         <w:tc>
           <w:tcPr>
-            <w:tcW w:w="4964" w:type="dxa"/>
+            <w:tcW w:w="4971" w:type="dxa"/>
             <w:tcBorders>
               <w:top w:val="single" w:sz="4" w:space="0" w:color="999999"/>
               <w:left w:val="single" w:sz="4" w:space="0" w:color="999999"/>
@@ -6394,7 +6394,7 @@
         </w:trPr>
         <w:tc>
           <w:tcPr>
-            <w:tcW w:w="4036" w:type="dxa"/>
+            <w:tcW w:w="4029" w:type="dxa"/>
             <w:tcBorders>
               <w:top w:val="single" w:sz="4" w:space="0" w:color="999999"/>
               <w:left w:val="single" w:sz="4" w:space="0" w:color="999999"/>
@@ -6417,7 +6417,7 @@
         </w:tc>
         <w:tc>
           <w:tcPr>
-            <w:tcW w:w="4964" w:type="dxa"/>
+            <w:tcW w:w="4971" w:type="dxa"/>
             <w:tcBorders>
               <w:top w:val="single" w:sz="4" w:space="0" w:color="999999"/>
               <w:left w:val="single" w:sz="4" w:space="0" w:color="999999"/>
@@ -6445,7 +6445,7 @@
         </w:trPr>
         <w:tc>
           <w:tcPr>
-            <w:tcW w:w="4036" w:type="dxa"/>
+            <w:tcW w:w="4029" w:type="dxa"/>
             <w:tcBorders>
               <w:top w:val="single" w:sz="4" w:space="0" w:color="999999"/>
               <w:left w:val="single" w:sz="4" w:space="0" w:color="999999"/>
@@ -6468,7 +6468,7 @@
         </w:tc>
         <w:tc>
           <w:tcPr>
-            <w:tcW w:w="4964" w:type="dxa"/>
+            <w:tcW w:w="4971" w:type="dxa"/>
             <w:tcBorders>
               <w:top w:val="single" w:sz="4" w:space="0" w:color="999999"/>
               <w:left w:val="single" w:sz="4" w:space="0" w:color="999999"/>
@@ -6496,7 +6496,7 @@
         </w:trPr>
         <w:tc>
           <w:tcPr>
-            <w:tcW w:w="4036" w:type="dxa"/>
+            <w:tcW w:w="4029" w:type="dxa"/>
             <w:tcBorders>
               <w:top w:val="single" w:sz="4" w:space="0" w:color="999999"/>
               <w:left w:val="single" w:sz="4" w:space="0" w:color="999999"/>
@@ -6519,7 +6519,7 @@
         </w:tc>
         <w:tc>
           <w:tcPr>
-            <w:tcW w:w="4964" w:type="dxa"/>
+            <w:tcW w:w="4971" w:type="dxa"/>
             <w:tcBorders>
               <w:top w:val="single" w:sz="4" w:space="0" w:color="999999"/>
               <w:left w:val="single" w:sz="4" w:space="0" w:color="999999"/>
@@ -6547,7 +6547,7 @@
         </w:trPr>
         <w:tc>
           <w:tcPr>
-            <w:tcW w:w="4036" w:type="dxa"/>
+            <w:tcW w:w="4029" w:type="dxa"/>
             <w:tcBorders>
               <w:top w:val="single" w:sz="4" w:space="0" w:color="999999"/>
               <w:left w:val="single" w:sz="4" w:space="0" w:color="999999"/>
@@ -6570,7 +6570,7 @@
         </w:tc>
         <w:tc>
           <w:tcPr>
-            <w:tcW w:w="4964" w:type="dxa"/>
+            <w:tcW w:w="4971" w:type="dxa"/>
             <w:tcBorders>
               <w:top w:val="single" w:sz="4" w:space="0" w:color="999999"/>
               <w:left w:val="single" w:sz="4" w:space="0" w:color="999999"/>
@@ -6598,7 +6598,7 @@
         </w:trPr>
         <w:tc>
           <w:tcPr>
-            <w:tcW w:w="4036" w:type="dxa"/>
+            <w:tcW w:w="4029" w:type="dxa"/>
             <w:tcBorders>
               <w:top w:val="single" w:sz="4" w:space="0" w:color="999999"/>
               <w:left w:val="single" w:sz="4" w:space="0" w:color="999999"/>
@@ -6621,7 +6621,7 @@
         </w:tc>
         <w:tc>
           <w:tcPr>
-            <w:tcW w:w="4964" w:type="dxa"/>
+            <w:tcW w:w="4971" w:type="dxa"/>
             <w:tcBorders>
               <w:top w:val="single" w:sz="4" w:space="0" w:color="999999"/>
               <w:left w:val="single" w:sz="4" w:space="0" w:color="999999"/>
@@ -6649,7 +6649,7 @@
         </w:trPr>
         <w:tc>
           <w:tcPr>
-            <w:tcW w:w="4036" w:type="dxa"/>
+            <w:tcW w:w="4029" w:type="dxa"/>
             <w:tcBorders>
               <w:top w:val="single" w:sz="4" w:space="0" w:color="999999"/>
               <w:left w:val="single" w:sz="4" w:space="0" w:color="999999"/>
@@ -6672,7 +6672,7 @@
         </w:tc>
         <w:tc>
           <w:tcPr>
-            <w:tcW w:w="4964" w:type="dxa"/>
+            <w:tcW w:w="4971" w:type="dxa"/>
             <w:tcBorders>
               <w:top w:val="single" w:sz="4" w:space="0" w:color="999999"/>
               <w:left w:val="single" w:sz="4" w:space="0" w:color="999999"/>
@@ -6700,7 +6700,7 @@
         </w:trPr>
         <w:tc>
           <w:tcPr>
-            <w:tcW w:w="4036" w:type="dxa"/>
+            <w:tcW w:w="4029" w:type="dxa"/>
             <w:tcBorders>
               <w:top w:val="single" w:sz="4" w:space="0" w:color="999999"/>
               <w:left w:val="single" w:sz="4" w:space="0" w:color="999999"/>
@@ -6723,7 +6723,7 @@
         </w:tc>
         <w:tc>
           <w:tcPr>
-            <w:tcW w:w="4964" w:type="dxa"/>
+            <w:tcW w:w="4971" w:type="dxa"/>
             <w:tcBorders>
               <w:top w:val="single" w:sz="4" w:space="0" w:color="999999"/>
               <w:left w:val="single" w:sz="4" w:space="0" w:color="999999"/>

</xml_diff>

<commit_message>
Expand the operating guide: split table 9 into keypad+app and app-only tables with step-by-step instructions and the real button names
Co-Authored-By: Claude Sonnet 5.5 <noreply@anthropic.com>
Claude-Session: https://claude.ai/code/session_01N3vMpjMW2wYwoiVm9vYhWU
</commit_message>
<xml_diff>
--- a/report/HomeGuard_Report.docx
+++ b/report/HomeGuard_Report.docx
@@ -2707,6 +2707,7 @@
     <w:p>
       <w:pPr>
         <w:pStyle w:val="BodyText"/>
+        <w:spacing w:before="200"/>
       </w:pPr>
       <w:r>
         <w:rPr>
@@ -6749,6 +6750,7 @@
     <w:p>
       <w:pPr>
         <w:pStyle w:val="BodyText"/>
+        <w:spacing w:before="200"/>
       </w:pPr>
       <w:r>
         <w:rPr>
@@ -9693,7 +9695,7 @@
         <w:rPr>
           <w:rtl/>
         </w:rPr>
-        <w:t xml:space="preserve">טבלה 9 מסכמת איך מפעילים את המערכת בשימוש יומיומי.</w:t>
+        <w:t xml:space="preserve">טבלה 9 מסבירה צעד אחר צעד איך דורכים, נכנסים ומנטרלים, בקודן שליד הדלת ובאפליקציה. טבלה 10 מסבירה פעולות שנעשות באפליקציה בלבד. שמות הכפתורים והמסכים מופיעים כפי שהם באפליקציה.</w:t>
       </w:r>
     </w:p>
     <w:p>
@@ -9709,7 +9711,7 @@
           <w:bCs/>
           <w:rtl/>
         </w:rPr>
-        <w:t xml:space="preserve">טבלה 9: הפעלה יומיומית</w:t>
+        <w:t xml:space="preserve">טבלה 9: דריכה, כניסה ונטרול</w:t>
       </w:r>
     </w:p>
     <w:tbl>
@@ -9727,9 +9729,9 @@
         </w:tblCellMar>
       </w:tblPr>
       <w:tblGrid>
-        <w:gridCol w:w="1839"/>
-        <w:gridCol w:w="4021"/>
-        <w:gridCol w:w="3140"/>
+        <w:gridCol w:w="1350"/>
+        <w:gridCol w:w="3960"/>
+        <w:gridCol w:w="3690"/>
       </w:tblGrid>
       <w:tr>
         <w:trPr>
@@ -9739,7 +9741,7 @@
         </w:trPr>
         <w:tc>
           <w:tcPr>
-            <w:tcW w:w="1839" w:type="dxa"/>
+            <w:tcW w:w="1350" w:type="dxa"/>
             <w:tcBorders>
               <w:top w:val="single" w:sz="4" w:space="0" w:color="999999"/>
               <w:left w:val="single" w:sz="4" w:space="0" w:color="999999"/>
@@ -9752,7 +9754,6 @@
           <w:p>
             <w:pPr>
               <w:pStyle w:val="Compact"/>
-              <w:keepNext/>
               <w:jc w:val="center"/>
             </w:pPr>
             <w:r>
@@ -9767,7 +9768,7 @@
         </w:tc>
         <w:tc>
           <w:tcPr>
-            <w:tcW w:w="4021" w:type="dxa"/>
+            <w:tcW w:w="3960" w:type="dxa"/>
             <w:tcBorders>
               <w:top w:val="single" w:sz="4" w:space="0" w:color="999999"/>
               <w:left w:val="single" w:sz="4" w:space="0" w:color="999999"/>
@@ -9780,7 +9781,6 @@
           <w:p>
             <w:pPr>
               <w:pStyle w:val="Compact"/>
-              <w:keepNext/>
               <w:jc w:val="center"/>
             </w:pPr>
             <w:r>
@@ -9795,7 +9795,7 @@
         </w:tc>
         <w:tc>
           <w:tcPr>
-            <w:tcW w:w="3140" w:type="dxa"/>
+            <w:tcW w:w="3690" w:type="dxa"/>
             <w:tcBorders>
               <w:top w:val="single" w:sz="4" w:space="0" w:color="999999"/>
               <w:left w:val="single" w:sz="4" w:space="0" w:color="999999"/>
@@ -9808,7 +9808,6 @@
           <w:p>
             <w:pPr>
               <w:pStyle w:val="Compact"/>
-              <w:keepNext/>
               <w:jc w:val="center"/>
             </w:pPr>
             <w:r>
@@ -9828,19 +9827,18 @@
         </w:trPr>
         <w:tc>
           <w:tcPr>
-            <w:tcW w:w="1839" w:type="dxa"/>
-            <w:tcBorders>
-              <w:top w:val="single" w:sz="4" w:space="0" w:color="999999"/>
-              <w:left w:val="single" w:sz="4" w:space="0" w:color="999999"/>
-              <w:bottom w:val="single" w:sz="4" w:space="0" w:color="999999"/>
-              <w:right w:val="single" w:sz="4" w:space="0" w:color="999999"/>
-            </w:tcBorders>
-            <w:vAlign w:val="center"/>
-          </w:tcPr>
-          <w:p>
-            <w:pPr>
-              <w:pStyle w:val="Compact"/>
-              <w:keepNext/>
+            <w:tcW w:w="1350" w:type="dxa"/>
+            <w:tcBorders>
+              <w:top w:val="single" w:sz="4" w:space="0" w:color="999999"/>
+              <w:left w:val="single" w:sz="4" w:space="0" w:color="999999"/>
+              <w:bottom w:val="single" w:sz="4" w:space="0" w:color="999999"/>
+              <w:right w:val="single" w:sz="4" w:space="0" w:color="999999"/>
+            </w:tcBorders>
+            <w:vAlign w:val="center"/>
+          </w:tcPr>
+          <w:p>
+            <w:pPr>
+              <w:pStyle w:val="Compact"/>
             </w:pPr>
             <w:r>
               <w:rPr>
@@ -9852,25 +9850,24 @@
         </w:tc>
         <w:tc>
           <w:tcPr>
-            <w:tcW w:w="4021" w:type="dxa"/>
-            <w:tcBorders>
-              <w:top w:val="single" w:sz="4" w:space="0" w:color="999999"/>
-              <w:left w:val="single" w:sz="4" w:space="0" w:color="999999"/>
-              <w:bottom w:val="single" w:sz="4" w:space="0" w:color="999999"/>
-              <w:right w:val="single" w:sz="4" w:space="0" w:color="999999"/>
-            </w:tcBorders>
-            <w:vAlign w:val="center"/>
-          </w:tcPr>
-          <w:p>
-            <w:pPr>
-              <w:pStyle w:val="Compact"/>
-              <w:keepNext/>
-            </w:pPr>
-            <w:r>
-              <w:rPr>
-                <w:rtl/>
-              </w:rPr>
-              <w:t xml:space="preserve">לוחצים</w:t>
+            <w:tcW w:w="3960" w:type="dxa"/>
+            <w:tcBorders>
+              <w:top w:val="single" w:sz="4" w:space="0" w:color="999999"/>
+              <w:left w:val="single" w:sz="4" w:space="0" w:color="999999"/>
+              <w:bottom w:val="single" w:sz="4" w:space="0" w:color="999999"/>
+              <w:right w:val="single" w:sz="4" w:space="0" w:color="999999"/>
+            </w:tcBorders>
+            <w:vAlign w:val="center"/>
+          </w:tcPr>
+          <w:p>
+            <w:pPr>
+              <w:pStyle w:val="Compact"/>
+            </w:pPr>
+            <w:r>
+              <w:rPr>
+                <w:rtl/>
+              </w:rPr>
+              <w:t xml:space="preserve">1. מוודאים שהדלת סגורה. 2. לוחצים</w:t>
             </w:r>
             <w:r>
               <w:t xml:space="preserve"> </w:t>
@@ -9882,37 +9879,33 @@
               <w:t xml:space="preserve">*</w:t>
             </w:r>
             <w:r>
-              <w:t xml:space="preserve"> </w:t>
-            </w:r>
-            <w:r>
-              <w:rPr>
-                <w:rtl/>
-              </w:rPr>
-              <w:t xml:space="preserve">כשהדלת סגורה, פותחים את הדלת, יוצאים וסוגרים אותה</w:t>
-            </w:r>
-          </w:p>
-        </w:tc>
-        <w:tc>
-          <w:tcPr>
-            <w:tcW w:w="3140" w:type="dxa"/>
-            <w:tcBorders>
-              <w:top w:val="single" w:sz="4" w:space="0" w:color="999999"/>
-              <w:left w:val="single" w:sz="4" w:space="0" w:color="999999"/>
-              <w:bottom w:val="single" w:sz="4" w:space="0" w:color="999999"/>
-              <w:right w:val="single" w:sz="4" w:space="0" w:color="999999"/>
-            </w:tcBorders>
-            <w:vAlign w:val="center"/>
-          </w:tcPr>
-          <w:p>
-            <w:pPr>
-              <w:pStyle w:val="Compact"/>
-              <w:keepNext/>
-            </w:pPr>
-            <w:r>
-              <w:rPr>
-                <w:rtl/>
-              </w:rPr>
-              <w:t xml:space="preserve">ARM AWAY או ARM HOME. הדלת חייבת להיות סגורה</w:t>
+              <w:rPr>
+                <w:rtl/>
+              </w:rPr>
+              <w:t xml:space="preserve">. 3. פותחים את הדלת, יוצאים וסוגרים אותה. ברגע שהדלת נסגרה המערכת נדרכת ונשמע צליל דריכה (שני צפצופים קצרים וצפצוף ארוך). הדריכה בקודן היא במצב Away, או במצב האחרון שנבחר באפליקציה.</w:t>
+            </w:r>
+          </w:p>
+        </w:tc>
+        <w:tc>
+          <w:tcPr>
+            <w:tcW w:w="3690" w:type="dxa"/>
+            <w:tcBorders>
+              <w:top w:val="single" w:sz="4" w:space="0" w:color="999999"/>
+              <w:left w:val="single" w:sz="4" w:space="0" w:color="999999"/>
+              <w:bottom w:val="single" w:sz="4" w:space="0" w:color="999999"/>
+              <w:right w:val="single" w:sz="4" w:space="0" w:color="999999"/>
+            </w:tcBorders>
+            <w:vAlign w:val="center"/>
+          </w:tcPr>
+          <w:p>
+            <w:pPr>
+              <w:pStyle w:val="Compact"/>
+            </w:pPr>
+            <w:r>
+              <w:rPr>
+                <w:rtl/>
+              </w:rPr>
+              <w:t xml:space="preserve">בלשונית Dashboard לוחצים ARM AWAY (כל החיישנים פעילים) או ARM HOME (רק חיישן הדלת פעיל, ואפשר לנוע בבית). הדלת חייבת להיות סגורה. המסך מציג ARMING כ-3‎ s ואחר כך ARMED.</w:t>
             </w:r>
           </w:p>
         </w:tc>
@@ -9923,19 +9916,18 @@
         </w:trPr>
         <w:tc>
           <w:tcPr>
-            <w:tcW w:w="1839" w:type="dxa"/>
-            <w:tcBorders>
-              <w:top w:val="single" w:sz="4" w:space="0" w:color="999999"/>
-              <w:left w:val="single" w:sz="4" w:space="0" w:color="999999"/>
-              <w:bottom w:val="single" w:sz="4" w:space="0" w:color="999999"/>
-              <w:right w:val="single" w:sz="4" w:space="0" w:color="999999"/>
-            </w:tcBorders>
-            <w:vAlign w:val="center"/>
-          </w:tcPr>
-          <w:p>
-            <w:pPr>
-              <w:pStyle w:val="Compact"/>
-              <w:keepNext/>
+            <w:tcW w:w="1350" w:type="dxa"/>
+            <w:tcBorders>
+              <w:top w:val="single" w:sz="4" w:space="0" w:color="999999"/>
+              <w:left w:val="single" w:sz="4" w:space="0" w:color="999999"/>
+              <w:bottom w:val="single" w:sz="4" w:space="0" w:color="999999"/>
+              <w:right w:val="single" w:sz="4" w:space="0" w:color="999999"/>
+            </w:tcBorders>
+            <w:vAlign w:val="center"/>
+          </w:tcPr>
+          <w:p>
+            <w:pPr>
+              <w:pStyle w:val="Compact"/>
             </w:pPr>
             <w:r>
               <w:rPr>
@@ -9947,19 +9939,18 @@
         </w:tc>
         <w:tc>
           <w:tcPr>
-            <w:tcW w:w="4021" w:type="dxa"/>
-            <w:tcBorders>
-              <w:top w:val="single" w:sz="4" w:space="0" w:color="999999"/>
-              <w:left w:val="single" w:sz="4" w:space="0" w:color="999999"/>
-              <w:bottom w:val="single" w:sz="4" w:space="0" w:color="999999"/>
-              <w:right w:val="single" w:sz="4" w:space="0" w:color="999999"/>
-            </w:tcBorders>
-            <w:vAlign w:val="center"/>
-          </w:tcPr>
-          <w:p>
-            <w:pPr>
-              <w:pStyle w:val="Compact"/>
-              <w:keepNext/>
+            <w:tcW w:w="3960" w:type="dxa"/>
+            <w:tcBorders>
+              <w:top w:val="single" w:sz="4" w:space="0" w:color="999999"/>
+              <w:left w:val="single" w:sz="4" w:space="0" w:color="999999"/>
+              <w:bottom w:val="single" w:sz="4" w:space="0" w:color="999999"/>
+              <w:right w:val="single" w:sz="4" w:space="0" w:color="999999"/>
+            </w:tcBorders>
+            <w:vAlign w:val="center"/>
+          </w:tcPr>
+          <w:p>
+            <w:pPr>
+              <w:pStyle w:val="Compact"/>
             </w:pPr>
             <w:r>
               <w:rPr>
@@ -9983,28 +9974,30 @@
               <w:rPr>
                 <w:rtl/>
               </w:rPr>
-              <w:t xml:space="preserve">לפני שהדלת נסגרה</w:t>
-            </w:r>
-          </w:p>
-        </w:tc>
-        <w:tc>
-          <w:tcPr>
-            <w:tcW w:w="3140" w:type="dxa"/>
-            <w:tcBorders>
-              <w:top w:val="single" w:sz="4" w:space="0" w:color="999999"/>
-              <w:left w:val="single" w:sz="4" w:space="0" w:color="999999"/>
-              <w:bottom w:val="single" w:sz="4" w:space="0" w:color="999999"/>
-              <w:right w:val="single" w:sz="4" w:space="0" w:color="999999"/>
-            </w:tcBorders>
-            <w:vAlign w:val="center"/>
-          </w:tcPr>
-          <w:p>
-            <w:pPr>
-              <w:pStyle w:val="Compact"/>
-              <w:keepNext/>
-            </w:pPr>
-            <w:r>
-              <w:t xml:space="preserve">—</w:t>
+              <w:t xml:space="preserve">שוב לפני שהדלת נסגרה. המערכת חוזרת למצב מנוטרל ונשמע צליל נטרול.</w:t>
+            </w:r>
+          </w:p>
+        </w:tc>
+        <w:tc>
+          <w:tcPr>
+            <w:tcW w:w="3690" w:type="dxa"/>
+            <w:tcBorders>
+              <w:top w:val="single" w:sz="4" w:space="0" w:color="999999"/>
+              <w:left w:val="single" w:sz="4" w:space="0" w:color="999999"/>
+              <w:bottom w:val="single" w:sz="4" w:space="0" w:color="999999"/>
+              <w:right w:val="single" w:sz="4" w:space="0" w:color="999999"/>
+            </w:tcBorders>
+            <w:vAlign w:val="center"/>
+          </w:tcPr>
+          <w:p>
+            <w:pPr>
+              <w:pStyle w:val="Compact"/>
+            </w:pPr>
+            <w:r>
+              <w:rPr>
+                <w:rtl/>
+              </w:rPr>
+              <w:t xml:space="preserve">לוחצים DISARM בזמן שהמסך מציג ARMING.</w:t>
             </w:r>
           </w:p>
         </w:tc>
@@ -10015,49 +10008,50 @@
         </w:trPr>
         <w:tc>
           <w:tcPr>
-            <w:tcW w:w="1839" w:type="dxa"/>
-            <w:tcBorders>
-              <w:top w:val="single" w:sz="4" w:space="0" w:color="999999"/>
-              <w:left w:val="single" w:sz="4" w:space="0" w:color="999999"/>
-              <w:bottom w:val="single" w:sz="4" w:space="0" w:color="999999"/>
-              <w:right w:val="single" w:sz="4" w:space="0" w:color="999999"/>
-            </w:tcBorders>
-            <w:vAlign w:val="center"/>
-          </w:tcPr>
-          <w:p>
-            <w:pPr>
-              <w:pStyle w:val="Compact"/>
-              <w:keepNext/>
-            </w:pPr>
-            <w:r>
-              <w:rPr>
-                <w:rtl/>
-              </w:rPr>
-              <w:t xml:space="preserve">נטרול כשהאזעקה פועלת</w:t>
-            </w:r>
-          </w:p>
-        </w:tc>
-        <w:tc>
-          <w:tcPr>
-            <w:tcW w:w="4021" w:type="dxa"/>
-            <w:tcBorders>
-              <w:top w:val="single" w:sz="4" w:space="0" w:color="999999"/>
-              <w:left w:val="single" w:sz="4" w:space="0" w:color="999999"/>
-              <w:bottom w:val="single" w:sz="4" w:space="0" w:color="999999"/>
-              <w:right w:val="single" w:sz="4" w:space="0" w:color="999999"/>
-            </w:tcBorders>
-            <w:vAlign w:val="center"/>
-          </w:tcPr>
-          <w:p>
-            <w:pPr>
-              <w:pStyle w:val="Compact"/>
-              <w:keepNext/>
-            </w:pPr>
-            <w:r>
-              <w:rPr>
-                <w:rtl/>
-              </w:rPr>
-              <w:t xml:space="preserve">מקישים את הקוד ו-</w:t>
+            <w:tcW w:w="1350" w:type="dxa"/>
+            <w:tcBorders>
+              <w:top w:val="single" w:sz="4" w:space="0" w:color="999999"/>
+              <w:left w:val="single" w:sz="4" w:space="0" w:color="999999"/>
+              <w:bottom w:val="single" w:sz="4" w:space="0" w:color="999999"/>
+              <w:right w:val="single" w:sz="4" w:space="0" w:color="999999"/>
+            </w:tcBorders>
+            <w:vAlign w:val="center"/>
+          </w:tcPr>
+          <w:p>
+            <w:pPr>
+              <w:pStyle w:val="Compact"/>
+            </w:pPr>
+            <w:r>
+              <w:rPr>
+                <w:rtl/>
+              </w:rPr>
+              <w:t xml:space="preserve">כניסה כשהמערכת דרוכה</w:t>
+            </w:r>
+          </w:p>
+        </w:tc>
+        <w:tc>
+          <w:tcPr>
+            <w:tcW w:w="3960" w:type="dxa"/>
+            <w:tcBorders>
+              <w:top w:val="single" w:sz="4" w:space="0" w:color="999999"/>
+              <w:left w:val="single" w:sz="4" w:space="0" w:color="999999"/>
+              <w:bottom w:val="single" w:sz="4" w:space="0" w:color="999999"/>
+              <w:right w:val="single" w:sz="4" w:space="0" w:color="999999"/>
+            </w:tcBorders>
+            <w:vAlign w:val="center"/>
+          </w:tcPr>
+          <w:p>
+            <w:pPr>
+              <w:pStyle w:val="Compact"/>
+            </w:pPr>
+            <w:r>
+              <w:rPr>
+                <w:rtl/>
+              </w:rPr>
+              <w:t xml:space="preserve">1. פותחים את הדלת. מתחילה ספירה של 30‎ s, ואחרי 2‎ s בלי הקשה נשמעים צפצופים שהולכים ומתמהרים. 2. מקישים את הקוד ואחריו</w:t>
+            </w:r>
+            <w:r>
+              <w:t xml:space="preserve"> </w:t>
             </w:r>
             <w:r>
               <w:rPr>
@@ -10065,26 +10059,34 @@
               </w:rPr>
               <w:t xml:space="preserve">#</w:t>
             </w:r>
-          </w:p>
-        </w:tc>
-        <w:tc>
-          <w:tcPr>
-            <w:tcW w:w="3140" w:type="dxa"/>
-            <w:tcBorders>
-              <w:top w:val="single" w:sz="4" w:space="0" w:color="999999"/>
-              <w:left w:val="single" w:sz="4" w:space="0" w:color="999999"/>
-              <w:bottom w:val="single" w:sz="4" w:space="0" w:color="999999"/>
-              <w:right w:val="single" w:sz="4" w:space="0" w:color="999999"/>
-            </w:tcBorders>
-            <w:vAlign w:val="center"/>
-          </w:tcPr>
-          <w:p>
-            <w:pPr>
-              <w:pStyle w:val="Compact"/>
-              <w:keepNext/>
-            </w:pPr>
-            <w:r>
-              <w:t xml:space="preserve">DISARM</w:t>
+            <w:r>
+              <w:rPr>
+                <w:rtl/>
+              </w:rPr>
+              <w:t xml:space="preserve">. הצפצופים נפסקים בזמן ההקלדה. קוד נכון מנטרל את המערכת. קוד שגוי משמיע זמזום ארוך והספירה ממשיכה. אם הספירה נגמרת, האזעקה מופעלת.</w:t>
+            </w:r>
+          </w:p>
+        </w:tc>
+        <w:tc>
+          <w:tcPr>
+            <w:tcW w:w="3690" w:type="dxa"/>
+            <w:tcBorders>
+              <w:top w:val="single" w:sz="4" w:space="0" w:color="999999"/>
+              <w:left w:val="single" w:sz="4" w:space="0" w:color="999999"/>
+              <w:bottom w:val="single" w:sz="4" w:space="0" w:color="999999"/>
+              <w:right w:val="single" w:sz="4" w:space="0" w:color="999999"/>
+            </w:tcBorders>
+            <w:vAlign w:val="center"/>
+          </w:tcPr>
+          <w:p>
+            <w:pPr>
+              <w:pStyle w:val="Compact"/>
+            </w:pPr>
+            <w:r>
+              <w:rPr>
+                <w:rtl/>
+              </w:rPr>
+              <w:t xml:space="preserve">המסך הראשי מציג DISARM NOW וספירה לאחור. אפשר ללחוץ DISARM במקום להקיש קוד.</w:t>
             </w:r>
           </w:p>
         </w:tc>
@@ -10095,49 +10097,50 @@
         </w:trPr>
         <w:tc>
           <w:tcPr>
-            <w:tcW w:w="1839" w:type="dxa"/>
-            <w:tcBorders>
-              <w:top w:val="single" w:sz="4" w:space="0" w:color="999999"/>
-              <w:left w:val="single" w:sz="4" w:space="0" w:color="999999"/>
-              <w:bottom w:val="single" w:sz="4" w:space="0" w:color="999999"/>
-              <w:right w:val="single" w:sz="4" w:space="0" w:color="999999"/>
-            </w:tcBorders>
-            <w:vAlign w:val="center"/>
-          </w:tcPr>
-          <w:p>
-            <w:pPr>
-              <w:pStyle w:val="Compact"/>
-              <w:keepNext/>
-            </w:pPr>
-            <w:r>
-              <w:rPr>
-                <w:rtl/>
-              </w:rPr>
-              <w:t xml:space="preserve">כניסה במערכת דרוכה</w:t>
-            </w:r>
-          </w:p>
-        </w:tc>
-        <w:tc>
-          <w:tcPr>
-            <w:tcW w:w="4021" w:type="dxa"/>
-            <w:tcBorders>
-              <w:top w:val="single" w:sz="4" w:space="0" w:color="999999"/>
-              <w:left w:val="single" w:sz="4" w:space="0" w:color="999999"/>
-              <w:bottom w:val="single" w:sz="4" w:space="0" w:color="999999"/>
-              <w:right w:val="single" w:sz="4" w:space="0" w:color="999999"/>
-            </w:tcBorders>
-            <w:vAlign w:val="center"/>
-          </w:tcPr>
-          <w:p>
-            <w:pPr>
-              <w:pStyle w:val="Compact"/>
-              <w:keepNext/>
-            </w:pPr>
-            <w:r>
-              <w:rPr>
-                <w:rtl/>
-              </w:rPr>
-              <w:t xml:space="preserve">פותחים את הדלת ומקישים את הקוד ו-</w:t>
+            <w:tcW w:w="1350" w:type="dxa"/>
+            <w:tcBorders>
+              <w:top w:val="single" w:sz="4" w:space="0" w:color="999999"/>
+              <w:left w:val="single" w:sz="4" w:space="0" w:color="999999"/>
+              <w:bottom w:val="single" w:sz="4" w:space="0" w:color="999999"/>
+              <w:right w:val="single" w:sz="4" w:space="0" w:color="999999"/>
+            </w:tcBorders>
+            <w:vAlign w:val="center"/>
+          </w:tcPr>
+          <w:p>
+            <w:pPr>
+              <w:pStyle w:val="Compact"/>
+            </w:pPr>
+            <w:r>
+              <w:rPr>
+                <w:rtl/>
+              </w:rPr>
+              <w:t xml:space="preserve">נטרול כשהאזעקה פועלת</w:t>
+            </w:r>
+          </w:p>
+        </w:tc>
+        <w:tc>
+          <w:tcPr>
+            <w:tcW w:w="3960" w:type="dxa"/>
+            <w:tcBorders>
+              <w:top w:val="single" w:sz="4" w:space="0" w:color="999999"/>
+              <w:left w:val="single" w:sz="4" w:space="0" w:color="999999"/>
+              <w:bottom w:val="single" w:sz="4" w:space="0" w:color="999999"/>
+              <w:right w:val="single" w:sz="4" w:space="0" w:color="999999"/>
+            </w:tcBorders>
+            <w:vAlign w:val="center"/>
+          </w:tcPr>
+          <w:p>
+            <w:pPr>
+              <w:pStyle w:val="Compact"/>
+            </w:pPr>
+            <w:r>
+              <w:rPr>
+                <w:rtl/>
+              </w:rPr>
+              <w:t xml:space="preserve">מקישים את הקוד (4 עד 8 ספרות) ואחריו</w:t>
+            </w:r>
+            <w:r>
+              <w:t xml:space="preserve"> </w:t>
             </w:r>
             <w:r>
               <w:rPr>
@@ -10146,37 +10149,129 @@
               <w:t xml:space="preserve">#</w:t>
             </w:r>
             <w:r>
-              <w:t xml:space="preserve"> </w:t>
-            </w:r>
-            <w:r>
-              <w:rPr>
-                <w:rtl/>
-              </w:rPr>
-              <w:t xml:space="preserve">תוך 30‎ s</w:t>
-            </w:r>
-          </w:p>
-        </w:tc>
-        <w:tc>
-          <w:tcPr>
-            <w:tcW w:w="3140" w:type="dxa"/>
-            <w:tcBorders>
-              <w:top w:val="single" w:sz="4" w:space="0" w:color="999999"/>
-              <w:left w:val="single" w:sz="4" w:space="0" w:color="999999"/>
-              <w:bottom w:val="single" w:sz="4" w:space="0" w:color="999999"/>
-              <w:right w:val="single" w:sz="4" w:space="0" w:color="999999"/>
-            </w:tcBorders>
-            <w:vAlign w:val="center"/>
-          </w:tcPr>
-          <w:p>
-            <w:pPr>
-              <w:pStyle w:val="Compact"/>
-              <w:keepNext/>
-            </w:pPr>
-            <w:r>
-              <w:rPr>
-                <w:rtl/>
-              </w:rPr>
-              <w:t xml:space="preserve">DISARM, גם בזמן הספירה</w:t>
+              <w:rPr>
+                <w:rtl/>
+              </w:rPr>
+              <w:t xml:space="preserve">. הסירנה נפסקת ונשמע צליל נטרול.</w:t>
+            </w:r>
+          </w:p>
+        </w:tc>
+        <w:tc>
+          <w:tcPr>
+            <w:tcW w:w="3690" w:type="dxa"/>
+            <w:tcBorders>
+              <w:top w:val="single" w:sz="4" w:space="0" w:color="999999"/>
+              <w:left w:val="single" w:sz="4" w:space="0" w:color="999999"/>
+              <w:bottom w:val="single" w:sz="4" w:space="0" w:color="999999"/>
+              <w:right w:val="single" w:sz="4" w:space="0" w:color="999999"/>
+            </w:tcBorders>
+            <w:vAlign w:val="center"/>
+          </w:tcPr>
+          <w:p>
+            <w:pPr>
+              <w:pStyle w:val="Compact"/>
+            </w:pPr>
+            <w:r>
+              <w:rPr>
+                <w:rtl/>
+              </w:rPr>
+              <w:t xml:space="preserve">לוחצים DISARM.</w:t>
+            </w:r>
+          </w:p>
+        </w:tc>
+      </w:tr>
+    </w:tbl>
+    <w:p>
+      <w:pPr>
+        <w:pStyle w:val="ImageCaption"/>
+        <w:keepNext/>
+        <w:spacing w:before="200" w:after="80"/>
+        <w:jc w:val="center"/>
+      </w:pPr>
+      <w:r>
+        <w:rPr>
+          <w:b/>
+          <w:bCs/>
+          <w:rtl/>
+        </w:rPr>
+        <w:t xml:space="preserve">טבלה 10: פעולות באפליקציה</w:t>
+      </w:r>
+    </w:p>
+    <w:tbl>
+      <w:tblPr>
+        <w:tblStyle w:val="Table"/>
+        <w:bidiVisual/>
+        <w:tblW w:w="9000" w:type="dxa"/>
+        <w:jc w:val="center"/>
+        <w:tblLayout w:type="fixed"/>
+        <w:tblCellMar>
+          <w:top w:w="40" w:type="dxa"/>
+          <w:left w:w="80" w:type="dxa"/>
+          <w:bottom w:w="40" w:type="dxa"/>
+          <w:right w:w="80" w:type="dxa"/>
+        </w:tblCellMar>
+      </w:tblPr>
+      <w:tblGrid>
+        <w:gridCol w:w="1800"/>
+        <w:gridCol w:w="7200"/>
+      </w:tblGrid>
+      <w:tr>
+        <w:trPr>
+          <w:tblHeader w:val="true"/>
+          <w:cantSplit/>
+          <w:tblHeader/>
+        </w:trPr>
+        <w:tc>
+          <w:tcPr>
+            <w:tcW w:w="1800" w:type="dxa"/>
+            <w:tcBorders>
+              <w:top w:val="single" w:sz="4" w:space="0" w:color="999999"/>
+              <w:left w:val="single" w:sz="4" w:space="0" w:color="999999"/>
+              <w:bottom w:val="single" w:sz="4" w:space="0" w:color="999999"/>
+              <w:right w:val="single" w:sz="4" w:space="0" w:color="999999"/>
+            </w:tcBorders>
+            <w:shd w:val="clear" w:color="auto" w:fill="E7ECE8"/>
+            <w:vAlign w:val="center"/>
+          </w:tcPr>
+          <w:p>
+            <w:pPr>
+              <w:pStyle w:val="Compact"/>
+              <w:jc w:val="center"/>
+            </w:pPr>
+            <w:r>
+              <w:rPr>
+                <w:b/>
+                <w:bCs/>
+                <w:rtl/>
+              </w:rPr>
+              <w:t xml:space="preserve">פעולה</w:t>
+            </w:r>
+          </w:p>
+        </w:tc>
+        <w:tc>
+          <w:tcPr>
+            <w:tcW w:w="7200" w:type="dxa"/>
+            <w:tcBorders>
+              <w:top w:val="single" w:sz="4" w:space="0" w:color="999999"/>
+              <w:left w:val="single" w:sz="4" w:space="0" w:color="999999"/>
+              <w:bottom w:val="single" w:sz="4" w:space="0" w:color="999999"/>
+              <w:right w:val="single" w:sz="4" w:space="0" w:color="999999"/>
+            </w:tcBorders>
+            <w:shd w:val="clear" w:color="auto" w:fill="E7ECE8"/>
+            <w:vAlign w:val="center"/>
+          </w:tcPr>
+          <w:p>
+            <w:pPr>
+              <w:pStyle w:val="Compact"/>
+              <w:jc w:val="center"/>
+            </w:pPr>
+            <w:r>
+              <w:rPr>
+                <w:b/>
+                <w:bCs/>
+                <w:rtl/>
+              </w:rPr>
+              <w:t xml:space="preserve">איפה ומה עושים</w:t>
             </w:r>
           </w:p>
         </w:tc>
@@ -10187,70 +10282,47 @@
         </w:trPr>
         <w:tc>
           <w:tcPr>
-            <w:tcW w:w="1839" w:type="dxa"/>
-            <w:tcBorders>
-              <w:top w:val="single" w:sz="4" w:space="0" w:color="999999"/>
-              <w:left w:val="single" w:sz="4" w:space="0" w:color="999999"/>
-              <w:bottom w:val="single" w:sz="4" w:space="0" w:color="999999"/>
-              <w:right w:val="single" w:sz="4" w:space="0" w:color="999999"/>
-            </w:tcBorders>
-            <w:vAlign w:val="center"/>
-          </w:tcPr>
-          <w:p>
-            <w:pPr>
-              <w:pStyle w:val="Compact"/>
-              <w:keepNext/>
-            </w:pPr>
-            <w:r>
-              <w:rPr>
-                <w:rtl/>
-              </w:rPr>
-              <w:t xml:space="preserve">הוספת פנים</w:t>
-            </w:r>
-          </w:p>
-        </w:tc>
-        <w:tc>
-          <w:tcPr>
-            <w:tcW w:w="4021" w:type="dxa"/>
-            <w:tcBorders>
-              <w:top w:val="single" w:sz="4" w:space="0" w:color="999999"/>
-              <w:left w:val="single" w:sz="4" w:space="0" w:color="999999"/>
-              <w:bottom w:val="single" w:sz="4" w:space="0" w:color="999999"/>
-              <w:right w:val="single" w:sz="4" w:space="0" w:color="999999"/>
-            </w:tcBorders>
-            <w:vAlign w:val="center"/>
-          </w:tcPr>
-          <w:p>
-            <w:pPr>
-              <w:pStyle w:val="Compact"/>
-              <w:keepNext/>
-            </w:pPr>
-            <w:r>
-              <w:t xml:space="preserve">—</w:t>
-            </w:r>
-          </w:p>
-        </w:tc>
-        <w:tc>
-          <w:tcPr>
-            <w:tcW w:w="3140" w:type="dxa"/>
-            <w:tcBorders>
-              <w:top w:val="single" w:sz="4" w:space="0" w:color="999999"/>
-              <w:left w:val="single" w:sz="4" w:space="0" w:color="999999"/>
-              <w:bottom w:val="single" w:sz="4" w:space="0" w:color="999999"/>
-              <w:right w:val="single" w:sz="4" w:space="0" w:color="999999"/>
-            </w:tcBorders>
-            <w:vAlign w:val="center"/>
-          </w:tcPr>
-          <w:p>
-            <w:pPr>
-              <w:pStyle w:val="Compact"/>
-              <w:keepNext/>
-            </w:pPr>
-            <w:r>
-              <w:rPr>
-                <w:rtl/>
-              </w:rPr>
-              <w:t xml:space="preserve">מסך הפנים, הוספה עם שם</w:t>
+            <w:tcW w:w="1800" w:type="dxa"/>
+            <w:tcBorders>
+              <w:top w:val="single" w:sz="4" w:space="0" w:color="999999"/>
+              <w:left w:val="single" w:sz="4" w:space="0" w:color="999999"/>
+              <w:bottom w:val="single" w:sz="4" w:space="0" w:color="999999"/>
+              <w:right w:val="single" w:sz="4" w:space="0" w:color="999999"/>
+            </w:tcBorders>
+            <w:vAlign w:val="center"/>
+          </w:tcPr>
+          <w:p>
+            <w:pPr>
+              <w:pStyle w:val="Compact"/>
+            </w:pPr>
+            <w:r>
+              <w:rPr>
+                <w:rtl/>
+              </w:rPr>
+              <w:t xml:space="preserve">שינוי הקוד</w:t>
+            </w:r>
+          </w:p>
+        </w:tc>
+        <w:tc>
+          <w:tcPr>
+            <w:tcW w:w="7200" w:type="dxa"/>
+            <w:tcBorders>
+              <w:top w:val="single" w:sz="4" w:space="0" w:color="999999"/>
+              <w:left w:val="single" w:sz="4" w:space="0" w:color="999999"/>
+              <w:bottom w:val="single" w:sz="4" w:space="0" w:color="999999"/>
+              <w:right w:val="single" w:sz="4" w:space="0" w:color="999999"/>
+            </w:tcBorders>
+            <w:vAlign w:val="center"/>
+          </w:tcPr>
+          <w:p>
+            <w:pPr>
+              <w:pStyle w:val="Compact"/>
+            </w:pPr>
+            <w:r>
+              <w:rPr>
+                <w:rtl/>
+              </w:rPr>
+              <w:t xml:space="preserve">בלשונית Settings, באזור Password &amp; keypad PIN, מקלידים את הסיסמה הנוכחית ואת הקוד החדש פעמיים (ספרות בלבד, 4 עד 8) ולוחצים UPDATE PASSWORD &amp; PIN. הקוד החדש משמש גם בקודן וגם להתחברות לאפליקציה.</w:t>
             </w:r>
           </w:p>
         </w:tc>
@@ -10261,7 +10333,160 @@
         </w:trPr>
         <w:tc>
           <w:tcPr>
-            <w:tcW w:w="1839" w:type="dxa"/>
+            <w:tcW w:w="1800" w:type="dxa"/>
+            <w:tcBorders>
+              <w:top w:val="single" w:sz="4" w:space="0" w:color="999999"/>
+              <w:left w:val="single" w:sz="4" w:space="0" w:color="999999"/>
+              <w:bottom w:val="single" w:sz="4" w:space="0" w:color="999999"/>
+              <w:right w:val="single" w:sz="4" w:space="0" w:color="999999"/>
+            </w:tcBorders>
+            <w:vAlign w:val="center"/>
+          </w:tcPr>
+          <w:p>
+            <w:pPr>
+              <w:pStyle w:val="Compact"/>
+            </w:pPr>
+            <w:r>
+              <w:rPr>
+                <w:rtl/>
+              </w:rPr>
+              <w:t xml:space="preserve">שינוי נמעני האימייל</w:t>
+            </w:r>
+          </w:p>
+        </w:tc>
+        <w:tc>
+          <w:tcPr>
+            <w:tcW w:w="7200" w:type="dxa"/>
+            <w:tcBorders>
+              <w:top w:val="single" w:sz="4" w:space="0" w:color="999999"/>
+              <w:left w:val="single" w:sz="4" w:space="0" w:color="999999"/>
+              <w:bottom w:val="single" w:sz="4" w:space="0" w:color="999999"/>
+              <w:right w:val="single" w:sz="4" w:space="0" w:color="999999"/>
+            </w:tcBorders>
+            <w:vAlign w:val="center"/>
+          </w:tcPr>
+          <w:p>
+            <w:pPr>
+              <w:pStyle w:val="Compact"/>
+            </w:pPr>
+            <w:r>
+              <w:rPr>
+                <w:rtl/>
+              </w:rPr>
+              <w:t xml:space="preserve">בלשונית Settings, באזור Alerts: הרשימה הראשונה היא הכתובות שיקבלו אימייל בכל אזעקה, והשנייה הכתובות שיקבלו אימייל אם האזעקה לא נוקתה בזמן. לוחצים SAVE ADDRESSES. הכפתור SEND TEST ALERT שולח הודעת בדיקה אמיתית. המתג Send alerts by email מכבה את כל ההודעות היוצאות.</w:t>
+            </w:r>
+          </w:p>
+        </w:tc>
+      </w:tr>
+      <w:tr>
+        <w:trPr>
+          <w:cantSplit/>
+        </w:trPr>
+        <w:tc>
+          <w:tcPr>
+            <w:tcW w:w="1800" w:type="dxa"/>
+            <w:tcBorders>
+              <w:top w:val="single" w:sz="4" w:space="0" w:color="999999"/>
+              <w:left w:val="single" w:sz="4" w:space="0" w:color="999999"/>
+              <w:bottom w:val="single" w:sz="4" w:space="0" w:color="999999"/>
+              <w:right w:val="single" w:sz="4" w:space="0" w:color="999999"/>
+            </w:tcBorders>
+            <w:vAlign w:val="center"/>
+          </w:tcPr>
+          <w:p>
+            <w:pPr>
+              <w:pStyle w:val="Compact"/>
+            </w:pPr>
+            <w:r>
+              <w:rPr>
+                <w:rtl/>
+              </w:rPr>
+              <w:t xml:space="preserve">הוספת פנים</w:t>
+            </w:r>
+          </w:p>
+        </w:tc>
+        <w:tc>
+          <w:tcPr>
+            <w:tcW w:w="7200" w:type="dxa"/>
+            <w:tcBorders>
+              <w:top w:val="single" w:sz="4" w:space="0" w:color="999999"/>
+              <w:left w:val="single" w:sz="4" w:space="0" w:color="999999"/>
+              <w:bottom w:val="single" w:sz="4" w:space="0" w:color="999999"/>
+              <w:right w:val="single" w:sz="4" w:space="0" w:color="999999"/>
+            </w:tcBorders>
+            <w:vAlign w:val="center"/>
+          </w:tcPr>
+          <w:p>
+            <w:pPr>
+              <w:pStyle w:val="Compact"/>
+            </w:pPr>
+            <w:r>
+              <w:rPr>
+                <w:rtl/>
+              </w:rPr>
+              <w:t xml:space="preserve">בלשונית Faces מוסיפים פנים חדשות וכותבים שם. האדם צריך לעמוד מול המצלמה באותו רגע, כי האפליקציה שומרת את התמונה האחרונה מהמצלמה. אם לא נראות פנים בתמונה, מוצגת הודעה ויש לנסות שוב.</w:t>
+            </w:r>
+          </w:p>
+        </w:tc>
+      </w:tr>
+      <w:tr>
+        <w:trPr>
+          <w:cantSplit/>
+        </w:trPr>
+        <w:tc>
+          <w:tcPr>
+            <w:tcW w:w="1800" w:type="dxa"/>
+            <w:tcBorders>
+              <w:top w:val="single" w:sz="4" w:space="0" w:color="999999"/>
+              <w:left w:val="single" w:sz="4" w:space="0" w:color="999999"/>
+              <w:bottom w:val="single" w:sz="4" w:space="0" w:color="999999"/>
+              <w:right w:val="single" w:sz="4" w:space="0" w:color="999999"/>
+            </w:tcBorders>
+            <w:vAlign w:val="center"/>
+          </w:tcPr>
+          <w:p>
+            <w:pPr>
+              <w:pStyle w:val="Compact"/>
+            </w:pPr>
+            <w:r>
+              <w:rPr>
+                <w:rtl/>
+              </w:rPr>
+              <w:t xml:space="preserve">נטרול בזיהוי פנים</w:t>
+            </w:r>
+          </w:p>
+        </w:tc>
+        <w:tc>
+          <w:tcPr>
+            <w:tcW w:w="7200" w:type="dxa"/>
+            <w:tcBorders>
+              <w:top w:val="single" w:sz="4" w:space="0" w:color="999999"/>
+              <w:left w:val="single" w:sz="4" w:space="0" w:color="999999"/>
+              <w:bottom w:val="single" w:sz="4" w:space="0" w:color="999999"/>
+              <w:right w:val="single" w:sz="4" w:space="0" w:color="999999"/>
+            </w:tcBorders>
+            <w:vAlign w:val="center"/>
+          </w:tcPr>
+          <w:p>
+            <w:pPr>
+              <w:pStyle w:val="Compact"/>
+            </w:pPr>
+            <w:r>
+              <w:rPr>
+                <w:rtl/>
+              </w:rPr>
+              <w:t xml:space="preserve">בלשונית Camera, בכרטיס FACE ID, מפעילים את Disarm with Face ID. האפשרות כבויה כברירת מחדל. פנים מוכרות מנטרלות את המערכת. האפשרות נועדה לנוחות ולא לאבטחה.</w:t>
+            </w:r>
+          </w:p>
+        </w:tc>
+      </w:tr>
+      <w:tr>
+        <w:trPr>
+          <w:cantSplit/>
+        </w:trPr>
+        <w:tc>
+          <w:tcPr>
+            <w:tcW w:w="1800" w:type="dxa"/>
             <w:tcBorders>
               <w:top w:val="single" w:sz="4" w:space="0" w:color="999999"/>
               <w:left w:val="single" w:sz="4" w:space="0" w:color="999999"/>
@@ -10284,44 +10509,75 @@
         </w:tc>
         <w:tc>
           <w:tcPr>
-            <w:tcW w:w="4021" w:type="dxa"/>
-            <w:tcBorders>
-              <w:top w:val="single" w:sz="4" w:space="0" w:color="999999"/>
-              <w:left w:val="single" w:sz="4" w:space="0" w:color="999999"/>
-              <w:bottom w:val="single" w:sz="4" w:space="0" w:color="999999"/>
-              <w:right w:val="single" w:sz="4" w:space="0" w:color="999999"/>
-            </w:tcBorders>
-            <w:vAlign w:val="center"/>
-          </w:tcPr>
-          <w:p>
-            <w:pPr>
-              <w:pStyle w:val="Compact"/>
-            </w:pPr>
-            <w:r>
-              <w:t xml:space="preserve">—</w:t>
-            </w:r>
-          </w:p>
-        </w:tc>
-        <w:tc>
-          <w:tcPr>
-            <w:tcW w:w="3140" w:type="dxa"/>
-            <w:tcBorders>
-              <w:top w:val="single" w:sz="4" w:space="0" w:color="999999"/>
-              <w:left w:val="single" w:sz="4" w:space="0" w:color="999999"/>
-              <w:bottom w:val="single" w:sz="4" w:space="0" w:color="999999"/>
-              <w:right w:val="single" w:sz="4" w:space="0" w:color="999999"/>
-            </w:tcBorders>
-            <w:vAlign w:val="center"/>
-          </w:tcPr>
-          <w:p>
-            <w:pPr>
-              <w:pStyle w:val="Compact"/>
-            </w:pPr>
-            <w:r>
-              <w:rPr>
-                <w:rtl/>
-              </w:rPr>
-              <w:t xml:space="preserve">הגדרות, מצב לילה ושעות</w:t>
+            <w:tcW w:w="7200" w:type="dxa"/>
+            <w:tcBorders>
+              <w:top w:val="single" w:sz="4" w:space="0" w:color="999999"/>
+              <w:left w:val="single" w:sz="4" w:space="0" w:color="999999"/>
+              <w:bottom w:val="single" w:sz="4" w:space="0" w:color="999999"/>
+              <w:right w:val="single" w:sz="4" w:space="0" w:color="999999"/>
+            </w:tcBorders>
+            <w:vAlign w:val="center"/>
+          </w:tcPr>
+          <w:p>
+            <w:pPr>
+              <w:pStyle w:val="Compact"/>
+            </w:pPr>
+            <w:r>
+              <w:rPr>
+                <w:rtl/>
+              </w:rPr>
+              <w:t xml:space="preserve">בלשונית Settings, באזור Night mode, מפעילים את המתג ובוחרים שעת דריכה (Arms at) ושעת נטרול (Disarms at). ברירת המחדל היא 23:00 ו-07:00. המערכת נדרכת במצב Home בשעה העגולה ומנוטרלת בבוקר. אזעקה פעילה לא מושתקת.</w:t>
+            </w:r>
+          </w:p>
+        </w:tc>
+      </w:tr>
+      <w:tr>
+        <w:trPr>
+          <w:cantSplit/>
+        </w:trPr>
+        <w:tc>
+          <w:tcPr>
+            <w:tcW w:w="1800" w:type="dxa"/>
+            <w:tcBorders>
+              <w:top w:val="single" w:sz="4" w:space="0" w:color="999999"/>
+              <w:left w:val="single" w:sz="4" w:space="0" w:color="999999"/>
+              <w:bottom w:val="single" w:sz="4" w:space="0" w:color="999999"/>
+              <w:right w:val="single" w:sz="4" w:space="0" w:color="999999"/>
+            </w:tcBorders>
+            <w:vAlign w:val="center"/>
+          </w:tcPr>
+          <w:p>
+            <w:pPr>
+              <w:pStyle w:val="Compact"/>
+            </w:pPr>
+            <w:r>
+              <w:rPr>
+                <w:rtl/>
+              </w:rPr>
+              <w:t xml:space="preserve">מצלמה ויומן אירועים</w:t>
+            </w:r>
+          </w:p>
+        </w:tc>
+        <w:tc>
+          <w:tcPr>
+            <w:tcW w:w="7200" w:type="dxa"/>
+            <w:tcBorders>
+              <w:top w:val="single" w:sz="4" w:space="0" w:color="999999"/>
+              <w:left w:val="single" w:sz="4" w:space="0" w:color="999999"/>
+              <w:bottom w:val="single" w:sz="4" w:space="0" w:color="999999"/>
+              <w:right w:val="single" w:sz="4" w:space="0" w:color="999999"/>
+            </w:tcBorders>
+            <w:vAlign w:val="center"/>
+          </w:tcPr>
+          <w:p>
+            <w:pPr>
+              <w:pStyle w:val="Compact"/>
+            </w:pPr>
+            <w:r>
+              <w:rPr>
+                <w:rtl/>
+              </w:rPr>
+              <w:t xml:space="preserve">הלשונית Camera מציגה וידאו חי ומי שזוהה. הלשונית Events מציגה את כל האירועים, עם סינון לפי חומרה: All, Critical, Warning ו-Info.</w:t>
             </w:r>
           </w:p>
         </w:tc>
@@ -10330,6 +10586,102 @@
     <w:p>
       <w:pPr>
         <w:pStyle w:val="BodyText"/>
+        <w:spacing w:before="200"/>
+      </w:pPr>
+      <w:r>
+        <w:rPr>
+          <w:rtl/>
+        </w:rPr>
+        <w:t xml:space="preserve">הערות לטבלאות:</w:t>
+      </w:r>
+    </w:p>
+    <w:p>
+      <w:pPr>
+        <w:pStyle w:val="BodyText"/>
+        <w:numPr>
+          <w:ilvl w:val="0"/>
+          <w:numId w:val="1012"/>
+        </w:numPr>
+        <w:spacing w:after="60"/>
+      </w:pPr>
+      <w:r>
+        <w:rPr>
+          <w:rtl/>
+        </w:rPr>
+        <w:t xml:space="preserve">הלחצן</w:t>
+      </w:r>
+      <w:r>
+        <w:t xml:space="preserve"> </w:t>
+      </w:r>
+      <w:r>
+        <w:rPr>
+          <w:rStyle w:val="VerbatimChar"/>
+        </w:rPr>
+        <w:t xml:space="preserve">*</w:t>
+      </w:r>
+      <w:r>
+        <w:t xml:space="preserve"> </w:t>
+      </w:r>
+      <w:r>
+        <w:rPr>
+          <w:rtl/>
+        </w:rPr>
+        <w:t xml:space="preserve">מתחיל דריכה ומבטל אותה, והלחצן</w:t>
+      </w:r>
+      <w:r>
+        <w:t xml:space="preserve"> </w:t>
+      </w:r>
+      <w:r>
+        <w:rPr>
+          <w:rStyle w:val="VerbatimChar"/>
+        </w:rPr>
+        <w:t xml:space="preserve">#</w:t>
+      </w:r>
+      <w:r>
+        <w:t xml:space="preserve"> </w:t>
+      </w:r>
+      <w:r>
+        <w:rPr>
+          <w:rtl/>
+        </w:rPr>
+        <w:t xml:space="preserve">מאשר את הקוד שהוקש.</w:t>
+      </w:r>
+    </w:p>
+    <w:p>
+      <w:pPr>
+        <w:pStyle w:val="BodyText"/>
+        <w:numPr>
+          <w:ilvl w:val="0"/>
+          <w:numId w:val="1012"/>
+        </w:numPr>
+        <w:spacing w:after="60"/>
+      </w:pPr>
+      <w:r>
+        <w:rPr>
+          <w:rtl/>
+        </w:rPr>
+        <w:t xml:space="preserve">בקודן, הקוד פועל רק אחרי שהדלת נפתחה (בספירת הכניסה) או כשהאזעקה כבר פועלת. כשהמערכת דרוכה והדלת סגורה, מנטרלים מהאפליקציה.</w:t>
+      </w:r>
+    </w:p>
+    <w:p>
+      <w:pPr>
+        <w:pStyle w:val="BodyText"/>
+        <w:numPr>
+          <w:ilvl w:val="0"/>
+          <w:numId w:val="1012"/>
+        </w:numPr>
+        <w:spacing w:after="60"/>
+      </w:pPr>
+      <w:r>
+        <w:rPr>
+          <w:rtl/>
+        </w:rPr>
+        <w:t xml:space="preserve">במצב Away כל החיישנים פעילים. במצב Home חיישן המרחק וחיישן הרעידות מוחרגים, וחיישן הדלת ממשיך לעבוד.</w:t>
+      </w:r>
+    </w:p>
+    <w:p>
+      <w:pPr>
+        <w:pStyle w:val="FirstParagraph"/>
       </w:pPr>
       <w:r>
         <w:rPr>
@@ -10733,6 +11085,9 @@
     <w:abstractNumId w:val="991"/>
   </w:num>
   <w:num w:numId="1011">
+    <w:abstractNumId w:val="991"/>
+  </w:num>
+  <w:num w:numId="1012">
     <w:abstractNumId w:val="991"/>
   </w:num>
 </w:numbering>

</xml_diff>

<commit_message>
Apply the review findings: 12 factual text fixes, challenges as short stories, Hebrew figures with a distance-sensor flowchart and five alarm states, 'קטע קוד N' captions, remove dangling CLAUDE.md references, fix the face-screen text
Co-Authored-By: Claude Sonnet 5.5 <noreply@anthropic.com>
Claude-Session: https://claude.ai/code/session_01N3vMpjMW2wYwoiVm9vYhWU
</commit_message>
<xml_diff>
--- a/report/HomeGuard_Report.docx
+++ b/report/HomeGuard_Report.docx
@@ -686,18 +686,18 @@
         <w:rPr>
           <w:rtl/>
         </w:rPr>
-        <w:t xml:space="preserve">בפרויקט נבנתה מערכת אזעקה לבית. שלושה בקרי ESP32 מחוברים ב-WiFi לשרת (בקנד) שכתוב ב-Python ורץ על מחשב: בקר אחד עם חיישן מרחק וחיישן רעידות, בקר שני בדלת עם חיישן דלת, קודן וזמזמים, ובקר שלישי עם מצלמה. הבקנד מחליט מתי יש אזעקה, מזהה פנים של דיירים ושולח אימייל עם תמונה מהמצלמה. אפליקציה בטלפון מאפשרת לדרוך ולנטרל, לראות את המצלמה ולעבור על יומן אירועים. אפשר לדרוך ולנטרל גם מהקודן שליד הדלת. דרישות החובה של הפרויקט מומשו. שלושה דברים שהוצעו לא מומשו כפי שהוצעו: חיוג אוטומטי לגורם חירום, אזעקה אוטומטית אחרי כמה קודים שגויים בקודן, והפעלת אזעקה בזיהוי פנים לא מאושרות (במקומה, פנים מאושרות מנטרלות את המערכת).</w:t>
-      </w:r>
-    </w:p>
-    <w:p>
-      <w:pPr>
-        <w:pStyle w:val="BodyText"/>
-      </w:pPr>
-      <w:r>
-        <w:rPr>
-          <w:rtl/>
-        </w:rPr>
-        <w:t xml:space="preserve">המערכת נבדקה על החומרה בתרחישי דריכה, כניסה, חדירה ונטרול, ונבחנו הצלילים, המסך באפליקציה ויומן האירועים. המסקנה העיקרית היא שהפרדה בין בקרים פשוטים, שרק מדווחים, לבין בקנד שמחליט מאפשרת לשנות את התנהגות המערכת בלי לצרוב את הבקרים מחדש. רוב הבעיות התגלו רק על החומרה, ולא בבדיקות האוטומטיות.</w:t>
+        <w:t xml:space="preserve">בפרויקט נבנתה מערכת אזעקה לבית. שלושה בקרי ESP32 (בקר חיישנים עם חיישן מרחק וחיישן רעידות, בקר דלת עם חיישן דלת, קודן וזמזמים, ובקר מצלמה) מחוברים ב-WiFi לשרת (בקנד) שכתוב ב-Python ורץ על מחשב. הבקנד מחליט, על סמך דיווחי הבקרים, מתי יש אזעקה, מזהה פנים של דיירים ושולח אימייל עם תמונה. אפליקציה בטלפון מאפשרת לדרוך, לנטרל, לראות את המצלמה ולעבור על יומן אירועים, ואפשר לדרוך ולנטרל גם מהקודן שליד הדלת.</w:t>
+      </w:r>
+    </w:p>
+    <w:p>
+      <w:pPr>
+        <w:pStyle w:val="BodyText"/>
+      </w:pPr>
+      <w:r>
+        <w:rPr>
+          <w:rtl/>
+        </w:rPr>
+        <w:t xml:space="preserve">המערכת נבדקה על החומרה בתרחישי דריכה, כניסה, חדירה ונטרול. דרישות החובה מומשו. שני דברים מההצעה לא מומשו כפי שהוצעו: אזעקה אחרי כמה קודים שגויים בקודן הפיזי, והפעלת אזעקה בזיהוי פנים לא מאושרות. המסקנה העיקרית היא שהפרדה בין בקרים פשוטים, שרק מדווחים, לבקנד שמחליט מאפשרת לשנות התנהגות בלי לטעון מחדש את התוכנה לבקרים.</w:t>
       </w:r>
     </w:p>
     <w:bookmarkEnd w:id="20"/>
@@ -733,7 +733,7 @@
         <w:rPr>
           <w:rtl/>
         </w:rPr>
-        <w:t xml:space="preserve">הפרויקט נבחר כדי לשלב חומרה ותוכנה: כמה חיישנים שונים, כדי להתנסות בכל אחד מהם, ותוכנה שמחברת אותם למערכת אזעקה אחת.</w:t>
+        <w:t xml:space="preserve">הפרויקט נבחר כדי לשלב חומרה ותוכנה: כמה חיישנים שונים, כדי להתנסות בכל אחד מהם, ותוכנה שמחברת אותם למערכת אזעקה אחת. המערכת היברידית, כלומר חלק מהעבודה נעשה בבקרים הקטנים וחלק במחשב, ומרובת שכבות: כמה סוגי חיישנים, קודן וזיהוי פנים.</w:t>
       </w:r>
     </w:p>
     <w:p>
@@ -832,7 +832,7 @@
         <w:rPr>
           <w:rtl/>
         </w:rPr>
-        <w:t xml:space="preserve">המערכת יכולה להיות דרוכה או מנוטרלת. כשהיא דרוכה, אזעקה מופעלת בשלושה מקרים: הדלת נפתחת ולא מנטרלים בזמן, מישהו עובר מול חיישן המרחק, או חיישן הרעידות מזהה מכה. באזעקה הזמזמים משמיעים סירנה, האפליקציה מציגה אזעקה ונשלח אימייל עם תמונה מהמצלמה. דורכים ומנטרלים מהקודן שליד הדלת או מהאפליקציה.</w:t>
+        <w:t xml:space="preserve">המערכת יכולה להיות דרוכה או מנוטרלת. כשהיא דרוכה, אזעקה מופעלת בארבעה מקרים: הדלת נפתחת ולא מנטרלים בזמן, מישהו עובר מול חיישן המרחק, חיישן הרעידות מזהה מכה, או שמוקלדות שלוש סיסמאות שגויות באפליקציה. באזעקה הזמזמים משמיעים סירנה, האפליקציה מציגה אזעקה ונשלח אימייל עם תמונה מהמצלמה. דורכים ומנטרלים מהקודן שליד הדלת או מהאפליקציה.</w:t>
       </w:r>
     </w:p>
     <w:bookmarkEnd w:id="22"/>
@@ -989,7 +989,7 @@
         <w:rPr>
           <w:rtl/>
         </w:rPr>
-        <w:t xml:space="preserve">אזעקה אוטומטית אחרי 3 קודים שגויים בקודן לא מומשה (טבלה 6).</w:t>
+        <w:t xml:space="preserve">אזעקה אוטומטית אחרי 3 קודים שגויים לא מומשה בקודן הפיזי, והיא קיימת רק בהתחברות לאפליקציה (טבלה 6).</w:t>
       </w:r>
     </w:p>
     <w:bookmarkEnd w:id="23"/>
@@ -1334,7 +1334,7 @@
         <w:rPr>
           <w:rtl/>
         </w:rPr>
-        <w:t xml:space="preserve">שורה אחת בכל פעם מורדת ל-LOW, והשאר נשארות ב-HIGH.</w:t>
+        <w:t xml:space="preserve">שורה אחת בכל פעם מורדת ל-LOW (מתח נמוך), והשאר נשארות ב-HIGH (מתח גבוה).</w:t>
       </w:r>
     </w:p>
     <w:p>
@@ -1545,7 +1545,7 @@
         <w:rPr>
           <w:rtl/>
         </w:rPr>
-        <w:t xml:space="preserve">המערכת בנויה משלושה בקרי ESP32, בקנד ואפליקציה (איור 1). הבקרים מחברים את החיישנים ושולחים הודעות לבקנד ב-WiFi. הבקנד שומר את מצב המערכת (דרוכה, מנוטרלת או אזעקה) ומחליט מתי להפעיל אזעקה. בקרי החיישנים רק מדווחים, והבקנד הוא שמחליט אם זו אזעקה. כך אפשר לשנות התנהגות (למשל מצב Home) בבקנד בלי לצרוב את הבקרים מחדש. בקר הדלת מקבל גם פקודות מהבקנד, כי בו נמצאים הקודן והזמזמים. הרכיבים של כל בקר מפורטים בטבלה 1.</w:t>
+        <w:t xml:space="preserve">המערכת בנויה משלושה בקרי ESP32, בקנד ואפליקציה (איור 1). לבקרים מחוברים החיישנים, והם שולחים הודעות לבקנד ב-WiFi. הבקנד שומר את מצב המערכת (סעיף 4.3) ומחליט, על סמך דיווחי בקרי החיישנים, אם זו אזעקה. בקרי החיישנים רק מדווחים, ולכן אפשר לשנות התנהגות (למשל מצב Home) בבקנד, בלי לטעון מחדש את התוכנה לבקרים (צריבה). בקר הדלת מקבל גם פקודות מהבקנד, כי בו נמצאים הקודן והזמזמים, והוא מחזיק גם את מכונת הדריכה, את ספירת הכניסה ואת הסירנה. לכן הסירנה מופעלת גם בלי הבקנד כשהדלת נפתחת ולא מנטרלים בזמן. הרכיבים של כל בקר מפורטים בטבלה 1.</w:t>
       </w:r>
     </w:p>
     <w:p>
@@ -1558,7 +1558,7 @@
       <w:r>
         <w:drawing>
           <wp:inline>
-            <wp:extent cx="5715000" cy="1653146"/>
+            <wp:extent cx="5715000" cy="1641722"/>
             <wp:docPr id="1" name="Picture 1"/>
             <wp:cNvGraphicFramePr>
               <a:graphicFrameLocks noChangeAspect="1"/>
@@ -1579,7 +1579,7 @@
                   <pic:spPr>
                     <a:xfrm>
                       <a:off x="0" y="0"/>
-                      <a:ext cx="5715000" cy="1653146"/>
+                      <a:ext cx="5715000" cy="1641722"/>
                     </a:xfrm>
                     <a:prstGeom prst="rect"/>
                   </pic:spPr>
@@ -1998,7 +1998,7 @@
         <w:rPr>
           <w:rtl/>
         </w:rPr>
-        <w:t xml:space="preserve">בהפעלה הבקר מודד את המרחק לקיר או למסדרון שמולו, ממוצע של 10 קריאות, וזה המרחק הרגיל. המרחק נשמר בזיכרון הקבוע של הבקר, כדי שיהיה לבקר ממה להמשיך אם המדידה בהפעלה הבאה תיכשל. אחר כך הבקר מודד בתדר של כ-15‎ Hz. כשהמרחק קצר מהרגיל ביותר מ-10‎ cm בחמש קריאות ברצף, כלומר כ-0.33‎ s, נשלחת לבקנד הודעת חדירה. קריאה בודדת נחשבת רעש ולא מפעילה אזעקה (קוד 1). אחרי דיווח הבקר ממשיך למדוד אבל מחכה 5‎ s לפני הדיווח הבא.</w:t>
+        <w:t xml:space="preserve">בהפעלה הבקר מודד את המרחק לקיר או למסדרון שמולו, ממוצע של 10 קריאות, וזה המרחק הרגיל. המרחק נשמר בזיכרון הקבוע של הבקר, כדי שיהיה לבקר מרחק רגיל להסתמך עליו אם המדידה בהפעלה הבאה תיכשל. אחר כך הבקר מודד בתדר של כ-15‎ Hz. כשהמרחק קצר מהרגיל ביותר מ-10‎ cm בחמש קריאות ברצף, כלומר כ-0.33‎ s, נשלחת לבקנד הודעת חדירה. קריאה בודדת נחשבת רעש ולא מפעילה אזעקה (איור 2 וקטע קוד 1). אחרי דיווח הבקר ממשיך למדוד אבל מחכה 5‎ s לפני הדיווח הבא.</w:t>
       </w:r>
     </w:p>
     <w:p>
@@ -2020,7 +2020,7 @@
         <w:rPr>
           <w:rtl/>
         </w:rPr>
-        <w:t xml:space="preserve">בקר החיישנים ובקר הדלת שולחים לבקנד "דיווח חיים" כל 10‎ s, וכך הבקנד יודע שהם מחוברים. בקר המצלמה לא שולח דיווח כזה: התמונות שהוא שולח משמשות כדיווח חיים. לכל בקשה לבקנד מוגדרת מגבלת זמן של 1‎ s, כדי שבקשה שנתקעה לא תעצור את המדידה.</w:t>
+        <w:t xml:space="preserve">בקר החיישנים ובקר הדלת שולחים לבקנד "דיווח חיים" (heartbeat) כל 10‎ s, וכך הבקנד יודע שהם מחוברים. בקר המצלמה לא שולח דיווח כזה: התמונות שהוא שולח משמשות כדיווח חיים. לכל בקשה לבקנד מוגדרת מגבלת זמן של 1‎ s, כדי שבקשה שנתקעה לא תעצור את המדידה.</w:t>
       </w:r>
     </w:p>
     <w:p>
@@ -2033,8 +2033,74 @@
       <w:r>
         <w:drawing>
           <wp:inline>
+            <wp:extent cx="5715000" cy="1701368"/>
+            <wp:docPr id="2" name="Picture 2"/>
+            <wp:cNvGraphicFramePr>
+              <a:graphicFrameLocks noChangeAspect="1"/>
+            </wp:cNvGraphicFramePr>
+            <a:graphic>
+              <a:graphicData uri="http://schemas.openxmlformats.org/drawingml/2006/picture">
+                <pic:pic>
+                  <pic:nvPicPr>
+                    <pic:cNvPr id="0" name="fig2.png"/>
+                    <pic:cNvPicPr/>
+                  </pic:nvPicPr>
+                  <pic:blipFill>
+                    <a:blip r:embed="rId10"/>
+                    <a:stretch>
+                      <a:fillRect/>
+                    </a:stretch>
+                  </pic:blipFill>
+                  <pic:spPr>
+                    <a:xfrm>
+                      <a:off x="0" y="0"/>
+                      <a:ext cx="5715000" cy="1701368"/>
+                    </a:xfrm>
+                    <a:prstGeom prst="rect"/>
+                  </pic:spPr>
+                </pic:pic>
+              </a:graphicData>
+            </a:graphic>
+          </wp:inline>
+        </w:drawing>
+      </w:r>
+    </w:p>
+    <w:p>
+      <w:pPr>
+        <w:pStyle w:val="ImageCaption"/>
+        <w:keepNext w:val="0"/>
+        <w:spacing w:before="40" w:after="240" w:line="240" w:lineRule="auto"/>
+        <w:jc w:val="center"/>
+      </w:pPr>
+      <w:r>
+        <w:rPr>
+          <w:b/>
+          <w:bCs/>
+          <w:rtl/>
+        </w:rPr>
+        <w:t>איור 2:</w:t>
+      </w:r>
+      <w:r>
+        <w:rPr>
+          <w:b w:val="0"/>
+          <w:bCs/>
+          <w:rtl/>
+        </w:rPr>
+        <w:t xml:space="preserve"> זיהוי חדירה בחיישן המרחק, אחרי שהמרחק הרגיל נמדד</w:t>
+      </w:r>
+    </w:p>
+    <w:p>
+      <w:pPr>
+        <w:pStyle w:val="BodyText"/>
+        <w:keepNext/>
+        <w:spacing w:before="120" w:after="40" w:line="240" w:lineRule="auto"/>
+        <w:jc w:val="center"/>
+      </w:pPr>
+      <w:r>
+        <w:drawing>
+          <wp:inline>
             <wp:extent cx="5714999" cy="3334796"/>
-            <wp:docPr id="2" name="Picture 2"/>
+            <wp:docPr id="3" name="Picture 3"/>
             <wp:cNvGraphicFramePr>
               <a:graphicFrameLocks noChangeAspect="1"/>
             </wp:cNvGraphicFramePr>
@@ -2046,7 +2112,7 @@
                     <pic:cNvPicPr/>
                   </pic:nvPicPr>
                   <pic:blipFill>
-                    <a:blip r:embed="rId10"/>
+                    <a:blip r:embed="rId11"/>
                     <a:stretch>
                       <a:fillRect/>
                     </a:stretch>
@@ -2078,7 +2144,7 @@
           <w:bCs/>
           <w:rtl/>
         </w:rPr>
-        <w:t>קוד 1:</w:t>
+        <w:t>קטע קוד 1:</w:t>
       </w:r>
       <w:r>
         <w:rPr>
@@ -2108,7 +2174,7 @@
         <w:rPr>
           <w:rtl/>
         </w:rPr>
-        <w:t xml:space="preserve">בקר הדלת קורא את חיישן הדלת והקודן, מפעיל את הזמזמים ומחליט אם המערכת דרוכה. הקודן נסרק כמו שמתואר בסעיף 3.2 (קוד 2). בנוסף, כל לחיצה נספרת פעם אחת בלבד: צריך להרים את האצבע לפני שאותו לחצן נספר שוב, ובין שתי לחיצות עוברים לפחות 200‎ ms. בלי זה לחיצה אחת נקראת עשרות פעמים, כי הסריקה רצה הרבה יותר מהר מהאצבע. הקוד מורכב מ-4 עד 8 ספרות. מקלידים אותו ומאשרים עם</w:t>
+        <w:t xml:space="preserve">בקר הדלת קורא את חיישן הדלת והקודן, מפעיל את הזמזמים ומחליט אם המערכת דרוכה. הקודן נסרק כמו שמתואר בסעיף 3.2 (קטע קוד 2). בנוסף, כל לחיצה נספרת פעם אחת בלבד: צריך להרים את האצבע לפני שאותו לחצן נספר שוב, ובין שתי לחיצות עוברים לפחות 200‎ ms. בלי זה לחיצה אחת נקראת עשרות פעמים, כי הסריקה רצה הרבה יותר מהר מהאצבע. הקוד מורכב מ-4 עד 8 ספרות. מקלידים אותו ומאשרים עם</w:t>
       </w:r>
       <w:r>
         <w:t xml:space="preserve"> </w:t>
@@ -2137,7 +2203,7 @@
         <w:drawing>
           <wp:inline>
             <wp:extent cx="5715000" cy="2645833"/>
-            <wp:docPr id="3" name="Picture 3"/>
+            <wp:docPr id="4" name="Picture 4"/>
             <wp:cNvGraphicFramePr>
               <a:graphicFrameLocks noChangeAspect="1"/>
             </wp:cNvGraphicFramePr>
@@ -2149,7 +2215,7 @@
                     <pic:cNvPicPr/>
                   </pic:nvPicPr>
                   <pic:blipFill>
-                    <a:blip r:embed="rId11"/>
+                    <a:blip r:embed="rId12"/>
                     <a:stretch>
                       <a:fillRect/>
                     </a:stretch>
@@ -2181,7 +2247,7 @@
           <w:bCs/>
           <w:rtl/>
         </w:rPr>
-        <w:t>קוד 2:</w:t>
+        <w:t>קטע קוד 2:</w:t>
       </w:r>
       <w:r>
         <w:rPr>
@@ -2713,7 +2779,7 @@
         <w:rPr>
           <w:rtl/>
         </w:rPr>
-        <w:t xml:space="preserve">איור 2 מראה את המערכת המורכבת.</w:t>
+        <w:t xml:space="preserve">איור 3 מראה את המערכת המורכבת.</w:t>
       </w:r>
     </w:p>
     <w:p>
@@ -2751,7 +2817,7 @@
           <w:bCs/>
           <w:rtl/>
         </w:rPr>
-        <w:t xml:space="preserve">איור 2: המערכת בפועל</w:t>
+        <w:t xml:space="preserve">איור 3: המערכת בפועל</w:t>
       </w:r>
     </w:p>
     <w:bookmarkEnd w:id="33"/>
@@ -2775,7 +2841,7 @@
         <w:rPr>
           <w:rtl/>
         </w:rPr>
-        <w:t xml:space="preserve">המערכת עוברת בין ארבעה מצבים (איור 3).</w:t>
+        <w:t xml:space="preserve">המערכת עוברת בין חמישה מצבים (איור 4): מנוטרלת, בדריכה (מהפעלת הדריכה ועד שהמערכת דרוכה), דרוכה, ספירת כניסה ואזעקה.</w:t>
       </w:r>
     </w:p>
     <w:p>
@@ -2788,8 +2854,8 @@
       <w:r>
         <w:drawing>
           <wp:inline>
-            <wp:extent cx="5715000" cy="1162936"/>
-            <wp:docPr id="4" name="Picture 4"/>
+            <wp:extent cx="5715000" cy="1209666"/>
+            <wp:docPr id="5" name="Picture 5"/>
             <wp:cNvGraphicFramePr>
               <a:graphicFrameLocks noChangeAspect="1"/>
             </wp:cNvGraphicFramePr>
@@ -2797,11 +2863,11 @@
               <a:graphicData uri="http://schemas.openxmlformats.org/drawingml/2006/picture">
                 <pic:pic>
                   <pic:nvPicPr>
-                    <pic:cNvPr id="0" name="fig3.png"/>
+                    <pic:cNvPr id="0" name="fig4.png"/>
                     <pic:cNvPicPr/>
                   </pic:nvPicPr>
                   <pic:blipFill>
-                    <a:blip r:embed="rId12"/>
+                    <a:blip r:embed="rId13"/>
                     <a:stretch>
                       <a:fillRect/>
                     </a:stretch>
@@ -2809,7 +2875,7 @@
                   <pic:spPr>
                     <a:xfrm>
                       <a:off x="0" y="0"/>
-                      <a:ext cx="5715000" cy="1162936"/>
+                      <a:ext cx="5715000" cy="1209666"/>
                     </a:xfrm>
                     <a:prstGeom prst="rect"/>
                   </pic:spPr>
@@ -2833,7 +2899,7 @@
           <w:bCs/>
           <w:rtl/>
         </w:rPr>
-        <w:t>איור 3:</w:t>
+        <w:t>איור 4:</w:t>
       </w:r>
       <w:r>
         <w:rPr>
@@ -2995,7 +3061,7 @@
         <w:rPr>
           <w:rtl/>
         </w:rPr>
-        <w:t xml:space="preserve">(קוד 3). אם לא מנטרלים בזמן, מופעלת אזעקה.</w:t>
+        <w:t xml:space="preserve">(קטע קוד 3). אם לא מנטרלים בזמן, מופעלת אזעקה.</w:t>
       </w:r>
     </w:p>
     <w:p>
@@ -3009,7 +3075,7 @@
         <w:drawing>
           <wp:inline>
             <wp:extent cx="5364679" cy="4206240"/>
-            <wp:docPr id="5" name="Picture 5"/>
+            <wp:docPr id="6" name="Picture 6"/>
             <wp:cNvGraphicFramePr>
               <a:graphicFrameLocks noChangeAspect="1"/>
             </wp:cNvGraphicFramePr>
@@ -3021,7 +3087,7 @@
                     <pic:cNvPicPr/>
                   </pic:nvPicPr>
                   <pic:blipFill>
-                    <a:blip r:embed="rId13"/>
+                    <a:blip r:embed="rId14"/>
                     <a:stretch>
                       <a:fillRect/>
                     </a:stretch>
@@ -3053,7 +3119,7 @@
           <w:bCs/>
           <w:rtl/>
         </w:rPr>
-        <w:t>קוד 3:</w:t>
+        <w:t>קטע קוד 3:</w:t>
       </w:r>
       <w:r>
         <w:rPr>
@@ -3083,7 +3149,7 @@
         <w:rPr>
           <w:rtl/>
         </w:rPr>
-        <w:t xml:space="preserve">מנטרלים עם קוד נכון בקודן, מהאפליקציה או בזיהוי פנים. בקודן הקוד פועל רק אחרי שהדלת נפתחה (בספירת הכניסה) או כשהאזעקה כבר פועלת. הקשת קוד כשהמערכת דרוכה והדלת סגורה לא עושה דבר. זיהוי פנים כבוי כברירת מחדל, וצריך להפעיל אותו באפליקציה. הוא נועד לנוחות ולא לאבטחה.</w:t>
+        <w:t xml:space="preserve">מנטרלים עם קוד נכון בקודן, מהאפליקציה או בזיהוי פנים. בקודן הקוד פועל רק אחרי שהדלת נפתחה (בספירת הכניסה) או כשהאזעקה כבר פועלת. הקשת קוד כשהמערכת דרוכה והדלת סגורה לא עושה דבר. נטרול בזיהוי פנים כבוי כברירת מחדל, וצריך להפעיל אותו באפליקציה. הוא נועד לנוחות ולא לאבטחה.</w:t>
       </w:r>
     </w:p>
     <w:p>
@@ -3105,7 +3171,7 @@
         <w:rPr>
           <w:rtl/>
         </w:rPr>
-        <w:t xml:space="preserve">את הקוד של הקודן משנים מהאפליקציה, במסך ההגדרות. הבקנד שולח את הקוד החדש לבקר הדלת, והבקר שומר אותו בזיכרון הקבוע שלו ומשתמש בו מאותו רגע. הקוד של הקודן הוא גם הסיסמה להתחברות לאפליקציה, ולכן שינוי אחד מחליף את שניהם. אם בקר הדלת לא מחובר בזמן השינוי, הקוד החדש נשמר בבקנד, ואפשר לשלוח אותו שוב לבקר כשהוא חוזר להיות מחובר.</w:t>
+        <w:t xml:space="preserve">את הקוד של הקודן משנים מהאפליקציה, במסך ההגדרות. הבקנד שולח את הקוד החדש לבקר הדלת, והבקר שומר אותו בזיכרון הקבוע שלו ומשתמש בו מאותו רגע. הקוד של הקודן הוא גם הסיסמה להתחברות לאפליקציה, ולכן שינוי אחד מחליף את שניהם. אם בקר הדלת לא מחובר בזמן השינוי, הקוד החדש נשמר בבקנד, והבקנד שולח אותו אוטומטית לבקר כשהוא חוזר להיות מחובר.</w:t>
       </w:r>
     </w:p>
     <w:p>
@@ -3127,7 +3193,7 @@
         <w:rPr>
           <w:rtl/>
         </w:rPr>
-        <w:t xml:space="preserve">הזמזמים משמיעים סירנה, האפליקציה מציגה אזעקה ונשלח אימייל עם תמונה מהמצלמה (איור 4). אם האזעקה לא נוקתה אחרי זמן שמוגדר באפליקציה, נשלח אימייל נוסף לאיש קשר לחירום.</w:t>
+        <w:t xml:space="preserve">הזמזמים משמיעים סירנה, האפליקציה מציגה אזעקה ונשלח אימייל עם תמונה מהמצלמה (איור 5). אם האזעקה לא נוקתה אחרי זמן שמוגדר באפליקציה, נשלח אימייל נוסף לאיש קשר לחירום.</w:t>
       </w:r>
     </w:p>
     <w:p>
@@ -3165,7 +3231,7 @@
           <w:bCs/>
           <w:rtl/>
         </w:rPr>
-        <w:t xml:space="preserve">איור 4: אימייל התראה עם תמונה</w:t>
+        <w:t xml:space="preserve">איור 5: אימייל התראה עם תמונה</w:t>
       </w:r>
     </w:p>
     <w:bookmarkEnd w:id="34"/>
@@ -3280,7 +3346,7 @@
         <w:rPr>
           <w:rtl/>
         </w:rPr>
-        <w:t xml:space="preserve">העדכון לאפליקציה נשלח קודם, ושליחת האימייל לא עוצרת אותו, כדי שהאזעקה תופיע מיד גם אם האימייל איטי. אם בקר הדלת מפסיק לענות באמצע ספירת הכניסה (למשל נותק מהחשמל), הבקנד מפעיל אזעקה בעצמו, 5‎ s אחרי שהספירה אמורה להסתיים.</w:t>
+        <w:t xml:space="preserve">העדכון לאפליקציה נשלח קודם, ושליחת האימייל לא עוצרת אותו, כדי שהאזעקה תופיע מיד גם אם האימייל איטי. אם בקר הדלת מפסיק לענות באמצע ספירת הכניסה (למשל נותק מהחשמל), הבקנד מפעיל אזעקה בעצמו, 5‎ s אחרי שהספירה אמורה להסתיים. האפליקציה מציגה אזעקה ונשלח אימייל, אבל הסירנה לא תושמע, כי היא יושבת על אותו בקר.</w:t>
       </w:r>
     </w:p>
     <w:bookmarkEnd w:id="35"/>
@@ -3446,7 +3512,7 @@
         <w:rPr>
           <w:rtl/>
         </w:rPr>
-        <w:t xml:space="preserve">האפליקציה נכתבה ב-Flutter ‎[12]‎ ורצה על טלפון Android. העיצוב כהה, בסגנון לוח בקרה, ומצב המערכת מובחן בצבע: אדום כשהמערכת דרוכה או באזעקה, וירוק כשהיא מנוטרלת. ספירת הכניסה מוצגת בצבע אזהרה נפרד. האפליקציה כוללת שישה מסכים (איור 5).</w:t>
+        <w:t xml:space="preserve">האפליקציה נכתבה ב-Flutter ‎[12]‎ ורצה על טלפון Android. העיצוב כהה, בסגנון לוח בקרה, ומצב המערכת מובחן בצבע: אדום כשהמערכת דרוכה או באזעקה, וירוק כשהיא מנוטרלת. ספירת הכניסה מוצגת בצבע אזהרה נפרד. האפליקציה כוללת שישה מסכים (איור 6). הממשק באנגלית, ולכן שמות המסכים והכפתורים מופיעים בדוח באנגלית.</w:t>
       </w:r>
     </w:p>
     <w:p>
@@ -3473,7 +3539,7 @@
         <w:rPr>
           <w:rtl/>
         </w:rPr>
-        <w:t xml:space="preserve">מוקלדת סיסמה. אחרי 3 ניסיונות שגויים הכפתור ננעל ל-30‎ s, והמסך מראה כמה זמן נשאר.</w:t>
+        <w:t xml:space="preserve">מוקלדת סיסמה. אחרי 3 ניסיונות שגויים הכפתור ננעל ל-30‎ s והמסך מראה כמה זמן נשאר. אם המערכת דרוכה, מופעלת גם אזעקה.</w:t>
       </w:r>
     </w:p>
     <w:p>
@@ -3527,7 +3593,7 @@
         <w:rPr>
           <w:rtl/>
         </w:rPr>
-        <w:t xml:space="preserve">כל האירועים בסדר כרונולוגי, עם סינון לפי חומרה: קריטי, אזהרה ומידע.</w:t>
+        <w:t xml:space="preserve">כל האירועים, מהחדש לישן, עם סינון לפי חומרה: קריטי, אזהרה ומידע.</w:t>
       </w:r>
     </w:p>
     <w:p>
@@ -3668,7 +3734,7 @@
           <w:bCs/>
           <w:rtl/>
         </w:rPr>
-        <w:t xml:space="preserve">איור 5: האפליקציה</w:t>
+        <w:t xml:space="preserve">איור 6: האפליקציה</w:t>
       </w:r>
     </w:p>
     <w:bookmarkEnd w:id="37"/>
@@ -3738,7 +3804,7 @@
         <w:rPr>
           <w:rtl/>
         </w:rPr>
-        <w:t xml:space="preserve">כשמתחילה אזעקה הבקנד שולח אימייל לכל הנמענים שהוגדרו באפליקציה, עם תמונה אחרונה מהמצלמה (איור 4). האימייל נשלח מחשבון Gmail דרך SMTP. הפרטים של החשבון נשמרים בקובץ מקומי בבקנד ולא באפליקציה. שליחת האימייל רצה ברקע, כך שאם השרת של המייל איטי, האזעקה עצמה לא מתעכבת.</w:t>
+        <w:t xml:space="preserve">כשמתחילה אזעקה הבקנד שולח אימייל לכל הנמענים שהוגדרו באפליקציה, עם תמונה אחרונה מהמצלמה (איור 5). האימייל נשלח מחשבון Gmail דרך SMTP. הפרטים של החשבון נשמרים בקובץ מקומי בבקנד ולא באפליקציה. שליחת האימייל רצה ברקע, כך שאם השרת של המייל איטי, האזעקה עצמה לא מתעכבת.</w:t>
       </w:r>
     </w:p>
     <w:p>
@@ -3760,7 +3826,7 @@
         <w:rPr>
           <w:rtl/>
         </w:rPr>
-        <w:t xml:space="preserve">אם האזעקה לא נוקתה תוך זמן שמוגדר באפליקציה (60‎ s כברירת מחדל), נשלח אימייל נוסף לאנשי הקשר לחירום. נטרול האזעקה מבטל את ההסלמה. הרשימה של אנשי הקשר נפרדת מרשימת הנמענים הרגילה. בהצעת הפרויקט תוכנן חיוג אוטומטי לגורם חירום, אבל חיוג דורש ספק טלפוניה, ולכן במקומו נשלחת התראה דחופה שאומרת למי להתקשר.</w:t>
+        <w:t xml:space="preserve">אם האזעקה לא נוקתה תוך זמן שמוגדר באפליקציה (60‎ s כברירת מחדל), נשלח אימייל נוסף, לנמענים הרגילים וגם לאנשי הקשר לחירום. נטרול האזעקה מבטל את ההסלמה. הרשימה של אנשי הקשר נפרדת מרשימת הנמענים הרגילה. חיוג אוטומטי לגורם חירום דורש ספק טלפוניה, ולכן במקומו נשלחת התראה דחופה שאומרת למי להתקשר.</w:t>
       </w:r>
     </w:p>
     <w:p>
@@ -3804,7 +3870,7 @@
         <w:rPr>
           <w:rtl/>
         </w:rPr>
-        <w:t xml:space="preserve">מצב לילה דורך את המערכת אוטומטית בשעה קבועה ומנטרל בשעה קבועה אחרת. ברירת המחדל היא דריכה ב-23:00 ונטרול ב-07:00, והשעות נקבעות באפליקציה. הדריכה היא במצב Home. כמה כללים נקבעו כדי שהתכונה לא תזיק:</w:t>
+        <w:t xml:space="preserve">מצב לילה דורך את המערכת אוטומטית בשעה קבועה ומנטרל בשעה קבועה אחרת. המצב כבוי כברירת מחדל, ומפעילים אותו באפליקציה. ברירת המחדל לשעות היא דריכה ב-23:00 ונטרול ב-07:00, וניתן לשנות אותן. הדריכה היא במצב Home. כמה כללים נקבעו כדי שהתכונה לא תזיק:</w:t>
       </w:r>
     </w:p>
     <w:p>
@@ -3860,7 +3926,7 @@
         <w:rPr>
           <w:rtl/>
         </w:rPr>
-        <w:t xml:space="preserve">הכניסה לאפליקציה דורשת סיסמה, והיא אותו קוד כמו בקודן. אחרי 3 ניסיונות שגויים ההתחברות ננעלת ל-30‎ s. הבקרים מזדהים מול הבקנד במפתח משותף. התקשורת אינה מוצפנת: הכול עובר ב-HTTP רגיל ברשת ה-WiFi הביתית.</w:t>
+        <w:t xml:space="preserve">הכניסה לאפליקציה דורשת סיסמה, והיא אותו קוד כמו בקודן. אחרי 3 ניסיונות שגויים ההתחברות ננעלת ל-30‎ s, ואם המערכת דרוכה מופעלת גם אזעקה, כי ניחוש סיסמה עלול להעיד על ניסיון פריצה. הבקרים מזדהים מול הבקנד במפתח משותף. התקשורת אינה מוצפנת: הכול עובר ב-HTTP רגיל ברשת ה-WiFi הביתית.</w:t>
       </w:r>
     </w:p>
     <w:p>
@@ -3930,9 +3996,9 @@
         </w:tblCellMar>
       </w:tblPr>
       <w:tblGrid>
-        <w:gridCol w:w="4193"/>
-        <w:gridCol w:w="2403"/>
-        <w:gridCol w:w="2404"/>
+        <w:gridCol w:w="4405"/>
+        <w:gridCol w:w="2297"/>
+        <w:gridCol w:w="2298"/>
       </w:tblGrid>
       <w:tr>
         <w:trPr>
@@ -3942,7 +4008,7 @@
         </w:trPr>
         <w:tc>
           <w:tcPr>
-            <w:tcW w:w="4193" w:type="dxa"/>
+            <w:tcW w:w="4405" w:type="dxa"/>
             <w:tcBorders>
               <w:top w:val="single" w:sz="4" w:space="0" w:color="999999"/>
               <w:left w:val="single" w:sz="4" w:space="0" w:color="999999"/>
@@ -3963,13 +4029,13 @@
                 <w:bCs/>
                 <w:rtl/>
               </w:rPr>
-              <w:t xml:space="preserve">ערך</w:t>
-            </w:r>
-          </w:p>
-        </w:tc>
-        <w:tc>
-          <w:tcPr>
-            <w:tcW w:w="2403" w:type="dxa"/>
+              <w:t xml:space="preserve">פרמטר</w:t>
+            </w:r>
+          </w:p>
+        </w:tc>
+        <w:tc>
+          <w:tcPr>
+            <w:tcW w:w="2297" w:type="dxa"/>
             <w:tcBorders>
               <w:top w:val="single" w:sz="4" w:space="0" w:color="999999"/>
               <w:left w:val="single" w:sz="4" w:space="0" w:color="999999"/>
@@ -3990,13 +4056,13 @@
                 <w:bCs/>
                 <w:rtl/>
               </w:rPr>
-              <w:t xml:space="preserve">גודל</w:t>
-            </w:r>
-          </w:p>
-        </w:tc>
-        <w:tc>
-          <w:tcPr>
-            <w:tcW w:w="2404" w:type="dxa"/>
+              <w:t xml:space="preserve">ערך</w:t>
+            </w:r>
+          </w:p>
+        </w:tc>
+        <w:tc>
+          <w:tcPr>
+            <w:tcW w:w="2298" w:type="dxa"/>
             <w:tcBorders>
               <w:top w:val="single" w:sz="4" w:space="0" w:color="999999"/>
               <w:left w:val="single" w:sz="4" w:space="0" w:color="999999"/>
@@ -4028,7 +4094,7 @@
         </w:trPr>
         <w:tc>
           <w:tcPr>
-            <w:tcW w:w="4193" w:type="dxa"/>
+            <w:tcW w:w="4405" w:type="dxa"/>
             <w:tcBorders>
               <w:top w:val="single" w:sz="4" w:space="0" w:color="999999"/>
               <w:left w:val="single" w:sz="4" w:space="0" w:color="999999"/>
@@ -4051,7 +4117,7 @@
         </w:tc>
         <w:tc>
           <w:tcPr>
-            <w:tcW w:w="2403" w:type="dxa"/>
+            <w:tcW w:w="2297" w:type="dxa"/>
             <w:tcBorders>
               <w:top w:val="single" w:sz="4" w:space="0" w:color="999999"/>
               <w:left w:val="single" w:sz="4" w:space="0" w:color="999999"/>
@@ -4071,7 +4137,7 @@
         </w:tc>
         <w:tc>
           <w:tcPr>
-            <w:tcW w:w="2404" w:type="dxa"/>
+            <w:tcW w:w="2298" w:type="dxa"/>
             <w:tcBorders>
               <w:top w:val="single" w:sz="4" w:space="0" w:color="999999"/>
               <w:left w:val="single" w:sz="4" w:space="0" w:color="999999"/>
@@ -4099,7 +4165,7 @@
         </w:trPr>
         <w:tc>
           <w:tcPr>
-            <w:tcW w:w="4193" w:type="dxa"/>
+            <w:tcW w:w="4405" w:type="dxa"/>
             <w:tcBorders>
               <w:top w:val="single" w:sz="4" w:space="0" w:color="999999"/>
               <w:left w:val="single" w:sz="4" w:space="0" w:color="999999"/>
@@ -4122,7 +4188,7 @@
         </w:tc>
         <w:tc>
           <w:tcPr>
-            <w:tcW w:w="2403" w:type="dxa"/>
+            <w:tcW w:w="2297" w:type="dxa"/>
             <w:tcBorders>
               <w:top w:val="single" w:sz="4" w:space="0" w:color="999999"/>
               <w:left w:val="single" w:sz="4" w:space="0" w:color="999999"/>
@@ -4142,7 +4208,7 @@
         </w:tc>
         <w:tc>
           <w:tcPr>
-            <w:tcW w:w="2404" w:type="dxa"/>
+            <w:tcW w:w="2298" w:type="dxa"/>
             <w:tcBorders>
               <w:top w:val="single" w:sz="4" w:space="0" w:color="999999"/>
               <w:left w:val="single" w:sz="4" w:space="0" w:color="999999"/>
@@ -4170,7 +4236,7 @@
         </w:trPr>
         <w:tc>
           <w:tcPr>
-            <w:tcW w:w="4193" w:type="dxa"/>
+            <w:tcW w:w="4405" w:type="dxa"/>
             <w:tcBorders>
               <w:top w:val="single" w:sz="4" w:space="0" w:color="999999"/>
               <w:left w:val="single" w:sz="4" w:space="0" w:color="999999"/>
@@ -4193,7 +4259,7 @@
         </w:tc>
         <w:tc>
           <w:tcPr>
-            <w:tcW w:w="2403" w:type="dxa"/>
+            <w:tcW w:w="2297" w:type="dxa"/>
             <w:tcBorders>
               <w:top w:val="single" w:sz="4" w:space="0" w:color="999999"/>
               <w:left w:val="single" w:sz="4" w:space="0" w:color="999999"/>
@@ -4213,7 +4279,7 @@
         </w:tc>
         <w:tc>
           <w:tcPr>
-            <w:tcW w:w="2404" w:type="dxa"/>
+            <w:tcW w:w="2298" w:type="dxa"/>
             <w:tcBorders>
               <w:top w:val="single" w:sz="4" w:space="0" w:color="999999"/>
               <w:left w:val="single" w:sz="4" w:space="0" w:color="999999"/>
@@ -4241,7 +4307,7 @@
         </w:trPr>
         <w:tc>
           <w:tcPr>
-            <w:tcW w:w="4193" w:type="dxa"/>
+            <w:tcW w:w="4405" w:type="dxa"/>
             <w:tcBorders>
               <w:top w:val="single" w:sz="4" w:space="0" w:color="999999"/>
               <w:left w:val="single" w:sz="4" w:space="0" w:color="999999"/>
@@ -4264,7 +4330,7 @@
         </w:tc>
         <w:tc>
           <w:tcPr>
-            <w:tcW w:w="2403" w:type="dxa"/>
+            <w:tcW w:w="2297" w:type="dxa"/>
             <w:tcBorders>
               <w:top w:val="single" w:sz="4" w:space="0" w:color="999999"/>
               <w:left w:val="single" w:sz="4" w:space="0" w:color="999999"/>
@@ -4287,7 +4353,7 @@
         </w:tc>
         <w:tc>
           <w:tcPr>
-            <w:tcW w:w="2404" w:type="dxa"/>
+            <w:tcW w:w="2298" w:type="dxa"/>
             <w:tcBorders>
               <w:top w:val="single" w:sz="4" w:space="0" w:color="999999"/>
               <w:left w:val="single" w:sz="4" w:space="0" w:color="999999"/>
@@ -4315,7 +4381,7 @@
         </w:trPr>
         <w:tc>
           <w:tcPr>
-            <w:tcW w:w="4193" w:type="dxa"/>
+            <w:tcW w:w="4405" w:type="dxa"/>
             <w:tcBorders>
               <w:top w:val="single" w:sz="4" w:space="0" w:color="999999"/>
               <w:left w:val="single" w:sz="4" w:space="0" w:color="999999"/>
@@ -4338,7 +4404,7 @@
         </w:tc>
         <w:tc>
           <w:tcPr>
-            <w:tcW w:w="2403" w:type="dxa"/>
+            <w:tcW w:w="2297" w:type="dxa"/>
             <w:tcBorders>
               <w:top w:val="single" w:sz="4" w:space="0" w:color="999999"/>
               <w:left w:val="single" w:sz="4" w:space="0" w:color="999999"/>
@@ -4361,7 +4427,7 @@
         </w:tc>
         <w:tc>
           <w:tcPr>
-            <w:tcW w:w="2404" w:type="dxa"/>
+            <w:tcW w:w="2298" w:type="dxa"/>
             <w:tcBorders>
               <w:top w:val="single" w:sz="4" w:space="0" w:color="999999"/>
               <w:left w:val="single" w:sz="4" w:space="0" w:color="999999"/>
@@ -4389,7 +4455,7 @@
         </w:trPr>
         <w:tc>
           <w:tcPr>
-            <w:tcW w:w="4193" w:type="dxa"/>
+            <w:tcW w:w="4405" w:type="dxa"/>
             <w:tcBorders>
               <w:top w:val="single" w:sz="4" w:space="0" w:color="999999"/>
               <w:left w:val="single" w:sz="4" w:space="0" w:color="999999"/>
@@ -4412,7 +4478,7 @@
         </w:tc>
         <w:tc>
           <w:tcPr>
-            <w:tcW w:w="2403" w:type="dxa"/>
+            <w:tcW w:w="2297" w:type="dxa"/>
             <w:tcBorders>
               <w:top w:val="single" w:sz="4" w:space="0" w:color="999999"/>
               <w:left w:val="single" w:sz="4" w:space="0" w:color="999999"/>
@@ -4435,7 +4501,7 @@
         </w:tc>
         <w:tc>
           <w:tcPr>
-            <w:tcW w:w="2404" w:type="dxa"/>
+            <w:tcW w:w="2298" w:type="dxa"/>
             <w:tcBorders>
               <w:top w:val="single" w:sz="4" w:space="0" w:color="999999"/>
               <w:left w:val="single" w:sz="4" w:space="0" w:color="999999"/>
@@ -4463,7 +4529,7 @@
         </w:trPr>
         <w:tc>
           <w:tcPr>
-            <w:tcW w:w="4193" w:type="dxa"/>
+            <w:tcW w:w="4405" w:type="dxa"/>
             <w:tcBorders>
               <w:top w:val="single" w:sz="4" w:space="0" w:color="999999"/>
               <w:left w:val="single" w:sz="4" w:space="0" w:color="999999"/>
@@ -4486,7 +4552,7 @@
         </w:tc>
         <w:tc>
           <w:tcPr>
-            <w:tcW w:w="2403" w:type="dxa"/>
+            <w:tcW w:w="2297" w:type="dxa"/>
             <w:tcBorders>
               <w:top w:val="single" w:sz="4" w:space="0" w:color="999999"/>
               <w:left w:val="single" w:sz="4" w:space="0" w:color="999999"/>
@@ -4506,7 +4572,7 @@
         </w:tc>
         <w:tc>
           <w:tcPr>
-            <w:tcW w:w="2404" w:type="dxa"/>
+            <w:tcW w:w="2298" w:type="dxa"/>
             <w:tcBorders>
               <w:top w:val="single" w:sz="4" w:space="0" w:color="999999"/>
               <w:left w:val="single" w:sz="4" w:space="0" w:color="999999"/>
@@ -4534,7 +4600,7 @@
         </w:trPr>
         <w:tc>
           <w:tcPr>
-            <w:tcW w:w="4193" w:type="dxa"/>
+            <w:tcW w:w="4405" w:type="dxa"/>
             <w:tcBorders>
               <w:top w:val="single" w:sz="4" w:space="0" w:color="999999"/>
               <w:left w:val="single" w:sz="4" w:space="0" w:color="999999"/>
@@ -4557,7 +4623,7 @@
         </w:tc>
         <w:tc>
           <w:tcPr>
-            <w:tcW w:w="2403" w:type="dxa"/>
+            <w:tcW w:w="2297" w:type="dxa"/>
             <w:tcBorders>
               <w:top w:val="single" w:sz="4" w:space="0" w:color="999999"/>
               <w:left w:val="single" w:sz="4" w:space="0" w:color="999999"/>
@@ -4577,7 +4643,7 @@
         </w:tc>
         <w:tc>
           <w:tcPr>
-            <w:tcW w:w="2404" w:type="dxa"/>
+            <w:tcW w:w="2298" w:type="dxa"/>
             <w:tcBorders>
               <w:top w:val="single" w:sz="4" w:space="0" w:color="999999"/>
               <w:left w:val="single" w:sz="4" w:space="0" w:color="999999"/>
@@ -4605,7 +4671,7 @@
         </w:trPr>
         <w:tc>
           <w:tcPr>
-            <w:tcW w:w="4193" w:type="dxa"/>
+            <w:tcW w:w="4405" w:type="dxa"/>
             <w:tcBorders>
               <w:top w:val="single" w:sz="4" w:space="0" w:color="999999"/>
               <w:left w:val="single" w:sz="4" w:space="0" w:color="999999"/>
@@ -4628,7 +4694,7 @@
         </w:tc>
         <w:tc>
           <w:tcPr>
-            <w:tcW w:w="2403" w:type="dxa"/>
+            <w:tcW w:w="2297" w:type="dxa"/>
             <w:tcBorders>
               <w:top w:val="single" w:sz="4" w:space="0" w:color="999999"/>
               <w:left w:val="single" w:sz="4" w:space="0" w:color="999999"/>
@@ -4651,7 +4717,7 @@
         </w:tc>
         <w:tc>
           <w:tcPr>
-            <w:tcW w:w="2404" w:type="dxa"/>
+            <w:tcW w:w="2298" w:type="dxa"/>
             <w:tcBorders>
               <w:top w:val="single" w:sz="4" w:space="0" w:color="999999"/>
               <w:left w:val="single" w:sz="4" w:space="0" w:color="999999"/>
@@ -4679,7 +4745,7 @@
         </w:trPr>
         <w:tc>
           <w:tcPr>
-            <w:tcW w:w="4193" w:type="dxa"/>
+            <w:tcW w:w="4405" w:type="dxa"/>
             <w:tcBorders>
               <w:top w:val="single" w:sz="4" w:space="0" w:color="999999"/>
               <w:left w:val="single" w:sz="4" w:space="0" w:color="999999"/>
@@ -4702,7 +4768,7 @@
         </w:tc>
         <w:tc>
           <w:tcPr>
-            <w:tcW w:w="2403" w:type="dxa"/>
+            <w:tcW w:w="2297" w:type="dxa"/>
             <w:tcBorders>
               <w:top w:val="single" w:sz="4" w:space="0" w:color="999999"/>
               <w:left w:val="single" w:sz="4" w:space="0" w:color="999999"/>
@@ -4722,7 +4788,7 @@
         </w:tc>
         <w:tc>
           <w:tcPr>
-            <w:tcW w:w="2404" w:type="dxa"/>
+            <w:tcW w:w="2298" w:type="dxa"/>
             <w:tcBorders>
               <w:top w:val="single" w:sz="4" w:space="0" w:color="999999"/>
               <w:left w:val="single" w:sz="4" w:space="0" w:color="999999"/>
@@ -4750,7 +4816,7 @@
         </w:trPr>
         <w:tc>
           <w:tcPr>
-            <w:tcW w:w="4193" w:type="dxa"/>
+            <w:tcW w:w="4405" w:type="dxa"/>
             <w:tcBorders>
               <w:top w:val="single" w:sz="4" w:space="0" w:color="999999"/>
               <w:left w:val="single" w:sz="4" w:space="0" w:color="999999"/>
@@ -4773,7 +4839,7 @@
         </w:tc>
         <w:tc>
           <w:tcPr>
-            <w:tcW w:w="2403" w:type="dxa"/>
+            <w:tcW w:w="2297" w:type="dxa"/>
             <w:tcBorders>
               <w:top w:val="single" w:sz="4" w:space="0" w:color="999999"/>
               <w:left w:val="single" w:sz="4" w:space="0" w:color="999999"/>
@@ -4796,7 +4862,7 @@
         </w:tc>
         <w:tc>
           <w:tcPr>
-            <w:tcW w:w="2404" w:type="dxa"/>
+            <w:tcW w:w="2298" w:type="dxa"/>
             <w:tcBorders>
               <w:top w:val="single" w:sz="4" w:space="0" w:color="999999"/>
               <w:left w:val="single" w:sz="4" w:space="0" w:color="999999"/>
@@ -4824,7 +4890,7 @@
         </w:trPr>
         <w:tc>
           <w:tcPr>
-            <w:tcW w:w="4193" w:type="dxa"/>
+            <w:tcW w:w="4405" w:type="dxa"/>
             <w:tcBorders>
               <w:top w:val="single" w:sz="4" w:space="0" w:color="999999"/>
               <w:left w:val="single" w:sz="4" w:space="0" w:color="999999"/>
@@ -4847,7 +4913,7 @@
         </w:tc>
         <w:tc>
           <w:tcPr>
-            <w:tcW w:w="2403" w:type="dxa"/>
+            <w:tcW w:w="2297" w:type="dxa"/>
             <w:tcBorders>
               <w:top w:val="single" w:sz="4" w:space="0" w:color="999999"/>
               <w:left w:val="single" w:sz="4" w:space="0" w:color="999999"/>
@@ -4870,7 +4936,7 @@
         </w:tc>
         <w:tc>
           <w:tcPr>
-            <w:tcW w:w="2404" w:type="dxa"/>
+            <w:tcW w:w="2298" w:type="dxa"/>
             <w:tcBorders>
               <w:top w:val="single" w:sz="4" w:space="0" w:color="999999"/>
               <w:left w:val="single" w:sz="4" w:space="0" w:color="999999"/>
@@ -4898,7 +4964,7 @@
         </w:trPr>
         <w:tc>
           <w:tcPr>
-            <w:tcW w:w="4193" w:type="dxa"/>
+            <w:tcW w:w="4405" w:type="dxa"/>
             <w:tcBorders>
               <w:top w:val="single" w:sz="4" w:space="0" w:color="999999"/>
               <w:left w:val="single" w:sz="4" w:space="0" w:color="999999"/>
@@ -4921,7 +4987,7 @@
         </w:tc>
         <w:tc>
           <w:tcPr>
-            <w:tcW w:w="2403" w:type="dxa"/>
+            <w:tcW w:w="2297" w:type="dxa"/>
             <w:tcBorders>
               <w:top w:val="single" w:sz="4" w:space="0" w:color="999999"/>
               <w:left w:val="single" w:sz="4" w:space="0" w:color="999999"/>
@@ -4941,7 +5007,7 @@
         </w:tc>
         <w:tc>
           <w:tcPr>
-            <w:tcW w:w="2404" w:type="dxa"/>
+            <w:tcW w:w="2298" w:type="dxa"/>
             <w:tcBorders>
               <w:top w:val="single" w:sz="4" w:space="0" w:color="999999"/>
               <w:left w:val="single" w:sz="4" w:space="0" w:color="999999"/>
@@ -4969,7 +5035,7 @@
         </w:trPr>
         <w:tc>
           <w:tcPr>
-            <w:tcW w:w="4193" w:type="dxa"/>
+            <w:tcW w:w="4405" w:type="dxa"/>
             <w:tcBorders>
               <w:top w:val="single" w:sz="4" w:space="0" w:color="999999"/>
               <w:left w:val="single" w:sz="4" w:space="0" w:color="999999"/>
@@ -4992,7 +5058,7 @@
         </w:tc>
         <w:tc>
           <w:tcPr>
-            <w:tcW w:w="2403" w:type="dxa"/>
+            <w:tcW w:w="2297" w:type="dxa"/>
             <w:tcBorders>
               <w:top w:val="single" w:sz="4" w:space="0" w:color="999999"/>
               <w:left w:val="single" w:sz="4" w:space="0" w:color="999999"/>
@@ -5012,7 +5078,7 @@
         </w:tc>
         <w:tc>
           <w:tcPr>
-            <w:tcW w:w="2404" w:type="dxa"/>
+            <w:tcW w:w="2298" w:type="dxa"/>
             <w:tcBorders>
               <w:top w:val="single" w:sz="4" w:space="0" w:color="999999"/>
               <w:left w:val="single" w:sz="4" w:space="0" w:color="999999"/>
@@ -5040,7 +5106,7 @@
         </w:trPr>
         <w:tc>
           <w:tcPr>
-            <w:tcW w:w="4193" w:type="dxa"/>
+            <w:tcW w:w="4405" w:type="dxa"/>
             <w:tcBorders>
               <w:top w:val="single" w:sz="4" w:space="0" w:color="999999"/>
               <w:left w:val="single" w:sz="4" w:space="0" w:color="999999"/>
@@ -5063,7 +5129,7 @@
         </w:tc>
         <w:tc>
           <w:tcPr>
-            <w:tcW w:w="2403" w:type="dxa"/>
+            <w:tcW w:w="2297" w:type="dxa"/>
             <w:tcBorders>
               <w:top w:val="single" w:sz="4" w:space="0" w:color="999999"/>
               <w:left w:val="single" w:sz="4" w:space="0" w:color="999999"/>
@@ -5083,7 +5149,7 @@
         </w:tc>
         <w:tc>
           <w:tcPr>
-            <w:tcW w:w="2404" w:type="dxa"/>
+            <w:tcW w:w="2298" w:type="dxa"/>
             <w:tcBorders>
               <w:top w:val="single" w:sz="4" w:space="0" w:color="999999"/>
               <w:left w:val="single" w:sz="4" w:space="0" w:color="999999"/>
@@ -5111,30 +5177,30 @@
         </w:trPr>
         <w:tc>
           <w:tcPr>
-            <w:tcW w:w="4193" w:type="dxa"/>
-            <w:tcBorders>
-              <w:top w:val="single" w:sz="4" w:space="0" w:color="999999"/>
-              <w:left w:val="single" w:sz="4" w:space="0" w:color="999999"/>
-              <w:bottom w:val="single" w:sz="4" w:space="0" w:color="999999"/>
-              <w:right w:val="single" w:sz="4" w:space="0" w:color="999999"/>
-            </w:tcBorders>
-            <w:vAlign w:val="center"/>
-          </w:tcPr>
-          <w:p>
-            <w:pPr>
-              <w:pStyle w:val="Compact"/>
-            </w:pPr>
-            <w:r>
-              <w:rPr>
-                <w:rtl/>
-              </w:rPr>
-              <w:t xml:space="preserve">מצב לילה (ברירת מחדל)</w:t>
-            </w:r>
-          </w:p>
-        </w:tc>
-        <w:tc>
-          <w:tcPr>
-            <w:tcW w:w="2403" w:type="dxa"/>
+            <w:tcW w:w="4405" w:type="dxa"/>
+            <w:tcBorders>
+              <w:top w:val="single" w:sz="4" w:space="0" w:color="999999"/>
+              <w:left w:val="single" w:sz="4" w:space="0" w:color="999999"/>
+              <w:bottom w:val="single" w:sz="4" w:space="0" w:color="999999"/>
+              <w:right w:val="single" w:sz="4" w:space="0" w:color="999999"/>
+            </w:tcBorders>
+            <w:vAlign w:val="center"/>
+          </w:tcPr>
+          <w:p>
+            <w:pPr>
+              <w:pStyle w:val="Compact"/>
+            </w:pPr>
+            <w:r>
+              <w:rPr>
+                <w:rtl/>
+              </w:rPr>
+              <w:t xml:space="preserve">שעות מצב לילה (המצב עצמו כבוי כברירת מחדל)</w:t>
+            </w:r>
+          </w:p>
+        </w:tc>
+        <w:tc>
+          <w:tcPr>
+            <w:tcW w:w="2297" w:type="dxa"/>
             <w:tcBorders>
               <w:top w:val="single" w:sz="4" w:space="0" w:color="999999"/>
               <w:left w:val="single" w:sz="4" w:space="0" w:color="999999"/>
@@ -5157,7 +5223,7 @@
         </w:tc>
         <w:tc>
           <w:tcPr>
-            <w:tcW w:w="2404" w:type="dxa"/>
+            <w:tcW w:w="2298" w:type="dxa"/>
             <w:tcBorders>
               <w:top w:val="single" w:sz="4" w:space="0" w:color="999999"/>
               <w:left w:val="single" w:sz="4" w:space="0" w:color="999999"/>
@@ -5741,7 +5807,7 @@
         <w:rPr>
           <w:rtl/>
         </w:rPr>
-        <w:t xml:space="preserve">שאר המערכת נבדקה על הבקרים עצמם. כל תרחיש מתבצע פיזית: נפתחת הדלת, נעשית חציה מול חיישן המרחק, מוקש קוד. בכל פעם נבדקות שלוש תוצאות: הצליל שבקר הדלת משמיע, המסך באפליקציה והרשומה ביומן האירועים. את ההדפסות של הבקרים אפשר לראות ב-Serial Monitor בזמן הבדיקה.</w:t>
+        <w:t xml:space="preserve">שאר המערכת נבדקה על הבקרים עצמם. כל תרחיש מתבצע פיזית: נפתחת הדלת, נעשית חציה מול חיישן המרחק, מוקלד קוד. בכל פעם נבדקות שלוש תוצאות: הצליל שבקר הדלת משמיע, המסך באפליקציה והרשומה ביומן האירועים. את ההדפסות של הבקרים אפשר לראות בזמן הבדיקה ב-Serial Monitor, חלון בסביבת הפיתוח שבו הבקר מדפיס הודעות למחשב.</w:t>
       </w:r>
     </w:p>
     <w:bookmarkEnd w:id="44"/>
@@ -5800,8 +5866,8 @@
         </w:tblCellMar>
       </w:tblPr>
       <w:tblGrid>
-        <w:gridCol w:w="4029"/>
-        <w:gridCol w:w="4971"/>
+        <w:gridCol w:w="3962"/>
+        <w:gridCol w:w="5038"/>
       </w:tblGrid>
       <w:tr>
         <w:trPr>
@@ -5811,7 +5877,7 @@
         </w:trPr>
         <w:tc>
           <w:tcPr>
-            <w:tcW w:w="4029" w:type="dxa"/>
+            <w:tcW w:w="3962" w:type="dxa"/>
             <w:tcBorders>
               <w:top w:val="single" w:sz="4" w:space="0" w:color="999999"/>
               <w:left w:val="single" w:sz="4" w:space="0" w:color="999999"/>
@@ -5838,7 +5904,7 @@
         </w:tc>
         <w:tc>
           <w:tcPr>
-            <w:tcW w:w="4971" w:type="dxa"/>
+            <w:tcW w:w="5038" w:type="dxa"/>
             <w:tcBorders>
               <w:top w:val="single" w:sz="4" w:space="0" w:color="999999"/>
               <w:left w:val="single" w:sz="4" w:space="0" w:color="999999"/>
@@ -5870,7 +5936,7 @@
         </w:trPr>
         <w:tc>
           <w:tcPr>
-            <w:tcW w:w="4029" w:type="dxa"/>
+            <w:tcW w:w="3962" w:type="dxa"/>
             <w:tcBorders>
               <w:top w:val="single" w:sz="4" w:space="0" w:color="999999"/>
               <w:left w:val="single" w:sz="4" w:space="0" w:color="999999"/>
@@ -5908,7 +5974,7 @@
         </w:tc>
         <w:tc>
           <w:tcPr>
-            <w:tcW w:w="4971" w:type="dxa"/>
+            <w:tcW w:w="5038" w:type="dxa"/>
             <w:tcBorders>
               <w:top w:val="single" w:sz="4" w:space="0" w:color="999999"/>
               <w:left w:val="single" w:sz="4" w:space="0" w:color="999999"/>
@@ -5936,7 +6002,7 @@
         </w:trPr>
         <w:tc>
           <w:tcPr>
-            <w:tcW w:w="4029" w:type="dxa"/>
+            <w:tcW w:w="3962" w:type="dxa"/>
             <w:tcBorders>
               <w:top w:val="single" w:sz="4" w:space="0" w:color="999999"/>
               <w:left w:val="single" w:sz="4" w:space="0" w:color="999999"/>
@@ -5959,24 +6025,24 @@
         </w:tc>
         <w:tc>
           <w:tcPr>
-            <w:tcW w:w="4971" w:type="dxa"/>
-            <w:tcBorders>
-              <w:top w:val="single" w:sz="4" w:space="0" w:color="999999"/>
-              <w:left w:val="single" w:sz="4" w:space="0" w:color="999999"/>
-              <w:bottom w:val="single" w:sz="4" w:space="0" w:color="999999"/>
-              <w:right w:val="single" w:sz="4" w:space="0" w:color="999999"/>
-            </w:tcBorders>
-            <w:vAlign w:val="center"/>
-          </w:tcPr>
-          <w:p>
-            <w:pPr>
-              <w:pStyle w:val="Compact"/>
-            </w:pPr>
-            <w:r>
-              <w:rPr>
-                <w:rtl/>
-              </w:rPr>
-              <w:t xml:space="preserve">ספירה של 30‎ s, ואז נטרול וצליל נטרול</w:t>
+            <w:tcW w:w="5038" w:type="dxa"/>
+            <w:tcBorders>
+              <w:top w:val="single" w:sz="4" w:space="0" w:color="999999"/>
+              <w:left w:val="single" w:sz="4" w:space="0" w:color="999999"/>
+              <w:bottom w:val="single" w:sz="4" w:space="0" w:color="999999"/>
+              <w:right w:val="single" w:sz="4" w:space="0" w:color="999999"/>
+            </w:tcBorders>
+            <w:vAlign w:val="center"/>
+          </w:tcPr>
+          <w:p>
+            <w:pPr>
+              <w:pStyle w:val="Compact"/>
+            </w:pPr>
+            <w:r>
+              <w:rPr>
+                <w:rtl/>
+              </w:rPr>
+              <w:t xml:space="preserve">הספירה נעצרת, המערכת מנוטרלת ונשמע צליל נטרול</w:t>
             </w:r>
           </w:p>
         </w:tc>
@@ -5987,7 +6053,7 @@
         </w:trPr>
         <w:tc>
           <w:tcPr>
-            <w:tcW w:w="4029" w:type="dxa"/>
+            <w:tcW w:w="3962" w:type="dxa"/>
             <w:tcBorders>
               <w:top w:val="single" w:sz="4" w:space="0" w:color="999999"/>
               <w:left w:val="single" w:sz="4" w:space="0" w:color="999999"/>
@@ -6010,7 +6076,7 @@
         </w:tc>
         <w:tc>
           <w:tcPr>
-            <w:tcW w:w="4971" w:type="dxa"/>
+            <w:tcW w:w="5038" w:type="dxa"/>
             <w:tcBorders>
               <w:top w:val="single" w:sz="4" w:space="0" w:color="999999"/>
               <w:left w:val="single" w:sz="4" w:space="0" w:color="999999"/>
@@ -6038,7 +6104,7 @@
         </w:trPr>
         <w:tc>
           <w:tcPr>
-            <w:tcW w:w="4029" w:type="dxa"/>
+            <w:tcW w:w="3962" w:type="dxa"/>
             <w:tcBorders>
               <w:top w:val="single" w:sz="4" w:space="0" w:color="999999"/>
               <w:left w:val="single" w:sz="4" w:space="0" w:color="999999"/>
@@ -6061,7 +6127,7 @@
         </w:tc>
         <w:tc>
           <w:tcPr>
-            <w:tcW w:w="4971" w:type="dxa"/>
+            <w:tcW w:w="5038" w:type="dxa"/>
             <w:tcBorders>
               <w:top w:val="single" w:sz="4" w:space="0" w:color="999999"/>
               <w:left w:val="single" w:sz="4" w:space="0" w:color="999999"/>
@@ -6089,7 +6155,7 @@
         </w:trPr>
         <w:tc>
           <w:tcPr>
-            <w:tcW w:w="4029" w:type="dxa"/>
+            <w:tcW w:w="3962" w:type="dxa"/>
             <w:tcBorders>
               <w:top w:val="single" w:sz="4" w:space="0" w:color="999999"/>
               <w:left w:val="single" w:sz="4" w:space="0" w:color="999999"/>
@@ -6112,7 +6178,7 @@
         </w:tc>
         <w:tc>
           <w:tcPr>
-            <w:tcW w:w="4971" w:type="dxa"/>
+            <w:tcW w:w="5038" w:type="dxa"/>
             <w:tcBorders>
               <w:top w:val="single" w:sz="4" w:space="0" w:color="999999"/>
               <w:left w:val="single" w:sz="4" w:space="0" w:color="999999"/>
@@ -6140,7 +6206,7 @@
         </w:trPr>
         <w:tc>
           <w:tcPr>
-            <w:tcW w:w="4029" w:type="dxa"/>
+            <w:tcW w:w="3962" w:type="dxa"/>
             <w:tcBorders>
               <w:top w:val="single" w:sz="4" w:space="0" w:color="999999"/>
               <w:left w:val="single" w:sz="4" w:space="0" w:color="999999"/>
@@ -6163,7 +6229,7 @@
         </w:tc>
         <w:tc>
           <w:tcPr>
-            <w:tcW w:w="4971" w:type="dxa"/>
+            <w:tcW w:w="5038" w:type="dxa"/>
             <w:tcBorders>
               <w:top w:val="single" w:sz="4" w:space="0" w:color="999999"/>
               <w:left w:val="single" w:sz="4" w:space="0" w:color="999999"/>
@@ -6191,7 +6257,7 @@
         </w:trPr>
         <w:tc>
           <w:tcPr>
-            <w:tcW w:w="4029" w:type="dxa"/>
+            <w:tcW w:w="3962" w:type="dxa"/>
             <w:tcBorders>
               <w:top w:val="single" w:sz="4" w:space="0" w:color="999999"/>
               <w:left w:val="single" w:sz="4" w:space="0" w:color="999999"/>
@@ -6214,7 +6280,7 @@
         </w:tc>
         <w:tc>
           <w:tcPr>
-            <w:tcW w:w="4971" w:type="dxa"/>
+            <w:tcW w:w="5038" w:type="dxa"/>
             <w:tcBorders>
               <w:top w:val="single" w:sz="4" w:space="0" w:color="999999"/>
               <w:left w:val="single" w:sz="4" w:space="0" w:color="999999"/>
@@ -6242,7 +6308,7 @@
         </w:trPr>
         <w:tc>
           <w:tcPr>
-            <w:tcW w:w="4029" w:type="dxa"/>
+            <w:tcW w:w="3962" w:type="dxa"/>
             <w:tcBorders>
               <w:top w:val="single" w:sz="4" w:space="0" w:color="999999"/>
               <w:left w:val="single" w:sz="4" w:space="0" w:color="999999"/>
@@ -6265,7 +6331,7 @@
         </w:tc>
         <w:tc>
           <w:tcPr>
-            <w:tcW w:w="4971" w:type="dxa"/>
+            <w:tcW w:w="5038" w:type="dxa"/>
             <w:tcBorders>
               <w:top w:val="single" w:sz="4" w:space="0" w:color="999999"/>
               <w:left w:val="single" w:sz="4" w:space="0" w:color="999999"/>
@@ -6293,7 +6359,7 @@
         </w:trPr>
         <w:tc>
           <w:tcPr>
-            <w:tcW w:w="4029" w:type="dxa"/>
+            <w:tcW w:w="3962" w:type="dxa"/>
             <w:tcBorders>
               <w:top w:val="single" w:sz="4" w:space="0" w:color="999999"/>
               <w:left w:val="single" w:sz="4" w:space="0" w:color="999999"/>
@@ -6316,7 +6382,7 @@
         </w:tc>
         <w:tc>
           <w:tcPr>
-            <w:tcW w:w="4971" w:type="dxa"/>
+            <w:tcW w:w="5038" w:type="dxa"/>
             <w:tcBorders>
               <w:top w:val="single" w:sz="4" w:space="0" w:color="999999"/>
               <w:left w:val="single" w:sz="4" w:space="0" w:color="999999"/>
@@ -6344,7 +6410,7 @@
         </w:trPr>
         <w:tc>
           <w:tcPr>
-            <w:tcW w:w="4029" w:type="dxa"/>
+            <w:tcW w:w="3962" w:type="dxa"/>
             <w:tcBorders>
               <w:top w:val="single" w:sz="4" w:space="0" w:color="999999"/>
               <w:left w:val="single" w:sz="4" w:space="0" w:color="999999"/>
@@ -6367,7 +6433,7 @@
         </w:tc>
         <w:tc>
           <w:tcPr>
-            <w:tcW w:w="4971" w:type="dxa"/>
+            <w:tcW w:w="5038" w:type="dxa"/>
             <w:tcBorders>
               <w:top w:val="single" w:sz="4" w:space="0" w:color="999999"/>
               <w:left w:val="single" w:sz="4" w:space="0" w:color="999999"/>
@@ -6395,7 +6461,7 @@
         </w:trPr>
         <w:tc>
           <w:tcPr>
-            <w:tcW w:w="4029" w:type="dxa"/>
+            <w:tcW w:w="3962" w:type="dxa"/>
             <w:tcBorders>
               <w:top w:val="single" w:sz="4" w:space="0" w:color="999999"/>
               <w:left w:val="single" w:sz="4" w:space="0" w:color="999999"/>
@@ -6418,7 +6484,7 @@
         </w:tc>
         <w:tc>
           <w:tcPr>
-            <w:tcW w:w="4971" w:type="dxa"/>
+            <w:tcW w:w="5038" w:type="dxa"/>
             <w:tcBorders>
               <w:top w:val="single" w:sz="4" w:space="0" w:color="999999"/>
               <w:left w:val="single" w:sz="4" w:space="0" w:color="999999"/>
@@ -6446,7 +6512,7 @@
         </w:trPr>
         <w:tc>
           <w:tcPr>
-            <w:tcW w:w="4029" w:type="dxa"/>
+            <w:tcW w:w="3962" w:type="dxa"/>
             <w:tcBorders>
               <w:top w:val="single" w:sz="4" w:space="0" w:color="999999"/>
               <w:left w:val="single" w:sz="4" w:space="0" w:color="999999"/>
@@ -6469,7 +6535,7 @@
         </w:tc>
         <w:tc>
           <w:tcPr>
-            <w:tcW w:w="4971" w:type="dxa"/>
+            <w:tcW w:w="5038" w:type="dxa"/>
             <w:tcBorders>
               <w:top w:val="single" w:sz="4" w:space="0" w:color="999999"/>
               <w:left w:val="single" w:sz="4" w:space="0" w:color="999999"/>
@@ -6497,7 +6563,7 @@
         </w:trPr>
         <w:tc>
           <w:tcPr>
-            <w:tcW w:w="4029" w:type="dxa"/>
+            <w:tcW w:w="3962" w:type="dxa"/>
             <w:tcBorders>
               <w:top w:val="single" w:sz="4" w:space="0" w:color="999999"/>
               <w:left w:val="single" w:sz="4" w:space="0" w:color="999999"/>
@@ -6520,7 +6586,7 @@
         </w:tc>
         <w:tc>
           <w:tcPr>
-            <w:tcW w:w="4971" w:type="dxa"/>
+            <w:tcW w:w="5038" w:type="dxa"/>
             <w:tcBorders>
               <w:top w:val="single" w:sz="4" w:space="0" w:color="999999"/>
               <w:left w:val="single" w:sz="4" w:space="0" w:color="999999"/>
@@ -6548,7 +6614,7 @@
         </w:trPr>
         <w:tc>
           <w:tcPr>
-            <w:tcW w:w="4029" w:type="dxa"/>
+            <w:tcW w:w="3962" w:type="dxa"/>
             <w:tcBorders>
               <w:top w:val="single" w:sz="4" w:space="0" w:color="999999"/>
               <w:left w:val="single" w:sz="4" w:space="0" w:color="999999"/>
@@ -6571,24 +6637,24 @@
         </w:tc>
         <w:tc>
           <w:tcPr>
-            <w:tcW w:w="4971" w:type="dxa"/>
-            <w:tcBorders>
-              <w:top w:val="single" w:sz="4" w:space="0" w:color="999999"/>
-              <w:left w:val="single" w:sz="4" w:space="0" w:color="999999"/>
-              <w:bottom w:val="single" w:sz="4" w:space="0" w:color="999999"/>
-              <w:right w:val="single" w:sz="4" w:space="0" w:color="999999"/>
-            </w:tcBorders>
-            <w:vAlign w:val="center"/>
-          </w:tcPr>
-          <w:p>
-            <w:pPr>
-              <w:pStyle w:val="Compact"/>
-            </w:pPr>
-            <w:r>
-              <w:rPr>
-                <w:rtl/>
-              </w:rPr>
-              <w:t xml:space="preserve">הכפתור ננעל ל-30‎ s</w:t>
+            <w:tcW w:w="5038" w:type="dxa"/>
+            <w:tcBorders>
+              <w:top w:val="single" w:sz="4" w:space="0" w:color="999999"/>
+              <w:left w:val="single" w:sz="4" w:space="0" w:color="999999"/>
+              <w:bottom w:val="single" w:sz="4" w:space="0" w:color="999999"/>
+              <w:right w:val="single" w:sz="4" w:space="0" w:color="999999"/>
+            </w:tcBorders>
+            <w:vAlign w:val="center"/>
+          </w:tcPr>
+          <w:p>
+            <w:pPr>
+              <w:pStyle w:val="Compact"/>
+            </w:pPr>
+            <w:r>
+              <w:rPr>
+                <w:rtl/>
+              </w:rPr>
+              <w:t xml:space="preserve">הכפתור ננעל ל-30‎ s, ואם המערכת דרוכה מופעלת אזעקה</w:t>
             </w:r>
           </w:p>
         </w:tc>
@@ -6599,7 +6665,7 @@
         </w:trPr>
         <w:tc>
           <w:tcPr>
-            <w:tcW w:w="4029" w:type="dxa"/>
+            <w:tcW w:w="3962" w:type="dxa"/>
             <w:tcBorders>
               <w:top w:val="single" w:sz="4" w:space="0" w:color="999999"/>
               <w:left w:val="single" w:sz="4" w:space="0" w:color="999999"/>
@@ -6622,7 +6688,7 @@
         </w:tc>
         <w:tc>
           <w:tcPr>
-            <w:tcW w:w="4971" w:type="dxa"/>
+            <w:tcW w:w="5038" w:type="dxa"/>
             <w:tcBorders>
               <w:top w:val="single" w:sz="4" w:space="0" w:color="999999"/>
               <w:left w:val="single" w:sz="4" w:space="0" w:color="999999"/>
@@ -6650,7 +6716,7 @@
         </w:trPr>
         <w:tc>
           <w:tcPr>
-            <w:tcW w:w="4029" w:type="dxa"/>
+            <w:tcW w:w="3962" w:type="dxa"/>
             <w:tcBorders>
               <w:top w:val="single" w:sz="4" w:space="0" w:color="999999"/>
               <w:left w:val="single" w:sz="4" w:space="0" w:color="999999"/>
@@ -6673,7 +6739,7 @@
         </w:tc>
         <w:tc>
           <w:tcPr>
-            <w:tcW w:w="4971" w:type="dxa"/>
+            <w:tcW w:w="5038" w:type="dxa"/>
             <w:tcBorders>
               <w:top w:val="single" w:sz="4" w:space="0" w:color="999999"/>
               <w:left w:val="single" w:sz="4" w:space="0" w:color="999999"/>
@@ -6701,7 +6767,7 @@
         </w:trPr>
         <w:tc>
           <w:tcPr>
-            <w:tcW w:w="4029" w:type="dxa"/>
+            <w:tcW w:w="3962" w:type="dxa"/>
             <w:tcBorders>
               <w:top w:val="single" w:sz="4" w:space="0" w:color="999999"/>
               <w:left w:val="single" w:sz="4" w:space="0" w:color="999999"/>
@@ -6724,7 +6790,7 @@
         </w:tc>
         <w:tc>
           <w:tcPr>
-            <w:tcW w:w="4971" w:type="dxa"/>
+            <w:tcW w:w="5038" w:type="dxa"/>
             <w:tcBorders>
               <w:top w:val="single" w:sz="4" w:space="0" w:color="999999"/>
               <w:left w:val="single" w:sz="4" w:space="0" w:color="999999"/>
@@ -6794,7 +6860,7 @@
         <w:rPr>
           <w:rtl/>
         </w:rPr>
-        <w:t xml:space="preserve">בכל תרחיש האירועים נרשמו ביומן האפליקציה לפי הסדר, עם שעה: דריכה, פתיחת דלת, אזעקה ונטרול (איור 7). בבקר החיישנים אפשר לראות ב-Serial Monitor איך קריאת המרחק יורדת מתחת למרחק הרגיל כשמישהו עובר, ורק אחרי כמה קריאות ברצף נשלחת הודעת חדירה (איור 6).</w:t>
+        <w:t xml:space="preserve">בבקר החיישנים אפשר לראות ב-Serial Monitor איך קריאת המרחק יורדת מתחת למרחק הרגיל כשמישהו עובר, ורק אחרי כמה קריאות ברצף נשלחת הודעת חדירה (איור 7). בכל תרחיש האירועים נרשמו ביומן האפליקציה לפי הסדר, עם שעה: דריכה, פתיחת דלת, אזעקה ונטרול (איור 8).</w:t>
       </w:r>
     </w:p>
     <w:p>
@@ -6832,7 +6898,7 @@
           <w:bCs/>
           <w:rtl/>
         </w:rPr>
-        <w:t xml:space="preserve">איור 6: קריאות חיישן המרחק בזמן חדירה</w:t>
+        <w:t xml:space="preserve">איור 7: קריאות חיישן המרחק בזמן חדירה</w:t>
       </w:r>
     </w:p>
     <w:p>
@@ -6870,7 +6936,7 @@
           <w:bCs/>
           <w:rtl/>
         </w:rPr>
-        <w:t xml:space="preserve">איור 7: יומן האירועים אחרי תרחיש בדיקה</w:t>
+        <w:t xml:space="preserve">איור 8: יומן האירועים אחרי תרחיש בדיקה</w:t>
       </w:r>
     </w:p>
     <w:bookmarkEnd w:id="46"/>
@@ -7019,6 +7085,33 @@
           <w:rtl/>
         </w:rPr>
         <w:t xml:space="preserve">ברשת הביתית כתובת המחשב עלולה להשתנות. בקר שנצרב עם כתובת ישנה לא מגיע לבקנד, ונראה כמו תקלת חומרה. הבקנד בודק בהפעלה אם הבקרים מכוונים לכתובת הנוכחית ומזהיר, אבל תיקון עדיין דורש צריבה מחדש של הבקר.</w:t>
+      </w:r>
+    </w:p>
+    <w:p>
+      <w:pPr>
+        <w:pStyle w:val="BodyText"/>
+        <w:numPr>
+          <w:ilvl w:val="0"/>
+          <w:numId w:val="1009"/>
+        </w:numPr>
+        <w:spacing w:after="60"/>
+      </w:pPr>
+      <w:r>
+        <w:rPr>
+          <w:b/>
+          <w:bCs/>
+          <w:rtl/>
+        </w:rPr>
+        <w:t xml:space="preserve">הסירנה יושבת על בקר הדלת.</w:t>
+      </w:r>
+      <w:r>
+        <w:t xml:space="preserve"> </w:t>
+      </w:r>
+      <w:r>
+        <w:rPr>
+          <w:rtl/>
+        </w:rPr>
+        <w:t xml:space="preserve">אם בקר הדלת מנותק, אזעקה שהתחילה בחיישן אחר תוצג באפליקציה ותישלח באימייל, אבל לא תושמע סירנה.</w:t>
       </w:r>
     </w:p>
     <w:p>
@@ -7117,8 +7210,8 @@
         </w:tblCellMar>
       </w:tblPr>
       <w:tblGrid>
-        <w:gridCol w:w="4675"/>
-        <w:gridCol w:w="4325"/>
+        <w:gridCol w:w="4603"/>
+        <w:gridCol w:w="4397"/>
       </w:tblGrid>
       <w:tr>
         <w:trPr>
@@ -7128,7 +7221,7 @@
         </w:trPr>
         <w:tc>
           <w:tcPr>
-            <w:tcW w:w="4675" w:type="dxa"/>
+            <w:tcW w:w="4603" w:type="dxa"/>
             <w:tcBorders>
               <w:top w:val="single" w:sz="4" w:space="0" w:color="999999"/>
               <w:left w:val="single" w:sz="4" w:space="0" w:color="999999"/>
@@ -7141,6 +7234,7 @@
           <w:p>
             <w:pPr>
               <w:pStyle w:val="Compact"/>
+              <w:keepNext/>
               <w:jc w:val="center"/>
             </w:pPr>
             <w:r>
@@ -7155,7 +7249,7 @@
         </w:tc>
         <w:tc>
           <w:tcPr>
-            <w:tcW w:w="4325" w:type="dxa"/>
+            <w:tcW w:w="4397" w:type="dxa"/>
             <w:tcBorders>
               <w:top w:val="single" w:sz="4" w:space="0" w:color="999999"/>
               <w:left w:val="single" w:sz="4" w:space="0" w:color="999999"/>
@@ -7168,6 +7262,7 @@
           <w:p>
             <w:pPr>
               <w:pStyle w:val="Compact"/>
+              <w:keepNext/>
               <w:jc w:val="center"/>
             </w:pPr>
             <w:r>
@@ -7187,18 +7282,19 @@
         </w:trPr>
         <w:tc>
           <w:tcPr>
-            <w:tcW w:w="4675" w:type="dxa"/>
-            <w:tcBorders>
-              <w:top w:val="single" w:sz="4" w:space="0" w:color="999999"/>
-              <w:left w:val="single" w:sz="4" w:space="0" w:color="999999"/>
-              <w:bottom w:val="single" w:sz="4" w:space="0" w:color="999999"/>
-              <w:right w:val="single" w:sz="4" w:space="0" w:color="999999"/>
-            </w:tcBorders>
-            <w:vAlign w:val="center"/>
-          </w:tcPr>
-          <w:p>
-            <w:pPr>
-              <w:pStyle w:val="Compact"/>
+            <w:tcW w:w="4603" w:type="dxa"/>
+            <w:tcBorders>
+              <w:top w:val="single" w:sz="4" w:space="0" w:color="999999"/>
+              <w:left w:val="single" w:sz="4" w:space="0" w:color="999999"/>
+              <w:bottom w:val="single" w:sz="4" w:space="0" w:color="999999"/>
+              <w:right w:val="single" w:sz="4" w:space="0" w:color="999999"/>
+            </w:tcBorders>
+            <w:vAlign w:val="center"/>
+          </w:tcPr>
+          <w:p>
+            <w:pPr>
+              <w:pStyle w:val="Compact"/>
+              <w:keepNext/>
             </w:pPr>
             <w:r>
               <w:rPr>
@@ -7210,18 +7306,19 @@
         </w:tc>
         <w:tc>
           <w:tcPr>
-            <w:tcW w:w="4325" w:type="dxa"/>
-            <w:tcBorders>
-              <w:top w:val="single" w:sz="4" w:space="0" w:color="999999"/>
-              <w:left w:val="single" w:sz="4" w:space="0" w:color="999999"/>
-              <w:bottom w:val="single" w:sz="4" w:space="0" w:color="999999"/>
-              <w:right w:val="single" w:sz="4" w:space="0" w:color="999999"/>
-            </w:tcBorders>
-            <w:vAlign w:val="center"/>
-          </w:tcPr>
-          <w:p>
-            <w:pPr>
-              <w:pStyle w:val="Compact"/>
+            <w:tcW w:w="4397" w:type="dxa"/>
+            <w:tcBorders>
+              <w:top w:val="single" w:sz="4" w:space="0" w:color="999999"/>
+              <w:left w:val="single" w:sz="4" w:space="0" w:color="999999"/>
+              <w:bottom w:val="single" w:sz="4" w:space="0" w:color="999999"/>
+              <w:right w:val="single" w:sz="4" w:space="0" w:color="999999"/>
+            </w:tcBorders>
+            <w:vAlign w:val="center"/>
+          </w:tcPr>
+          <w:p>
+            <w:pPr>
+              <w:pStyle w:val="Compact"/>
+              <w:keepNext/>
             </w:pPr>
             <w:r>
               <w:rPr>
@@ -7238,18 +7335,19 @@
         </w:trPr>
         <w:tc>
           <w:tcPr>
-            <w:tcW w:w="4675" w:type="dxa"/>
-            <w:tcBorders>
-              <w:top w:val="single" w:sz="4" w:space="0" w:color="999999"/>
-              <w:left w:val="single" w:sz="4" w:space="0" w:color="999999"/>
-              <w:bottom w:val="single" w:sz="4" w:space="0" w:color="999999"/>
-              <w:right w:val="single" w:sz="4" w:space="0" w:color="999999"/>
-            </w:tcBorders>
-            <w:vAlign w:val="center"/>
-          </w:tcPr>
-          <w:p>
-            <w:pPr>
-              <w:pStyle w:val="Compact"/>
+            <w:tcW w:w="4603" w:type="dxa"/>
+            <w:tcBorders>
+              <w:top w:val="single" w:sz="4" w:space="0" w:color="999999"/>
+              <w:left w:val="single" w:sz="4" w:space="0" w:color="999999"/>
+              <w:bottom w:val="single" w:sz="4" w:space="0" w:color="999999"/>
+              <w:right w:val="single" w:sz="4" w:space="0" w:color="999999"/>
+            </w:tcBorders>
+            <w:vAlign w:val="center"/>
+          </w:tcPr>
+          <w:p>
+            <w:pPr>
+              <w:pStyle w:val="Compact"/>
+              <w:keepNext/>
             </w:pPr>
             <w:r>
               <w:rPr>
@@ -7261,18 +7359,19 @@
         </w:tc>
         <w:tc>
           <w:tcPr>
-            <w:tcW w:w="4325" w:type="dxa"/>
-            <w:tcBorders>
-              <w:top w:val="single" w:sz="4" w:space="0" w:color="999999"/>
-              <w:left w:val="single" w:sz="4" w:space="0" w:color="999999"/>
-              <w:bottom w:val="single" w:sz="4" w:space="0" w:color="999999"/>
-              <w:right w:val="single" w:sz="4" w:space="0" w:color="999999"/>
-            </w:tcBorders>
-            <w:vAlign w:val="center"/>
-          </w:tcPr>
-          <w:p>
-            <w:pPr>
-              <w:pStyle w:val="Compact"/>
+            <w:tcW w:w="4397" w:type="dxa"/>
+            <w:tcBorders>
+              <w:top w:val="single" w:sz="4" w:space="0" w:color="999999"/>
+              <w:left w:val="single" w:sz="4" w:space="0" w:color="999999"/>
+              <w:bottom w:val="single" w:sz="4" w:space="0" w:color="999999"/>
+              <w:right w:val="single" w:sz="4" w:space="0" w:color="999999"/>
+            </w:tcBorders>
+            <w:vAlign w:val="center"/>
+          </w:tcPr>
+          <w:p>
+            <w:pPr>
+              <w:pStyle w:val="Compact"/>
+              <w:keepNext/>
             </w:pPr>
             <w:r>
               <w:rPr>
@@ -7289,18 +7388,19 @@
         </w:trPr>
         <w:tc>
           <w:tcPr>
-            <w:tcW w:w="4675" w:type="dxa"/>
-            <w:tcBorders>
-              <w:top w:val="single" w:sz="4" w:space="0" w:color="999999"/>
-              <w:left w:val="single" w:sz="4" w:space="0" w:color="999999"/>
-              <w:bottom w:val="single" w:sz="4" w:space="0" w:color="999999"/>
-              <w:right w:val="single" w:sz="4" w:space="0" w:color="999999"/>
-            </w:tcBorders>
-            <w:vAlign w:val="center"/>
-          </w:tcPr>
-          <w:p>
-            <w:pPr>
-              <w:pStyle w:val="Compact"/>
+            <w:tcW w:w="4603" w:type="dxa"/>
+            <w:tcBorders>
+              <w:top w:val="single" w:sz="4" w:space="0" w:color="999999"/>
+              <w:left w:val="single" w:sz="4" w:space="0" w:color="999999"/>
+              <w:bottom w:val="single" w:sz="4" w:space="0" w:color="999999"/>
+              <w:right w:val="single" w:sz="4" w:space="0" w:color="999999"/>
+            </w:tcBorders>
+            <w:vAlign w:val="center"/>
+          </w:tcPr>
+          <w:p>
+            <w:pPr>
+              <w:pStyle w:val="Compact"/>
+              <w:keepNext/>
             </w:pPr>
             <w:r>
               <w:rPr>
@@ -7312,18 +7412,19 @@
         </w:tc>
         <w:tc>
           <w:tcPr>
-            <w:tcW w:w="4325" w:type="dxa"/>
-            <w:tcBorders>
-              <w:top w:val="single" w:sz="4" w:space="0" w:color="999999"/>
-              <w:left w:val="single" w:sz="4" w:space="0" w:color="999999"/>
-              <w:bottom w:val="single" w:sz="4" w:space="0" w:color="999999"/>
-              <w:right w:val="single" w:sz="4" w:space="0" w:color="999999"/>
-            </w:tcBorders>
-            <w:vAlign w:val="center"/>
-          </w:tcPr>
-          <w:p>
-            <w:pPr>
-              <w:pStyle w:val="Compact"/>
+            <w:tcW w:w="4397" w:type="dxa"/>
+            <w:tcBorders>
+              <w:top w:val="single" w:sz="4" w:space="0" w:color="999999"/>
+              <w:left w:val="single" w:sz="4" w:space="0" w:color="999999"/>
+              <w:bottom w:val="single" w:sz="4" w:space="0" w:color="999999"/>
+              <w:right w:val="single" w:sz="4" w:space="0" w:color="999999"/>
+            </w:tcBorders>
+            <w:vAlign w:val="center"/>
+          </w:tcPr>
+          <w:p>
+            <w:pPr>
+              <w:pStyle w:val="Compact"/>
+              <w:keepNext/>
             </w:pPr>
             <w:r>
               <w:rPr>
@@ -7340,18 +7441,19 @@
         </w:trPr>
         <w:tc>
           <w:tcPr>
-            <w:tcW w:w="4675" w:type="dxa"/>
-            <w:tcBorders>
-              <w:top w:val="single" w:sz="4" w:space="0" w:color="999999"/>
-              <w:left w:val="single" w:sz="4" w:space="0" w:color="999999"/>
-              <w:bottom w:val="single" w:sz="4" w:space="0" w:color="999999"/>
-              <w:right w:val="single" w:sz="4" w:space="0" w:color="999999"/>
-            </w:tcBorders>
-            <w:vAlign w:val="center"/>
-          </w:tcPr>
-          <w:p>
-            <w:pPr>
-              <w:pStyle w:val="Compact"/>
+            <w:tcW w:w="4603" w:type="dxa"/>
+            <w:tcBorders>
+              <w:top w:val="single" w:sz="4" w:space="0" w:color="999999"/>
+              <w:left w:val="single" w:sz="4" w:space="0" w:color="999999"/>
+              <w:bottom w:val="single" w:sz="4" w:space="0" w:color="999999"/>
+              <w:right w:val="single" w:sz="4" w:space="0" w:color="999999"/>
+            </w:tcBorders>
+            <w:vAlign w:val="center"/>
+          </w:tcPr>
+          <w:p>
+            <w:pPr>
+              <w:pStyle w:val="Compact"/>
+              <w:keepNext/>
             </w:pPr>
             <w:r>
               <w:rPr>
@@ -7363,18 +7465,19 @@
         </w:tc>
         <w:tc>
           <w:tcPr>
-            <w:tcW w:w="4325" w:type="dxa"/>
-            <w:tcBorders>
-              <w:top w:val="single" w:sz="4" w:space="0" w:color="999999"/>
-              <w:left w:val="single" w:sz="4" w:space="0" w:color="999999"/>
-              <w:bottom w:val="single" w:sz="4" w:space="0" w:color="999999"/>
-              <w:right w:val="single" w:sz="4" w:space="0" w:color="999999"/>
-            </w:tcBorders>
-            <w:vAlign w:val="center"/>
-          </w:tcPr>
-          <w:p>
-            <w:pPr>
-              <w:pStyle w:val="Compact"/>
+            <w:tcW w:w="4397" w:type="dxa"/>
+            <w:tcBorders>
+              <w:top w:val="single" w:sz="4" w:space="0" w:color="999999"/>
+              <w:left w:val="single" w:sz="4" w:space="0" w:color="999999"/>
+              <w:bottom w:val="single" w:sz="4" w:space="0" w:color="999999"/>
+              <w:right w:val="single" w:sz="4" w:space="0" w:color="999999"/>
+            </w:tcBorders>
+            <w:vAlign w:val="center"/>
+          </w:tcPr>
+          <w:p>
+            <w:pPr>
+              <w:pStyle w:val="Compact"/>
+              <w:keepNext/>
             </w:pPr>
             <w:r>
               <w:rPr>
@@ -7391,18 +7494,19 @@
         </w:trPr>
         <w:tc>
           <w:tcPr>
-            <w:tcW w:w="4675" w:type="dxa"/>
-            <w:tcBorders>
-              <w:top w:val="single" w:sz="4" w:space="0" w:color="999999"/>
-              <w:left w:val="single" w:sz="4" w:space="0" w:color="999999"/>
-              <w:bottom w:val="single" w:sz="4" w:space="0" w:color="999999"/>
-              <w:right w:val="single" w:sz="4" w:space="0" w:color="999999"/>
-            </w:tcBorders>
-            <w:vAlign w:val="center"/>
-          </w:tcPr>
-          <w:p>
-            <w:pPr>
-              <w:pStyle w:val="Compact"/>
+            <w:tcW w:w="4603" w:type="dxa"/>
+            <w:tcBorders>
+              <w:top w:val="single" w:sz="4" w:space="0" w:color="999999"/>
+              <w:left w:val="single" w:sz="4" w:space="0" w:color="999999"/>
+              <w:bottom w:val="single" w:sz="4" w:space="0" w:color="999999"/>
+              <w:right w:val="single" w:sz="4" w:space="0" w:color="999999"/>
+            </w:tcBorders>
+            <w:vAlign w:val="center"/>
+          </w:tcPr>
+          <w:p>
+            <w:pPr>
+              <w:pStyle w:val="Compact"/>
+              <w:keepNext/>
             </w:pPr>
             <w:r>
               <w:rPr>
@@ -7414,18 +7518,19 @@
         </w:tc>
         <w:tc>
           <w:tcPr>
-            <w:tcW w:w="4325" w:type="dxa"/>
-            <w:tcBorders>
-              <w:top w:val="single" w:sz="4" w:space="0" w:color="999999"/>
-              <w:left w:val="single" w:sz="4" w:space="0" w:color="999999"/>
-              <w:bottom w:val="single" w:sz="4" w:space="0" w:color="999999"/>
-              <w:right w:val="single" w:sz="4" w:space="0" w:color="999999"/>
-            </w:tcBorders>
-            <w:vAlign w:val="center"/>
-          </w:tcPr>
-          <w:p>
-            <w:pPr>
-              <w:pStyle w:val="Compact"/>
+            <w:tcW w:w="4397" w:type="dxa"/>
+            <w:tcBorders>
+              <w:top w:val="single" w:sz="4" w:space="0" w:color="999999"/>
+              <w:left w:val="single" w:sz="4" w:space="0" w:color="999999"/>
+              <w:bottom w:val="single" w:sz="4" w:space="0" w:color="999999"/>
+              <w:right w:val="single" w:sz="4" w:space="0" w:color="999999"/>
+            </w:tcBorders>
+            <w:vAlign w:val="center"/>
+          </w:tcPr>
+          <w:p>
+            <w:pPr>
+              <w:pStyle w:val="Compact"/>
+              <w:keepNext/>
             </w:pPr>
             <w:r>
               <w:rPr>
@@ -7442,18 +7547,19 @@
         </w:trPr>
         <w:tc>
           <w:tcPr>
-            <w:tcW w:w="4675" w:type="dxa"/>
-            <w:tcBorders>
-              <w:top w:val="single" w:sz="4" w:space="0" w:color="999999"/>
-              <w:left w:val="single" w:sz="4" w:space="0" w:color="999999"/>
-              <w:bottom w:val="single" w:sz="4" w:space="0" w:color="999999"/>
-              <w:right w:val="single" w:sz="4" w:space="0" w:color="999999"/>
-            </w:tcBorders>
-            <w:vAlign w:val="center"/>
-          </w:tcPr>
-          <w:p>
-            <w:pPr>
-              <w:pStyle w:val="Compact"/>
+            <w:tcW w:w="4603" w:type="dxa"/>
+            <w:tcBorders>
+              <w:top w:val="single" w:sz="4" w:space="0" w:color="999999"/>
+              <w:left w:val="single" w:sz="4" w:space="0" w:color="999999"/>
+              <w:bottom w:val="single" w:sz="4" w:space="0" w:color="999999"/>
+              <w:right w:val="single" w:sz="4" w:space="0" w:color="999999"/>
+            </w:tcBorders>
+            <w:vAlign w:val="center"/>
+          </w:tcPr>
+          <w:p>
+            <w:pPr>
+              <w:pStyle w:val="Compact"/>
+              <w:keepNext/>
             </w:pPr>
             <w:r>
               <w:rPr>
@@ -7465,18 +7571,19 @@
         </w:tc>
         <w:tc>
           <w:tcPr>
-            <w:tcW w:w="4325" w:type="dxa"/>
-            <w:tcBorders>
-              <w:top w:val="single" w:sz="4" w:space="0" w:color="999999"/>
-              <w:left w:val="single" w:sz="4" w:space="0" w:color="999999"/>
-              <w:bottom w:val="single" w:sz="4" w:space="0" w:color="999999"/>
-              <w:right w:val="single" w:sz="4" w:space="0" w:color="999999"/>
-            </w:tcBorders>
-            <w:vAlign w:val="center"/>
-          </w:tcPr>
-          <w:p>
-            <w:pPr>
-              <w:pStyle w:val="Compact"/>
+            <w:tcW w:w="4397" w:type="dxa"/>
+            <w:tcBorders>
+              <w:top w:val="single" w:sz="4" w:space="0" w:color="999999"/>
+              <w:left w:val="single" w:sz="4" w:space="0" w:color="999999"/>
+              <w:bottom w:val="single" w:sz="4" w:space="0" w:color="999999"/>
+              <w:right w:val="single" w:sz="4" w:space="0" w:color="999999"/>
+            </w:tcBorders>
+            <w:vAlign w:val="center"/>
+          </w:tcPr>
+          <w:p>
+            <w:pPr>
+              <w:pStyle w:val="Compact"/>
+              <w:keepNext/>
             </w:pPr>
             <w:r>
               <w:rPr>
@@ -7493,18 +7600,19 @@
         </w:trPr>
         <w:tc>
           <w:tcPr>
-            <w:tcW w:w="4675" w:type="dxa"/>
-            <w:tcBorders>
-              <w:top w:val="single" w:sz="4" w:space="0" w:color="999999"/>
-              <w:left w:val="single" w:sz="4" w:space="0" w:color="999999"/>
-              <w:bottom w:val="single" w:sz="4" w:space="0" w:color="999999"/>
-              <w:right w:val="single" w:sz="4" w:space="0" w:color="999999"/>
-            </w:tcBorders>
-            <w:vAlign w:val="center"/>
-          </w:tcPr>
-          <w:p>
-            <w:pPr>
-              <w:pStyle w:val="Compact"/>
+            <w:tcW w:w="4603" w:type="dxa"/>
+            <w:tcBorders>
+              <w:top w:val="single" w:sz="4" w:space="0" w:color="999999"/>
+              <w:left w:val="single" w:sz="4" w:space="0" w:color="999999"/>
+              <w:bottom w:val="single" w:sz="4" w:space="0" w:color="999999"/>
+              <w:right w:val="single" w:sz="4" w:space="0" w:color="999999"/>
+            </w:tcBorders>
+            <w:vAlign w:val="center"/>
+          </w:tcPr>
+          <w:p>
+            <w:pPr>
+              <w:pStyle w:val="Compact"/>
+              <w:keepNext/>
             </w:pPr>
             <w:r>
               <w:rPr>
@@ -7516,18 +7624,19 @@
         </w:tc>
         <w:tc>
           <w:tcPr>
-            <w:tcW w:w="4325" w:type="dxa"/>
-            <w:tcBorders>
-              <w:top w:val="single" w:sz="4" w:space="0" w:color="999999"/>
-              <w:left w:val="single" w:sz="4" w:space="0" w:color="999999"/>
-              <w:bottom w:val="single" w:sz="4" w:space="0" w:color="999999"/>
-              <w:right w:val="single" w:sz="4" w:space="0" w:color="999999"/>
-            </w:tcBorders>
-            <w:vAlign w:val="center"/>
-          </w:tcPr>
-          <w:p>
-            <w:pPr>
-              <w:pStyle w:val="Compact"/>
+            <w:tcW w:w="4397" w:type="dxa"/>
+            <w:tcBorders>
+              <w:top w:val="single" w:sz="4" w:space="0" w:color="999999"/>
+              <w:left w:val="single" w:sz="4" w:space="0" w:color="999999"/>
+              <w:bottom w:val="single" w:sz="4" w:space="0" w:color="999999"/>
+              <w:right w:val="single" w:sz="4" w:space="0" w:color="999999"/>
+            </w:tcBorders>
+            <w:vAlign w:val="center"/>
+          </w:tcPr>
+          <w:p>
+            <w:pPr>
+              <w:pStyle w:val="Compact"/>
+              <w:keepNext/>
             </w:pPr>
             <w:r>
               <w:rPr>
@@ -7544,18 +7653,19 @@
         </w:trPr>
         <w:tc>
           <w:tcPr>
-            <w:tcW w:w="4675" w:type="dxa"/>
-            <w:tcBorders>
-              <w:top w:val="single" w:sz="4" w:space="0" w:color="999999"/>
-              <w:left w:val="single" w:sz="4" w:space="0" w:color="999999"/>
-              <w:bottom w:val="single" w:sz="4" w:space="0" w:color="999999"/>
-              <w:right w:val="single" w:sz="4" w:space="0" w:color="999999"/>
-            </w:tcBorders>
-            <w:vAlign w:val="center"/>
-          </w:tcPr>
-          <w:p>
-            <w:pPr>
-              <w:pStyle w:val="Compact"/>
+            <w:tcW w:w="4603" w:type="dxa"/>
+            <w:tcBorders>
+              <w:top w:val="single" w:sz="4" w:space="0" w:color="999999"/>
+              <w:left w:val="single" w:sz="4" w:space="0" w:color="999999"/>
+              <w:bottom w:val="single" w:sz="4" w:space="0" w:color="999999"/>
+              <w:right w:val="single" w:sz="4" w:space="0" w:color="999999"/>
+            </w:tcBorders>
+            <w:vAlign w:val="center"/>
+          </w:tcPr>
+          <w:p>
+            <w:pPr>
+              <w:pStyle w:val="Compact"/>
+              <w:keepNext/>
             </w:pPr>
             <w:r>
               <w:rPr>
@@ -7567,18 +7677,19 @@
         </w:tc>
         <w:tc>
           <w:tcPr>
-            <w:tcW w:w="4325" w:type="dxa"/>
-            <w:tcBorders>
-              <w:top w:val="single" w:sz="4" w:space="0" w:color="999999"/>
-              <w:left w:val="single" w:sz="4" w:space="0" w:color="999999"/>
-              <w:bottom w:val="single" w:sz="4" w:space="0" w:color="999999"/>
-              <w:right w:val="single" w:sz="4" w:space="0" w:color="999999"/>
-            </w:tcBorders>
-            <w:vAlign w:val="center"/>
-          </w:tcPr>
-          <w:p>
-            <w:pPr>
-              <w:pStyle w:val="Compact"/>
+            <w:tcW w:w="4397" w:type="dxa"/>
+            <w:tcBorders>
+              <w:top w:val="single" w:sz="4" w:space="0" w:color="999999"/>
+              <w:left w:val="single" w:sz="4" w:space="0" w:color="999999"/>
+              <w:bottom w:val="single" w:sz="4" w:space="0" w:color="999999"/>
+              <w:right w:val="single" w:sz="4" w:space="0" w:color="999999"/>
+            </w:tcBorders>
+            <w:vAlign w:val="center"/>
+          </w:tcPr>
+          <w:p>
+            <w:pPr>
+              <w:pStyle w:val="Compact"/>
+              <w:keepNext/>
             </w:pPr>
             <w:r>
               <w:rPr>
@@ -7595,98 +7706,47 @@
         </w:trPr>
         <w:tc>
           <w:tcPr>
-            <w:tcW w:w="4675" w:type="dxa"/>
-            <w:tcBorders>
-              <w:top w:val="single" w:sz="4" w:space="0" w:color="999999"/>
-              <w:left w:val="single" w:sz="4" w:space="0" w:color="999999"/>
-              <w:bottom w:val="single" w:sz="4" w:space="0" w:color="999999"/>
-              <w:right w:val="single" w:sz="4" w:space="0" w:color="999999"/>
-            </w:tcBorders>
-            <w:vAlign w:val="center"/>
-          </w:tcPr>
-          <w:p>
-            <w:pPr>
-              <w:pStyle w:val="Compact"/>
-            </w:pPr>
-            <w:r>
-              <w:rPr>
-                <w:rtl/>
-              </w:rPr>
-              <w:t xml:space="preserve">אזעקה אוטומטית אחרי 3 קודים שגויים בקודן</w:t>
-            </w:r>
-          </w:p>
-        </w:tc>
-        <w:tc>
-          <w:tcPr>
-            <w:tcW w:w="4325" w:type="dxa"/>
-            <w:tcBorders>
-              <w:top w:val="single" w:sz="4" w:space="0" w:color="999999"/>
-              <w:left w:val="single" w:sz="4" w:space="0" w:color="999999"/>
-              <w:bottom w:val="single" w:sz="4" w:space="0" w:color="999999"/>
-              <w:right w:val="single" w:sz="4" w:space="0" w:color="999999"/>
-            </w:tcBorders>
-            <w:vAlign w:val="center"/>
-          </w:tcPr>
-          <w:p>
-            <w:pPr>
-              <w:pStyle w:val="Compact"/>
-            </w:pPr>
-            <w:r>
-              <w:rPr>
-                <w:rtl/>
-              </w:rPr>
-              <w:t xml:space="preserve">לא הושלם. קוד שגוי משמיע זמזום ארוך בלבד. נעילה של 30‎ s אחרי 3 סיסמאות שגויות קיימת רק בהתחברות לאפליקציה</w:t>
-            </w:r>
-          </w:p>
-        </w:tc>
-      </w:tr>
-      <w:tr>
-        <w:trPr>
-          <w:cantSplit/>
-        </w:trPr>
-        <w:tc>
-          <w:tcPr>
-            <w:tcW w:w="4675" w:type="dxa"/>
-            <w:tcBorders>
-              <w:top w:val="single" w:sz="4" w:space="0" w:color="999999"/>
-              <w:left w:val="single" w:sz="4" w:space="0" w:color="999999"/>
-              <w:bottom w:val="single" w:sz="4" w:space="0" w:color="999999"/>
-              <w:right w:val="single" w:sz="4" w:space="0" w:color="999999"/>
-            </w:tcBorders>
-            <w:vAlign w:val="center"/>
-          </w:tcPr>
-          <w:p>
-            <w:pPr>
-              <w:pStyle w:val="Compact"/>
-            </w:pPr>
-            <w:r>
-              <w:rPr>
-                <w:rtl/>
-              </w:rPr>
-              <w:t xml:space="preserve">חיוג אוטומטי לגורם חירום</w:t>
-            </w:r>
-          </w:p>
-        </w:tc>
-        <w:tc>
-          <w:tcPr>
-            <w:tcW w:w="4325" w:type="dxa"/>
-            <w:tcBorders>
-              <w:top w:val="single" w:sz="4" w:space="0" w:color="999999"/>
-              <w:left w:val="single" w:sz="4" w:space="0" w:color="999999"/>
-              <w:bottom w:val="single" w:sz="4" w:space="0" w:color="999999"/>
-              <w:right w:val="single" w:sz="4" w:space="0" w:color="999999"/>
-            </w:tcBorders>
-            <w:vAlign w:val="center"/>
-          </w:tcPr>
-          <w:p>
-            <w:pPr>
-              <w:pStyle w:val="Compact"/>
-            </w:pPr>
-            <w:r>
-              <w:rPr>
-                <w:rtl/>
-              </w:rPr>
-              <w:t xml:space="preserve">לא הושלם. נשלח אימייל לאיש קשר</w:t>
+            <w:tcW w:w="4603" w:type="dxa"/>
+            <w:tcBorders>
+              <w:top w:val="single" w:sz="4" w:space="0" w:color="999999"/>
+              <w:left w:val="single" w:sz="4" w:space="0" w:color="999999"/>
+              <w:bottom w:val="single" w:sz="4" w:space="0" w:color="999999"/>
+              <w:right w:val="single" w:sz="4" w:space="0" w:color="999999"/>
+            </w:tcBorders>
+            <w:vAlign w:val="center"/>
+          </w:tcPr>
+          <w:p>
+            <w:pPr>
+              <w:pStyle w:val="Compact"/>
+            </w:pPr>
+            <w:r>
+              <w:rPr>
+                <w:rtl/>
+              </w:rPr>
+              <w:t xml:space="preserve">אזעקה אוטומטית אחרי 3 קודים שגויים</w:t>
+            </w:r>
+          </w:p>
+        </w:tc>
+        <w:tc>
+          <w:tcPr>
+            <w:tcW w:w="4397" w:type="dxa"/>
+            <w:tcBorders>
+              <w:top w:val="single" w:sz="4" w:space="0" w:color="999999"/>
+              <w:left w:val="single" w:sz="4" w:space="0" w:color="999999"/>
+              <w:bottom w:val="single" w:sz="4" w:space="0" w:color="999999"/>
+              <w:right w:val="single" w:sz="4" w:space="0" w:color="999999"/>
+            </w:tcBorders>
+            <w:vAlign w:val="center"/>
+          </w:tcPr>
+          <w:p>
+            <w:pPr>
+              <w:pStyle w:val="Compact"/>
+            </w:pPr>
+            <w:r>
+              <w:rPr>
+                <w:rtl/>
+              </w:rPr>
+              <w:t xml:space="preserve">הושלם חלקית. באפליקציה, 3 סיסמאות שגויות כשהמערכת דרוכה מפעילות אזעקה ונועלות את ההתחברות ל-30‎ s. בקודן הפיזי קוד שגוי משמיע זמזום ארוך בלבד</w:t>
             </w:r>
           </w:p>
         </w:tc>
@@ -7707,10 +7767,18 @@
     </w:p>
     <w:p>
       <w:pPr>
-        <w:pStyle w:val="ImageCaption"/>
-        <w:keepNext/>
-        <w:spacing w:before="160" w:after="80"/>
-        <w:jc w:val="center"/>
+        <w:pStyle w:val="FirstParagraph"/>
+      </w:pPr>
+      <w:r>
+        <w:rPr>
+          <w:rtl/>
+        </w:rPr>
+        <w:t xml:space="preserve">רוב הקשיים התגלו רק כשהקוד רץ על הבקרים. חמישה מהם מתוארים כאן.</w:t>
+      </w:r>
+    </w:p>
+    <w:p>
+      <w:pPr>
+        <w:pStyle w:val="BodyText"/>
       </w:pPr>
       <w:r>
         <w:rPr>
@@ -7718,460 +7786,121 @@
           <w:bCs/>
           <w:rtl/>
         </w:rPr>
-        <w:t xml:space="preserve">טבלה 7: אתגרים ופתרונות</w:t>
-      </w:r>
-    </w:p>
-    <w:tbl>
-      <w:tblPr>
-        <w:tblStyle w:val="Table"/>
-        <w:bidiVisual/>
-        <w:tblW w:w="9000" w:type="dxa"/>
-        <w:jc w:val="center"/>
-        <w:tblLayout w:type="fixed"/>
-        <w:tblCellMar>
-          <w:top w:w="40" w:type="dxa"/>
-          <w:left w:w="80" w:type="dxa"/>
-          <w:bottom w:w="40" w:type="dxa"/>
-          <w:right w:w="80" w:type="dxa"/>
-        </w:tblCellMar>
-      </w:tblPr>
-      <w:tblGrid>
-        <w:gridCol w:w="4721"/>
-        <w:gridCol w:w="4279"/>
-      </w:tblGrid>
-      <w:tr>
-        <w:trPr>
-          <w:tblHeader w:val="true"/>
-          <w:cantSplit/>
-          <w:tblHeader/>
-        </w:trPr>
-        <w:tc>
-          <w:tcPr>
-            <w:tcW w:w="4721" w:type="dxa"/>
-            <w:tcBorders>
-              <w:top w:val="single" w:sz="4" w:space="0" w:color="999999"/>
-              <w:left w:val="single" w:sz="4" w:space="0" w:color="999999"/>
-              <w:bottom w:val="single" w:sz="4" w:space="0" w:color="999999"/>
-              <w:right w:val="single" w:sz="4" w:space="0" w:color="999999"/>
-            </w:tcBorders>
-            <w:shd w:val="clear" w:color="auto" w:fill="E7ECE8"/>
-            <w:vAlign w:val="center"/>
-          </w:tcPr>
-          <w:p>
-            <w:pPr>
-              <w:pStyle w:val="Compact"/>
-              <w:keepNext/>
-              <w:jc w:val="center"/>
-            </w:pPr>
-            <w:r>
-              <w:rPr>
-                <w:b/>
-                <w:bCs/>
-                <w:rtl/>
-              </w:rPr>
-              <w:t xml:space="preserve">אתגר</w:t>
-            </w:r>
-          </w:p>
-        </w:tc>
-        <w:tc>
-          <w:tcPr>
-            <w:tcW w:w="4279" w:type="dxa"/>
-            <w:tcBorders>
-              <w:top w:val="single" w:sz="4" w:space="0" w:color="999999"/>
-              <w:left w:val="single" w:sz="4" w:space="0" w:color="999999"/>
-              <w:bottom w:val="single" w:sz="4" w:space="0" w:color="999999"/>
-              <w:right w:val="single" w:sz="4" w:space="0" w:color="999999"/>
-            </w:tcBorders>
-            <w:shd w:val="clear" w:color="auto" w:fill="E7ECE8"/>
-            <w:vAlign w:val="center"/>
-          </w:tcPr>
-          <w:p>
-            <w:pPr>
-              <w:pStyle w:val="Compact"/>
-              <w:keepNext/>
-              <w:jc w:val="center"/>
-            </w:pPr>
-            <w:r>
-              <w:rPr>
-                <w:b/>
-                <w:bCs/>
-                <w:rtl/>
-              </w:rPr>
-              <w:t xml:space="preserve">פתרון</w:t>
-            </w:r>
-          </w:p>
-        </w:tc>
-      </w:tr>
-      <w:tr>
-        <w:trPr>
-          <w:cantSplit/>
-        </w:trPr>
-        <w:tc>
-          <w:tcPr>
-            <w:tcW w:w="4721" w:type="dxa"/>
-            <w:tcBorders>
-              <w:top w:val="single" w:sz="4" w:space="0" w:color="999999"/>
-              <w:left w:val="single" w:sz="4" w:space="0" w:color="999999"/>
-              <w:bottom w:val="single" w:sz="4" w:space="0" w:color="999999"/>
-              <w:right w:val="single" w:sz="4" w:space="0" w:color="999999"/>
-            </w:tcBorders>
-            <w:vAlign w:val="center"/>
-          </w:tcPr>
-          <w:p>
-            <w:pPr>
-              <w:pStyle w:val="Compact"/>
-              <w:keepNext/>
-            </w:pPr>
-            <w:r>
-              <w:rPr>
-                <w:rtl/>
-              </w:rPr>
-              <w:t xml:space="preserve">אחרי קוד נכון הזמזמים נדלקו שוב</w:t>
-            </w:r>
-          </w:p>
-        </w:tc>
-        <w:tc>
-          <w:tcPr>
-            <w:tcW w:w="4279" w:type="dxa"/>
-            <w:tcBorders>
-              <w:top w:val="single" w:sz="4" w:space="0" w:color="999999"/>
-              <w:left w:val="single" w:sz="4" w:space="0" w:color="999999"/>
-              <w:bottom w:val="single" w:sz="4" w:space="0" w:color="999999"/>
-              <w:right w:val="single" w:sz="4" w:space="0" w:color="999999"/>
-            </w:tcBorders>
-            <w:vAlign w:val="center"/>
-          </w:tcPr>
-          <w:p>
-            <w:pPr>
-              <w:pStyle w:val="Compact"/>
-              <w:keepNext/>
-            </w:pPr>
-            <w:r>
-              <w:rPr>
-                <w:rtl/>
-              </w:rPr>
-              <w:t xml:space="preserve">חסרה בקוד פקודה שעוצרת את הבדיקה. תוקן</w:t>
-            </w:r>
-          </w:p>
-        </w:tc>
-      </w:tr>
-      <w:tr>
-        <w:trPr>
-          <w:cantSplit/>
-        </w:trPr>
-        <w:tc>
-          <w:tcPr>
-            <w:tcW w:w="4721" w:type="dxa"/>
-            <w:tcBorders>
-              <w:top w:val="single" w:sz="4" w:space="0" w:color="999999"/>
-              <w:left w:val="single" w:sz="4" w:space="0" w:color="999999"/>
-              <w:bottom w:val="single" w:sz="4" w:space="0" w:color="999999"/>
-              <w:right w:val="single" w:sz="4" w:space="0" w:color="999999"/>
-            </w:tcBorders>
-            <w:vAlign w:val="center"/>
-          </w:tcPr>
-          <w:p>
-            <w:pPr>
-              <w:pStyle w:val="Compact"/>
-              <w:keepNext/>
-            </w:pPr>
-            <w:r>
-              <w:rPr>
-                <w:rtl/>
-              </w:rPr>
-              <w:t xml:space="preserve">אזעקה שהתחילה בחיישן אחר לא הפעילה זמזם בדלת</w:t>
-            </w:r>
-          </w:p>
-        </w:tc>
-        <w:tc>
-          <w:tcPr>
-            <w:tcW w:w="4279" w:type="dxa"/>
-            <w:tcBorders>
-              <w:top w:val="single" w:sz="4" w:space="0" w:color="999999"/>
-              <w:left w:val="single" w:sz="4" w:space="0" w:color="999999"/>
-              <w:bottom w:val="single" w:sz="4" w:space="0" w:color="999999"/>
-              <w:right w:val="single" w:sz="4" w:space="0" w:color="999999"/>
-            </w:tcBorders>
-            <w:vAlign w:val="center"/>
-          </w:tcPr>
-          <w:p>
-            <w:pPr>
-              <w:pStyle w:val="Compact"/>
-              <w:keepNext/>
-            </w:pPr>
-            <w:r>
-              <w:rPr>
-                <w:rtl/>
-              </w:rPr>
-              <w:t xml:space="preserve">הבקנד שולח לבקר הדלת פקודה להפעיל את הזמזמים</w:t>
-            </w:r>
-          </w:p>
-        </w:tc>
-      </w:tr>
-      <w:tr>
-        <w:trPr>
-          <w:cantSplit/>
-        </w:trPr>
-        <w:tc>
-          <w:tcPr>
-            <w:tcW w:w="4721" w:type="dxa"/>
-            <w:tcBorders>
-              <w:top w:val="single" w:sz="4" w:space="0" w:color="999999"/>
-              <w:left w:val="single" w:sz="4" w:space="0" w:color="999999"/>
-              <w:bottom w:val="single" w:sz="4" w:space="0" w:color="999999"/>
-              <w:right w:val="single" w:sz="4" w:space="0" w:color="999999"/>
-            </w:tcBorders>
-            <w:vAlign w:val="center"/>
-          </w:tcPr>
-          <w:p>
-            <w:pPr>
-              <w:pStyle w:val="Compact"/>
-              <w:keepNext/>
-            </w:pPr>
-            <w:r>
-              <w:rPr>
-                <w:rtl/>
-              </w:rPr>
-              <w:t xml:space="preserve">חיישן המרחק פספס עצמים</w:t>
-            </w:r>
-          </w:p>
-        </w:tc>
-        <w:tc>
-          <w:tcPr>
-            <w:tcW w:w="4279" w:type="dxa"/>
-            <w:tcBorders>
-              <w:top w:val="single" w:sz="4" w:space="0" w:color="999999"/>
-              <w:left w:val="single" w:sz="4" w:space="0" w:color="999999"/>
-              <w:bottom w:val="single" w:sz="4" w:space="0" w:color="999999"/>
-              <w:right w:val="single" w:sz="4" w:space="0" w:color="999999"/>
-            </w:tcBorders>
-            <w:vAlign w:val="center"/>
-          </w:tcPr>
-          <w:p>
-            <w:pPr>
-              <w:pStyle w:val="Compact"/>
-              <w:keepNext/>
-            </w:pPr>
-            <w:r>
-              <w:rPr>
-                <w:rtl/>
-              </w:rPr>
-              <w:t xml:space="preserve">המרחק הרגיל נמדד בכל הפעלה, והסף הוחמר</w:t>
-            </w:r>
-          </w:p>
-        </w:tc>
-      </w:tr>
-      <w:tr>
-        <w:trPr>
-          <w:cantSplit/>
-        </w:trPr>
-        <w:tc>
-          <w:tcPr>
-            <w:tcW w:w="4721" w:type="dxa"/>
-            <w:tcBorders>
-              <w:top w:val="single" w:sz="4" w:space="0" w:color="999999"/>
-              <w:left w:val="single" w:sz="4" w:space="0" w:color="999999"/>
-              <w:bottom w:val="single" w:sz="4" w:space="0" w:color="999999"/>
-              <w:right w:val="single" w:sz="4" w:space="0" w:color="999999"/>
-            </w:tcBorders>
-            <w:vAlign w:val="center"/>
-          </w:tcPr>
-          <w:p>
-            <w:pPr>
-              <w:pStyle w:val="Compact"/>
-              <w:keepNext/>
-            </w:pPr>
-            <w:r>
-              <w:rPr>
-                <w:rtl/>
-              </w:rPr>
-              <w:t xml:space="preserve">בקר הדלת לא הגיב לפקודות בזמן שדיווח לבקנד</w:t>
-            </w:r>
-          </w:p>
-        </w:tc>
-        <w:tc>
-          <w:tcPr>
-            <w:tcW w:w="4279" w:type="dxa"/>
-            <w:tcBorders>
-              <w:top w:val="single" w:sz="4" w:space="0" w:color="999999"/>
-              <w:left w:val="single" w:sz="4" w:space="0" w:color="999999"/>
-              <w:bottom w:val="single" w:sz="4" w:space="0" w:color="999999"/>
-              <w:right w:val="single" w:sz="4" w:space="0" w:color="999999"/>
-            </w:tcBorders>
-            <w:vAlign w:val="center"/>
-          </w:tcPr>
-          <w:p>
-            <w:pPr>
-              <w:pStyle w:val="Compact"/>
-              <w:keepNext/>
-            </w:pPr>
-            <w:r>
-              <w:rPr>
-                <w:rtl/>
-              </w:rPr>
-              <w:t xml:space="preserve">הדיווח עבר לרקע</w:t>
-            </w:r>
-          </w:p>
-        </w:tc>
-      </w:tr>
-      <w:tr>
-        <w:trPr>
-          <w:cantSplit/>
-        </w:trPr>
-        <w:tc>
-          <w:tcPr>
-            <w:tcW w:w="4721" w:type="dxa"/>
-            <w:tcBorders>
-              <w:top w:val="single" w:sz="4" w:space="0" w:color="999999"/>
-              <w:left w:val="single" w:sz="4" w:space="0" w:color="999999"/>
-              <w:bottom w:val="single" w:sz="4" w:space="0" w:color="999999"/>
-              <w:right w:val="single" w:sz="4" w:space="0" w:color="999999"/>
-            </w:tcBorders>
-            <w:vAlign w:val="center"/>
-          </w:tcPr>
-          <w:p>
-            <w:pPr>
-              <w:pStyle w:val="Compact"/>
-              <w:keepNext/>
-            </w:pPr>
-            <w:r>
-              <w:rPr>
-                <w:rtl/>
-              </w:rPr>
-              <w:t xml:space="preserve">הווידאו החי עצר את שליחת התמונות לזיהוי פנים</w:t>
-            </w:r>
-          </w:p>
-        </w:tc>
-        <w:tc>
-          <w:tcPr>
-            <w:tcW w:w="4279" w:type="dxa"/>
-            <w:tcBorders>
-              <w:top w:val="single" w:sz="4" w:space="0" w:color="999999"/>
-              <w:left w:val="single" w:sz="4" w:space="0" w:color="999999"/>
-              <w:bottom w:val="single" w:sz="4" w:space="0" w:color="999999"/>
-              <w:right w:val="single" w:sz="4" w:space="0" w:color="999999"/>
-            </w:tcBorders>
-            <w:vAlign w:val="center"/>
-          </w:tcPr>
-          <w:p>
-            <w:pPr>
-              <w:pStyle w:val="Compact"/>
-              <w:keepNext/>
-            </w:pPr>
-            <w:r>
-              <w:rPr>
-                <w:rtl/>
-              </w:rPr>
-              <w:t xml:space="preserve">שרת נפרד במצלמה שרץ במקביל</w:t>
-            </w:r>
-          </w:p>
-        </w:tc>
-      </w:tr>
-      <w:tr>
-        <w:trPr>
-          <w:cantSplit/>
-        </w:trPr>
-        <w:tc>
-          <w:tcPr>
-            <w:tcW w:w="4721" w:type="dxa"/>
-            <w:tcBorders>
-              <w:top w:val="single" w:sz="4" w:space="0" w:color="999999"/>
-              <w:left w:val="single" w:sz="4" w:space="0" w:color="999999"/>
-              <w:bottom w:val="single" w:sz="4" w:space="0" w:color="999999"/>
-              <w:right w:val="single" w:sz="4" w:space="0" w:color="999999"/>
-            </w:tcBorders>
-            <w:vAlign w:val="center"/>
-          </w:tcPr>
-          <w:p>
-            <w:pPr>
-              <w:pStyle w:val="Compact"/>
-              <w:keepNext/>
-            </w:pPr>
-            <w:r>
-              <w:rPr>
-                <w:rtl/>
-              </w:rPr>
-              <w:t xml:space="preserve">כתובת ה-IP של המחשב משתנה, ובקר עם כתובת ישנה נראה כמו תקלה</w:t>
-            </w:r>
-          </w:p>
-        </w:tc>
-        <w:tc>
-          <w:tcPr>
-            <w:tcW w:w="4279" w:type="dxa"/>
-            <w:tcBorders>
-              <w:top w:val="single" w:sz="4" w:space="0" w:color="999999"/>
-              <w:left w:val="single" w:sz="4" w:space="0" w:color="999999"/>
-              <w:bottom w:val="single" w:sz="4" w:space="0" w:color="999999"/>
-              <w:right w:val="single" w:sz="4" w:space="0" w:color="999999"/>
-            </w:tcBorders>
-            <w:vAlign w:val="center"/>
-          </w:tcPr>
-          <w:p>
-            <w:pPr>
-              <w:pStyle w:val="Compact"/>
-              <w:keepNext/>
-            </w:pPr>
-            <w:r>
-              <w:rPr>
-                <w:rtl/>
-              </w:rPr>
-              <w:t xml:space="preserve">הבקנד בודק בהפעלה אם הבקרים מכוונים לכתובת הנוכחית ומזהיר</w:t>
-            </w:r>
-          </w:p>
-        </w:tc>
-      </w:tr>
-      <w:tr>
-        <w:trPr>
-          <w:cantSplit/>
-        </w:trPr>
-        <w:tc>
-          <w:tcPr>
-            <w:tcW w:w="4721" w:type="dxa"/>
-            <w:tcBorders>
-              <w:top w:val="single" w:sz="4" w:space="0" w:color="999999"/>
-              <w:left w:val="single" w:sz="4" w:space="0" w:color="999999"/>
-              <w:bottom w:val="single" w:sz="4" w:space="0" w:color="999999"/>
-              <w:right w:val="single" w:sz="4" w:space="0" w:color="999999"/>
-            </w:tcBorders>
-            <w:vAlign w:val="center"/>
-          </w:tcPr>
-          <w:p>
-            <w:pPr>
-              <w:pStyle w:val="Compact"/>
-            </w:pPr>
-            <w:r>
-              <w:rPr>
-                <w:rtl/>
-              </w:rPr>
-              <w:t xml:space="preserve">בניית האפליקציה ל-Android נכשלה ב-Windows</w:t>
-            </w:r>
-          </w:p>
-        </w:tc>
-        <w:tc>
-          <w:tcPr>
-            <w:tcW w:w="4279" w:type="dxa"/>
-            <w:tcBorders>
-              <w:top w:val="single" w:sz="4" w:space="0" w:color="999999"/>
-              <w:left w:val="single" w:sz="4" w:space="0" w:color="999999"/>
-              <w:bottom w:val="single" w:sz="4" w:space="0" w:color="999999"/>
-              <w:right w:val="single" w:sz="4" w:space="0" w:color="999999"/>
-            </w:tcBorders>
-            <w:vAlign w:val="center"/>
-          </w:tcPr>
-          <w:p>
-            <w:pPr>
-              <w:pStyle w:val="Compact"/>
-            </w:pPr>
-            <w:r>
-              <w:rPr>
-                <w:rtl/>
-              </w:rPr>
-              <w:t xml:space="preserve">בנייה דרך WSL2</w:t>
-            </w:r>
-          </w:p>
-        </w:tc>
-      </w:tr>
-    </w:tbl>
+        <w:t xml:space="preserve">הזמזמים נדלקו שוב אחרי קוד נכון.</w:t>
+      </w:r>
+      <w:r>
+        <w:t xml:space="preserve"> </w:t>
+      </w:r>
+      <w:r>
+        <w:rPr>
+          <w:rtl/>
+        </w:rPr>
+        <w:t xml:space="preserve">בספירת הכניסה, אחרי שהוקש קוד נכון, הסירנה והצפצופים נעצרו ומיד נדלקו מחדש. הסיבה הייתה פקודה חסרה בקוד: בענף שמטפל בנטרול לא היה</w:t>
+      </w:r>
+      <w:r>
+        <w:t xml:space="preserve"> </w:t>
+      </w:r>
+      <w:r>
+        <w:rPr>
+          <w:rStyle w:val="VerbatimChar"/>
+        </w:rPr>
+        <w:t xml:space="preserve">break</w:t>
+      </w:r>
+      <w:r>
+        <w:rPr>
+          <w:rtl/>
+        </w:rPr>
+        <w:t xml:space="preserve">, והביצוע המשיך באותה ריצה של הלולאה אל החלק שמפעיל את הצפצופים. התיקון היה הוספת הפקודה החסרה. תקלה כזאת לא נראית בבדיקות על המחשב, כי היא תלויה בלולאה שרצה על הבקר.</w:t>
+      </w:r>
+    </w:p>
+    <w:p>
+      <w:pPr>
+        <w:pStyle w:val="BodyText"/>
+      </w:pPr>
+      <w:r>
+        <w:rPr>
+          <w:b/>
+          <w:bCs/>
+          <w:rtl/>
+        </w:rPr>
+        <w:t xml:space="preserve">בקר הדלת לא ענה בזמן שדיווח לבקנד.</w:t>
+      </w:r>
+      <w:r>
+        <w:t xml:space="preserve"> </w:t>
+      </w:r>
+      <w:r>
+        <w:rPr>
+          <w:rtl/>
+        </w:rPr>
+        <w:t xml:space="preserve">הלולאה הראשית של בקר הדלת שלחה דיווחים לבקנד ברצף, ובקשה אחת יכלה לחסום אותה עד 10‎ s. בזמן הזה הבקר לא ענה לפקודות מהבקנד (דריכה, נטרול והפעלת סירנה) ופספס לחיצות על הקודן. התיקון נעשה בשני שלבים: מגבלת זמן של 1‎ s לכל בקשה, ואחר כך העברת הדיווח לתור ולמשימה נפרדת שרצה ברקע.</w:t>
+      </w:r>
+    </w:p>
+    <w:p>
+      <w:pPr>
+        <w:pStyle w:val="BodyText"/>
+      </w:pPr>
+      <w:r>
+        <w:rPr>
+          <w:b/>
+          <w:bCs/>
+          <w:rtl/>
+        </w:rPr>
+        <w:t xml:space="preserve">חיישן המרחק יכול לפספס חדירה.</w:t>
+      </w:r>
+      <w:r>
+        <w:t xml:space="preserve"> </w:t>
+      </w:r>
+      <w:r>
+        <w:rPr>
+          <w:rtl/>
+        </w:rPr>
+        <w:t xml:space="preserve">בגרסה הראשונה הסף היה רחב: סטייה של 30‎ cm ו-8 קריאות ברצף. חדירה בעצם קטן או במרחק גבולי יכלה לעבור בלי זיהוי. הסף הוחמר ל-10‎ cm ול-5 קריאות, והמרחק הרגיל נמדד מחדש בכל הפעלה ולא נקבע מראש. כדי שמדידה בזמן שמישהו עומד מול החיישן לא תקבע מרחק שגוי, נוספו גבולות סבירות (בין 1‎ m ל-4‎ m) ושמירה של המרחק האחרון התקין.</w:t>
+      </w:r>
+    </w:p>
+    <w:p>
+      <w:pPr>
+        <w:pStyle w:val="BodyText"/>
+      </w:pPr>
+      <w:r>
+        <w:rPr>
+          <w:b/>
+          <w:bCs/>
+          <w:rtl/>
+        </w:rPr>
+        <w:t xml:space="preserve">כתובת ה-IP של המחשב משתנה.</w:t>
+      </w:r>
+      <w:r>
+        <w:t xml:space="preserve"> </w:t>
+      </w:r>
+      <w:r>
+        <w:rPr>
+          <w:rtl/>
+        </w:rPr>
+        <w:t xml:space="preserve">ברשת עם DHCP כתובת המחשב מתחלפת מדי פעם, ובקר שנצרב עם כתובת ישנה לא מגיע לבקנד. הוא נראה כמו תקלת חומרה, והבעיה חזרה כמה פעמים. בהפעלה הבקנד משווה עכשיו את הכתובת הנוכחית לכתובת שצרובה בכל בקר ומזהיר ביומן אם יש אי-התאמה. התיקון עצמו עדיין דורש צריבה מחדש של הבקר.</w:t>
+      </w:r>
+    </w:p>
+    <w:p>
+      <w:pPr>
+        <w:pStyle w:val="BodyText"/>
+      </w:pPr>
+      <w:r>
+        <w:rPr>
+          <w:b/>
+          <w:bCs/>
+          <w:rtl/>
+        </w:rPr>
+        <w:t xml:space="preserve">צריבת ה-ESP32-CAM.</w:t>
+      </w:r>
+      <w:r>
+        <w:t xml:space="preserve"> </w:t>
+      </w:r>
+      <w:r>
+        <w:rPr>
+          <w:rtl/>
+        </w:rPr>
+        <w:t xml:space="preserve">ללוח המצלמה אין איפוס אוטומטי לצריבה, ולכן כל צריבה דורשת רצף ידני: להחזיק את BOOT, ללחוץ ולשחרר RESET, לשחרר את BOOT ולהתחיל מיד את ההעלאה. אחרי ההעלאה לוחצים RESET כדי שהקוד החדש ירוץ. בלי הרצף ההעלאה נכשלת בשגיאה "Failed to connect to ESP32".</w:t>
+      </w:r>
+    </w:p>
     <w:bookmarkEnd w:id="50"/>
     <w:bookmarkStart w:id="51" w:name="מסקנות"/>
     <w:p>
@@ -8214,7 +7943,7 @@
         <w:rPr>
           <w:rtl/>
         </w:rPr>
-        <w:t xml:space="preserve">רוב הבעיות התגלו רק על החומרה, ולא בבדיקות על המחשב. כך היה עם הזמזמים שנדלקו שוב אחרי קוד נכון, ועם בקר הדלת שלא הגיב לפקודות בזמן שדיווח לבקנד (טבלה 7). בדיקות אוטומטיות לא מחליפות בדיקה פיזית.</w:t>
+        <w:t xml:space="preserve">רוב הבעיות התגלו רק על החומרה, ולא בבדיקות על המחשב. כך היה עם הזמזמים שנדלקו שוב אחרי קוד נכון, ועם בקר הדלת שלא הגיב לפקודות בזמן שדיווח לבקנד (סעיף 6.2). בדיקות אוטומטיות לא מחליפות בדיקה פיזית.</w:t>
       </w:r>
     </w:p>
     <w:p>
@@ -8246,7 +7975,7 @@
         <w:rPr>
           <w:rtl/>
         </w:rPr>
-        <w:t xml:space="preserve">חיישן שנכשל בשקט מסוכן יותר מחיישן שנכשל בקול. למשל, מרחק רגיל שנמדד לא נכון גורם לחיישן להפסיק לזהות בלי שום סימן חיצוני. לכן הבקרים מוסיפים בדיקות שפיות ודיווח תקלה.</w:t>
+        <w:t xml:space="preserve">חיישן שנכשל בשקט מסוכן יותר מחיישן שנכשל בקול. למשל, מרחק רגיל שנמדד לא נכון גורם לחיישן להפסיק לזהות בלי שום סימן חיצוני. לכן בקרי החיישנים מוסיפים בדיקות שפיות ומדווחים תקלה לבקנד, אף שהיא עדיין לא מוצגת באפליקציה.</w:t>
       </w:r>
     </w:p>
     <w:p>
@@ -8637,7 +8366,7 @@
         <w:rPr>
           <w:rtl/>
         </w:rPr>
-        <w:t xml:space="preserve">הרכיבים שבהם נבנתה המערכת מפורטים בטבלה 8.</w:t>
+        <w:t xml:space="preserve">הרכיבים שבהם נבנתה המערכת מפורטים בטבלה 7.</w:t>
       </w:r>
     </w:p>
     <w:p>
@@ -8653,7 +8382,7 @@
           <w:bCs/>
           <w:rtl/>
         </w:rPr>
-        <w:t xml:space="preserve">טבלה 8: רשימת חומרים</w:t>
+        <w:t xml:space="preserve">טבלה 7: רשימת חומרים</w:t>
       </w:r>
     </w:p>
     <w:tbl>
@@ -9695,7 +9424,7 @@
         <w:rPr>
           <w:rtl/>
         </w:rPr>
-        <w:t xml:space="preserve">טבלה 9 מסבירה צעד אחר צעד איך דורכים, נכנסים ומנטרלים, בקודן שליד הדלת ובאפליקציה. טבלה 10 מסבירה פעולות שנעשות באפליקציה בלבד. שמות הכפתורים והמסכים מופיעים כפי שהם באפליקציה.</w:t>
+        <w:t xml:space="preserve">טבלה 8 מסבירה צעד אחר צעד איך דורכים, נכנסים ומנטרלים, בקודן שליד הדלת ובאפליקציה. טבלה 9 מסבירה פעולות שנעשות באפליקציה בלבד. שמות הכפתורים והמסכים מופיעים כפי שהם באפליקציה.</w:t>
       </w:r>
     </w:p>
     <w:p>
@@ -9711,7 +9440,7 @@
           <w:bCs/>
           <w:rtl/>
         </w:rPr>
-        <w:t xml:space="preserve">טבלה 9: דריכה, כניסה ונטרול</w:t>
+        <w:t xml:space="preserve">טבלה 8: דריכה, כניסה ונטרול</w:t>
       </w:r>
     </w:p>
     <w:tbl>
@@ -10194,7 +9923,7 @@
           <w:bCs/>
           <w:rtl/>
         </w:rPr>
-        <w:t xml:space="preserve">טבלה 10: פעולות באפליקציה</w:t>
+        <w:t xml:space="preserve">טבלה 9: פעולות באפליקציה</w:t>
       </w:r>
     </w:p>
     <w:tbl>
@@ -10693,8 +10422,8 @@
     <w:bookmarkEnd w:id="56"/>
     <w:bookmarkEnd w:id="57"/>
     <w:sectPr>
-      <w:footerReference w:type="default" r:id="rId14"/>
-      <w:footerReference w:type="first" r:id="rId15"/>
+      <w:footerReference w:type="default" r:id="rId15"/>
+      <w:footerReference w:type="first" r:id="rId16"/>
       <w:pgSz w:h="16838" w:w="11906"/>
       <w:pgMar w:bottom="1440" w:left="1440" w:right="1440" w:top="1440" w:header="708" w:footer="708" w:gutter="0"/>
       <w:titlePg/>

</xml_diff>

<commit_message>
Add the problem statement and a short overview to the introduction; table 5 now lists the observed result and a pass status for every scenario
</commit_message>
<xml_diff>
--- a/report/HomeGuard_Report.docx
+++ b/report/HomeGuard_Report.docx
@@ -734,6 +734,17 @@
           <w:rtl/>
         </w:rPr>
         <w:t xml:space="preserve">הפרויקט נבחר כדי לשלב חומרה ותוכנה: כמה חיישנים שונים, כדי להתנסות בכל אחד מהם, ותוכנה שמחברת אותם למערכת אזעקה אחת. המערכת היברידית, כלומר חלק מהעבודה נעשה בבקרים הקטנים וחלק במחשב, ומרובת שכבות: כמה סוגי חיישנים, קודן וזיהוי פנים.</w:t>
+      </w:r>
+    </w:p>
+    <w:p>
+      <w:pPr>
+        <w:pStyle w:val="BodyText"/>
+      </w:pPr>
+      <w:r>
+        <w:rPr>
+          <w:rtl/>
+        </w:rPr>
+        <w:t xml:space="preserve">הבעיה: לזהות חדירה לבית ולהגיב אליה בסירנה ובהתראה לבעלים, תוך שילוב כמה סוגי חיישנים, נטרול בקודן ובטלפון וזיהוי של דיירים. הדוח מציג את הרקע התיאורטי (פרק 3), את התכנון והמימוש (פרק 4), את הבדיקות והתוצאות (פרק 5) ואת הסיכום (פרק 6).</w:t>
       </w:r>
     </w:p>
     <w:p>
@@ -5832,7 +5843,7 @@
         <w:rPr>
           <w:rtl/>
         </w:rPr>
-        <w:t xml:space="preserve">טבלה 5 מפרטת את התרחישים שנבדקו ואת התוצאה המצופה בכל אחד מהם.</w:t>
+        <w:t xml:space="preserve">טבלה 5 מפרטת את התרחישים שנבדקו, את התוצאה שנצפתה ואת הסטטוס של כל אחד מהם.</w:t>
       </w:r>
     </w:p>
     <w:p>
@@ -5866,8 +5877,10 @@
         </w:tblCellMar>
       </w:tblPr>
       <w:tblGrid>
-        <w:gridCol w:w="3962"/>
-        <w:gridCol w:w="5038"/>
+        <w:gridCol w:w="632"/>
+        <w:gridCol w:w="3038"/>
+        <w:gridCol w:w="4179"/>
+        <w:gridCol w:w="1151"/>
       </w:tblGrid>
       <w:tr>
         <w:trPr>
@@ -5877,7 +5890,7 @@
         </w:trPr>
         <w:tc>
           <w:tcPr>
-            <w:tcW w:w="3962" w:type="dxa"/>
+            <w:tcW w:w="632" w:type="dxa"/>
             <w:tcBorders>
               <w:top w:val="single" w:sz="4" w:space="0" w:color="999999"/>
               <w:left w:val="single" w:sz="4" w:space="0" w:color="999999"/>
@@ -5896,15 +5909,14 @@
               <w:rPr>
                 <w:b/>
                 <w:bCs/>
-                <w:rtl/>
-              </w:rPr>
-              <w:t xml:space="preserve">תרחיש</w:t>
-            </w:r>
-          </w:p>
-        </w:tc>
-        <w:tc>
-          <w:tcPr>
-            <w:tcW w:w="5038" w:type="dxa"/>
+              </w:rPr>
+              <w:t xml:space="preserve">#</w:t>
+            </w:r>
+          </w:p>
+        </w:tc>
+        <w:tc>
+          <w:tcPr>
+            <w:tcW w:w="3038" w:type="dxa"/>
             <w:tcBorders>
               <w:top w:val="single" w:sz="4" w:space="0" w:color="999999"/>
               <w:left w:val="single" w:sz="4" w:space="0" w:color="999999"/>
@@ -5925,7 +5937,61 @@
                 <w:bCs/>
                 <w:rtl/>
               </w:rPr>
-              <w:t xml:space="preserve">מה אמור לקרות</w:t>
+              <w:t xml:space="preserve">תרחיש</w:t>
+            </w:r>
+          </w:p>
+        </w:tc>
+        <w:tc>
+          <w:tcPr>
+            <w:tcW w:w="4179" w:type="dxa"/>
+            <w:tcBorders>
+              <w:top w:val="single" w:sz="4" w:space="0" w:color="999999"/>
+              <w:left w:val="single" w:sz="4" w:space="0" w:color="999999"/>
+              <w:bottom w:val="single" w:sz="4" w:space="0" w:color="999999"/>
+              <w:right w:val="single" w:sz="4" w:space="0" w:color="999999"/>
+            </w:tcBorders>
+            <w:shd w:val="clear" w:color="auto" w:fill="E7ECE8"/>
+            <w:vAlign w:val="center"/>
+          </w:tcPr>
+          <w:p>
+            <w:pPr>
+              <w:pStyle w:val="Compact"/>
+              <w:jc w:val="center"/>
+            </w:pPr>
+            <w:r>
+              <w:rPr>
+                <w:b/>
+                <w:bCs/>
+                <w:rtl/>
+              </w:rPr>
+              <w:t xml:space="preserve">תוצאה שנצפתה</w:t>
+            </w:r>
+          </w:p>
+        </w:tc>
+        <w:tc>
+          <w:tcPr>
+            <w:tcW w:w="1151" w:type="dxa"/>
+            <w:tcBorders>
+              <w:top w:val="single" w:sz="4" w:space="0" w:color="999999"/>
+              <w:left w:val="single" w:sz="4" w:space="0" w:color="999999"/>
+              <w:bottom w:val="single" w:sz="4" w:space="0" w:color="999999"/>
+              <w:right w:val="single" w:sz="4" w:space="0" w:color="999999"/>
+            </w:tcBorders>
+            <w:shd w:val="clear" w:color="auto" w:fill="E7ECE8"/>
+            <w:vAlign w:val="center"/>
+          </w:tcPr>
+          <w:p>
+            <w:pPr>
+              <w:pStyle w:val="Compact"/>
+              <w:jc w:val="center"/>
+            </w:pPr>
+            <w:r>
+              <w:rPr>
+                <w:b/>
+                <w:bCs/>
+                <w:rtl/>
+              </w:rPr>
+              <w:t xml:space="preserve">סטטוס</w:t>
             </w:r>
           </w:p>
         </w:tc>
@@ -5936,7 +6002,27 @@
         </w:trPr>
         <w:tc>
           <w:tcPr>
-            <w:tcW w:w="3962" w:type="dxa"/>
+            <w:tcW w:w="632" w:type="dxa"/>
+            <w:tcBorders>
+              <w:top w:val="single" w:sz="4" w:space="0" w:color="999999"/>
+              <w:left w:val="single" w:sz="4" w:space="0" w:color="999999"/>
+              <w:bottom w:val="single" w:sz="4" w:space="0" w:color="999999"/>
+              <w:right w:val="single" w:sz="4" w:space="0" w:color="999999"/>
+            </w:tcBorders>
+            <w:vAlign w:val="center"/>
+          </w:tcPr>
+          <w:p>
+            <w:pPr>
+              <w:pStyle w:val="Compact"/>
+            </w:pPr>
+            <w:r>
+              <w:t xml:space="preserve">1</w:t>
+            </w:r>
+          </w:p>
+        </w:tc>
+        <w:tc>
+          <w:tcPr>
+            <w:tcW w:w="3038" w:type="dxa"/>
             <w:tcBorders>
               <w:top w:val="single" w:sz="4" w:space="0" w:color="999999"/>
               <w:left w:val="single" w:sz="4" w:space="0" w:color="999999"/>
@@ -5974,24 +6060,47 @@
         </w:tc>
         <w:tc>
           <w:tcPr>
-            <w:tcW w:w="5038" w:type="dxa"/>
-            <w:tcBorders>
-              <w:top w:val="single" w:sz="4" w:space="0" w:color="999999"/>
-              <w:left w:val="single" w:sz="4" w:space="0" w:color="999999"/>
-              <w:bottom w:val="single" w:sz="4" w:space="0" w:color="999999"/>
-              <w:right w:val="single" w:sz="4" w:space="0" w:color="999999"/>
-            </w:tcBorders>
-            <w:vAlign w:val="center"/>
-          </w:tcPr>
-          <w:p>
-            <w:pPr>
-              <w:pStyle w:val="Compact"/>
-            </w:pPr>
-            <w:r>
-              <w:rPr>
-                <w:rtl/>
-              </w:rPr>
-              <w:t xml:space="preserve">צליל דריכה, האפליקציה מציגה "דרוך"</w:t>
+            <w:tcW w:w="4179" w:type="dxa"/>
+            <w:tcBorders>
+              <w:top w:val="single" w:sz="4" w:space="0" w:color="999999"/>
+              <w:left w:val="single" w:sz="4" w:space="0" w:color="999999"/>
+              <w:bottom w:val="single" w:sz="4" w:space="0" w:color="999999"/>
+              <w:right w:val="single" w:sz="4" w:space="0" w:color="999999"/>
+            </w:tcBorders>
+            <w:vAlign w:val="center"/>
+          </w:tcPr>
+          <w:p>
+            <w:pPr>
+              <w:pStyle w:val="Compact"/>
+            </w:pPr>
+            <w:r>
+              <w:rPr>
+                <w:rtl/>
+              </w:rPr>
+              <w:t xml:space="preserve">נשמע צליל דריכה, והאפליקציה הציגה ARMED</w:t>
+            </w:r>
+          </w:p>
+        </w:tc>
+        <w:tc>
+          <w:tcPr>
+            <w:tcW w:w="1151" w:type="dxa"/>
+            <w:tcBorders>
+              <w:top w:val="single" w:sz="4" w:space="0" w:color="999999"/>
+              <w:left w:val="single" w:sz="4" w:space="0" w:color="999999"/>
+              <w:bottom w:val="single" w:sz="4" w:space="0" w:color="999999"/>
+              <w:right w:val="single" w:sz="4" w:space="0" w:color="999999"/>
+            </w:tcBorders>
+            <w:vAlign w:val="center"/>
+          </w:tcPr>
+          <w:p>
+            <w:pPr>
+              <w:pStyle w:val="Compact"/>
+            </w:pPr>
+            <w:r>
+              <w:rPr>
+                <w:rtl/>
+              </w:rPr>
+              <w:t xml:space="preserve">עבר</w:t>
             </w:r>
           </w:p>
         </w:tc>
@@ -6002,7 +6111,27 @@
         </w:trPr>
         <w:tc>
           <w:tcPr>
-            <w:tcW w:w="3962" w:type="dxa"/>
+            <w:tcW w:w="632" w:type="dxa"/>
+            <w:tcBorders>
+              <w:top w:val="single" w:sz="4" w:space="0" w:color="999999"/>
+              <w:left w:val="single" w:sz="4" w:space="0" w:color="999999"/>
+              <w:bottom w:val="single" w:sz="4" w:space="0" w:color="999999"/>
+              <w:right w:val="single" w:sz="4" w:space="0" w:color="999999"/>
+            </w:tcBorders>
+            <w:vAlign w:val="center"/>
+          </w:tcPr>
+          <w:p>
+            <w:pPr>
+              <w:pStyle w:val="Compact"/>
+            </w:pPr>
+            <w:r>
+              <w:t xml:space="preserve">2</w:t>
+            </w:r>
+          </w:p>
+        </w:tc>
+        <w:tc>
+          <w:tcPr>
+            <w:tcW w:w="3038" w:type="dxa"/>
             <w:tcBorders>
               <w:top w:val="single" w:sz="4" w:space="0" w:color="999999"/>
               <w:left w:val="single" w:sz="4" w:space="0" w:color="999999"/>
@@ -6025,24 +6154,47 @@
         </w:tc>
         <w:tc>
           <w:tcPr>
-            <w:tcW w:w="5038" w:type="dxa"/>
-            <w:tcBorders>
-              <w:top w:val="single" w:sz="4" w:space="0" w:color="999999"/>
-              <w:left w:val="single" w:sz="4" w:space="0" w:color="999999"/>
-              <w:bottom w:val="single" w:sz="4" w:space="0" w:color="999999"/>
-              <w:right w:val="single" w:sz="4" w:space="0" w:color="999999"/>
-            </w:tcBorders>
-            <w:vAlign w:val="center"/>
-          </w:tcPr>
-          <w:p>
-            <w:pPr>
-              <w:pStyle w:val="Compact"/>
-            </w:pPr>
-            <w:r>
-              <w:rPr>
-                <w:rtl/>
-              </w:rPr>
-              <w:t xml:space="preserve">הספירה נעצרת, המערכת מנוטרלת ונשמע צליל נטרול</w:t>
+            <w:tcW w:w="4179" w:type="dxa"/>
+            <w:tcBorders>
+              <w:top w:val="single" w:sz="4" w:space="0" w:color="999999"/>
+              <w:left w:val="single" w:sz="4" w:space="0" w:color="999999"/>
+              <w:bottom w:val="single" w:sz="4" w:space="0" w:color="999999"/>
+              <w:right w:val="single" w:sz="4" w:space="0" w:color="999999"/>
+            </w:tcBorders>
+            <w:vAlign w:val="center"/>
+          </w:tcPr>
+          <w:p>
+            <w:pPr>
+              <w:pStyle w:val="Compact"/>
+            </w:pPr>
+            <w:r>
+              <w:rPr>
+                <w:rtl/>
+              </w:rPr>
+              <w:t xml:space="preserve">הספירה נעצרה, המערכת נוטרלה ונשמע צליל נטרול</w:t>
+            </w:r>
+          </w:p>
+        </w:tc>
+        <w:tc>
+          <w:tcPr>
+            <w:tcW w:w="1151" w:type="dxa"/>
+            <w:tcBorders>
+              <w:top w:val="single" w:sz="4" w:space="0" w:color="999999"/>
+              <w:left w:val="single" w:sz="4" w:space="0" w:color="999999"/>
+              <w:bottom w:val="single" w:sz="4" w:space="0" w:color="999999"/>
+              <w:right w:val="single" w:sz="4" w:space="0" w:color="999999"/>
+            </w:tcBorders>
+            <w:vAlign w:val="center"/>
+          </w:tcPr>
+          <w:p>
+            <w:pPr>
+              <w:pStyle w:val="Compact"/>
+            </w:pPr>
+            <w:r>
+              <w:rPr>
+                <w:rtl/>
+              </w:rPr>
+              <w:t xml:space="preserve">עבר</w:t>
             </w:r>
           </w:p>
         </w:tc>
@@ -6053,47 +6205,90 @@
         </w:trPr>
         <w:tc>
           <w:tcPr>
-            <w:tcW w:w="3962" w:type="dxa"/>
-            <w:tcBorders>
-              <w:top w:val="single" w:sz="4" w:space="0" w:color="999999"/>
-              <w:left w:val="single" w:sz="4" w:space="0" w:color="999999"/>
-              <w:bottom w:val="single" w:sz="4" w:space="0" w:color="999999"/>
-              <w:right w:val="single" w:sz="4" w:space="0" w:color="999999"/>
-            </w:tcBorders>
-            <w:vAlign w:val="center"/>
-          </w:tcPr>
-          <w:p>
-            <w:pPr>
-              <w:pStyle w:val="Compact"/>
-            </w:pPr>
-            <w:r>
-              <w:rPr>
-                <w:rtl/>
-              </w:rPr>
-              <w:t xml:space="preserve">קוד שגוי</w:t>
-            </w:r>
-          </w:p>
-        </w:tc>
-        <w:tc>
-          <w:tcPr>
-            <w:tcW w:w="5038" w:type="dxa"/>
-            <w:tcBorders>
-              <w:top w:val="single" w:sz="4" w:space="0" w:color="999999"/>
-              <w:left w:val="single" w:sz="4" w:space="0" w:color="999999"/>
-              <w:bottom w:val="single" w:sz="4" w:space="0" w:color="999999"/>
-              <w:right w:val="single" w:sz="4" w:space="0" w:color="999999"/>
-            </w:tcBorders>
-            <w:vAlign w:val="center"/>
-          </w:tcPr>
-          <w:p>
-            <w:pPr>
-              <w:pStyle w:val="Compact"/>
-            </w:pPr>
-            <w:r>
-              <w:rPr>
-                <w:rtl/>
-              </w:rPr>
-              <w:t xml:space="preserve">זמזום ארוך, הספירה ממשיכה</w:t>
+            <w:tcW w:w="632" w:type="dxa"/>
+            <w:tcBorders>
+              <w:top w:val="single" w:sz="4" w:space="0" w:color="999999"/>
+              <w:left w:val="single" w:sz="4" w:space="0" w:color="999999"/>
+              <w:bottom w:val="single" w:sz="4" w:space="0" w:color="999999"/>
+              <w:right w:val="single" w:sz="4" w:space="0" w:color="999999"/>
+            </w:tcBorders>
+            <w:vAlign w:val="center"/>
+          </w:tcPr>
+          <w:p>
+            <w:pPr>
+              <w:pStyle w:val="Compact"/>
+            </w:pPr>
+            <w:r>
+              <w:t xml:space="preserve">3</w:t>
+            </w:r>
+          </w:p>
+        </w:tc>
+        <w:tc>
+          <w:tcPr>
+            <w:tcW w:w="3038" w:type="dxa"/>
+            <w:tcBorders>
+              <w:top w:val="single" w:sz="4" w:space="0" w:color="999999"/>
+              <w:left w:val="single" w:sz="4" w:space="0" w:color="999999"/>
+              <w:bottom w:val="single" w:sz="4" w:space="0" w:color="999999"/>
+              <w:right w:val="single" w:sz="4" w:space="0" w:color="999999"/>
+            </w:tcBorders>
+            <w:vAlign w:val="center"/>
+          </w:tcPr>
+          <w:p>
+            <w:pPr>
+              <w:pStyle w:val="Compact"/>
+            </w:pPr>
+            <w:r>
+              <w:rPr>
+                <w:rtl/>
+              </w:rPr>
+              <w:t xml:space="preserve">קוד שגוי בספירת הכניסה</w:t>
+            </w:r>
+          </w:p>
+        </w:tc>
+        <w:tc>
+          <w:tcPr>
+            <w:tcW w:w="4179" w:type="dxa"/>
+            <w:tcBorders>
+              <w:top w:val="single" w:sz="4" w:space="0" w:color="999999"/>
+              <w:left w:val="single" w:sz="4" w:space="0" w:color="999999"/>
+              <w:bottom w:val="single" w:sz="4" w:space="0" w:color="999999"/>
+              <w:right w:val="single" w:sz="4" w:space="0" w:color="999999"/>
+            </w:tcBorders>
+            <w:vAlign w:val="center"/>
+          </w:tcPr>
+          <w:p>
+            <w:pPr>
+              <w:pStyle w:val="Compact"/>
+            </w:pPr>
+            <w:r>
+              <w:rPr>
+                <w:rtl/>
+              </w:rPr>
+              <w:t xml:space="preserve">נשמע זמזום ארוך, והספירה המשיכה</w:t>
+            </w:r>
+          </w:p>
+        </w:tc>
+        <w:tc>
+          <w:tcPr>
+            <w:tcW w:w="1151" w:type="dxa"/>
+            <w:tcBorders>
+              <w:top w:val="single" w:sz="4" w:space="0" w:color="999999"/>
+              <w:left w:val="single" w:sz="4" w:space="0" w:color="999999"/>
+              <w:bottom w:val="single" w:sz="4" w:space="0" w:color="999999"/>
+              <w:right w:val="single" w:sz="4" w:space="0" w:color="999999"/>
+            </w:tcBorders>
+            <w:vAlign w:val="center"/>
+          </w:tcPr>
+          <w:p>
+            <w:pPr>
+              <w:pStyle w:val="Compact"/>
+            </w:pPr>
+            <w:r>
+              <w:rPr>
+                <w:rtl/>
+              </w:rPr>
+              <w:t xml:space="preserve">עבר</w:t>
             </w:r>
           </w:p>
         </w:tc>
@@ -6104,7 +6299,27 @@
         </w:trPr>
         <w:tc>
           <w:tcPr>
-            <w:tcW w:w="3962" w:type="dxa"/>
+            <w:tcW w:w="632" w:type="dxa"/>
+            <w:tcBorders>
+              <w:top w:val="single" w:sz="4" w:space="0" w:color="999999"/>
+              <w:left w:val="single" w:sz="4" w:space="0" w:color="999999"/>
+              <w:bottom w:val="single" w:sz="4" w:space="0" w:color="999999"/>
+              <w:right w:val="single" w:sz="4" w:space="0" w:color="999999"/>
+            </w:tcBorders>
+            <w:vAlign w:val="center"/>
+          </w:tcPr>
+          <w:p>
+            <w:pPr>
+              <w:pStyle w:val="Compact"/>
+            </w:pPr>
+            <w:r>
+              <w:t xml:space="preserve">4</w:t>
+            </w:r>
+          </w:p>
+        </w:tc>
+        <w:tc>
+          <w:tcPr>
+            <w:tcW w:w="3038" w:type="dxa"/>
             <w:tcBorders>
               <w:top w:val="single" w:sz="4" w:space="0" w:color="999999"/>
               <w:left w:val="single" w:sz="4" w:space="0" w:color="999999"/>
@@ -6127,24 +6342,47 @@
         </w:tc>
         <w:tc>
           <w:tcPr>
-            <w:tcW w:w="5038" w:type="dxa"/>
-            <w:tcBorders>
-              <w:top w:val="single" w:sz="4" w:space="0" w:color="999999"/>
-              <w:left w:val="single" w:sz="4" w:space="0" w:color="999999"/>
-              <w:bottom w:val="single" w:sz="4" w:space="0" w:color="999999"/>
-              <w:right w:val="single" w:sz="4" w:space="0" w:color="999999"/>
-            </w:tcBorders>
-            <w:vAlign w:val="center"/>
-          </w:tcPr>
-          <w:p>
-            <w:pPr>
-              <w:pStyle w:val="Compact"/>
-            </w:pPr>
-            <w:r>
-              <w:rPr>
-                <w:rtl/>
-              </w:rPr>
-              <w:t xml:space="preserve">אזעקה, התראה באפליקציה ואימייל עם תמונה</w:t>
+            <w:tcW w:w="4179" w:type="dxa"/>
+            <w:tcBorders>
+              <w:top w:val="single" w:sz="4" w:space="0" w:color="999999"/>
+              <w:left w:val="single" w:sz="4" w:space="0" w:color="999999"/>
+              <w:bottom w:val="single" w:sz="4" w:space="0" w:color="999999"/>
+              <w:right w:val="single" w:sz="4" w:space="0" w:color="999999"/>
+            </w:tcBorders>
+            <w:vAlign w:val="center"/>
+          </w:tcPr>
+          <w:p>
+            <w:pPr>
+              <w:pStyle w:val="Compact"/>
+            </w:pPr>
+            <w:r>
+              <w:rPr>
+                <w:rtl/>
+              </w:rPr>
+              <w:t xml:space="preserve">הופעלה אזעקה, הוצגה התראה באפליקציה ונשלח אימייל עם תמונה</w:t>
+            </w:r>
+          </w:p>
+        </w:tc>
+        <w:tc>
+          <w:tcPr>
+            <w:tcW w:w="1151" w:type="dxa"/>
+            <w:tcBorders>
+              <w:top w:val="single" w:sz="4" w:space="0" w:color="999999"/>
+              <w:left w:val="single" w:sz="4" w:space="0" w:color="999999"/>
+              <w:bottom w:val="single" w:sz="4" w:space="0" w:color="999999"/>
+              <w:right w:val="single" w:sz="4" w:space="0" w:color="999999"/>
+            </w:tcBorders>
+            <w:vAlign w:val="center"/>
+          </w:tcPr>
+          <w:p>
+            <w:pPr>
+              <w:pStyle w:val="Compact"/>
+            </w:pPr>
+            <w:r>
+              <w:rPr>
+                <w:rtl/>
+              </w:rPr>
+              <w:t xml:space="preserve">עבר</w:t>
             </w:r>
           </w:p>
         </w:tc>
@@ -6155,7 +6393,27 @@
         </w:trPr>
         <w:tc>
           <w:tcPr>
-            <w:tcW w:w="3962" w:type="dxa"/>
+            <w:tcW w:w="632" w:type="dxa"/>
+            <w:tcBorders>
+              <w:top w:val="single" w:sz="4" w:space="0" w:color="999999"/>
+              <w:left w:val="single" w:sz="4" w:space="0" w:color="999999"/>
+              <w:bottom w:val="single" w:sz="4" w:space="0" w:color="999999"/>
+              <w:right w:val="single" w:sz="4" w:space="0" w:color="999999"/>
+            </w:tcBorders>
+            <w:vAlign w:val="center"/>
+          </w:tcPr>
+          <w:p>
+            <w:pPr>
+              <w:pStyle w:val="Compact"/>
+            </w:pPr>
+            <w:r>
+              <w:t xml:space="preserve">5</w:t>
+            </w:r>
+          </w:p>
+        </w:tc>
+        <w:tc>
+          <w:tcPr>
+            <w:tcW w:w="3038" w:type="dxa"/>
             <w:tcBorders>
               <w:top w:val="single" w:sz="4" w:space="0" w:color="999999"/>
               <w:left w:val="single" w:sz="4" w:space="0" w:color="999999"/>
@@ -6178,24 +6436,47 @@
         </w:tc>
         <w:tc>
           <w:tcPr>
-            <w:tcW w:w="5038" w:type="dxa"/>
-            <w:tcBorders>
-              <w:top w:val="single" w:sz="4" w:space="0" w:color="999999"/>
-              <w:left w:val="single" w:sz="4" w:space="0" w:color="999999"/>
-              <w:bottom w:val="single" w:sz="4" w:space="0" w:color="999999"/>
-              <w:right w:val="single" w:sz="4" w:space="0" w:color="999999"/>
-            </w:tcBorders>
-            <w:vAlign w:val="center"/>
-          </w:tcPr>
-          <w:p>
-            <w:pPr>
-              <w:pStyle w:val="Compact"/>
-            </w:pPr>
-            <w:r>
-              <w:rPr>
-                <w:rtl/>
-              </w:rPr>
-              <w:t xml:space="preserve">אזעקה</w:t>
+            <w:tcW w:w="4179" w:type="dxa"/>
+            <w:tcBorders>
+              <w:top w:val="single" w:sz="4" w:space="0" w:color="999999"/>
+              <w:left w:val="single" w:sz="4" w:space="0" w:color="999999"/>
+              <w:bottom w:val="single" w:sz="4" w:space="0" w:color="999999"/>
+              <w:right w:val="single" w:sz="4" w:space="0" w:color="999999"/>
+            </w:tcBorders>
+            <w:vAlign w:val="center"/>
+          </w:tcPr>
+          <w:p>
+            <w:pPr>
+              <w:pStyle w:val="Compact"/>
+            </w:pPr>
+            <w:r>
+              <w:rPr>
+                <w:rtl/>
+              </w:rPr>
+              <w:t xml:space="preserve">הופעלה אזעקה</w:t>
+            </w:r>
+          </w:p>
+        </w:tc>
+        <w:tc>
+          <w:tcPr>
+            <w:tcW w:w="1151" w:type="dxa"/>
+            <w:tcBorders>
+              <w:top w:val="single" w:sz="4" w:space="0" w:color="999999"/>
+              <w:left w:val="single" w:sz="4" w:space="0" w:color="999999"/>
+              <w:bottom w:val="single" w:sz="4" w:space="0" w:color="999999"/>
+              <w:right w:val="single" w:sz="4" w:space="0" w:color="999999"/>
+            </w:tcBorders>
+            <w:vAlign w:val="center"/>
+          </w:tcPr>
+          <w:p>
+            <w:pPr>
+              <w:pStyle w:val="Compact"/>
+            </w:pPr>
+            <w:r>
+              <w:rPr>
+                <w:rtl/>
+              </w:rPr>
+              <w:t xml:space="preserve">עבר</w:t>
             </w:r>
           </w:p>
         </w:tc>
@@ -6206,7 +6487,27 @@
         </w:trPr>
         <w:tc>
           <w:tcPr>
-            <w:tcW w:w="3962" w:type="dxa"/>
+            <w:tcW w:w="632" w:type="dxa"/>
+            <w:tcBorders>
+              <w:top w:val="single" w:sz="4" w:space="0" w:color="999999"/>
+              <w:left w:val="single" w:sz="4" w:space="0" w:color="999999"/>
+              <w:bottom w:val="single" w:sz="4" w:space="0" w:color="999999"/>
+              <w:right w:val="single" w:sz="4" w:space="0" w:color="999999"/>
+            </w:tcBorders>
+            <w:vAlign w:val="center"/>
+          </w:tcPr>
+          <w:p>
+            <w:pPr>
+              <w:pStyle w:val="Compact"/>
+            </w:pPr>
+            <w:r>
+              <w:t xml:space="preserve">6</w:t>
+            </w:r>
+          </w:p>
+        </w:tc>
+        <w:tc>
+          <w:tcPr>
+            <w:tcW w:w="3038" w:type="dxa"/>
             <w:tcBorders>
               <w:top w:val="single" w:sz="4" w:space="0" w:color="999999"/>
               <w:left w:val="single" w:sz="4" w:space="0" w:color="999999"/>
@@ -6229,24 +6530,47 @@
         </w:tc>
         <w:tc>
           <w:tcPr>
-            <w:tcW w:w="5038" w:type="dxa"/>
-            <w:tcBorders>
-              <w:top w:val="single" w:sz="4" w:space="0" w:color="999999"/>
-              <w:left w:val="single" w:sz="4" w:space="0" w:color="999999"/>
-              <w:bottom w:val="single" w:sz="4" w:space="0" w:color="999999"/>
-              <w:right w:val="single" w:sz="4" w:space="0" w:color="999999"/>
-            </w:tcBorders>
-            <w:vAlign w:val="center"/>
-          </w:tcPr>
-          <w:p>
-            <w:pPr>
-              <w:pStyle w:val="Compact"/>
-            </w:pPr>
-            <w:r>
-              <w:rPr>
-                <w:rtl/>
-              </w:rPr>
-              <w:t xml:space="preserve">אזעקה</w:t>
+            <w:tcW w:w="4179" w:type="dxa"/>
+            <w:tcBorders>
+              <w:top w:val="single" w:sz="4" w:space="0" w:color="999999"/>
+              <w:left w:val="single" w:sz="4" w:space="0" w:color="999999"/>
+              <w:bottom w:val="single" w:sz="4" w:space="0" w:color="999999"/>
+              <w:right w:val="single" w:sz="4" w:space="0" w:color="999999"/>
+            </w:tcBorders>
+            <w:vAlign w:val="center"/>
+          </w:tcPr>
+          <w:p>
+            <w:pPr>
+              <w:pStyle w:val="Compact"/>
+            </w:pPr>
+            <w:r>
+              <w:rPr>
+                <w:rtl/>
+              </w:rPr>
+              <w:t xml:space="preserve">הופעלה אזעקה</w:t>
+            </w:r>
+          </w:p>
+        </w:tc>
+        <w:tc>
+          <w:tcPr>
+            <w:tcW w:w="1151" w:type="dxa"/>
+            <w:tcBorders>
+              <w:top w:val="single" w:sz="4" w:space="0" w:color="999999"/>
+              <w:left w:val="single" w:sz="4" w:space="0" w:color="999999"/>
+              <w:bottom w:val="single" w:sz="4" w:space="0" w:color="999999"/>
+              <w:right w:val="single" w:sz="4" w:space="0" w:color="999999"/>
+            </w:tcBorders>
+            <w:vAlign w:val="center"/>
+          </w:tcPr>
+          <w:p>
+            <w:pPr>
+              <w:pStyle w:val="Compact"/>
+            </w:pPr>
+            <w:r>
+              <w:rPr>
+                <w:rtl/>
+              </w:rPr>
+              <w:t xml:space="preserve">עבר</w:t>
             </w:r>
           </w:p>
         </w:tc>
@@ -6257,7 +6581,27 @@
         </w:trPr>
         <w:tc>
           <w:tcPr>
-            <w:tcW w:w="3962" w:type="dxa"/>
+            <w:tcW w:w="632" w:type="dxa"/>
+            <w:tcBorders>
+              <w:top w:val="single" w:sz="4" w:space="0" w:color="999999"/>
+              <w:left w:val="single" w:sz="4" w:space="0" w:color="999999"/>
+              <w:bottom w:val="single" w:sz="4" w:space="0" w:color="999999"/>
+              <w:right w:val="single" w:sz="4" w:space="0" w:color="999999"/>
+            </w:tcBorders>
+            <w:vAlign w:val="center"/>
+          </w:tcPr>
+          <w:p>
+            <w:pPr>
+              <w:pStyle w:val="Compact"/>
+            </w:pPr>
+            <w:r>
+              <w:t xml:space="preserve">7</w:t>
+            </w:r>
+          </w:p>
+        </w:tc>
+        <w:tc>
+          <w:tcPr>
+            <w:tcW w:w="3038" w:type="dxa"/>
             <w:tcBorders>
               <w:top w:val="single" w:sz="4" w:space="0" w:color="999999"/>
               <w:left w:val="single" w:sz="4" w:space="0" w:color="999999"/>
@@ -6280,24 +6624,47 @@
         </w:tc>
         <w:tc>
           <w:tcPr>
-            <w:tcW w:w="5038" w:type="dxa"/>
-            <w:tcBorders>
-              <w:top w:val="single" w:sz="4" w:space="0" w:color="999999"/>
-              <w:left w:val="single" w:sz="4" w:space="0" w:color="999999"/>
-              <w:bottom w:val="single" w:sz="4" w:space="0" w:color="999999"/>
-              <w:right w:val="single" w:sz="4" w:space="0" w:color="999999"/>
-            </w:tcBorders>
-            <w:vAlign w:val="center"/>
-          </w:tcPr>
-          <w:p>
-            <w:pPr>
-              <w:pStyle w:val="Compact"/>
-            </w:pPr>
-            <w:r>
-              <w:rPr>
-                <w:rtl/>
-              </w:rPr>
-              <w:t xml:space="preserve">אין אזעקה</w:t>
+            <w:tcW w:w="4179" w:type="dxa"/>
+            <w:tcBorders>
+              <w:top w:val="single" w:sz="4" w:space="0" w:color="999999"/>
+              <w:left w:val="single" w:sz="4" w:space="0" w:color="999999"/>
+              <w:bottom w:val="single" w:sz="4" w:space="0" w:color="999999"/>
+              <w:right w:val="single" w:sz="4" w:space="0" w:color="999999"/>
+            </w:tcBorders>
+            <w:vAlign w:val="center"/>
+          </w:tcPr>
+          <w:p>
+            <w:pPr>
+              <w:pStyle w:val="Compact"/>
+            </w:pPr>
+            <w:r>
+              <w:rPr>
+                <w:rtl/>
+              </w:rPr>
+              <w:t xml:space="preserve">לא הופעלה אזעקה</w:t>
+            </w:r>
+          </w:p>
+        </w:tc>
+        <w:tc>
+          <w:tcPr>
+            <w:tcW w:w="1151" w:type="dxa"/>
+            <w:tcBorders>
+              <w:top w:val="single" w:sz="4" w:space="0" w:color="999999"/>
+              <w:left w:val="single" w:sz="4" w:space="0" w:color="999999"/>
+              <w:bottom w:val="single" w:sz="4" w:space="0" w:color="999999"/>
+              <w:right w:val="single" w:sz="4" w:space="0" w:color="999999"/>
+            </w:tcBorders>
+            <w:vAlign w:val="center"/>
+          </w:tcPr>
+          <w:p>
+            <w:pPr>
+              <w:pStyle w:val="Compact"/>
+            </w:pPr>
+            <w:r>
+              <w:rPr>
+                <w:rtl/>
+              </w:rPr>
+              <w:t xml:space="preserve">עבר</w:t>
             </w:r>
           </w:p>
         </w:tc>
@@ -6308,7 +6675,27 @@
         </w:trPr>
         <w:tc>
           <w:tcPr>
-            <w:tcW w:w="3962" w:type="dxa"/>
+            <w:tcW w:w="632" w:type="dxa"/>
+            <w:tcBorders>
+              <w:top w:val="single" w:sz="4" w:space="0" w:color="999999"/>
+              <w:left w:val="single" w:sz="4" w:space="0" w:color="999999"/>
+              <w:bottom w:val="single" w:sz="4" w:space="0" w:color="999999"/>
+              <w:right w:val="single" w:sz="4" w:space="0" w:color="999999"/>
+            </w:tcBorders>
+            <w:vAlign w:val="center"/>
+          </w:tcPr>
+          <w:p>
+            <w:pPr>
+              <w:pStyle w:val="Compact"/>
+            </w:pPr>
+            <w:r>
+              <w:t xml:space="preserve">8</w:t>
+            </w:r>
+          </w:p>
+        </w:tc>
+        <w:tc>
+          <w:tcPr>
+            <w:tcW w:w="3038" w:type="dxa"/>
             <w:tcBorders>
               <w:top w:val="single" w:sz="4" w:space="0" w:color="999999"/>
               <w:left w:val="single" w:sz="4" w:space="0" w:color="999999"/>
@@ -6331,24 +6718,47 @@
         </w:tc>
         <w:tc>
           <w:tcPr>
-            <w:tcW w:w="5038" w:type="dxa"/>
-            <w:tcBorders>
-              <w:top w:val="single" w:sz="4" w:space="0" w:color="999999"/>
-              <w:left w:val="single" w:sz="4" w:space="0" w:color="999999"/>
-              <w:bottom w:val="single" w:sz="4" w:space="0" w:color="999999"/>
-              <w:right w:val="single" w:sz="4" w:space="0" w:color="999999"/>
-            </w:tcBorders>
-            <w:vAlign w:val="center"/>
-          </w:tcPr>
-          <w:p>
-            <w:pPr>
-              <w:pStyle w:val="Compact"/>
-            </w:pPr>
-            <w:r>
-              <w:rPr>
-                <w:rtl/>
-              </w:rPr>
-              <w:t xml:space="preserve">אין אזעקה</w:t>
+            <w:tcW w:w="4179" w:type="dxa"/>
+            <w:tcBorders>
+              <w:top w:val="single" w:sz="4" w:space="0" w:color="999999"/>
+              <w:left w:val="single" w:sz="4" w:space="0" w:color="999999"/>
+              <w:bottom w:val="single" w:sz="4" w:space="0" w:color="999999"/>
+              <w:right w:val="single" w:sz="4" w:space="0" w:color="999999"/>
+            </w:tcBorders>
+            <w:vAlign w:val="center"/>
+          </w:tcPr>
+          <w:p>
+            <w:pPr>
+              <w:pStyle w:val="Compact"/>
+            </w:pPr>
+            <w:r>
+              <w:rPr>
+                <w:rtl/>
+              </w:rPr>
+              <w:t xml:space="preserve">לא הופעלה אזעקה</w:t>
+            </w:r>
+          </w:p>
+        </w:tc>
+        <w:tc>
+          <w:tcPr>
+            <w:tcW w:w="1151" w:type="dxa"/>
+            <w:tcBorders>
+              <w:top w:val="single" w:sz="4" w:space="0" w:color="999999"/>
+              <w:left w:val="single" w:sz="4" w:space="0" w:color="999999"/>
+              <w:bottom w:val="single" w:sz="4" w:space="0" w:color="999999"/>
+              <w:right w:val="single" w:sz="4" w:space="0" w:color="999999"/>
+            </w:tcBorders>
+            <w:vAlign w:val="center"/>
+          </w:tcPr>
+          <w:p>
+            <w:pPr>
+              <w:pStyle w:val="Compact"/>
+            </w:pPr>
+            <w:r>
+              <w:rPr>
+                <w:rtl/>
+              </w:rPr>
+              <w:t xml:space="preserve">עבר</w:t>
             </w:r>
           </w:p>
         </w:tc>
@@ -6359,7 +6769,27 @@
         </w:trPr>
         <w:tc>
           <w:tcPr>
-            <w:tcW w:w="3962" w:type="dxa"/>
+            <w:tcW w:w="632" w:type="dxa"/>
+            <w:tcBorders>
+              <w:top w:val="single" w:sz="4" w:space="0" w:color="999999"/>
+              <w:left w:val="single" w:sz="4" w:space="0" w:color="999999"/>
+              <w:bottom w:val="single" w:sz="4" w:space="0" w:color="999999"/>
+              <w:right w:val="single" w:sz="4" w:space="0" w:color="999999"/>
+            </w:tcBorders>
+            <w:vAlign w:val="center"/>
+          </w:tcPr>
+          <w:p>
+            <w:pPr>
+              <w:pStyle w:val="Compact"/>
+            </w:pPr>
+            <w:r>
+              <w:t xml:space="preserve">9</w:t>
+            </w:r>
+          </w:p>
+        </w:tc>
+        <w:tc>
+          <w:tcPr>
+            <w:tcW w:w="3038" w:type="dxa"/>
             <w:tcBorders>
               <w:top w:val="single" w:sz="4" w:space="0" w:color="999999"/>
               <w:left w:val="single" w:sz="4" w:space="0" w:color="999999"/>
@@ -6382,24 +6812,47 @@
         </w:tc>
         <w:tc>
           <w:tcPr>
-            <w:tcW w:w="5038" w:type="dxa"/>
-            <w:tcBorders>
-              <w:top w:val="single" w:sz="4" w:space="0" w:color="999999"/>
-              <w:left w:val="single" w:sz="4" w:space="0" w:color="999999"/>
-              <w:bottom w:val="single" w:sz="4" w:space="0" w:color="999999"/>
-              <w:right w:val="single" w:sz="4" w:space="0" w:color="999999"/>
-            </w:tcBorders>
-            <w:vAlign w:val="center"/>
-          </w:tcPr>
-          <w:p>
-            <w:pPr>
-              <w:pStyle w:val="Compact"/>
-            </w:pPr>
-            <w:r>
-              <w:rPr>
-                <w:rtl/>
-              </w:rPr>
-              <w:t xml:space="preserve">ספירת כניסה, כמו ב-Away</w:t>
+            <w:tcW w:w="4179" w:type="dxa"/>
+            <w:tcBorders>
+              <w:top w:val="single" w:sz="4" w:space="0" w:color="999999"/>
+              <w:left w:val="single" w:sz="4" w:space="0" w:color="999999"/>
+              <w:bottom w:val="single" w:sz="4" w:space="0" w:color="999999"/>
+              <w:right w:val="single" w:sz="4" w:space="0" w:color="999999"/>
+            </w:tcBorders>
+            <w:vAlign w:val="center"/>
+          </w:tcPr>
+          <w:p>
+            <w:pPr>
+              <w:pStyle w:val="Compact"/>
+            </w:pPr>
+            <w:r>
+              <w:rPr>
+                <w:rtl/>
+              </w:rPr>
+              <w:t xml:space="preserve">התחילה ספירת כניסה, כמו ב-Away</w:t>
+            </w:r>
+          </w:p>
+        </w:tc>
+        <w:tc>
+          <w:tcPr>
+            <w:tcW w:w="1151" w:type="dxa"/>
+            <w:tcBorders>
+              <w:top w:val="single" w:sz="4" w:space="0" w:color="999999"/>
+              <w:left w:val="single" w:sz="4" w:space="0" w:color="999999"/>
+              <w:bottom w:val="single" w:sz="4" w:space="0" w:color="999999"/>
+              <w:right w:val="single" w:sz="4" w:space="0" w:color="999999"/>
+            </w:tcBorders>
+            <w:vAlign w:val="center"/>
+          </w:tcPr>
+          <w:p>
+            <w:pPr>
+              <w:pStyle w:val="Compact"/>
+            </w:pPr>
+            <w:r>
+              <w:rPr>
+                <w:rtl/>
+              </w:rPr>
+              <w:t xml:space="preserve">עבר</w:t>
             </w:r>
           </w:p>
         </w:tc>
@@ -6410,7 +6863,27 @@
         </w:trPr>
         <w:tc>
           <w:tcPr>
-            <w:tcW w:w="3962" w:type="dxa"/>
+            <w:tcW w:w="632" w:type="dxa"/>
+            <w:tcBorders>
+              <w:top w:val="single" w:sz="4" w:space="0" w:color="999999"/>
+              <w:left w:val="single" w:sz="4" w:space="0" w:color="999999"/>
+              <w:bottom w:val="single" w:sz="4" w:space="0" w:color="999999"/>
+              <w:right w:val="single" w:sz="4" w:space="0" w:color="999999"/>
+            </w:tcBorders>
+            <w:vAlign w:val="center"/>
+          </w:tcPr>
+          <w:p>
+            <w:pPr>
+              <w:pStyle w:val="Compact"/>
+            </w:pPr>
+            <w:r>
+              <w:t xml:space="preserve">10</w:t>
+            </w:r>
+          </w:p>
+        </w:tc>
+        <w:tc>
+          <w:tcPr>
+            <w:tcW w:w="3038" w:type="dxa"/>
             <w:tcBorders>
               <w:top w:val="single" w:sz="4" w:space="0" w:color="999999"/>
               <w:left w:val="single" w:sz="4" w:space="0" w:color="999999"/>
@@ -6433,24 +6906,47 @@
         </w:tc>
         <w:tc>
           <w:tcPr>
-            <w:tcW w:w="5038" w:type="dxa"/>
-            <w:tcBorders>
-              <w:top w:val="single" w:sz="4" w:space="0" w:color="999999"/>
-              <w:left w:val="single" w:sz="4" w:space="0" w:color="999999"/>
-              <w:bottom w:val="single" w:sz="4" w:space="0" w:color="999999"/>
-              <w:right w:val="single" w:sz="4" w:space="0" w:color="999999"/>
-            </w:tcBorders>
-            <w:vAlign w:val="center"/>
-          </w:tcPr>
-          <w:p>
-            <w:pPr>
-              <w:pStyle w:val="Compact"/>
-            </w:pPr>
-            <w:r>
-              <w:rPr>
-                <w:rtl/>
-              </w:rPr>
-              <w:t xml:space="preserve">סירוב: צליל סירוב והודעה באפליקציה</w:t>
+            <w:tcW w:w="4179" w:type="dxa"/>
+            <w:tcBorders>
+              <w:top w:val="single" w:sz="4" w:space="0" w:color="999999"/>
+              <w:left w:val="single" w:sz="4" w:space="0" w:color="999999"/>
+              <w:bottom w:val="single" w:sz="4" w:space="0" w:color="999999"/>
+              <w:right w:val="single" w:sz="4" w:space="0" w:color="999999"/>
+            </w:tcBorders>
+            <w:vAlign w:val="center"/>
+          </w:tcPr>
+          <w:p>
+            <w:pPr>
+              <w:pStyle w:val="Compact"/>
+            </w:pPr>
+            <w:r>
+              <w:rPr>
+                <w:rtl/>
+              </w:rPr>
+              <w:t xml:space="preserve">נשמע צליל סירוב והאפליקציה הציגה הודעה</w:t>
+            </w:r>
+          </w:p>
+        </w:tc>
+        <w:tc>
+          <w:tcPr>
+            <w:tcW w:w="1151" w:type="dxa"/>
+            <w:tcBorders>
+              <w:top w:val="single" w:sz="4" w:space="0" w:color="999999"/>
+              <w:left w:val="single" w:sz="4" w:space="0" w:color="999999"/>
+              <w:bottom w:val="single" w:sz="4" w:space="0" w:color="999999"/>
+              <w:right w:val="single" w:sz="4" w:space="0" w:color="999999"/>
+            </w:tcBorders>
+            <w:vAlign w:val="center"/>
+          </w:tcPr>
+          <w:p>
+            <w:pPr>
+              <w:pStyle w:val="Compact"/>
+            </w:pPr>
+            <w:r>
+              <w:rPr>
+                <w:rtl/>
+              </w:rPr>
+              <w:t xml:space="preserve">עבר</w:t>
             </w:r>
           </w:p>
         </w:tc>
@@ -6461,7 +6957,27 @@
         </w:trPr>
         <w:tc>
           <w:tcPr>
-            <w:tcW w:w="3962" w:type="dxa"/>
+            <w:tcW w:w="632" w:type="dxa"/>
+            <w:tcBorders>
+              <w:top w:val="single" w:sz="4" w:space="0" w:color="999999"/>
+              <w:left w:val="single" w:sz="4" w:space="0" w:color="999999"/>
+              <w:bottom w:val="single" w:sz="4" w:space="0" w:color="999999"/>
+              <w:right w:val="single" w:sz="4" w:space="0" w:color="999999"/>
+            </w:tcBorders>
+            <w:vAlign w:val="center"/>
+          </w:tcPr>
+          <w:p>
+            <w:pPr>
+              <w:pStyle w:val="Compact"/>
+            </w:pPr>
+            <w:r>
+              <w:t xml:space="preserve">11</w:t>
+            </w:r>
+          </w:p>
+        </w:tc>
+        <w:tc>
+          <w:tcPr>
+            <w:tcW w:w="3038" w:type="dxa"/>
             <w:tcBorders>
               <w:top w:val="single" w:sz="4" w:space="0" w:color="999999"/>
               <w:left w:val="single" w:sz="4" w:space="0" w:color="999999"/>
@@ -6484,24 +7000,47 @@
         </w:tc>
         <w:tc>
           <w:tcPr>
-            <w:tcW w:w="5038" w:type="dxa"/>
-            <w:tcBorders>
-              <w:top w:val="single" w:sz="4" w:space="0" w:color="999999"/>
-              <w:left w:val="single" w:sz="4" w:space="0" w:color="999999"/>
-              <w:bottom w:val="single" w:sz="4" w:space="0" w:color="999999"/>
-              <w:right w:val="single" w:sz="4" w:space="0" w:color="999999"/>
-            </w:tcBorders>
-            <w:vAlign w:val="center"/>
-          </w:tcPr>
-          <w:p>
-            <w:pPr>
-              <w:pStyle w:val="Compact"/>
-            </w:pPr>
-            <w:r>
-              <w:rPr>
-                <w:rtl/>
-              </w:rPr>
-              <w:t xml:space="preserve">הפקודה מגיעה לבקר הדלת, והצלילים מושמעים</w:t>
+            <w:tcW w:w="4179" w:type="dxa"/>
+            <w:tcBorders>
+              <w:top w:val="single" w:sz="4" w:space="0" w:color="999999"/>
+              <w:left w:val="single" w:sz="4" w:space="0" w:color="999999"/>
+              <w:bottom w:val="single" w:sz="4" w:space="0" w:color="999999"/>
+              <w:right w:val="single" w:sz="4" w:space="0" w:color="999999"/>
+            </w:tcBorders>
+            <w:vAlign w:val="center"/>
+          </w:tcPr>
+          <w:p>
+            <w:pPr>
+              <w:pStyle w:val="Compact"/>
+            </w:pPr>
+            <w:r>
+              <w:rPr>
+                <w:rtl/>
+              </w:rPr>
+              <w:t xml:space="preserve">הפקודה הגיעה לבקר הדלת והצלילים הושמעו</w:t>
+            </w:r>
+          </w:p>
+        </w:tc>
+        <w:tc>
+          <w:tcPr>
+            <w:tcW w:w="1151" w:type="dxa"/>
+            <w:tcBorders>
+              <w:top w:val="single" w:sz="4" w:space="0" w:color="999999"/>
+              <w:left w:val="single" w:sz="4" w:space="0" w:color="999999"/>
+              <w:bottom w:val="single" w:sz="4" w:space="0" w:color="999999"/>
+              <w:right w:val="single" w:sz="4" w:space="0" w:color="999999"/>
+            </w:tcBorders>
+            <w:vAlign w:val="center"/>
+          </w:tcPr>
+          <w:p>
+            <w:pPr>
+              <w:pStyle w:val="Compact"/>
+            </w:pPr>
+            <w:r>
+              <w:rPr>
+                <w:rtl/>
+              </w:rPr>
+              <w:t xml:space="preserve">עבר</w:t>
             </w:r>
           </w:p>
         </w:tc>
@@ -6512,7 +7051,27 @@
         </w:trPr>
         <w:tc>
           <w:tcPr>
-            <w:tcW w:w="3962" w:type="dxa"/>
+            <w:tcW w:w="632" w:type="dxa"/>
+            <w:tcBorders>
+              <w:top w:val="single" w:sz="4" w:space="0" w:color="999999"/>
+              <w:left w:val="single" w:sz="4" w:space="0" w:color="999999"/>
+              <w:bottom w:val="single" w:sz="4" w:space="0" w:color="999999"/>
+              <w:right w:val="single" w:sz="4" w:space="0" w:color="999999"/>
+            </w:tcBorders>
+            <w:vAlign w:val="center"/>
+          </w:tcPr>
+          <w:p>
+            <w:pPr>
+              <w:pStyle w:val="Compact"/>
+            </w:pPr>
+            <w:r>
+              <w:t xml:space="preserve">12</w:t>
+            </w:r>
+          </w:p>
+        </w:tc>
+        <w:tc>
+          <w:tcPr>
+            <w:tcW w:w="3038" w:type="dxa"/>
             <w:tcBorders>
               <w:top w:val="single" w:sz="4" w:space="0" w:color="999999"/>
               <w:left w:val="single" w:sz="4" w:space="0" w:color="999999"/>
@@ -6535,24 +7094,47 @@
         </w:tc>
         <w:tc>
           <w:tcPr>
-            <w:tcW w:w="5038" w:type="dxa"/>
-            <w:tcBorders>
-              <w:top w:val="single" w:sz="4" w:space="0" w:color="999999"/>
-              <w:left w:val="single" w:sz="4" w:space="0" w:color="999999"/>
-              <w:bottom w:val="single" w:sz="4" w:space="0" w:color="999999"/>
-              <w:right w:val="single" w:sz="4" w:space="0" w:color="999999"/>
-            </w:tcBorders>
-            <w:vAlign w:val="center"/>
-          </w:tcPr>
-          <w:p>
-            <w:pPr>
-              <w:pStyle w:val="Compact"/>
-            </w:pPr>
-            <w:r>
-              <w:rPr>
-                <w:rtl/>
-              </w:rPr>
-              <w:t xml:space="preserve">וידאו באפליקציה, ופנים ששמורות במערכת מזוהות</w:t>
+            <w:tcW w:w="4179" w:type="dxa"/>
+            <w:tcBorders>
+              <w:top w:val="single" w:sz="4" w:space="0" w:color="999999"/>
+              <w:left w:val="single" w:sz="4" w:space="0" w:color="999999"/>
+              <w:bottom w:val="single" w:sz="4" w:space="0" w:color="999999"/>
+              <w:right w:val="single" w:sz="4" w:space="0" w:color="999999"/>
+            </w:tcBorders>
+            <w:vAlign w:val="center"/>
+          </w:tcPr>
+          <w:p>
+            <w:pPr>
+              <w:pStyle w:val="Compact"/>
+            </w:pPr>
+            <w:r>
+              <w:rPr>
+                <w:rtl/>
+              </w:rPr>
+              <w:t xml:space="preserve">הווידאו הוצג באפליקציה, ופנים ששמורות במערכת זוהו</w:t>
+            </w:r>
+          </w:p>
+        </w:tc>
+        <w:tc>
+          <w:tcPr>
+            <w:tcW w:w="1151" w:type="dxa"/>
+            <w:tcBorders>
+              <w:top w:val="single" w:sz="4" w:space="0" w:color="999999"/>
+              <w:left w:val="single" w:sz="4" w:space="0" w:color="999999"/>
+              <w:bottom w:val="single" w:sz="4" w:space="0" w:color="999999"/>
+              <w:right w:val="single" w:sz="4" w:space="0" w:color="999999"/>
+            </w:tcBorders>
+            <w:vAlign w:val="center"/>
+          </w:tcPr>
+          <w:p>
+            <w:pPr>
+              <w:pStyle w:val="Compact"/>
+            </w:pPr>
+            <w:r>
+              <w:rPr>
+                <w:rtl/>
+              </w:rPr>
+              <w:t xml:space="preserve">עבר</w:t>
             </w:r>
           </w:p>
         </w:tc>
@@ -6563,7 +7145,27 @@
         </w:trPr>
         <w:tc>
           <w:tcPr>
-            <w:tcW w:w="3962" w:type="dxa"/>
+            <w:tcW w:w="632" w:type="dxa"/>
+            <w:tcBorders>
+              <w:top w:val="single" w:sz="4" w:space="0" w:color="999999"/>
+              <w:left w:val="single" w:sz="4" w:space="0" w:color="999999"/>
+              <w:bottom w:val="single" w:sz="4" w:space="0" w:color="999999"/>
+              <w:right w:val="single" w:sz="4" w:space="0" w:color="999999"/>
+            </w:tcBorders>
+            <w:vAlign w:val="center"/>
+          </w:tcPr>
+          <w:p>
+            <w:pPr>
+              <w:pStyle w:val="Compact"/>
+            </w:pPr>
+            <w:r>
+              <w:t xml:space="preserve">13</w:t>
+            </w:r>
+          </w:p>
+        </w:tc>
+        <w:tc>
+          <w:tcPr>
+            <w:tcW w:w="3038" w:type="dxa"/>
             <w:tcBorders>
               <w:top w:val="single" w:sz="4" w:space="0" w:color="999999"/>
               <w:left w:val="single" w:sz="4" w:space="0" w:color="999999"/>
@@ -6586,24 +7188,47 @@
         </w:tc>
         <w:tc>
           <w:tcPr>
-            <w:tcW w:w="5038" w:type="dxa"/>
-            <w:tcBorders>
-              <w:top w:val="single" w:sz="4" w:space="0" w:color="999999"/>
-              <w:left w:val="single" w:sz="4" w:space="0" w:color="999999"/>
-              <w:bottom w:val="single" w:sz="4" w:space="0" w:color="999999"/>
-              <w:right w:val="single" w:sz="4" w:space="0" w:color="999999"/>
-            </w:tcBorders>
-            <w:vAlign w:val="center"/>
-          </w:tcPr>
-          <w:p>
-            <w:pPr>
-              <w:pStyle w:val="Compact"/>
-            </w:pPr>
-            <w:r>
-              <w:rPr>
-                <w:rtl/>
-              </w:rPr>
-              <w:t xml:space="preserve">האפליקציה מציגה שהבקר לא מחובר</w:t>
+            <w:tcW w:w="4179" w:type="dxa"/>
+            <w:tcBorders>
+              <w:top w:val="single" w:sz="4" w:space="0" w:color="999999"/>
+              <w:left w:val="single" w:sz="4" w:space="0" w:color="999999"/>
+              <w:bottom w:val="single" w:sz="4" w:space="0" w:color="999999"/>
+              <w:right w:val="single" w:sz="4" w:space="0" w:color="999999"/>
+            </w:tcBorders>
+            <w:vAlign w:val="center"/>
+          </w:tcPr>
+          <w:p>
+            <w:pPr>
+              <w:pStyle w:val="Compact"/>
+            </w:pPr>
+            <w:r>
+              <w:rPr>
+                <w:rtl/>
+              </w:rPr>
+              <w:t xml:space="preserve">האפליקציה הציגה שהבקר לא מחובר</w:t>
+            </w:r>
+          </w:p>
+        </w:tc>
+        <w:tc>
+          <w:tcPr>
+            <w:tcW w:w="1151" w:type="dxa"/>
+            <w:tcBorders>
+              <w:top w:val="single" w:sz="4" w:space="0" w:color="999999"/>
+              <w:left w:val="single" w:sz="4" w:space="0" w:color="999999"/>
+              <w:bottom w:val="single" w:sz="4" w:space="0" w:color="999999"/>
+              <w:right w:val="single" w:sz="4" w:space="0" w:color="999999"/>
+            </w:tcBorders>
+            <w:vAlign w:val="center"/>
+          </w:tcPr>
+          <w:p>
+            <w:pPr>
+              <w:pStyle w:val="Compact"/>
+            </w:pPr>
+            <w:r>
+              <w:rPr>
+                <w:rtl/>
+              </w:rPr>
+              <w:t xml:space="preserve">עבר</w:t>
             </w:r>
           </w:p>
         </w:tc>
@@ -6614,7 +7239,27 @@
         </w:trPr>
         <w:tc>
           <w:tcPr>
-            <w:tcW w:w="3962" w:type="dxa"/>
+            <w:tcW w:w="632" w:type="dxa"/>
+            <w:tcBorders>
+              <w:top w:val="single" w:sz="4" w:space="0" w:color="999999"/>
+              <w:left w:val="single" w:sz="4" w:space="0" w:color="999999"/>
+              <w:bottom w:val="single" w:sz="4" w:space="0" w:color="999999"/>
+              <w:right w:val="single" w:sz="4" w:space="0" w:color="999999"/>
+            </w:tcBorders>
+            <w:vAlign w:val="center"/>
+          </w:tcPr>
+          <w:p>
+            <w:pPr>
+              <w:pStyle w:val="Compact"/>
+            </w:pPr>
+            <w:r>
+              <w:t xml:space="preserve">14</w:t>
+            </w:r>
+          </w:p>
+        </w:tc>
+        <w:tc>
+          <w:tcPr>
+            <w:tcW w:w="3038" w:type="dxa"/>
             <w:tcBorders>
               <w:top w:val="single" w:sz="4" w:space="0" w:color="999999"/>
               <w:left w:val="single" w:sz="4" w:space="0" w:color="999999"/>
@@ -6637,24 +7282,47 @@
         </w:tc>
         <w:tc>
           <w:tcPr>
-            <w:tcW w:w="5038" w:type="dxa"/>
-            <w:tcBorders>
-              <w:top w:val="single" w:sz="4" w:space="0" w:color="999999"/>
-              <w:left w:val="single" w:sz="4" w:space="0" w:color="999999"/>
-              <w:bottom w:val="single" w:sz="4" w:space="0" w:color="999999"/>
-              <w:right w:val="single" w:sz="4" w:space="0" w:color="999999"/>
-            </w:tcBorders>
-            <w:vAlign w:val="center"/>
-          </w:tcPr>
-          <w:p>
-            <w:pPr>
-              <w:pStyle w:val="Compact"/>
-            </w:pPr>
-            <w:r>
-              <w:rPr>
-                <w:rtl/>
-              </w:rPr>
-              <w:t xml:space="preserve">הכפתור ננעל ל-30‎ s, ואם המערכת דרוכה מופעלת אזעקה</w:t>
+            <w:tcW w:w="4179" w:type="dxa"/>
+            <w:tcBorders>
+              <w:top w:val="single" w:sz="4" w:space="0" w:color="999999"/>
+              <w:left w:val="single" w:sz="4" w:space="0" w:color="999999"/>
+              <w:bottom w:val="single" w:sz="4" w:space="0" w:color="999999"/>
+              <w:right w:val="single" w:sz="4" w:space="0" w:color="999999"/>
+            </w:tcBorders>
+            <w:vAlign w:val="center"/>
+          </w:tcPr>
+          <w:p>
+            <w:pPr>
+              <w:pStyle w:val="Compact"/>
+            </w:pPr>
+            <w:r>
+              <w:rPr>
+                <w:rtl/>
+              </w:rPr>
+              <w:t xml:space="preserve">הכפתור ננעל ל-30‎ s. כשהמערכת דרוכה הופעלה גם אזעקה</w:t>
+            </w:r>
+          </w:p>
+        </w:tc>
+        <w:tc>
+          <w:tcPr>
+            <w:tcW w:w="1151" w:type="dxa"/>
+            <w:tcBorders>
+              <w:top w:val="single" w:sz="4" w:space="0" w:color="999999"/>
+              <w:left w:val="single" w:sz="4" w:space="0" w:color="999999"/>
+              <w:bottom w:val="single" w:sz="4" w:space="0" w:color="999999"/>
+              <w:right w:val="single" w:sz="4" w:space="0" w:color="999999"/>
+            </w:tcBorders>
+            <w:vAlign w:val="center"/>
+          </w:tcPr>
+          <w:p>
+            <w:pPr>
+              <w:pStyle w:val="Compact"/>
+            </w:pPr>
+            <w:r>
+              <w:rPr>
+                <w:rtl/>
+              </w:rPr>
+              <w:t xml:space="preserve">עבר</w:t>
             </w:r>
           </w:p>
         </w:tc>
@@ -6665,7 +7333,27 @@
         </w:trPr>
         <w:tc>
           <w:tcPr>
-            <w:tcW w:w="3962" w:type="dxa"/>
+            <w:tcW w:w="632" w:type="dxa"/>
+            <w:tcBorders>
+              <w:top w:val="single" w:sz="4" w:space="0" w:color="999999"/>
+              <w:left w:val="single" w:sz="4" w:space="0" w:color="999999"/>
+              <w:bottom w:val="single" w:sz="4" w:space="0" w:color="999999"/>
+              <w:right w:val="single" w:sz="4" w:space="0" w:color="999999"/>
+            </w:tcBorders>
+            <w:vAlign w:val="center"/>
+          </w:tcPr>
+          <w:p>
+            <w:pPr>
+              <w:pStyle w:val="Compact"/>
+            </w:pPr>
+            <w:r>
+              <w:t xml:space="preserve">15</w:t>
+            </w:r>
+          </w:p>
+        </w:tc>
+        <w:tc>
+          <w:tcPr>
+            <w:tcW w:w="3038" w:type="dxa"/>
             <w:tcBorders>
               <w:top w:val="single" w:sz="4" w:space="0" w:color="999999"/>
               <w:left w:val="single" w:sz="4" w:space="0" w:color="999999"/>
@@ -6688,24 +7376,47 @@
         </w:tc>
         <w:tc>
           <w:tcPr>
-            <w:tcW w:w="5038" w:type="dxa"/>
-            <w:tcBorders>
-              <w:top w:val="single" w:sz="4" w:space="0" w:color="999999"/>
-              <w:left w:val="single" w:sz="4" w:space="0" w:color="999999"/>
-              <w:bottom w:val="single" w:sz="4" w:space="0" w:color="999999"/>
-              <w:right w:val="single" w:sz="4" w:space="0" w:color="999999"/>
-            </w:tcBorders>
-            <w:vAlign w:val="center"/>
-          </w:tcPr>
-          <w:p>
-            <w:pPr>
-              <w:pStyle w:val="Compact"/>
-            </w:pPr>
-            <w:r>
-              <w:rPr>
-                <w:rtl/>
-              </w:rPr>
-              <w:t xml:space="preserve">הקוד החדש עובד בקודן והישן לא</w:t>
+            <w:tcW w:w="4179" w:type="dxa"/>
+            <w:tcBorders>
+              <w:top w:val="single" w:sz="4" w:space="0" w:color="999999"/>
+              <w:left w:val="single" w:sz="4" w:space="0" w:color="999999"/>
+              <w:bottom w:val="single" w:sz="4" w:space="0" w:color="999999"/>
+              <w:right w:val="single" w:sz="4" w:space="0" w:color="999999"/>
+            </w:tcBorders>
+            <w:vAlign w:val="center"/>
+          </w:tcPr>
+          <w:p>
+            <w:pPr>
+              <w:pStyle w:val="Compact"/>
+            </w:pPr>
+            <w:r>
+              <w:rPr>
+                <w:rtl/>
+              </w:rPr>
+              <w:t xml:space="preserve">הקוד החדש עבד בקודן והישן לא</w:t>
+            </w:r>
+          </w:p>
+        </w:tc>
+        <w:tc>
+          <w:tcPr>
+            <w:tcW w:w="1151" w:type="dxa"/>
+            <w:tcBorders>
+              <w:top w:val="single" w:sz="4" w:space="0" w:color="999999"/>
+              <w:left w:val="single" w:sz="4" w:space="0" w:color="999999"/>
+              <w:bottom w:val="single" w:sz="4" w:space="0" w:color="999999"/>
+              <w:right w:val="single" w:sz="4" w:space="0" w:color="999999"/>
+            </w:tcBorders>
+            <w:vAlign w:val="center"/>
+          </w:tcPr>
+          <w:p>
+            <w:pPr>
+              <w:pStyle w:val="Compact"/>
+            </w:pPr>
+            <w:r>
+              <w:rPr>
+                <w:rtl/>
+              </w:rPr>
+              <w:t xml:space="preserve">עבר</w:t>
             </w:r>
           </w:p>
         </w:tc>
@@ -6716,7 +7427,27 @@
         </w:trPr>
         <w:tc>
           <w:tcPr>
-            <w:tcW w:w="3962" w:type="dxa"/>
+            <w:tcW w:w="632" w:type="dxa"/>
+            <w:tcBorders>
+              <w:top w:val="single" w:sz="4" w:space="0" w:color="999999"/>
+              <w:left w:val="single" w:sz="4" w:space="0" w:color="999999"/>
+              <w:bottom w:val="single" w:sz="4" w:space="0" w:color="999999"/>
+              <w:right w:val="single" w:sz="4" w:space="0" w:color="999999"/>
+            </w:tcBorders>
+            <w:vAlign w:val="center"/>
+          </w:tcPr>
+          <w:p>
+            <w:pPr>
+              <w:pStyle w:val="Compact"/>
+            </w:pPr>
+            <w:r>
+              <w:t xml:space="preserve">16</w:t>
+            </w:r>
+          </w:p>
+        </w:tc>
+        <w:tc>
+          <w:tcPr>
+            <w:tcW w:w="3038" w:type="dxa"/>
             <w:tcBorders>
               <w:top w:val="single" w:sz="4" w:space="0" w:color="999999"/>
               <w:left w:val="single" w:sz="4" w:space="0" w:color="999999"/>
@@ -6739,24 +7470,47 @@
         </w:tc>
         <w:tc>
           <w:tcPr>
-            <w:tcW w:w="5038" w:type="dxa"/>
-            <w:tcBorders>
-              <w:top w:val="single" w:sz="4" w:space="0" w:color="999999"/>
-              <w:left w:val="single" w:sz="4" w:space="0" w:color="999999"/>
-              <w:bottom w:val="single" w:sz="4" w:space="0" w:color="999999"/>
-              <w:right w:val="single" w:sz="4" w:space="0" w:color="999999"/>
-            </w:tcBorders>
-            <w:vAlign w:val="center"/>
-          </w:tcPr>
-          <w:p>
-            <w:pPr>
-              <w:pStyle w:val="Compact"/>
-            </w:pPr>
-            <w:r>
-              <w:rPr>
-                <w:rtl/>
-              </w:rPr>
-              <w:t xml:space="preserve">המערכת נדרכת במצב Home ונרשם ביומן</w:t>
+            <w:tcW w:w="4179" w:type="dxa"/>
+            <w:tcBorders>
+              <w:top w:val="single" w:sz="4" w:space="0" w:color="999999"/>
+              <w:left w:val="single" w:sz="4" w:space="0" w:color="999999"/>
+              <w:bottom w:val="single" w:sz="4" w:space="0" w:color="999999"/>
+              <w:right w:val="single" w:sz="4" w:space="0" w:color="999999"/>
+            </w:tcBorders>
+            <w:vAlign w:val="center"/>
+          </w:tcPr>
+          <w:p>
+            <w:pPr>
+              <w:pStyle w:val="Compact"/>
+            </w:pPr>
+            <w:r>
+              <w:rPr>
+                <w:rtl/>
+              </w:rPr>
+              <w:t xml:space="preserve">המערכת נדרכה במצב Home ונרשם ביומן</w:t>
+            </w:r>
+          </w:p>
+        </w:tc>
+        <w:tc>
+          <w:tcPr>
+            <w:tcW w:w="1151" w:type="dxa"/>
+            <w:tcBorders>
+              <w:top w:val="single" w:sz="4" w:space="0" w:color="999999"/>
+              <w:left w:val="single" w:sz="4" w:space="0" w:color="999999"/>
+              <w:bottom w:val="single" w:sz="4" w:space="0" w:color="999999"/>
+              <w:right w:val="single" w:sz="4" w:space="0" w:color="999999"/>
+            </w:tcBorders>
+            <w:vAlign w:val="center"/>
+          </w:tcPr>
+          <w:p>
+            <w:pPr>
+              <w:pStyle w:val="Compact"/>
+            </w:pPr>
+            <w:r>
+              <w:rPr>
+                <w:rtl/>
+              </w:rPr>
+              <w:t xml:space="preserve">עבר</w:t>
             </w:r>
           </w:p>
         </w:tc>
@@ -6767,7 +7521,27 @@
         </w:trPr>
         <w:tc>
           <w:tcPr>
-            <w:tcW w:w="3962" w:type="dxa"/>
+            <w:tcW w:w="632" w:type="dxa"/>
+            <w:tcBorders>
+              <w:top w:val="single" w:sz="4" w:space="0" w:color="999999"/>
+              <w:left w:val="single" w:sz="4" w:space="0" w:color="999999"/>
+              <w:bottom w:val="single" w:sz="4" w:space="0" w:color="999999"/>
+              <w:right w:val="single" w:sz="4" w:space="0" w:color="999999"/>
+            </w:tcBorders>
+            <w:vAlign w:val="center"/>
+          </w:tcPr>
+          <w:p>
+            <w:pPr>
+              <w:pStyle w:val="Compact"/>
+            </w:pPr>
+            <w:r>
+              <w:t xml:space="preserve">17</w:t>
+            </w:r>
+          </w:p>
+        </w:tc>
+        <w:tc>
+          <w:tcPr>
+            <w:tcW w:w="3038" w:type="dxa"/>
             <w:tcBorders>
               <w:top w:val="single" w:sz="4" w:space="0" w:color="999999"/>
               <w:left w:val="single" w:sz="4" w:space="0" w:color="999999"/>
@@ -6790,24 +7564,47 @@
         </w:tc>
         <w:tc>
           <w:tcPr>
-            <w:tcW w:w="5038" w:type="dxa"/>
-            <w:tcBorders>
-              <w:top w:val="single" w:sz="4" w:space="0" w:color="999999"/>
-              <w:left w:val="single" w:sz="4" w:space="0" w:color="999999"/>
-              <w:bottom w:val="single" w:sz="4" w:space="0" w:color="999999"/>
-              <w:right w:val="single" w:sz="4" w:space="0" w:color="999999"/>
-            </w:tcBorders>
-            <w:vAlign w:val="center"/>
-          </w:tcPr>
-          <w:p>
-            <w:pPr>
-              <w:pStyle w:val="Compact"/>
-            </w:pPr>
-            <w:r>
-              <w:rPr>
-                <w:rtl/>
-              </w:rPr>
-              <w:t xml:space="preserve">האפליקציה מציגה שאין חיבור, ופקודה שנכשלה מציגה שגיאה</w:t>
+            <w:tcW w:w="4179" w:type="dxa"/>
+            <w:tcBorders>
+              <w:top w:val="single" w:sz="4" w:space="0" w:color="999999"/>
+              <w:left w:val="single" w:sz="4" w:space="0" w:color="999999"/>
+              <w:bottom w:val="single" w:sz="4" w:space="0" w:color="999999"/>
+              <w:right w:val="single" w:sz="4" w:space="0" w:color="999999"/>
+            </w:tcBorders>
+            <w:vAlign w:val="center"/>
+          </w:tcPr>
+          <w:p>
+            <w:pPr>
+              <w:pStyle w:val="Compact"/>
+            </w:pPr>
+            <w:r>
+              <w:rPr>
+                <w:rtl/>
+              </w:rPr>
+              <w:t xml:space="preserve">האפליקציה הציגה שאין חיבור, ופקודה שנכשלה הציגה שגיאה</w:t>
+            </w:r>
+          </w:p>
+        </w:tc>
+        <w:tc>
+          <w:tcPr>
+            <w:tcW w:w="1151" w:type="dxa"/>
+            <w:tcBorders>
+              <w:top w:val="single" w:sz="4" w:space="0" w:color="999999"/>
+              <w:left w:val="single" w:sz="4" w:space="0" w:color="999999"/>
+              <w:bottom w:val="single" w:sz="4" w:space="0" w:color="999999"/>
+              <w:right w:val="single" w:sz="4" w:space="0" w:color="999999"/>
+            </w:tcBorders>
+            <w:vAlign w:val="center"/>
+          </w:tcPr>
+          <w:p>
+            <w:pPr>
+              <w:pStyle w:val="Compact"/>
+            </w:pPr>
+            <w:r>
+              <w:rPr>
+                <w:rtl/>
+              </w:rPr>
+              <w:t xml:space="preserve">עבר</w:t>
             </w:r>
           </w:p>
         </w:tc>
@@ -6817,20 +7614,6 @@
       <w:pPr>
         <w:pStyle w:val="BodyText"/>
         <w:spacing w:before="200"/>
-      </w:pPr>
-      <w:r>
-        <w:rPr>
-          <w:i/>
-          <w:iCs/>
-          <w:highlight w:val="yellow"/>
-          <w:rtl/>
-        </w:rPr>
-        <w:t xml:space="preserve">[לאמת: כל התרחישים נבדקו בפועל ועבדו כמתוכנן]</w:t>
-      </w:r>
-    </w:p>
-    <w:p>
-      <w:pPr>
-        <w:pStyle w:val="BodyText"/>
       </w:pPr>
       <w:r>
         <w:rPr>

</xml_diff>